<commit_message>
Deploying to gh-pages from @ Morrison-Lab/psw@173d33fb93697d6119103d5a519805e6b9f6a8cf 🚀
</commit_message>
<xml_diff>
--- a/chapters/defining-terms.docx
+++ b/chapters/defining-terms.docx
@@ -15,7 +15,7 @@
         <w:pStyle w:val="Date"/>
       </w:pPr>
       <w:r>
-        <w:t xml:space="preserve">Last modified: 2026-10-02 17:01:49 (UTC)</w:t>
+        <w:t xml:space="preserve">Last modified: 2026-10-05 05:52:32 (UTC)</w:t>
       </w:r>
     </w:p>
     <w:p>
@@ -92,7 +92,7 @@
       </w:r>
     </w:p>
     <w:bookmarkEnd w:id="9"/>
-    <w:bookmarkStart w:id="11" w:name="exm-population"/>
+    <w:bookmarkStart w:id="10" w:name="def-population"/>
     <w:p>
       <w:pPr>
         <w:pStyle w:val="BodyText"/>
@@ -102,38 +102,55 @@
           <w:b/>
           <w:bCs/>
         </w:rPr>
-        <w:t xml:space="preserve">Example 1 (Population)</w:t>
-      </w:r>
-      <w:r>
-        <w:t xml:space="preserve"> </w:t>
-      </w:r>
-      <w:r>
-        <w:t xml:space="preserve"> </w:t>
-      </w:r>
-    </w:p>
-    <w:bookmarkStart w:id="10" w:name="def-population"/>
+        <w:t xml:space="preserve">Definition 2 (Population)</w:t>
+      </w:r>
+      <w:r>
+        <w:t xml:space="preserve"> </w:t>
+      </w:r>
+      <w:r>
+        <w:t xml:space="preserve">In statistics,</w:t>
+      </w:r>
+      <w:r>
+        <w:t xml:space="preserve"> </w:t>
+      </w:r>
+      <w:r>
+        <w:t xml:space="preserve">a</w:t>
+      </w:r>
+      <w:r>
+        <w:t xml:space="preserve"> </w:t>
+      </w:r>
+      <w:r>
+        <w:rPr>
+          <w:i/>
+          <w:iCs/>
+        </w:rPr>
+        <w:t xml:space="preserve">population</w:t>
+      </w:r>
+      <w:r>
+        <w:t xml:space="preserve"> </w:t>
+      </w:r>
+      <w:r>
+        <w:t xml:space="preserve">is the complete set of all items or individuals of interest.</w:t>
+      </w:r>
+    </w:p>
+    <w:bookmarkEnd w:id="10"/>
+    <w:bookmarkStart w:id="11" w:name="rem-population"/>
     <w:p>
       <w:pPr>
         <w:pStyle w:val="BodyText"/>
       </w:pPr>
       <w:r>
         <w:rPr>
-          <w:b/>
-          <w:bCs/>
-        </w:rPr>
-        <w:t xml:space="preserve">Definition 2 (Population)</w:t>
-      </w:r>
-      <w:r>
-        <w:t xml:space="preserve"> </w:t>
-      </w:r>
-      <w:r>
-        <w:t xml:space="preserve">In statistics,</w:t>
-      </w:r>
-      <w:r>
-        <w:t xml:space="preserve"> </w:t>
-      </w:r>
-      <w:r>
-        <w:t xml:space="preserve">the term</w:t>
+          <w:i/>
+          <w:iCs/>
+        </w:rPr>
+        <w:t xml:space="preserve">Remark 1</w:t>
+      </w:r>
+      <w:r>
+        <w:t xml:space="preserve"> (Population is not only geographic). </w:t>
+      </w:r>
+      <w:r>
+        <w:t xml:space="preserve">In everyday use,</w:t>
       </w:r>
       <w:r>
         <w:t xml:space="preserve"> </w:t>
@@ -145,16 +162,50 @@
         <w:t xml:space="preserve"> </w:t>
       </w:r>
       <w:r>
-        <w:t xml:space="preserve">refers to the complete set of all items or individuals of interest,</w:t>
-      </w:r>
-      <w:r>
-        <w:t xml:space="preserve"> </w:t>
-      </w:r>
-      <w:r>
-        <w:t xml:space="preserve">not just a geographic population of people.</w:t>
-      </w:r>
-    </w:p>
-    <w:bookmarkEnd w:id="10"/>
+        <w:t xml:space="preserve">usually means the people living in a place.</w:t>
+      </w:r>
+      <w:r>
+        <w:t xml:space="preserve"> </w:t>
+      </w:r>
+      <w:r>
+        <w:t xml:space="preserve">The statistical sense in</w:t>
+      </w:r>
+      <w:r>
+        <w:t xml:space="preserve"> </w:t>
+      </w:r>
+      <w:hyperlink w:anchor="def-population">
+        <w:r>
+          <w:rPr>
+            <w:rStyle w:val="Hyperlink"/>
+          </w:rPr>
+          <w:t xml:space="preserve">Definition 2</w:t>
+        </w:r>
+      </w:hyperlink>
+      <w:r>
+        <w:t xml:space="preserve"> </w:t>
+      </w:r>
+      <w:r>
+        <w:t xml:space="preserve">is broader:</w:t>
+      </w:r>
+      <w:r>
+        <w:t xml:space="preserve"> </w:t>
+      </w:r>
+      <w:r>
+        <w:t xml:space="preserve">a population can be all the patients with a condition,</w:t>
+      </w:r>
+      <w:r>
+        <w:t xml:space="preserve"> </w:t>
+      </w:r>
+      <w:r>
+        <w:t xml:space="preserve">all the batches a factory produces,</w:t>
+      </w:r>
+      <w:r>
+        <w:t xml:space="preserve"> </w:t>
+      </w:r>
+      <w:r>
+        <w:t xml:space="preserve">or any other set of items of interest.</w:t>
+      </w:r>
+    </w:p>
     <w:bookmarkEnd w:id="11"/>
     <w:bookmarkStart w:id="13" w:name="guidelines-for-defining-terms"/>
     <w:p>
@@ -225,6 +276,1141 @@
       </w:r>
       <w:r>
         <w:t xml:space="preserve">using only the words necessary to convey the meaning.</w:t>
+      </w:r>
+      <w:r>
+        <w:t xml:space="preserve"> </w:t>
+      </w:r>
+      <w:r>
+        <w:t xml:space="preserve">A definition block holds the defining statement and nothing else:</w:t>
+      </w:r>
+      <w:r>
+        <w:t xml:space="preserve"> </w:t>
+      </w:r>
+      <w:r>
+        <w:t xml:space="preserve">no examples, special cases, motivation or caveats.</w:t>
+      </w:r>
+    </w:p>
+    <w:p>
+      <w:pPr>
+        <w:numPr>
+          <w:ilvl w:val="0"/>
+          <w:numId w:val="1001"/>
+        </w:numPr>
+      </w:pPr>
+      <w:r>
+        <w:rPr>
+          <w:b/>
+          <w:bCs/>
+        </w:rPr>
+        <w:t xml:space="preserve">State technical definitions in both prose and math:</w:t>
+      </w:r>
+      <w:r>
+        <w:t xml:space="preserve"> </w:t>
+      </w:r>
+      <w:r>
+        <w:t xml:space="preserve">Give a quantitative term a one-sentence prose definition</w:t>
+      </w:r>
+      <w:r>
+        <w:t xml:space="preserve"> </w:t>
+      </w:r>
+      <w:r>
+        <w:t xml:space="preserve">and the formula it stands for, in the same definition block;</w:t>
+      </w:r>
+      <w:r>
+        <w:t xml:space="preserve"> </w:t>
+      </w:r>
+      <w:r>
+        <w:t xml:space="preserve">together the sentence and the formula are the defining statement.</w:t>
+      </w:r>
+      <w:r>
+        <w:t xml:space="preserve"> </w:t>
+      </w:r>
+      <w:r>
+        <w:t xml:space="preserve">The prose tells the reader what the quantity means;</w:t>
+      </w:r>
+      <w:r>
+        <w:t xml:space="preserve"> </w:t>
+      </w:r>
+      <w:r>
+        <w:t xml:space="preserve">the formula makes it exact and lets later derivations cite it.</w:t>
+      </w:r>
+      <w:r>
+        <w:t xml:space="preserve"> </w:t>
+      </w:r>
+      <w:r>
+        <w:t xml:space="preserve">For example, define the ordinary least squares estimate</w:t>
+      </w:r>
+      <w:r>
+        <w:t xml:space="preserve"> </w:t>
+      </w:r>
+      <w:r>
+        <w:t xml:space="preserve">of a parameter vector</w:t>
+      </w:r>
+      <w:r>
+        <w:t xml:space="preserve"> </w:t>
+      </w:r>
+      <m:oMath>
+        <m:acc>
+          <m:accPr>
+            <m:chr m:val="⃗"/>
+          </m:accPr>
+          <m:e>
+            <m:r>
+              <m:t>θ</m:t>
+            </m:r>
+          </m:e>
+        </m:acc>
+      </m:oMath>
+      <w:r>
+        <w:t xml:space="preserve"> </w:t>
+      </w:r>
+      <w:r>
+        <w:t xml:space="preserve">as</w:t>
+      </w:r>
+      <w:r>
+        <w:t xml:space="preserve"> </w:t>
+      </w:r>
+      <w:r>
+        <w:t xml:space="preserve">“the value of</w:t>
+      </w:r>
+      <w:r>
+        <w:t xml:space="preserve"> </w:t>
+      </w:r>
+      <m:oMath>
+        <m:acc>
+          <m:accPr>
+            <m:chr m:val="⃗"/>
+          </m:accPr>
+          <m:e>
+            <m:r>
+              <m:t>θ</m:t>
+            </m:r>
+          </m:e>
+        </m:acc>
+      </m:oMath>
+      <w:r>
+        <w:t xml:space="preserve"> </w:t>
+      </w:r>
+      <w:r>
+        <w:t xml:space="preserve">that minimizes</w:t>
+      </w:r>
+      <w:r>
+        <w:t xml:space="preserve"> </w:t>
+      </w:r>
+      <w:r>
+        <w:t xml:space="preserve">the</w:t>
+      </w:r>
+      <w:r>
+        <w:t xml:space="preserve"> </w:t>
+      </w:r>
+      <w:hyperlink w:anchor="def-rss">
+        <w:r>
+          <w:rPr>
+            <w:rStyle w:val="Hyperlink"/>
+          </w:rPr>
+          <w:t xml:space="preserve">residual sum of squares</w:t>
+        </w:r>
+      </w:hyperlink>
+      <w:r>
+        <w:t xml:space="preserve">”</w:t>
+      </w:r>
+      <w:r>
+        <w:t xml:space="preserve"> </w:t>
+      </w:r>
+      <w:r>
+        <w:rPr>
+          <w:i/>
+          <w:iCs/>
+        </w:rPr>
+        <w:t xml:space="preserve">and</w:t>
+      </w:r>
+      <w:r>
+        <w:t xml:space="preserve"> </w:t>
+      </w:r>
+      <w:r>
+        <w:t xml:space="preserve">as</w:t>
+      </w:r>
+      <w:r>
+        <w:t xml:space="preserve"> </w:t>
+      </w:r>
+      <m:oMath>
+        <m:acc>
+          <m:accPr>
+            <m:chr m:val="̂"/>
+          </m:accPr>
+          <m:e>
+            <m:acc>
+              <m:accPr>
+                <m:chr m:val="⃗"/>
+              </m:accPr>
+              <m:e>
+                <m:r>
+                  <m:t>θ</m:t>
+                </m:r>
+              </m:e>
+            </m:acc>
+          </m:e>
+        </m:acc>
+        <m:box>
+          <m:boxPr>
+            <m:opEmu m:val="on"/>
+          </m:boxPr>
+          <m:e>
+            <m:r>
+              <m:rPr>
+                <m:sty m:val="p"/>
+              </m:rPr>
+              <m:t>:=</m:t>
+            </m:r>
+          </m:e>
+        </m:box>
+        <m:r>
+          <m:rPr>
+            <m:sty m:val="p"/>
+          </m:rPr>
+          <m:t>arg</m:t>
+        </m:r>
+        <m:sSub>
+          <m:e>
+            <m:r>
+              <m:rPr>
+                <m:sty m:val="p"/>
+              </m:rPr>
+              <m:t>min</m:t>
+            </m:r>
+          </m:e>
+          <m:sub>
+            <m:acc>
+              <m:accPr>
+                <m:chr m:val="⃗"/>
+              </m:accPr>
+              <m:e>
+                <m:r>
+                  <m:t>θ</m:t>
+                </m:r>
+              </m:e>
+            </m:acc>
+          </m:sub>
+        </m:sSub>
+        <m:r>
+          <m:rPr>
+            <m:nor/>
+            <m:sty m:val="p"/>
+          </m:rPr>
+          <m:t>RSS</m:t>
+        </m:r>
+        <m:r>
+          <m:rPr>
+            <m:sty m:val="p"/>
+          </m:rPr>
+          <m:t>(</m:t>
+        </m:r>
+        <m:acc>
+          <m:accPr>
+            <m:chr m:val="⃗"/>
+          </m:accPr>
+          <m:e>
+            <m:r>
+              <m:t>θ</m:t>
+            </m:r>
+          </m:e>
+        </m:acc>
+        <m:r>
+          <m:rPr>
+            <m:sty m:val="p"/>
+          </m:rPr>
+          <m:t>)</m:t>
+        </m:r>
+      </m:oMath>
+      <w:r>
+        <w:t xml:space="preserve">,</w:t>
+      </w:r>
+      <w:r>
+        <w:t xml:space="preserve"> </w:t>
+      </w:r>
+      <w:r>
+        <w:t xml:space="preserve">not with only one of the two.</w:t>
+      </w:r>
+      <w:r>
+        <w:t xml:space="preserve"> </w:t>
+      </w:r>
+      <w:r>
+        <w:t xml:space="preserve">Build the formula from terms already defined,</w:t>
+      </w:r>
+      <w:r>
+        <w:t xml:space="preserve"> </w:t>
+      </w:r>
+      <w:r>
+        <w:t xml:space="preserve">rather than expanding them again:</w:t>
+      </w:r>
+      <w:r>
+        <w:t xml:space="preserve"> </w:t>
+      </w:r>
+      <w:r>
+        <w:t xml:space="preserve">once the residual and total sums of squares are defined,</w:t>
+      </w:r>
+      <w:r>
+        <w:t xml:space="preserve"> </w:t>
+      </w:r>
+      <w:r>
+        <w:t xml:space="preserve">write</w:t>
+      </w:r>
+      <w:r>
+        <w:t xml:space="preserve"> </w:t>
+      </w:r>
+      <m:oMath>
+        <m:sSup>
+          <m:e>
+            <m:r>
+              <m:t>R</m:t>
+            </m:r>
+          </m:e>
+          <m:sup>
+            <m:r>
+              <m:t>2</m:t>
+            </m:r>
+          </m:sup>
+        </m:sSup>
+        <m:box>
+          <m:boxPr>
+            <m:opEmu m:val="on"/>
+          </m:boxPr>
+          <m:e>
+            <m:r>
+              <m:rPr>
+                <m:sty m:val="p"/>
+              </m:rPr>
+              <m:t>:=</m:t>
+            </m:r>
+          </m:e>
+        </m:box>
+        <m:r>
+          <m:t>1</m:t>
+        </m:r>
+        <m:r>
+          <m:rPr>
+            <m:sty m:val="p"/>
+          </m:rPr>
+          <m:t>−</m:t>
+        </m:r>
+        <m:r>
+          <m:rPr>
+            <m:nor/>
+            <m:sty m:val="p"/>
+          </m:rPr>
+          <m:t>RSS</m:t>
+        </m:r>
+        <m:r>
+          <m:rPr>
+            <m:sty m:val="p"/>
+          </m:rPr>
+          <m:t>/</m:t>
+        </m:r>
+        <m:r>
+          <m:rPr>
+            <m:nor/>
+            <m:sty m:val="p"/>
+          </m:rPr>
+          <m:t>TSS</m:t>
+        </m:r>
+      </m:oMath>
+      <w:r>
+        <w:t xml:space="preserve">,</w:t>
+      </w:r>
+      <w:r>
+        <w:t xml:space="preserve"> </w:t>
+      </w:r>
+      <w:r>
+        <w:t xml:space="preserve">not the two sums that RSS and TSS stand for.</w:t>
+      </w:r>
+    </w:p>
+    <w:p>
+      <w:pPr>
+        <w:numPr>
+          <w:ilvl w:val="0"/>
+          <w:numId w:val="1001"/>
+        </w:numPr>
+      </w:pPr>
+      <w:r>
+        <w:rPr>
+          <w:b/>
+          <w:bCs/>
+        </w:rPr>
+        <w:t xml:space="preserve">Define a statistical model by its distribution, and derive its other forms:</w:t>
+      </w:r>
+      <w:r>
+        <w:t xml:space="preserve"> </w:t>
+      </w:r>
+      <w:r>
+        <w:t xml:space="preserve">Define a regression model by the distribution of the outcome</w:t>
+      </w:r>
+      <w:r>
+        <w:t xml:space="preserve"> </w:t>
+      </w:r>
+      <w:r>
+        <w:t xml:space="preserve">conditional on the covariates,</w:t>
+      </w:r>
+      <w:r>
+        <w:t xml:space="preserve"> </w:t>
+      </w:r>
+      <w:r>
+        <w:t xml:space="preserve">centered on a named mean function.</w:t>
+      </w:r>
+      <w:r>
+        <w:t xml:space="preserve"> </w:t>
+      </w:r>
+      <w:r>
+        <w:t xml:space="preserve">For example, define simple linear regression as</w:t>
+      </w:r>
+      <w:r>
+        <w:t xml:space="preserve"> </w:t>
+      </w:r>
+      <m:oMath>
+        <m:sSub>
+          <m:e>
+            <m:r>
+              <m:t>Y</m:t>
+            </m:r>
+          </m:e>
+          <m:sub>
+            <m:r>
+              <m:t>i</m:t>
+            </m:r>
+          </m:sub>
+        </m:sSub>
+        <m:r>
+          <m:rPr>
+            <m:sty m:val="p"/>
+          </m:rPr>
+          <m:t>∣</m:t>
+        </m:r>
+        <m:sSub>
+          <m:e>
+            <m:r>
+              <m:t>X</m:t>
+            </m:r>
+          </m:e>
+          <m:sub>
+            <m:r>
+              <m:t>i</m:t>
+            </m:r>
+          </m:sub>
+        </m:sSub>
+        <m:r>
+          <m:rPr>
+            <m:sty m:val="p"/>
+          </m:rPr>
+          <m:t>=</m:t>
+        </m:r>
+        <m:sSub>
+          <m:e>
+            <m:r>
+              <m:t>x</m:t>
+            </m:r>
+          </m:e>
+          <m:sub>
+            <m:r>
+              <m:t>i</m:t>
+            </m:r>
+          </m:sub>
+        </m:sSub>
+        <m:r>
+          <m:rPr>
+            <m:sty m:val="p"/>
+          </m:rPr>
+          <m:t>∼</m:t>
+        </m:r>
+        <m:r>
+          <m:rPr>
+            <m:nor/>
+            <m:sty m:val="p"/>
+          </m:rPr>
+          <m:t>N</m:t>
+        </m:r>
+        <m:r>
+          <m:rPr>
+            <m:sty m:val="p"/>
+          </m:rPr>
+          <m:t>(</m:t>
+        </m:r>
+        <m:sSub>
+          <m:e>
+            <m:r>
+              <m:t>μ</m:t>
+            </m:r>
+          </m:e>
+          <m:sub>
+            <m:r>
+              <m:t>i</m:t>
+            </m:r>
+          </m:sub>
+        </m:sSub>
+        <m:r>
+          <m:rPr>
+            <m:sty m:val="p"/>
+          </m:rPr>
+          <m:t>,</m:t>
+        </m:r>
+        <m:sSup>
+          <m:e>
+            <m:r>
+              <m:t>σ</m:t>
+            </m:r>
+          </m:e>
+          <m:sup>
+            <m:r>
+              <m:t>2</m:t>
+            </m:r>
+          </m:sup>
+        </m:sSup>
+        <m:r>
+          <m:rPr>
+            <m:sty m:val="p"/>
+          </m:rPr>
+          <m:t>)</m:t>
+        </m:r>
+      </m:oMath>
+      <w:r>
+        <w:t xml:space="preserve">, independently,</w:t>
+      </w:r>
+      <w:r>
+        <w:t xml:space="preserve"> </w:t>
+      </w:r>
+      <w:r>
+        <w:t xml:space="preserve">with</w:t>
+      </w:r>
+      <w:r>
+        <w:t xml:space="preserve"> </w:t>
+      </w:r>
+      <m:oMath>
+        <m:sSub>
+          <m:e>
+            <m:r>
+              <m:t>μ</m:t>
+            </m:r>
+          </m:e>
+          <m:sub>
+            <m:r>
+              <m:t>i</m:t>
+            </m:r>
+          </m:sub>
+        </m:sSub>
+        <m:box>
+          <m:boxPr>
+            <m:opEmu m:val="on"/>
+          </m:boxPr>
+          <m:e>
+            <m:r>
+              <m:rPr>
+                <m:sty m:val="p"/>
+              </m:rPr>
+              <m:t>:=</m:t>
+            </m:r>
+          </m:e>
+        </m:box>
+        <m:r>
+          <m:t>μ</m:t>
+        </m:r>
+        <m:r>
+          <m:rPr>
+            <m:sty m:val="p"/>
+          </m:rPr>
+          <m:t>(</m:t>
+        </m:r>
+        <m:sSub>
+          <m:e>
+            <m:r>
+              <m:t>x</m:t>
+            </m:r>
+          </m:e>
+          <m:sub>
+            <m:r>
+              <m:t>i</m:t>
+            </m:r>
+          </m:sub>
+        </m:sSub>
+        <m:r>
+          <m:rPr>
+            <m:sty m:val="p"/>
+          </m:rPr>
+          <m:t>)</m:t>
+        </m:r>
+      </m:oMath>
+      <w:r>
+        <w:t xml:space="preserve"> </w:t>
+      </w:r>
+      <w:r>
+        <w:t xml:space="preserve">and</w:t>
+      </w:r>
+      <w:r>
+        <w:t xml:space="preserve"> </w:t>
+      </w:r>
+      <m:oMath>
+        <m:r>
+          <m:t>μ</m:t>
+        </m:r>
+        <m:r>
+          <m:rPr>
+            <m:sty m:val="p"/>
+          </m:rPr>
+          <m:t>(</m:t>
+        </m:r>
+        <m:r>
+          <m:t>x</m:t>
+        </m:r>
+        <m:r>
+          <m:rPr>
+            <m:sty m:val="p"/>
+          </m:rPr>
+          <m:t>)</m:t>
+        </m:r>
+        <m:box>
+          <m:boxPr>
+            <m:opEmu m:val="on"/>
+          </m:boxPr>
+          <m:e>
+            <m:r>
+              <m:rPr>
+                <m:sty m:val="p"/>
+              </m:rPr>
+              <m:t>:=</m:t>
+            </m:r>
+          </m:e>
+        </m:box>
+        <m:sSub>
+          <m:e>
+            <m:r>
+              <m:t>β</m:t>
+            </m:r>
+          </m:e>
+          <m:sub>
+            <m:r>
+              <m:t>0</m:t>
+            </m:r>
+          </m:sub>
+        </m:sSub>
+        <m:r>
+          <m:rPr>
+            <m:sty m:val="p"/>
+          </m:rPr>
+          <m:t>+</m:t>
+        </m:r>
+        <m:sSub>
+          <m:e>
+            <m:r>
+              <m:t>β</m:t>
+            </m:r>
+          </m:e>
+          <m:sub>
+            <m:r>
+              <m:t>x</m:t>
+            </m:r>
+          </m:sub>
+        </m:sSub>
+        <m:r>
+          <m:t>x</m:t>
+        </m:r>
+      </m:oMath>
+      <w:r>
+        <w:t xml:space="preserve">.</w:t>
+      </w:r>
+      <w:r>
+        <w:t xml:space="preserve"> </w:t>
+      </w:r>
+      <w:r>
+        <w:t xml:space="preserve">Then define the deviation</w:t>
+      </w:r>
+      <w:r>
+        <w:t xml:space="preserve"> </w:t>
+      </w:r>
+      <m:oMath>
+        <m:sSub>
+          <m:e>
+            <m:r>
+              <m:t>ε</m:t>
+            </m:r>
+          </m:e>
+          <m:sub>
+            <m:r>
+              <m:t>i</m:t>
+            </m:r>
+          </m:sub>
+        </m:sSub>
+        <m:box>
+          <m:boxPr>
+            <m:opEmu m:val="on"/>
+          </m:boxPr>
+          <m:e>
+            <m:r>
+              <m:rPr>
+                <m:sty m:val="p"/>
+              </m:rPr>
+              <m:t>:=</m:t>
+            </m:r>
+          </m:e>
+        </m:box>
+        <m:sSub>
+          <m:e>
+            <m:r>
+              <m:t>Y</m:t>
+            </m:r>
+          </m:e>
+          <m:sub>
+            <m:r>
+              <m:t>i</m:t>
+            </m:r>
+          </m:sub>
+        </m:sSub>
+        <m:r>
+          <m:rPr>
+            <m:sty m:val="p"/>
+          </m:rPr>
+          <m:t>−</m:t>
+        </m:r>
+        <m:r>
+          <m:t>μ</m:t>
+        </m:r>
+        <m:r>
+          <m:rPr>
+            <m:sty m:val="p"/>
+          </m:rPr>
+          <m:t>(</m:t>
+        </m:r>
+        <m:sSub>
+          <m:e>
+            <m:r>
+              <m:t>x</m:t>
+            </m:r>
+          </m:e>
+          <m:sub>
+            <m:r>
+              <m:t>i</m:t>
+            </m:r>
+          </m:sub>
+        </m:sSub>
+        <m:r>
+          <m:rPr>
+            <m:sty m:val="p"/>
+          </m:rPr>
+          <m:t>)</m:t>
+        </m:r>
+      </m:oMath>
+      <w:r>
+        <w:t xml:space="preserve">,</w:t>
+      </w:r>
+      <w:r>
+        <w:t xml:space="preserve"> </w:t>
+      </w:r>
+      <w:r>
+        <w:t xml:space="preserve">and state</w:t>
+      </w:r>
+      <w:r>
+        <w:t xml:space="preserve"> </w:t>
+      </w:r>
+      <m:oMath>
+        <m:sSub>
+          <m:e>
+            <m:r>
+              <m:t>Y</m:t>
+            </m:r>
+          </m:e>
+          <m:sub>
+            <m:r>
+              <m:t>i</m:t>
+            </m:r>
+          </m:sub>
+        </m:sSub>
+        <m:r>
+          <m:rPr>
+            <m:sty m:val="p"/>
+          </m:rPr>
+          <m:t>=</m:t>
+        </m:r>
+        <m:sSub>
+          <m:e>
+            <m:r>
+              <m:t>μ</m:t>
+            </m:r>
+          </m:e>
+          <m:sub>
+            <m:r>
+              <m:t>i</m:t>
+            </m:r>
+          </m:sub>
+        </m:sSub>
+        <m:r>
+          <m:rPr>
+            <m:sty m:val="p"/>
+          </m:rPr>
+          <m:t>+</m:t>
+        </m:r>
+        <m:sSub>
+          <m:e>
+            <m:r>
+              <m:t>ε</m:t>
+            </m:r>
+          </m:e>
+          <m:sub>
+            <m:r>
+              <m:t>i</m:t>
+            </m:r>
+          </m:sub>
+        </m:sSub>
+      </m:oMath>
+      <w:r>
+        <w:t xml:space="preserve"> </w:t>
+      </w:r>
+      <w:r>
+        <w:t xml:space="preserve">with</w:t>
+      </w:r>
+      <w:r>
+        <w:t xml:space="preserve"> </w:t>
+      </w:r>
+      <m:oMath>
+        <m:sSub>
+          <m:e>
+            <m:r>
+              <m:t>ε</m:t>
+            </m:r>
+          </m:e>
+          <m:sub>
+            <m:r>
+              <m:t>i</m:t>
+            </m:r>
+          </m:sub>
+        </m:sSub>
+        <m:r>
+          <m:rPr>
+            <m:sty m:val="p"/>
+          </m:rPr>
+          <m:t>∣</m:t>
+        </m:r>
+        <m:sSub>
+          <m:e>
+            <m:r>
+              <m:t>X</m:t>
+            </m:r>
+          </m:e>
+          <m:sub>
+            <m:r>
+              <m:t>i</m:t>
+            </m:r>
+          </m:sub>
+        </m:sSub>
+        <m:r>
+          <m:rPr>
+            <m:sty m:val="p"/>
+          </m:rPr>
+          <m:t>=</m:t>
+        </m:r>
+        <m:sSub>
+          <m:e>
+            <m:r>
+              <m:t>x</m:t>
+            </m:r>
+          </m:e>
+          <m:sub>
+            <m:r>
+              <m:t>i</m:t>
+            </m:r>
+          </m:sub>
+        </m:sSub>
+        <m:r>
+          <m:rPr>
+            <m:sty m:val="p"/>
+          </m:rPr>
+          <m:t>∼</m:t>
+        </m:r>
+        <m:r>
+          <m:rPr>
+            <m:nor/>
+            <m:sty m:val="p"/>
+          </m:rPr>
+          <m:t>N</m:t>
+        </m:r>
+        <m:r>
+          <m:rPr>
+            <m:sty m:val="p"/>
+          </m:rPr>
+          <m:t>(</m:t>
+        </m:r>
+        <m:r>
+          <m:t>0</m:t>
+        </m:r>
+        <m:r>
+          <m:rPr>
+            <m:sty m:val="p"/>
+          </m:rPr>
+          <m:t>,</m:t>
+        </m:r>
+        <m:sSup>
+          <m:e>
+            <m:r>
+              <m:t>σ</m:t>
+            </m:r>
+          </m:e>
+          <m:sup>
+            <m:r>
+              <m:t>2</m:t>
+            </m:r>
+          </m:sup>
+        </m:sSup>
+        <m:r>
+          <m:rPr>
+            <m:sty m:val="p"/>
+          </m:rPr>
+          <m:t>)</m:t>
+        </m:r>
+      </m:oMath>
+      <w:r>
+        <w:t xml:space="preserve"> </w:t>
+      </w:r>
+      <w:r>
+        <w:t xml:space="preserve">as a result proved from those definitions.</w:t>
+      </w:r>
+      <w:r>
+        <w:t xml:space="preserve"> </w:t>
+      </w:r>
+      <w:r>
+        <w:t xml:space="preserve">Writing the model as</w:t>
+      </w:r>
+      <w:r>
+        <w:t xml:space="preserve"> </w:t>
+      </w:r>
+      <w:r>
+        <w:t xml:space="preserve">“</w:t>
+      </w:r>
+      <m:oMath>
+        <m:sSub>
+          <m:e>
+            <m:r>
+              <m:t>Y</m:t>
+            </m:r>
+          </m:e>
+          <m:sub>
+            <m:r>
+              <m:t>i</m:t>
+            </m:r>
+          </m:sub>
+        </m:sSub>
+        <m:r>
+          <m:rPr>
+            <m:sty m:val="p"/>
+          </m:rPr>
+          <m:t>=</m:t>
+        </m:r>
+        <m:sSub>
+          <m:e>
+            <m:r>
+              <m:t>β</m:t>
+            </m:r>
+          </m:e>
+          <m:sub>
+            <m:r>
+              <m:t>0</m:t>
+            </m:r>
+          </m:sub>
+        </m:sSub>
+        <m:r>
+          <m:rPr>
+            <m:sty m:val="p"/>
+          </m:rPr>
+          <m:t>+</m:t>
+        </m:r>
+        <m:sSub>
+          <m:e>
+            <m:r>
+              <m:t>β</m:t>
+            </m:r>
+          </m:e>
+          <m:sub>
+            <m:r>
+              <m:t>x</m:t>
+            </m:r>
+          </m:sub>
+        </m:sSub>
+        <m:sSub>
+          <m:e>
+            <m:r>
+              <m:t>x</m:t>
+            </m:r>
+          </m:e>
+          <m:sub>
+            <m:r>
+              <m:t>i</m:t>
+            </m:r>
+          </m:sub>
+        </m:sSub>
+        <m:r>
+          <m:rPr>
+            <m:sty m:val="p"/>
+          </m:rPr>
+          <m:t>+</m:t>
+        </m:r>
+        <m:sSub>
+          <m:e>
+            <m:r>
+              <m:t>ε</m:t>
+            </m:r>
+          </m:e>
+          <m:sub>
+            <m:r>
+              <m:t>i</m:t>
+            </m:r>
+          </m:sub>
+        </m:sSub>
+      </m:oMath>
+      <w:r>
+        <w:t xml:space="preserve"> </w:t>
+      </w:r>
+      <w:r>
+        <w:t xml:space="preserve">with Gaussian errors”</w:t>
+      </w:r>
+      <w:r>
+        <w:t xml:space="preserve"> </w:t>
+      </w:r>
+      <w:r>
+        <w:t xml:space="preserve">makes the definition rest on a quantity</w:t>
+      </w:r>
+      <w:r>
+        <w:t xml:space="preserve"> </w:t>
+      </w:r>
+      <w:r>
+        <w:t xml:space="preserve">that has not been defined yet,</w:t>
+      </w:r>
+      <w:r>
+        <w:t xml:space="preserve"> </w:t>
+      </w:r>
+      <w:r>
+        <w:t xml:space="preserve">and hides that the model is a statement about the outcome’s distribution.</w:t>
+      </w:r>
+    </w:p>
+    <w:p>
+      <w:pPr>
+        <w:numPr>
+          <w:ilvl w:val="0"/>
+          <w:numId w:val="1001"/>
+        </w:numPr>
+      </w:pPr>
+      <w:r>
+        <w:rPr>
+          <w:b/>
+          <w:bCs/>
+        </w:rPr>
+        <w:t xml:space="preserve">Define in the most general form the document needs:</w:t>
+      </w:r>
+      <w:r>
+        <w:t xml:space="preserve"> </w:t>
+      </w:r>
+      <w:r>
+        <w:t xml:space="preserve">State the concept at the level of generality</w:t>
+      </w:r>
+      <w:r>
+        <w:t xml:space="preserve"> </w:t>
+      </w:r>
+      <w:r>
+        <w:t xml:space="preserve">the rest of the document relies on,</w:t>
+      </w:r>
+      <w:r>
+        <w:t xml:space="preserve"> </w:t>
+      </w:r>
+      <w:r>
+        <w:t xml:space="preserve">not just for the first case the reader meets.</w:t>
+      </w:r>
+      <w:r>
+        <w:t xml:space="preserve"> </w:t>
+      </w:r>
+      <w:r>
+        <w:t xml:space="preserve">For example, define the residual sum of squares</w:t>
+      </w:r>
+      <w:r>
+        <w:t xml:space="preserve"> </w:t>
+      </w:r>
+      <w:r>
+        <w:t xml:space="preserve">as the sum of squared residuals of any fitted model,</w:t>
+      </w:r>
+      <w:r>
+        <w:t xml:space="preserve"> </w:t>
+      </w:r>
+      <w:r>
+        <w:t xml:space="preserve">not as a formula for a straight line.</w:t>
+      </w:r>
+      <w:r>
+        <w:t xml:space="preserve"> </w:t>
+      </w:r>
+      <w:r>
+        <w:t xml:space="preserve">A definition tied to one special case</w:t>
+      </w:r>
+      <w:r>
+        <w:t xml:space="preserve"> </w:t>
+      </w:r>
+      <w:r>
+        <w:t xml:space="preserve">has to be restated, or silently stretched,</w:t>
+      </w:r>
+      <w:r>
+        <w:t xml:space="preserve"> </w:t>
+      </w:r>
+      <w:r>
+        <w:t xml:space="preserve">the first time the document needs the general case.</w:t>
+      </w:r>
+    </w:p>
+    <w:p>
+      <w:pPr>
+        <w:numPr>
+          <w:ilvl w:val="0"/>
+          <w:numId w:val="1001"/>
+        </w:numPr>
+      </w:pPr>
+      <w:r>
+        <w:rPr>
+          <w:b/>
+          <w:bCs/>
+        </w:rPr>
+        <w:t xml:space="preserve">Follow the definition with examples, from general to specific:</w:t>
+      </w:r>
+      <w:r>
+        <w:t xml:space="preserve"> </w:t>
+      </w:r>
+      <w:r>
+        <w:t xml:space="preserve">Put each special case in its own example block right after the definition,</w:t>
+      </w:r>
+      <w:r>
+        <w:t xml:space="preserve"> </w:t>
+      </w:r>
+      <w:r>
+        <w:t xml:space="preserve">ordered from the most general to the most specific,</w:t>
+      </w:r>
+      <w:r>
+        <w:t xml:space="preserve"> </w:t>
+      </w:r>
+      <w:r>
+        <w:t xml:space="preserve">each linking back to the definition</w:t>
+      </w:r>
+      <w:r>
+        <w:t xml:space="preserve"> </w:t>
+      </w:r>
+      <w:r>
+        <w:t xml:space="preserve">or to the example it specializes</w:t>
+      </w:r>
+      <w:r>
+        <w:t xml:space="preserve"> </w:t>
+      </w:r>
+      <w:r>
+        <w:t xml:space="preserve">(see</w:t>
+      </w:r>
+      <w:r>
+        <w:t xml:space="preserve"> </w:t>
+      </w:r>
+      <w:hyperlink w:anchor="order-general-definition-then-examples">
+        <w:r>
+          <w:rPr>
+            <w:rStyle w:val="Hyperlink"/>
+          </w:rPr>
+          <w:t xml:space="preserve">Order: general definition, then examples</w:t>
+        </w:r>
+      </w:hyperlink>
+      <w:r>
+        <w:t xml:space="preserve">).</w:t>
       </w:r>
     </w:p>
     <w:p>
@@ -340,7 +1526,129 @@
         <w:t xml:space="preserve"> </w:t>
       </w:r>
       <w:r>
-        <w:t xml:space="preserve">with commentary after the div rather than inside it.</w:t>
+        <w:t xml:space="preserve">with commentary after the div rather than inside it,</w:t>
+      </w:r>
+      <w:r>
+        <w:t xml:space="preserve"> </w:t>
+      </w:r>
+      <w:r>
+        <w:t xml:space="preserve">in a remark block (</w:t>
+      </w:r>
+      <w:r>
+        <w:rPr>
+          <w:rStyle w:val="VerbatimChar"/>
+        </w:rPr>
+        <w:t xml:space="preserve">#rem-</w:t>
+      </w:r>
+      <w:r>
+        <w:t xml:space="preserve">) when it is about the concept.</w:t>
+      </w:r>
+      <w:r>
+        <w:t xml:space="preserve"> </w:t>
+      </w:r>
+      <w:r>
+        <w:t xml:space="preserve">Never nest one theorem-type block</w:t>
+      </w:r>
+      <w:r>
+        <w:t xml:space="preserve"> </w:t>
+      </w:r>
+      <w:r>
+        <w:t xml:space="preserve">(any of the prefixes listed in</w:t>
+      </w:r>
+      <w:r>
+        <w:t xml:space="preserve"> </w:t>
+      </w:r>
+      <w:hyperlink w:anchor="using-theorem-environments-in-quarto">
+        <w:r>
+          <w:rPr>
+            <w:rStyle w:val="Hyperlink"/>
+          </w:rPr>
+          <w:t xml:space="preserve">Using theorem environments in Quarto</w:t>
+        </w:r>
+      </w:hyperlink>
+      <w:r>
+        <w:t xml:space="preserve">,</w:t>
+      </w:r>
+      <w:r>
+        <w:t xml:space="preserve"> </w:t>
+      </w:r>
+      <w:r>
+        <w:t xml:space="preserve">such as</w:t>
+      </w:r>
+      <w:r>
+        <w:t xml:space="preserve"> </w:t>
+      </w:r>
+      <w:r>
+        <w:rPr>
+          <w:rStyle w:val="VerbatimChar"/>
+        </w:rPr>
+        <w:t xml:space="preserve">#def-</w:t>
+      </w:r>
+      <w:r>
+        <w:t xml:space="preserve">,</w:t>
+      </w:r>
+      <w:r>
+        <w:t xml:space="preserve"> </w:t>
+      </w:r>
+      <w:r>
+        <w:rPr>
+          <w:rStyle w:val="VerbatimChar"/>
+        </w:rPr>
+        <w:t xml:space="preserve">#exm-</w:t>
+      </w:r>
+      <w:r>
+        <w:t xml:space="preserve">,</w:t>
+      </w:r>
+      <w:r>
+        <w:t xml:space="preserve"> </w:t>
+      </w:r>
+      <w:r>
+        <w:rPr>
+          <w:rStyle w:val="VerbatimChar"/>
+        </w:rPr>
+        <w:t xml:space="preserve">#exr-</w:t>
+      </w:r>
+      <w:r>
+        <w:t xml:space="preserve">,</w:t>
+      </w:r>
+      <w:r>
+        <w:t xml:space="preserve"> </w:t>
+      </w:r>
+      <w:r>
+        <w:rPr>
+          <w:rStyle w:val="VerbatimChar"/>
+        </w:rPr>
+        <w:t xml:space="preserve">#sol-</w:t>
+      </w:r>
+      <w:r>
+        <w:t xml:space="preserve"> </w:t>
+      </w:r>
+      <w:r>
+        <w:t xml:space="preserve">or</w:t>
+      </w:r>
+      <w:r>
+        <w:t xml:space="preserve"> </w:t>
+      </w:r>
+      <w:r>
+        <w:rPr>
+          <w:rStyle w:val="VerbatimChar"/>
+        </w:rPr>
+        <w:t xml:space="preserve">#rem-</w:t>
+      </w:r>
+      <w:r>
+        <w:t xml:space="preserve">)</w:t>
+      </w:r>
+      <w:r>
+        <w:t xml:space="preserve"> </w:t>
+      </w:r>
+      <w:r>
+        <w:t xml:space="preserve">inside another;</w:t>
+      </w:r>
+      <w:r>
+        <w:t xml:space="preserve"> </w:t>
+      </w:r>
+      <w:r>
+        <w:t xml:space="preserve">give each its own div, in order.</w:t>
       </w:r>
       <w:r>
         <w:t xml:space="preserve"> </w:t>
@@ -513,7 +1821,7 @@
         <w:t xml:space="preserve">Here are examples of well-defined terms:</w:t>
       </w:r>
     </w:p>
-    <w:bookmarkStart w:id="15" w:name="exm-confidence-interval"/>
+    <w:bookmarkStart w:id="14" w:name="def-confidence-interval"/>
     <w:p>
       <w:pPr>
         <w:pStyle w:val="BodyText"/>
@@ -523,16 +1831,45 @@
           <w:b/>
           <w:bCs/>
         </w:rPr>
-        <w:t xml:space="preserve">Example 2 (Statistical term: Confidence interval)</w:t>
-      </w:r>
-      <w:r>
-        <w:t xml:space="preserve"> </w:t>
-      </w:r>
-      <w:r>
-        <w:t xml:space="preserve"> </w:t>
-      </w:r>
-    </w:p>
-    <w:bookmarkStart w:id="14" w:name="def-confidence-interval"/>
+        <w:t xml:space="preserve">Definition 3 (Confidence interval)</w:t>
+      </w:r>
+      <w:r>
+        <w:t xml:space="preserve"> </w:t>
+      </w:r>
+      <w:r>
+        <w:t xml:space="preserve">A</w:t>
+      </w:r>
+      <w:r>
+        <w:t xml:space="preserve"> </w:t>
+      </w:r>
+      <w:r>
+        <w:rPr>
+          <w:i/>
+          <w:iCs/>
+        </w:rPr>
+        <w:t xml:space="preserve">confidence interval</w:t>
+      </w:r>
+      <w:r>
+        <w:t xml:space="preserve"> </w:t>
+      </w:r>
+      <w:r>
+        <w:t xml:space="preserve">is a range of values,</w:t>
+      </w:r>
+      <w:r>
+        <w:t xml:space="preserve"> </w:t>
+      </w:r>
+      <w:r>
+        <w:t xml:space="preserve">derived from sample statistics,</w:t>
+      </w:r>
+      <w:r>
+        <w:t xml:space="preserve"> </w:t>
+      </w:r>
+      <w:r>
+        <w:t xml:space="preserve">that is likely to contain the true population parameter.</w:t>
+      </w:r>
+    </w:p>
+    <w:bookmarkEnd w:id="14"/>
+    <w:bookmarkStart w:id="15" w:name="exm-confidence-interval"/>
     <w:p>
       <w:pPr>
         <w:pStyle w:val="BodyText"/>
@@ -542,13 +1879,50 @@
           <w:b/>
           <w:bCs/>
         </w:rPr>
-        <w:t xml:space="preserve">Definition 3 (Confidence interval)</w:t>
-      </w:r>
-      <w:r>
-        <w:t xml:space="preserve"> </w:t>
-      </w:r>
-      <w:r>
-        <w:t xml:space="preserve">A</w:t>
+        <w:t xml:space="preserve">Example 1 (A confidence interval for mean height)</w:t>
+      </w:r>
+      <w:r>
+        <w:t xml:space="preserve"> </w:t>
+      </w:r>
+      <w:r>
+        <w:t xml:space="preserve">If we calculate a 95% confidence interval (</w:t>
+      </w:r>
+      <w:hyperlink w:anchor="def-confidence-interval">
+        <w:r>
+          <w:rPr>
+            <w:rStyle w:val="Hyperlink"/>
+          </w:rPr>
+          <w:t xml:space="preserve">Definition 3</w:t>
+        </w:r>
+      </w:hyperlink>
+      <w:r>
+        <w:t xml:space="preserve">)</w:t>
+      </w:r>
+      <w:r>
+        <w:t xml:space="preserve"> </w:t>
+      </w:r>
+      <w:r>
+        <w:t xml:space="preserve">for mean height as [165 cm, 175 cm],</w:t>
+      </w:r>
+      <w:r>
+        <w:t xml:space="preserve"> </w:t>
+      </w:r>
+      <w:r>
+        <w:t xml:space="preserve">we are 95% confident that the true population mean height falls within this range.</w:t>
+      </w:r>
+    </w:p>
+    <w:bookmarkEnd w:id="15"/>
+    <w:bookmarkStart w:id="16" w:name="def-active-voice"/>
+    <w:p>
+      <w:pPr>
+        <w:pStyle w:val="BodyText"/>
+      </w:pPr>
+      <w:r>
+        <w:rPr>
+          <w:b/>
+          <w:bCs/>
+        </w:rPr>
+        <w:t xml:space="preserve">Definition 4 (Active voice)</w:t>
       </w:r>
       <w:r>
         <w:t xml:space="preserve"> </w:t>
@@ -558,43 +1932,16 @@
           <w:i/>
           <w:iCs/>
         </w:rPr>
-        <w:t xml:space="preserve">confidence interval</w:t>
-      </w:r>
-      <w:r>
-        <w:t xml:space="preserve"> </w:t>
-      </w:r>
-      <w:r>
-        <w:t xml:space="preserve">is a range of values,</w:t>
-      </w:r>
-      <w:r>
-        <w:t xml:space="preserve"> </w:t>
-      </w:r>
-      <w:r>
-        <w:t xml:space="preserve">derived from sample statistics,</w:t>
-      </w:r>
-      <w:r>
-        <w:t xml:space="preserve"> </w:t>
-      </w:r>
-      <w:r>
-        <w:t xml:space="preserve">that is likely to contain the true population parameter.</w:t>
-      </w:r>
-    </w:p>
-    <w:bookmarkEnd w:id="14"/>
-    <w:p>
-      <w:pPr>
-        <w:pStyle w:val="BodyText"/>
-      </w:pPr>
-      <w:r>
-        <w:t xml:space="preserve">If we calculate a 95% confidence interval for mean height as [165 cm, 175 cm],</w:t>
-      </w:r>
-      <w:r>
-        <w:t xml:space="preserve"> </w:t>
-      </w:r>
-      <w:r>
-        <w:t xml:space="preserve">we are 95% confident that the true population mean height falls within this range.</w:t>
-      </w:r>
-    </w:p>
-    <w:bookmarkEnd w:id="15"/>
+        <w:t xml:space="preserve">Active voice</w:t>
+      </w:r>
+      <w:r>
+        <w:t xml:space="preserve"> </w:t>
+      </w:r>
+      <w:r>
+        <w:t xml:space="preserve">is a sentence structure where the subject performs the action expressed by the verb.</w:t>
+      </w:r>
+    </w:p>
+    <w:bookmarkEnd w:id="16"/>
     <w:bookmarkStart w:id="17" w:name="exm-active-voice"/>
     <w:p>
       <w:pPr>
@@ -605,16 +1952,106 @@
           <w:b/>
           <w:bCs/>
         </w:rPr>
-        <w:t xml:space="preserve">Example 3 (Writing term: Active voice)</w:t>
-      </w:r>
-      <w:r>
-        <w:t xml:space="preserve"> </w:t>
-      </w:r>
-      <w:r>
-        <w:t xml:space="preserve"> </w:t>
-      </w:r>
-    </w:p>
-    <w:bookmarkStart w:id="16" w:name="def-active-voice"/>
+        <w:t xml:space="preserve">Example 2 (Active and passive voice)</w:t>
+      </w:r>
+      <w:r>
+        <w:t xml:space="preserve"> </w:t>
+      </w:r>
+      <w:r>
+        <w:t xml:space="preserve">“The researcher conducted the experiment”</w:t>
+      </w:r>
+      <w:r>
+        <w:t xml:space="preserve"> </w:t>
+      </w:r>
+      <w:r>
+        <w:t xml:space="preserve">is in active voice (</w:t>
+      </w:r>
+      <w:hyperlink w:anchor="def-active-voice">
+        <w:r>
+          <w:rPr>
+            <w:rStyle w:val="Hyperlink"/>
+          </w:rPr>
+          <w:t xml:space="preserve">Definition 4</w:t>
+        </w:r>
+      </w:hyperlink>
+      <w:r>
+        <w:t xml:space="preserve">),</w:t>
+      </w:r>
+      <w:r>
+        <w:t xml:space="preserve"> </w:t>
+      </w:r>
+      <w:r>
+        <w:t xml:space="preserve">while</w:t>
+      </w:r>
+      <w:r>
+        <w:t xml:space="preserve"> </w:t>
+      </w:r>
+      <w:r>
+        <w:t xml:space="preserve">“The experiment was conducted by the researcher”</w:t>
+      </w:r>
+      <w:r>
+        <w:t xml:space="preserve"> </w:t>
+      </w:r>
+      <w:r>
+        <w:t xml:space="preserve">is in passive voice.</w:t>
+      </w:r>
+    </w:p>
+    <w:bookmarkEnd w:id="17"/>
+    <w:bookmarkEnd w:id="18"/>
+    <w:bookmarkStart w:id="22" w:name="order-general-definition-then-examples"/>
+    <w:p>
+      <w:pPr>
+        <w:pStyle w:val="Heading2"/>
+      </w:pPr>
+      <w:r>
+        <w:t xml:space="preserve">3 Order: general definition, then examples</w:t>
+      </w:r>
+    </w:p>
+    <w:p>
+      <w:pPr>
+        <w:pStyle w:val="FirstParagraph"/>
+      </w:pPr>
+      <w:r>
+        <w:t xml:space="preserve">When a concept has special cases,</w:t>
+      </w:r>
+      <w:r>
+        <w:t xml:space="preserve"> </w:t>
+      </w:r>
+      <w:r>
+        <w:t xml:space="preserve">write the general definition first and compactly,</w:t>
+      </w:r>
+      <w:r>
+        <w:t xml:space="preserve"> </w:t>
+      </w:r>
+      <w:r>
+        <w:t xml:space="preserve">then one example block per special case,</w:t>
+      </w:r>
+      <w:r>
+        <w:t xml:space="preserve"> </w:t>
+      </w:r>
+      <w:r>
+        <w:t xml:space="preserve">ordered from the most general to the most specific.</w:t>
+      </w:r>
+      <w:r>
+        <w:t xml:space="preserve"> </w:t>
+      </w:r>
+      <w:r>
+        <w:t xml:space="preserve">Put any commentary in a remark block after them.</w:t>
+      </w:r>
+      <w:r>
+        <w:t xml:space="preserve"> </w:t>
+      </w:r>
+      <w:r>
+        <w:t xml:space="preserve">For example, a statistics text that defines the residual sum of squares</w:t>
+      </w:r>
+      <w:r>
+        <w:t xml:space="preserve"> </w:t>
+      </w:r>
+      <w:r>
+        <w:t xml:space="preserve">would give these blocks, in this order:</w:t>
+      </w:r>
+    </w:p>
+    <w:bookmarkStart w:id="19" w:name="def-rss"/>
     <w:p>
       <w:pPr>
         <w:pStyle w:val="BodyText"/>
@@ -624,7 +2061,13 @@
           <w:b/>
           <w:bCs/>
         </w:rPr>
-        <w:t xml:space="preserve">Definition 4 (Active voice)</w:t>
+        <w:t xml:space="preserve">Definition 5 (Residual sum of squares)</w:t>
+      </w:r>
+      <w:r>
+        <w:t xml:space="preserve"> </w:t>
+      </w:r>
+      <w:r>
+        <w:t xml:space="preserve">The</w:t>
       </w:r>
       <w:r>
         <w:t xml:space="preserve"> </w:t>
@@ -634,57 +2077,736 @@
           <w:i/>
           <w:iCs/>
         </w:rPr>
-        <w:t xml:space="preserve">Active voice</w:t>
-      </w:r>
-      <w:r>
-        <w:t xml:space="preserve"> </w:t>
-      </w:r>
-      <w:r>
-        <w:t xml:space="preserve">is a sentence structure where the subject performs the action expressed by the verb.</w:t>
-      </w:r>
-    </w:p>
-    <w:bookmarkEnd w:id="16"/>
+        <w:t xml:space="preserve">residual sum of squares</w:t>
+      </w:r>
+      <w:r>
+        <w:t xml:space="preserve"> </w:t>
+      </w:r>
+      <w:r>
+        <w:t xml:space="preserve">of a model fitted to data</w:t>
+      </w:r>
+      <w:r>
+        <w:t xml:space="preserve"> </w:t>
+      </w:r>
+      <w:r>
+        <w:t xml:space="preserve">is the sum of its squared residuals:</w:t>
+      </w:r>
+      <w:r>
+        <w:t xml:space="preserve"> </w:t>
+      </w:r>
+      <m:oMath>
+        <m:r>
+          <m:rPr>
+            <m:nor/>
+            <m:sty m:val="p"/>
+          </m:rPr>
+          <m:t>RSS</m:t>
+        </m:r>
+        <m:r>
+          <m:rPr>
+            <m:sty m:val="p"/>
+          </m:rPr>
+          <m:t>=</m:t>
+        </m:r>
+        <m:nary>
+          <m:naryPr>
+            <m:chr m:val="∑"/>
+            <m:limLoc m:val="undOvr"/>
+            <m:subHide m:val="off"/>
+            <m:supHide m:val="off"/>
+          </m:naryPr>
+          <m:sub>
+            <m:r>
+              <m:t>i</m:t>
+            </m:r>
+            <m:r>
+              <m:rPr>
+                <m:sty m:val="p"/>
+              </m:rPr>
+              <m:t>=</m:t>
+            </m:r>
+            <m:r>
+              <m:t>1</m:t>
+            </m:r>
+          </m:sub>
+          <m:sup>
+            <m:r>
+              <m:t>n</m:t>
+            </m:r>
+          </m:sup>
+          <m:e>
+            <m:sSubSup>
+              <m:e>
+                <m:r>
+                  <m:t>r</m:t>
+                </m:r>
+              </m:e>
+              <m:sub>
+                <m:r>
+                  <m:t>i</m:t>
+                </m:r>
+              </m:sub>
+              <m:sup>
+                <m:r>
+                  <m:t>2</m:t>
+                </m:r>
+              </m:sup>
+            </m:sSubSup>
+          </m:e>
+        </m:nary>
+      </m:oMath>
+      <w:r>
+        <w:t xml:space="preserve">.</w:t>
+      </w:r>
+    </w:p>
+    <w:bookmarkEnd w:id="19"/>
+    <w:bookmarkStart w:id="20" w:name="exm-rss-line"/>
     <w:p>
       <w:pPr>
         <w:pStyle w:val="BodyText"/>
       </w:pPr>
       <w:r>
-        <w:t xml:space="preserve">“The researcher conducted the experiment”</w:t>
-      </w:r>
-      <w:r>
-        <w:t xml:space="preserve"> </w:t>
-      </w:r>
-      <w:r>
-        <w:t xml:space="preserve">is in active voice,</w:t>
-      </w:r>
-      <w:r>
-        <w:t xml:space="preserve"> </w:t>
-      </w:r>
-      <w:r>
-        <w:t xml:space="preserve">while</w:t>
-      </w:r>
-      <w:r>
-        <w:t xml:space="preserve"> </w:t>
-      </w:r>
-      <w:r>
-        <w:t xml:space="preserve">“The experiment was conducted by the researcher”</w:t>
-      </w:r>
-      <w:r>
-        <w:t xml:space="preserve"> </w:t>
-      </w:r>
-      <w:r>
-        <w:t xml:space="preserve">is in passive voice.</w:t>
-      </w:r>
-    </w:p>
-    <w:bookmarkEnd w:id="17"/>
-    <w:bookmarkEnd w:id="18"/>
-    <w:bookmarkStart w:id="19" w:name="why-examples-matter"/>
+        <w:rPr>
+          <w:b/>
+          <w:bCs/>
+        </w:rPr>
+        <w:t xml:space="preserve">Example 3 (Residual sum of squares of a straight line)</w:t>
+      </w:r>
+      <w:r>
+        <w:t xml:space="preserve"> </w:t>
+      </w:r>
+      <w:r>
+        <w:t xml:space="preserve">For a straight line with intercept</w:t>
+      </w:r>
+      <w:r>
+        <w:t xml:space="preserve"> </w:t>
+      </w:r>
+      <m:oMath>
+        <m:sSub>
+          <m:e>
+            <m:r>
+              <m:t>β</m:t>
+            </m:r>
+          </m:e>
+          <m:sub>
+            <m:r>
+              <m:t>0</m:t>
+            </m:r>
+          </m:sub>
+        </m:sSub>
+      </m:oMath>
+      <w:r>
+        <w:t xml:space="preserve"> </w:t>
+      </w:r>
+      <w:r>
+        <w:t xml:space="preserve">and slope</w:t>
+      </w:r>
+      <w:r>
+        <w:t xml:space="preserve"> </w:t>
+      </w:r>
+      <m:oMath>
+        <m:sSub>
+          <m:e>
+            <m:r>
+              <m:t>β</m:t>
+            </m:r>
+          </m:e>
+          <m:sub>
+            <m:r>
+              <m:t>x</m:t>
+            </m:r>
+          </m:sub>
+        </m:sSub>
+      </m:oMath>
+      <w:r>
+        <w:t xml:space="preserve">,</w:t>
+      </w:r>
+      <w:r>
+        <w:t xml:space="preserve"> </w:t>
+      </w:r>
+      <w:r>
+        <w:t xml:space="preserve">the fitted value of observation</w:t>
+      </w:r>
+      <w:r>
+        <w:t xml:space="preserve"> </w:t>
+      </w:r>
+      <m:oMath>
+        <m:r>
+          <m:t>i</m:t>
+        </m:r>
+      </m:oMath>
+      <w:r>
+        <w:t xml:space="preserve"> </w:t>
+      </w:r>
+      <w:r>
+        <w:t xml:space="preserve">is</w:t>
+      </w:r>
+      <w:r>
+        <w:t xml:space="preserve"> </w:t>
+      </w:r>
+      <m:oMath>
+        <m:sSub>
+          <m:e>
+            <m:r>
+              <m:t>β</m:t>
+            </m:r>
+          </m:e>
+          <m:sub>
+            <m:r>
+              <m:t>0</m:t>
+            </m:r>
+          </m:sub>
+        </m:sSub>
+        <m:r>
+          <m:rPr>
+            <m:sty m:val="p"/>
+          </m:rPr>
+          <m:t>+</m:t>
+        </m:r>
+        <m:sSub>
+          <m:e>
+            <m:r>
+              <m:t>β</m:t>
+            </m:r>
+          </m:e>
+          <m:sub>
+            <m:r>
+              <m:t>x</m:t>
+            </m:r>
+          </m:sub>
+        </m:sSub>
+        <m:sSub>
+          <m:e>
+            <m:r>
+              <m:t>x</m:t>
+            </m:r>
+          </m:e>
+          <m:sub>
+            <m:r>
+              <m:t>i</m:t>
+            </m:r>
+          </m:sub>
+        </m:sSub>
+      </m:oMath>
+      <w:r>
+        <w:t xml:space="preserve">,</w:t>
+      </w:r>
+      <w:r>
+        <w:t xml:space="preserve"> </w:t>
+      </w:r>
+      <w:r>
+        <w:t xml:space="preserve">so the residual sum of squares (</w:t>
+      </w:r>
+      <w:hyperlink w:anchor="def-rss">
+        <w:r>
+          <w:rPr>
+            <w:rStyle w:val="Hyperlink"/>
+          </w:rPr>
+          <w:t xml:space="preserve">Definition 5</w:t>
+        </w:r>
+      </w:hyperlink>
+      <w:r>
+        <w:t xml:space="preserve">) is a function of the two coefficients:</w:t>
+      </w:r>
+      <w:r>
+        <w:t xml:space="preserve"> </w:t>
+      </w:r>
+      <m:oMath>
+        <m:r>
+          <m:rPr>
+            <m:nor/>
+            <m:sty m:val="p"/>
+          </m:rPr>
+          <m:t>RSS</m:t>
+        </m:r>
+        <m:r>
+          <m:rPr>
+            <m:sty m:val="p"/>
+          </m:rPr>
+          <m:t>(</m:t>
+        </m:r>
+        <m:sSub>
+          <m:e>
+            <m:r>
+              <m:t>β</m:t>
+            </m:r>
+          </m:e>
+          <m:sub>
+            <m:r>
+              <m:t>0</m:t>
+            </m:r>
+          </m:sub>
+        </m:sSub>
+        <m:r>
+          <m:rPr>
+            <m:sty m:val="p"/>
+          </m:rPr>
+          <m:t>,</m:t>
+        </m:r>
+        <m:sSub>
+          <m:e>
+            <m:r>
+              <m:t>β</m:t>
+            </m:r>
+          </m:e>
+          <m:sub>
+            <m:r>
+              <m:t>x</m:t>
+            </m:r>
+          </m:sub>
+        </m:sSub>
+        <m:r>
+          <m:rPr>
+            <m:sty m:val="p"/>
+          </m:rPr>
+          <m:t>)</m:t>
+        </m:r>
+        <m:r>
+          <m:rPr>
+            <m:sty m:val="p"/>
+          </m:rPr>
+          <m:t>=</m:t>
+        </m:r>
+        <m:nary>
+          <m:naryPr>
+            <m:chr m:val="∑"/>
+            <m:limLoc m:val="undOvr"/>
+            <m:subHide m:val="off"/>
+            <m:supHide m:val="off"/>
+          </m:naryPr>
+          <m:sub>
+            <m:r>
+              <m:t>i</m:t>
+            </m:r>
+            <m:r>
+              <m:rPr>
+                <m:sty m:val="p"/>
+              </m:rPr>
+              <m:t>=</m:t>
+            </m:r>
+            <m:r>
+              <m:t>1</m:t>
+            </m:r>
+          </m:sub>
+          <m:sup>
+            <m:r>
+              <m:t>n</m:t>
+            </m:r>
+          </m:sup>
+          <m:e>
+            <m:r>
+              <m:rPr>
+                <m:sty m:val="p"/>
+              </m:rPr>
+              <m:t>(</m:t>
+            </m:r>
+          </m:e>
+        </m:nary>
+        <m:sSub>
+          <m:e>
+            <m:r>
+              <m:t>y</m:t>
+            </m:r>
+          </m:e>
+          <m:sub>
+            <m:r>
+              <m:t>i</m:t>
+            </m:r>
+          </m:sub>
+        </m:sSub>
+        <m:r>
+          <m:rPr>
+            <m:sty m:val="p"/>
+          </m:rPr>
+          <m:t>−</m:t>
+        </m:r>
+        <m:sSub>
+          <m:e>
+            <m:r>
+              <m:t>β</m:t>
+            </m:r>
+          </m:e>
+          <m:sub>
+            <m:r>
+              <m:t>0</m:t>
+            </m:r>
+          </m:sub>
+        </m:sSub>
+        <m:r>
+          <m:rPr>
+            <m:sty m:val="p"/>
+          </m:rPr>
+          <m:t>−</m:t>
+        </m:r>
+        <m:sSub>
+          <m:e>
+            <m:r>
+              <m:t>β</m:t>
+            </m:r>
+          </m:e>
+          <m:sub>
+            <m:r>
+              <m:t>x</m:t>
+            </m:r>
+          </m:sub>
+        </m:sSub>
+        <m:sSub>
+          <m:e>
+            <m:r>
+              <m:t>x</m:t>
+            </m:r>
+          </m:e>
+          <m:sub>
+            <m:r>
+              <m:t>i</m:t>
+            </m:r>
+          </m:sub>
+        </m:sSub>
+        <m:sSup>
+          <m:e>
+            <m:r>
+              <m:rPr>
+                <m:sty m:val="p"/>
+              </m:rPr>
+              <m:t>)</m:t>
+            </m:r>
+          </m:e>
+          <m:sup>
+            <m:r>
+              <m:t>2</m:t>
+            </m:r>
+          </m:sup>
+        </m:sSup>
+      </m:oMath>
+      <w:r>
+        <w:t xml:space="preserve">.</w:t>
+      </w:r>
+    </w:p>
+    <w:bookmarkEnd w:id="20"/>
+    <w:bookmarkStart w:id="21" w:name="exm-rss-three-points"/>
+    <w:p>
+      <w:pPr>
+        <w:pStyle w:val="BodyText"/>
+      </w:pPr>
+      <w:r>
+        <w:rPr>
+          <w:b/>
+          <w:bCs/>
+        </w:rPr>
+        <w:t xml:space="preserve">Example 4 (Residual sum of squares of a line through three points)</w:t>
+      </w:r>
+      <w:r>
+        <w:t xml:space="preserve"> </w:t>
+      </w:r>
+      <w:r>
+        <w:t xml:space="preserve">For the points</w:t>
+      </w:r>
+      <w:r>
+        <w:t xml:space="preserve"> </w:t>
+      </w:r>
+      <m:oMath>
+        <m:r>
+          <m:rPr>
+            <m:sty m:val="p"/>
+          </m:rPr>
+          <m:t>(</m:t>
+        </m:r>
+        <m:r>
+          <m:t>0</m:t>
+        </m:r>
+        <m:r>
+          <m:rPr>
+            <m:sty m:val="p"/>
+          </m:rPr>
+          <m:t>,</m:t>
+        </m:r>
+        <m:r>
+          <m:t>1</m:t>
+        </m:r>
+        <m:r>
+          <m:rPr>
+            <m:sty m:val="p"/>
+          </m:rPr>
+          <m:t>)</m:t>
+        </m:r>
+      </m:oMath>
+      <w:r>
+        <w:t xml:space="preserve">,</w:t>
+      </w:r>
+      <w:r>
+        <w:t xml:space="preserve"> </w:t>
+      </w:r>
+      <m:oMath>
+        <m:r>
+          <m:rPr>
+            <m:sty m:val="p"/>
+          </m:rPr>
+          <m:t>(</m:t>
+        </m:r>
+        <m:r>
+          <m:t>1</m:t>
+        </m:r>
+        <m:r>
+          <m:rPr>
+            <m:sty m:val="p"/>
+          </m:rPr>
+          <m:t>,</m:t>
+        </m:r>
+        <m:r>
+          <m:t>2</m:t>
+        </m:r>
+        <m:r>
+          <m:rPr>
+            <m:sty m:val="p"/>
+          </m:rPr>
+          <m:t>)</m:t>
+        </m:r>
+      </m:oMath>
+      <w:r>
+        <w:t xml:space="preserve">,</w:t>
+      </w:r>
+      <w:r>
+        <w:t xml:space="preserve"> </w:t>
+      </w:r>
+      <m:oMath>
+        <m:r>
+          <m:rPr>
+            <m:sty m:val="p"/>
+          </m:rPr>
+          <m:t>(</m:t>
+        </m:r>
+        <m:r>
+          <m:t>2</m:t>
+        </m:r>
+        <m:r>
+          <m:rPr>
+            <m:sty m:val="p"/>
+          </m:rPr>
+          <m:t>,</m:t>
+        </m:r>
+        <m:r>
+          <m:t>2</m:t>
+        </m:r>
+        <m:r>
+          <m:rPr>
+            <m:sty m:val="p"/>
+          </m:rPr>
+          <m:t>)</m:t>
+        </m:r>
+      </m:oMath>
+      <w:r>
+        <w:t xml:space="preserve"> </w:t>
+      </w:r>
+      <w:r>
+        <w:t xml:space="preserve">and the line with</w:t>
+      </w:r>
+      <w:r>
+        <w:t xml:space="preserve"> </w:t>
+      </w:r>
+      <m:oMath>
+        <m:sSub>
+          <m:e>
+            <m:r>
+              <m:t>β</m:t>
+            </m:r>
+          </m:e>
+          <m:sub>
+            <m:r>
+              <m:t>0</m:t>
+            </m:r>
+          </m:sub>
+        </m:sSub>
+        <m:r>
+          <m:rPr>
+            <m:sty m:val="p"/>
+          </m:rPr>
+          <m:t>=</m:t>
+        </m:r>
+        <m:r>
+          <m:t>1</m:t>
+        </m:r>
+      </m:oMath>
+      <w:r>
+        <w:t xml:space="preserve"> </w:t>
+      </w:r>
+      <w:r>
+        <w:t xml:space="preserve">and</w:t>
+      </w:r>
+      <w:r>
+        <w:t xml:space="preserve"> </w:t>
+      </w:r>
+      <m:oMath>
+        <m:sSub>
+          <m:e>
+            <m:r>
+              <m:t>β</m:t>
+            </m:r>
+          </m:e>
+          <m:sub>
+            <m:r>
+              <m:t>x</m:t>
+            </m:r>
+          </m:sub>
+        </m:sSub>
+        <m:r>
+          <m:rPr>
+            <m:sty m:val="p"/>
+          </m:rPr>
+          <m:t>=</m:t>
+        </m:r>
+        <m:r>
+          <m:t>0.5</m:t>
+        </m:r>
+      </m:oMath>
+      <w:r>
+        <w:t xml:space="preserve"> </w:t>
+      </w:r>
+      <w:r>
+        <w:t xml:space="preserve">(</w:t>
+      </w:r>
+      <w:hyperlink w:anchor="exm-rss-line">
+        <w:r>
+          <w:rPr>
+            <w:rStyle w:val="Hyperlink"/>
+          </w:rPr>
+          <w:t xml:space="preserve">Example 3</w:t>
+        </w:r>
+      </w:hyperlink>
+      <w:r>
+        <w:t xml:space="preserve">),</w:t>
+      </w:r>
+      <w:r>
+        <w:t xml:space="preserve"> </w:t>
+      </w:r>
+      <w:r>
+        <w:t xml:space="preserve">the residuals are</w:t>
+      </w:r>
+      <w:r>
+        <w:t xml:space="preserve"> </w:t>
+      </w:r>
+      <m:oMath>
+        <m:r>
+          <m:t>0</m:t>
+        </m:r>
+      </m:oMath>
+      <w:r>
+        <w:t xml:space="preserve">,</w:t>
+      </w:r>
+      <w:r>
+        <w:t xml:space="preserve"> </w:t>
+      </w:r>
+      <m:oMath>
+        <m:r>
+          <m:t>0.5</m:t>
+        </m:r>
+      </m:oMath>
+      <w:r>
+        <w:t xml:space="preserve"> </w:t>
+      </w:r>
+      <w:r>
+        <w:t xml:space="preserve">and</w:t>
+      </w:r>
+      <w:r>
+        <w:t xml:space="preserve"> </w:t>
+      </w:r>
+      <m:oMath>
+        <m:r>
+          <m:t>0</m:t>
+        </m:r>
+      </m:oMath>
+      <w:r>
+        <w:t xml:space="preserve">,</w:t>
+      </w:r>
+      <w:r>
+        <w:t xml:space="preserve"> </w:t>
+      </w:r>
+      <w:r>
+        <w:t xml:space="preserve">so</w:t>
+      </w:r>
+      <w:r>
+        <w:t xml:space="preserve"> </w:t>
+      </w:r>
+      <m:oMath>
+        <m:r>
+          <m:rPr>
+            <m:nor/>
+            <m:sty m:val="p"/>
+          </m:rPr>
+          <m:t>RSS</m:t>
+        </m:r>
+        <m:r>
+          <m:rPr>
+            <m:sty m:val="p"/>
+          </m:rPr>
+          <m:t>(</m:t>
+        </m:r>
+        <m:r>
+          <m:t>1</m:t>
+        </m:r>
+        <m:r>
+          <m:rPr>
+            <m:sty m:val="p"/>
+          </m:rPr>
+          <m:t>,</m:t>
+        </m:r>
+        <m:r>
+          <m:t>0.5</m:t>
+        </m:r>
+        <m:r>
+          <m:rPr>
+            <m:sty m:val="p"/>
+          </m:rPr>
+          <m:t>)</m:t>
+        </m:r>
+        <m:r>
+          <m:rPr>
+            <m:sty m:val="p"/>
+          </m:rPr>
+          <m:t>=</m:t>
+        </m:r>
+        <m:r>
+          <m:t>0.25</m:t>
+        </m:r>
+      </m:oMath>
+      <w:r>
+        <w:t xml:space="preserve">.</w:t>
+      </w:r>
+    </w:p>
+    <w:bookmarkEnd w:id="21"/>
+    <w:p>
+      <w:pPr>
+        <w:pStyle w:val="BodyText"/>
+      </w:pPr>
+      <w:r>
+        <w:t xml:space="preserve">The definition stays one sentence and one equation,</w:t>
+      </w:r>
+      <w:r>
+        <w:t xml:space="preserve"> </w:t>
+      </w:r>
+      <w:r>
+        <w:t xml:space="preserve">so it still applies when the document later fits a model that is not a line.</w:t>
+      </w:r>
+      <w:r>
+        <w:t xml:space="preserve"> </w:t>
+      </w:r>
+      <w:r>
+        <w:t xml:space="preserve">The line is a special case, so it is an example,</w:t>
+      </w:r>
+      <w:r>
+        <w:t xml:space="preserve"> </w:t>
+      </w:r>
+      <w:r>
+        <w:t xml:space="preserve">and the numerical case is a special case of the line, so it comes last.</w:t>
+      </w:r>
+    </w:p>
+    <w:bookmarkEnd w:id="22"/>
+    <w:bookmarkStart w:id="23" w:name="why-examples-matter"/>
     <w:p>
       <w:pPr>
         <w:pStyle w:val="Heading2"/>
       </w:pPr>
       <w:r>
-        <w:t xml:space="preserve">3 Why examples matter</w:t>
+        <w:t xml:space="preserve">4 Why examples matter</w:t>
       </w:r>
     </w:p>
     <w:p>
@@ -803,14 +2925,14 @@
         <w:t xml:space="preserve">than abstract definitions alone.</w:t>
       </w:r>
     </w:p>
-    <w:bookmarkEnd w:id="19"/>
-    <w:bookmarkStart w:id="20" w:name="common-pitfalls-to-avoid"/>
+    <w:bookmarkEnd w:id="23"/>
+    <w:bookmarkStart w:id="24" w:name="common-pitfalls-to-avoid"/>
     <w:p>
       <w:pPr>
         <w:pStyle w:val="Heading2"/>
       </w:pPr>
       <w:r>
-        <w:t xml:space="preserve">4 Common pitfalls to avoid</w:t>
+        <w:t xml:space="preserve">5 Common pitfalls to avoid</w:t>
       </w:r>
     </w:p>
     <w:p>
@@ -999,14 +3121,14 @@
         <w:t xml:space="preserve">of the definition they are meant to demonstrate.</w:t>
       </w:r>
     </w:p>
-    <w:bookmarkEnd w:id="20"/>
-    <w:bookmarkStart w:id="28" w:name="mathematical-statements-require-examples"/>
+    <w:bookmarkEnd w:id="24"/>
+    <w:bookmarkStart w:id="32" w:name="mathematical-statements-require-examples"/>
     <w:p>
       <w:pPr>
         <w:pStyle w:val="Heading2"/>
       </w:pPr>
       <w:r>
-        <w:t xml:space="preserve">5 Mathematical statements require examples</w:t>
+        <w:t xml:space="preserve">6 Mathematical statements require examples</w:t>
       </w:r>
     </w:p>
     <w:p>
@@ -1053,13 +3175,13 @@
         <w:t xml:space="preserve">when readers can see concrete instances.</w:t>
       </w:r>
     </w:p>
-    <w:bookmarkStart w:id="22" w:name="using-theorem-environments-in-quarto"/>
+    <w:bookmarkStart w:id="26" w:name="using-theorem-environments-in-quarto"/>
     <w:p>
       <w:pPr>
         <w:pStyle w:val="Heading3"/>
       </w:pPr>
       <w:r>
-        <w:t xml:space="preserve">5.1 Using theorem environments in Quarto</w:t>
+        <w:t xml:space="preserve">6.1 Using theorem environments in Quarto</w:t>
       </w:r>
     </w:p>
     <w:p>
@@ -1272,6 +3394,72 @@
     </w:p>
     <w:p>
       <w:pPr>
+        <w:pStyle w:val="Compact"/>
+        <w:numPr>
+          <w:ilvl w:val="0"/>
+          <w:numId w:val="1004"/>
+        </w:numPr>
+      </w:pPr>
+      <w:r>
+        <w:rPr>
+          <w:rStyle w:val="VerbatimChar"/>
+        </w:rPr>
+        <w:t xml:space="preserve">#sol-</w:t>
+      </w:r>
+      <w:r>
+        <w:t xml:space="preserve"> </w:t>
+      </w:r>
+      <w:r>
+        <w:t xml:space="preserve">for solutions, named after their exercise (</w:t>
+      </w:r>
+      <w:r>
+        <w:rPr>
+          <w:rStyle w:val="VerbatimChar"/>
+        </w:rPr>
+        <w:t xml:space="preserve">#exr-foo</w:t>
+      </w:r>
+      <w:r>
+        <w:t xml:space="preserve"> </w:t>
+      </w:r>
+      <w:r>
+        <w:t xml:space="preserve">and</w:t>
+      </w:r>
+      <w:r>
+        <w:t xml:space="preserve"> </w:t>
+      </w:r>
+      <w:r>
+        <w:rPr>
+          <w:rStyle w:val="VerbatimChar"/>
+        </w:rPr>
+        <w:t xml:space="preserve">#sol-foo</w:t>
+      </w:r>
+      <w:r>
+        <w:t xml:space="preserve">)</w:t>
+      </w:r>
+    </w:p>
+    <w:p>
+      <w:pPr>
+        <w:pStyle w:val="Compact"/>
+        <w:numPr>
+          <w:ilvl w:val="0"/>
+          <w:numId w:val="1004"/>
+        </w:numPr>
+      </w:pPr>
+      <w:r>
+        <w:rPr>
+          <w:rStyle w:val="VerbatimChar"/>
+        </w:rPr>
+        <w:t xml:space="preserve">#rem-</w:t>
+      </w:r>
+      <w:r>
+        <w:t xml:space="preserve"> </w:t>
+      </w:r>
+      <w:r>
+        <w:t xml:space="preserve">for remarks</w:t>
+      </w:r>
+    </w:p>
+    <w:p>
+      <w:pPr>
         <w:pStyle w:val="FirstParagraph"/>
       </w:pPr>
       <w:r>
@@ -1280,7 +3468,7 @@
       <w:r>
         <w:t xml:space="preserve"> </w:t>
       </w:r>
-      <w:hyperlink r:id="rId21">
+      <w:hyperlink r:id="rId25">
         <w:r>
           <w:rPr>
             <w:rStyle w:val="Hyperlink"/>
@@ -1404,17 +3592,17 @@
         <w:t xml:space="preserve">.</w:t>
       </w:r>
     </w:p>
-    <w:bookmarkEnd w:id="22"/>
-    <w:bookmarkStart w:id="27" w:name="example-pythagorean-theorem"/>
+    <w:bookmarkEnd w:id="26"/>
+    <w:bookmarkStart w:id="31" w:name="example-pythagorean-theorem"/>
     <w:p>
       <w:pPr>
         <w:pStyle w:val="Heading3"/>
       </w:pPr>
       <w:r>
-        <w:t xml:space="preserve">5.2 Example: Pythagorean theorem</w:t>
-      </w:r>
-    </w:p>
-    <w:bookmarkStart w:id="23" w:name="thm-pythagoras"/>
+        <w:t xml:space="preserve">6.2 Example: Pythagorean theorem</w:t>
+      </w:r>
+    </w:p>
+    <w:bookmarkStart w:id="27" w:name="thm-pythagoras"/>
     <w:p>
       <w:pPr>
         <w:pStyle w:val="FirstParagraph"/>
@@ -1495,8 +3683,8 @@
         <w:t xml:space="preserve">.</w:t>
       </w:r>
     </w:p>
-    <w:bookmarkEnd w:id="23"/>
-    <w:bookmarkStart w:id="24" w:name="exm-pythagoras"/>
+    <w:bookmarkEnd w:id="27"/>
+    <w:bookmarkStart w:id="28" w:name="exm-pythagoras"/>
     <w:p>
       <w:pPr>
         <w:pStyle w:val="BodyText"/>
@@ -1506,7 +3694,7 @@
           <w:b/>
           <w:bCs/>
         </w:rPr>
-        <w:t xml:space="preserve">Example 4 (Pythagorean theorem example)</w:t>
+        <w:t xml:space="preserve">Example 5 (Pythagorean theorem example)</w:t>
       </w:r>
       <w:r>
         <w:t xml:space="preserve"> </w:t>
@@ -1598,8 +3786,8 @@
         <w:t xml:space="preserve">.</w:t>
       </w:r>
     </w:p>
-    <w:bookmarkEnd w:id="24"/>
-    <w:bookmarkStart w:id="25" w:name="def-postulate"/>
+    <w:bookmarkEnd w:id="28"/>
+    <w:bookmarkStart w:id="29" w:name="def-postulate"/>
     <w:p>
       <w:pPr>
         <w:pStyle w:val="BodyText"/>
@@ -1609,7 +3797,7 @@
           <w:b/>
           <w:bCs/>
         </w:rPr>
-        <w:t xml:space="preserve">Definition 5 (Postulate (axiom))</w:t>
+        <w:t xml:space="preserve">Definition 6 (Postulate (axiom))</w:t>
       </w:r>
       <w:r>
         <w:t xml:space="preserve"> </w:t>
@@ -1640,8 +3828,8 @@
         <w:t xml:space="preserve">serving as a starting point for further reasoning.</w:t>
       </w:r>
     </w:p>
-    <w:bookmarkEnd w:id="25"/>
-    <w:bookmarkStart w:id="26" w:name="exm-parallel-postulate"/>
+    <w:bookmarkEnd w:id="29"/>
+    <w:bookmarkStart w:id="30" w:name="exm-parallel-postulate"/>
     <w:p>
       <w:pPr>
         <w:pStyle w:val="BodyText"/>
@@ -1651,7 +3839,7 @@
           <w:b/>
           <w:bCs/>
         </w:rPr>
-        <w:t xml:space="preserve">Example 5 (Euclid’s parallel postulate)</w:t>
+        <w:t xml:space="preserve">Example 6 (Euclid’s parallel postulate)</w:t>
       </w:r>
       <w:r>
         <w:t xml:space="preserve"> </w:t>
@@ -1744,9 +3932,9 @@
         <w:t xml:space="preserve">.</w:t>
       </w:r>
     </w:p>
-    <w:bookmarkEnd w:id="26"/>
-    <w:bookmarkEnd w:id="27"/>
-    <w:bookmarkEnd w:id="28"/>
+    <w:bookmarkEnd w:id="30"/>
+    <w:bookmarkEnd w:id="31"/>
+    <w:bookmarkEnd w:id="32"/>
     <w:sectPr>
       <w:footnotePr>
         <w:numRestart w:val="eachSect"/>

</xml_diff>

<commit_message>
Deploying to gh-pages from @ Morrison-Lab/psw@0c585b13a5963cd62ba2c5430b22a22148df2ef3 🚀
</commit_message>
<xml_diff>
--- a/chapters/defining-terms.docx
+++ b/chapters/defining-terms.docx
@@ -15,7 +15,7 @@
         <w:pStyle w:val="Date"/>
       </w:pPr>
       <w:r>
-        <w:t xml:space="preserve">Last modified: 2026-10-05 19:03:56 (UTC)</w:t>
+        <w:t xml:space="preserve">Last modified: 2026-10-05 19:13:31 (UTC)</w:t>
       </w:r>
     </w:p>
     <w:p>
@@ -92,7 +92,7 @@
       </w:r>
     </w:p>
     <w:bookmarkEnd w:id="9"/>
-    <w:bookmarkStart w:id="10" w:name="def-population"/>
+    <w:bookmarkStart w:id="10" w:name="exm-term"/>
     <w:p>
       <w:pPr>
         <w:pStyle w:val="BodyText"/>
@@ -102,6 +102,191 @@
           <w:b/>
           <w:bCs/>
         </w:rPr>
+        <w:t xml:space="preserve">Example 1 (</w:t>
+      </w:r>
+      <w:r>
+        <w:rPr>
+          <w:b/>
+          <w:bCs/>
+        </w:rPr>
+        <w:t xml:space="preserve">“Significant”</w:t>
+      </w:r>
+      <w:r>
+        <w:rPr>
+          <w:b/>
+          <w:bCs/>
+        </w:rPr>
+        <w:t xml:space="preserve"> </w:t>
+      </w:r>
+      <w:r>
+        <w:rPr>
+          <w:b/>
+          <w:bCs/>
+        </w:rPr>
+        <w:t xml:space="preserve">used as a term)</w:t>
+      </w:r>
+      <w:r>
+        <w:t xml:space="preserve"> </w:t>
+      </w:r>
+      <w:r>
+        <w:t xml:space="preserve">In</w:t>
+      </w:r>
+      <w:r>
+        <w:t xml:space="preserve"> </w:t>
+      </w:r>
+      <w:r>
+        <w:t xml:space="preserve">“the difference was statistically significant at the 5% level”</w:t>
+      </w:r>
+      <w:r>
+        <w:t xml:space="preserve">,</w:t>
+      </w:r>
+      <w:r>
+        <w:t xml:space="preserve"> </w:t>
+      </w:r>
+      <w:r>
+        <w:t xml:space="preserve">“significant”</w:t>
+      </w:r>
+      <w:r>
+        <w:t xml:space="preserve"> </w:t>
+      </w:r>
+      <w:r>
+        <w:t xml:space="preserve">is a term (</w:t>
+      </w:r>
+      <w:hyperlink w:anchor="def-term">
+        <w:r>
+          <w:rPr>
+            <w:rStyle w:val="Hyperlink"/>
+          </w:rPr>
+          <w:t xml:space="preserve">Definition 1</w:t>
+        </w:r>
+      </w:hyperlink>
+      <w:r>
+        <w:t xml:space="preserve">):</w:t>
+      </w:r>
+      <w:r>
+        <w:t xml:space="preserve"> </w:t>
+      </w:r>
+      <w:r>
+        <w:t xml:space="preserve">it means that a hypothesis test rejected its null hypothesis at that level.</w:t>
+      </w:r>
+    </w:p>
+    <w:bookmarkEnd w:id="10"/>
+    <w:bookmarkStart w:id="11" w:name="exm-not-term"/>
+    <w:p>
+      <w:pPr>
+        <w:pStyle w:val="BodyText"/>
+      </w:pPr>
+      <w:r>
+        <w:rPr>
+          <w:b/>
+          <w:bCs/>
+        </w:rPr>
+        <w:t xml:space="preserve">Example 2 (</w:t>
+      </w:r>
+      <w:r>
+        <w:rPr>
+          <w:b/>
+          <w:bCs/>
+        </w:rPr>
+        <w:t xml:space="preserve">“Significant”</w:t>
+      </w:r>
+      <w:r>
+        <w:rPr>
+          <w:b/>
+          <w:bCs/>
+        </w:rPr>
+        <w:t xml:space="preserve"> </w:t>
+      </w:r>
+      <w:r>
+        <w:rPr>
+          <w:b/>
+          <w:bCs/>
+        </w:rPr>
+        <w:t xml:space="preserve">used as an ordinary word)</w:t>
+      </w:r>
+      <w:r>
+        <w:t xml:space="preserve"> </w:t>
+      </w:r>
+      <w:r>
+        <w:t xml:space="preserve">In</w:t>
+      </w:r>
+      <w:r>
+        <w:t xml:space="preserve"> </w:t>
+      </w:r>
+      <w:r>
+        <w:t xml:space="preserve">“staffing is a significant problem for the clinic”</w:t>
+      </w:r>
+      <w:r>
+        <w:t xml:space="preserve">,</w:t>
+      </w:r>
+      <w:r>
+        <w:t xml:space="preserve"> </w:t>
+      </w:r>
+      <w:r>
+        <w:t xml:space="preserve">“significant”</w:t>
+      </w:r>
+      <w:r>
+        <w:t xml:space="preserve"> </w:t>
+      </w:r>
+      <w:r>
+        <w:t xml:space="preserve">is not a term (</w:t>
+      </w:r>
+      <w:hyperlink w:anchor="def-term">
+        <w:r>
+          <w:rPr>
+            <w:rStyle w:val="Hyperlink"/>
+          </w:rPr>
+          <w:t xml:space="preserve">Definition 1</w:t>
+        </w:r>
+      </w:hyperlink>
+      <w:r>
+        <w:t xml:space="preserve">).</w:t>
+      </w:r>
+      <w:r>
+        <w:t xml:space="preserve"> </w:t>
+      </w:r>
+      <w:r>
+        <w:t xml:space="preserve">It carries its everyday meaning,</w:t>
+      </w:r>
+      <w:r>
+        <w:t xml:space="preserve"> </w:t>
+      </w:r>
+      <w:r>
+        <w:t xml:space="preserve">“large”</w:t>
+      </w:r>
+      <w:r>
+        <w:t xml:space="preserve"> </w:t>
+      </w:r>
+      <w:r>
+        <w:t xml:space="preserve">or</w:t>
+      </w:r>
+      <w:r>
+        <w:t xml:space="preserve"> </w:t>
+      </w:r>
+      <w:r>
+        <w:t xml:space="preserve">“important”</w:t>
+      </w:r>
+      <w:r>
+        <w:t xml:space="preserve">,</w:t>
+      </w:r>
+      <w:r>
+        <w:t xml:space="preserve"> </w:t>
+      </w:r>
+      <w:r>
+        <w:t xml:space="preserve">and no hypothesis test is involved.</w:t>
+      </w:r>
+    </w:p>
+    <w:bookmarkEnd w:id="11"/>
+    <w:bookmarkStart w:id="12" w:name="def-population"/>
+    <w:p>
+      <w:pPr>
+        <w:pStyle w:val="BodyText"/>
+      </w:pPr>
+      <w:r>
+        <w:rPr>
+          <w:b/>
+          <w:bCs/>
+        </w:rPr>
         <w:t xml:space="preserve">Definition 2 (Population)</w:t>
       </w:r>
       <w:r>
@@ -133,45 +318,30 @@
         <w:t xml:space="preserve">is the complete set of all items or individuals of interest.</w:t>
       </w:r>
     </w:p>
-    <w:bookmarkEnd w:id="10"/>
-    <w:bookmarkStart w:id="11" w:name="rem-population"/>
+    <w:bookmarkEnd w:id="12"/>
+    <w:bookmarkStart w:id="13" w:name="exm-population"/>
     <w:p>
       <w:pPr>
         <w:pStyle w:val="BodyText"/>
       </w:pPr>
       <w:r>
         <w:rPr>
-          <w:i/>
-          <w:iCs/>
-        </w:rPr>
-        <w:t xml:space="preserve">Remark 1</w:t>
-      </w:r>
-      <w:r>
-        <w:t xml:space="preserve"> (Population is not only geographic). </w:t>
-      </w:r>
-      <w:r>
-        <w:t xml:space="preserve">In everyday use,</w:t>
-      </w:r>
-      <w:r>
-        <w:t xml:space="preserve"> </w:t>
-      </w:r>
-      <w:r>
-        <w:t xml:space="preserve">“population”</w:t>
-      </w:r>
-      <w:r>
-        <w:t xml:space="preserve"> </w:t>
-      </w:r>
-      <w:r>
-        <w:t xml:space="preserve">usually means the people living in a place.</w:t>
-      </w:r>
-      <w:r>
-        <w:t xml:space="preserve"> </w:t>
-      </w:r>
-      <w:r>
-        <w:t xml:space="preserve">The statistical sense in</w:t>
-      </w:r>
-      <w:r>
-        <w:t xml:space="preserve"> </w:t>
+          <w:b/>
+          <w:bCs/>
+        </w:rPr>
+        <w:t xml:space="preserve">Example 3 (A population of patients)</w:t>
+      </w:r>
+      <w:r>
+        <w:t xml:space="preserve"> </w:t>
+      </w:r>
+      <w:r>
+        <w:t xml:space="preserve">For a study of blood-sugar control,</w:t>
+      </w:r>
+      <w:r>
+        <w:t xml:space="preserve"> </w:t>
+      </w:r>
+      <w:r>
+        <w:t xml:space="preserve">the population (</w:t>
       </w:r>
       <w:hyperlink w:anchor="def-population">
         <w:r>
@@ -182,6 +352,119 @@
         </w:r>
       </w:hyperlink>
       <w:r>
+        <w:t xml:space="preserve">) might be</w:t>
+      </w:r>
+      <w:r>
+        <w:t xml:space="preserve"> </w:t>
+      </w:r>
+      <w:r>
+        <w:t xml:space="preserve">all adults in California with type 2 diabetes in 2024.</w:t>
+      </w:r>
+    </w:p>
+    <w:bookmarkEnd w:id="13"/>
+    <w:bookmarkStart w:id="14" w:name="exm-not-population"/>
+    <w:p>
+      <w:pPr>
+        <w:pStyle w:val="BodyText"/>
+      </w:pPr>
+      <w:r>
+        <w:rPr>
+          <w:b/>
+          <w:bCs/>
+        </w:rPr>
+        <w:t xml:space="preserve">Example 4 (A sample is not the population)</w:t>
+      </w:r>
+      <w:r>
+        <w:t xml:space="preserve"> </w:t>
+      </w:r>
+      <w:r>
+        <w:t xml:space="preserve">The 500 patients who enrolled in that study are not the population</w:t>
+      </w:r>
+      <w:r>
+        <w:t xml:space="preserve"> </w:t>
+      </w:r>
+      <w:r>
+        <w:t xml:space="preserve">(</w:t>
+      </w:r>
+      <w:hyperlink w:anchor="def-population">
+        <w:r>
+          <w:rPr>
+            <w:rStyle w:val="Hyperlink"/>
+          </w:rPr>
+          <w:t xml:space="preserve">Definition 2</w:t>
+        </w:r>
+      </w:hyperlink>
+      <w:r>
+        <w:t xml:space="preserve">).</w:t>
+      </w:r>
+      <w:r>
+        <w:t xml:space="preserve"> </w:t>
+      </w:r>
+      <w:r>
+        <w:t xml:space="preserve">They are a sample drawn from the population,</w:t>
+      </w:r>
+      <w:r>
+        <w:t xml:space="preserve"> </w:t>
+      </w:r>
+      <w:r>
+        <w:t xml:space="preserve">and the study’s estimates describe the population only as far as</w:t>
+      </w:r>
+      <w:r>
+        <w:t xml:space="preserve"> </w:t>
+      </w:r>
+      <w:r>
+        <w:t xml:space="preserve">the sample represents it.</w:t>
+      </w:r>
+    </w:p>
+    <w:bookmarkEnd w:id="14"/>
+    <w:bookmarkStart w:id="15" w:name="rem-population"/>
+    <w:p>
+      <w:pPr>
+        <w:pStyle w:val="BodyText"/>
+      </w:pPr>
+      <w:r>
+        <w:rPr>
+          <w:i/>
+          <w:iCs/>
+        </w:rPr>
+        <w:t xml:space="preserve">Remark 1</w:t>
+      </w:r>
+      <w:r>
+        <w:t xml:space="preserve"> (Population is not only geographic). </w:t>
+      </w:r>
+      <w:r>
+        <w:t xml:space="preserve">In everyday use,</w:t>
+      </w:r>
+      <w:r>
+        <w:t xml:space="preserve"> </w:t>
+      </w:r>
+      <w:r>
+        <w:t xml:space="preserve">“population”</w:t>
+      </w:r>
+      <w:r>
+        <w:t xml:space="preserve"> </w:t>
+      </w:r>
+      <w:r>
+        <w:t xml:space="preserve">usually means the people living in a place.</w:t>
+      </w:r>
+      <w:r>
+        <w:t xml:space="preserve"> </w:t>
+      </w:r>
+      <w:r>
+        <w:t xml:space="preserve">The statistical sense in</w:t>
+      </w:r>
+      <w:r>
+        <w:t xml:space="preserve"> </w:t>
+      </w:r>
+      <w:hyperlink w:anchor="def-population">
+        <w:r>
+          <w:rPr>
+            <w:rStyle w:val="Hyperlink"/>
+          </w:rPr>
+          <w:t xml:space="preserve">Definition 2</w:t>
+        </w:r>
+      </w:hyperlink>
+      <w:r>
         <w:t xml:space="preserve"> </w:t>
       </w:r>
       <w:r>
@@ -206,8 +489,8 @@
         <w:t xml:space="preserve">or any other set of items of interest.</w:t>
       </w:r>
     </w:p>
-    <w:bookmarkEnd w:id="11"/>
-    <w:bookmarkStart w:id="13" w:name="guidelines-for-defining-terms"/>
+    <w:bookmarkEnd w:id="15"/>
+    <w:bookmarkStart w:id="17" w:name="guidelines-for-defining-terms"/>
     <w:p>
       <w:pPr>
         <w:pStyle w:val="Heading2"/>
@@ -1503,7 +1786,7 @@
           <w:b/>
           <w:bCs/>
         </w:rPr>
-        <w:t xml:space="preserve">Provide examples:</w:t>
+        <w:t xml:space="preserve">Provide examples and counterexamples:</w:t>
       </w:r>
       <w:r>
         <w:t xml:space="preserve"> </w:t>
@@ -1515,7 +1798,43 @@
         <w:t xml:space="preserve"> </w:t>
       </w:r>
       <w:r>
-        <w:t xml:space="preserve">that illustrates how the term is used.</w:t>
+        <w:t xml:space="preserve">that illustrates how the term is used,</w:t>
+      </w:r>
+      <w:r>
+        <w:t xml:space="preserve"> </w:t>
+      </w:r>
+      <w:r>
+        <w:t xml:space="preserve">and at least one counterexample:</w:t>
+      </w:r>
+      <w:r>
+        <w:t xml:space="preserve"> </w:t>
+      </w:r>
+      <w:r>
+        <w:t xml:space="preserve">a case that looks as if it fits the definition but does not.</w:t>
+      </w:r>
+      <w:r>
+        <w:t xml:space="preserve"> </w:t>
+      </w:r>
+      <w:r>
+        <w:t xml:space="preserve">The example shows what the term covers;</w:t>
+      </w:r>
+      <w:r>
+        <w:t xml:space="preserve"> </w:t>
+      </w:r>
+      <w:r>
+        <w:t xml:space="preserve">the counterexample shows where its boundary is,</w:t>
+      </w:r>
+      <w:r>
+        <w:t xml:space="preserve"> </w:t>
+      </w:r>
+      <w:r>
+        <w:t xml:space="preserve">which is often where readers misapply it.</w:t>
+      </w:r>
+      <w:r>
+        <w:t xml:space="preserve"> </w:t>
+      </w:r>
+      <w:r>
+        <w:t xml:space="preserve">Put each in its own example block after the definition.</w:t>
       </w:r>
     </w:p>
     <w:p>
@@ -1848,7 +2167,7 @@
       <w:r>
         <w:t xml:space="preserve"> </w:t>
       </w:r>
-      <w:hyperlink r:id="rId12">
+      <w:hyperlink r:id="rId16">
         <w:r>
           <w:rPr>
             <w:rStyle w:val="Hyperlink"/>
@@ -1860,8 +2179,8 @@
         <w:t xml:space="preserve">).</w:t>
       </w:r>
     </w:p>
-    <w:bookmarkEnd w:id="13"/>
-    <w:bookmarkStart w:id="18" w:name="examples-of-term-definitions"/>
+    <w:bookmarkEnd w:id="17"/>
+    <w:bookmarkStart w:id="24" w:name="examples-of-term-definitions"/>
     <w:p>
       <w:pPr>
         <w:pStyle w:val="Heading2"/>
@@ -1878,7 +2197,7 @@
         <w:t xml:space="preserve">Here are examples of well-defined terms:</w:t>
       </w:r>
     </w:p>
-    <w:bookmarkStart w:id="14" w:name="def-confidence-interval"/>
+    <w:bookmarkStart w:id="18" w:name="def-confidence-interval"/>
     <w:p>
       <w:pPr>
         <w:pStyle w:val="BodyText"/>
@@ -2115,8 +2434,8 @@
         </m:oMath>
       </m:oMathPara>
     </w:p>
-    <w:bookmarkEnd w:id="14"/>
-    <w:bookmarkStart w:id="15" w:name="exm-confidence-interval"/>
+    <w:bookmarkEnd w:id="18"/>
+    <w:bookmarkStart w:id="19" w:name="exm-confidence-interval"/>
     <w:p>
       <w:pPr>
         <w:pStyle w:val="FirstParagraph"/>
@@ -2126,7 +2445,7 @@
           <w:b/>
           <w:bCs/>
         </w:rPr>
-        <w:t xml:space="preserve">Example 1 (A confidence interval for mean height)</w:t>
+        <w:t xml:space="preserve">Example 5 (A confidence interval for mean height)</w:t>
       </w:r>
       <w:r>
         <w:t xml:space="preserve"> </w:t>
@@ -2158,8 +2477,8 @@
         <w:t xml:space="preserve">we are 95% confident that the true population mean height falls within this range.</w:t>
       </w:r>
     </w:p>
-    <w:bookmarkEnd w:id="15"/>
-    <w:bookmarkStart w:id="16" w:name="def-active-voice"/>
+    <w:bookmarkEnd w:id="19"/>
+    <w:bookmarkStart w:id="20" w:name="exm-not-confidence-interval"/>
     <w:p>
       <w:pPr>
         <w:pStyle w:val="BodyText"/>
@@ -2169,6 +2488,67 @@
           <w:b/>
           <w:bCs/>
         </w:rPr>
+        <w:t xml:space="preserve">Example 6 (A range that is not a confidence interval for the mean)</w:t>
+      </w:r>
+      <w:r>
+        <w:t xml:space="preserve"> </w:t>
+      </w:r>
+      <w:r>
+        <w:t xml:space="preserve">The interval from the 2.5th to the 97.5th percentile of the observed heights,</w:t>
+      </w:r>
+      <w:r>
+        <w:t xml:space="preserve"> </w:t>
+      </w:r>
+      <w:r>
+        <w:t xml:space="preserve">[150 cm, 190 cm],</w:t>
+      </w:r>
+      <w:r>
+        <w:t xml:space="preserve"> </w:t>
+      </w:r>
+      <w:r>
+        <w:t xml:space="preserve">is not a 95% confidence interval (</w:t>
+      </w:r>
+      <w:hyperlink w:anchor="def-confidence-interval">
+        <w:r>
+          <w:rPr>
+            <w:rStyle w:val="Hyperlink"/>
+          </w:rPr>
+          <w:t xml:space="preserve">Definition 3</w:t>
+        </w:r>
+      </w:hyperlink>
+      <w:r>
+        <w:t xml:space="preserve">) for mean height.</w:t>
+      </w:r>
+      <w:r>
+        <w:t xml:space="preserve"> </w:t>
+      </w:r>
+      <w:r>
+        <w:t xml:space="preserve">The percentile interval describes where individual heights fall,</w:t>
+      </w:r>
+      <w:r>
+        <w:t xml:space="preserve"> </w:t>
+      </w:r>
+      <w:r>
+        <w:t xml:space="preserve">not where the population mean is likely to be,</w:t>
+      </w:r>
+      <w:r>
+        <w:t xml:space="preserve"> </w:t>
+      </w:r>
+      <w:r>
+        <w:t xml:space="preserve">and it does not shrink as the sample grows.</w:t>
+      </w:r>
+    </w:p>
+    <w:bookmarkEnd w:id="20"/>
+    <w:bookmarkStart w:id="21" w:name="def-active-voice"/>
+    <w:p>
+      <w:pPr>
+        <w:pStyle w:val="BodyText"/>
+      </w:pPr>
+      <w:r>
+        <w:rPr>
+          <w:b/>
+          <w:bCs/>
+        </w:rPr>
         <w:t xml:space="preserve">Definition 4 (Active voice)</w:t>
       </w:r>
       <w:r>
@@ -2188,8 +2568,8 @@
         <w:t xml:space="preserve">is a sentence structure where the subject performs the action expressed by the verb.</w:t>
       </w:r>
     </w:p>
-    <w:bookmarkEnd w:id="16"/>
-    <w:bookmarkStart w:id="17" w:name="exm-active-voice"/>
+    <w:bookmarkEnd w:id="21"/>
+    <w:bookmarkStart w:id="22" w:name="exm-active-voice"/>
     <w:p>
       <w:pPr>
         <w:pStyle w:val="BodyText"/>
@@ -2199,7 +2579,7 @@
           <w:b/>
           <w:bCs/>
         </w:rPr>
-        <w:t xml:space="preserve">Example 2 (Active and passive voice)</w:t>
+        <w:t xml:space="preserve">Example 7 (A sentence in active voice)</w:t>
       </w:r>
       <w:r>
         <w:t xml:space="preserve"> </w:t>
@@ -2222,13 +2602,45 @@
         </w:r>
       </w:hyperlink>
       <w:r>
-        <w:t xml:space="preserve">),</w:t>
-      </w:r>
-      <w:r>
-        <w:t xml:space="preserve"> </w:t>
-      </w:r>
-      <w:r>
-        <w:t xml:space="preserve">while</w:t>
+        <w:t xml:space="preserve">):</w:t>
+      </w:r>
+      <w:r>
+        <w:t xml:space="preserve"> </w:t>
+      </w:r>
+      <w:r>
+        <w:t xml:space="preserve">the subject,</w:t>
+      </w:r>
+      <w:r>
+        <w:t xml:space="preserve"> </w:t>
+      </w:r>
+      <w:r>
+        <w:t xml:space="preserve">“the researcher”</w:t>
+      </w:r>
+      <w:r>
+        <w:t xml:space="preserve">, performs the action,</w:t>
+      </w:r>
+      <w:r>
+        <w:t xml:space="preserve"> </w:t>
+      </w:r>
+      <w:r>
+        <w:t xml:space="preserve">“conducted”</w:t>
+      </w:r>
+      <w:r>
+        <w:t xml:space="preserve">.</w:t>
+      </w:r>
+    </w:p>
+    <w:bookmarkEnd w:id="22"/>
+    <w:bookmarkStart w:id="23" w:name="exm-passive-voice"/>
+    <w:p>
+      <w:pPr>
+        <w:pStyle w:val="BodyText"/>
+      </w:pPr>
+      <w:r>
+        <w:rPr>
+          <w:b/>
+          <w:bCs/>
+        </w:rPr>
+        <w:t xml:space="preserve">Example 8 (A sentence that is not in active voice)</w:t>
       </w:r>
       <w:r>
         <w:t xml:space="preserve"> </w:t>
@@ -2240,12 +2652,50 @@
         <w:t xml:space="preserve"> </w:t>
       </w:r>
       <w:r>
-        <w:t xml:space="preserve">is in passive voice.</w:t>
-      </w:r>
-    </w:p>
-    <w:bookmarkEnd w:id="17"/>
-    <w:bookmarkEnd w:id="18"/>
-    <w:bookmarkStart w:id="22" w:name="order-general-definition-then-examples"/>
+        <w:t xml:space="preserve">is not in active voice</w:t>
+      </w:r>
+      <w:r>
+        <w:t xml:space="preserve"> </w:t>
+      </w:r>
+      <w:r>
+        <w:t xml:space="preserve">(</w:t>
+      </w:r>
+      <w:hyperlink w:anchor="def-active-voice">
+        <w:r>
+          <w:rPr>
+            <w:rStyle w:val="Hyperlink"/>
+          </w:rPr>
+          <w:t xml:space="preserve">Definition 4</w:t>
+        </w:r>
+      </w:hyperlink>
+      <w:r>
+        <w:t xml:space="preserve">).</w:t>
+      </w:r>
+      <w:r>
+        <w:t xml:space="preserve"> </w:t>
+      </w:r>
+      <w:r>
+        <w:t xml:space="preserve">Its subject,</w:t>
+      </w:r>
+      <w:r>
+        <w:t xml:space="preserve"> </w:t>
+      </w:r>
+      <w:r>
+        <w:t xml:space="preserve">“the experiment”</w:t>
+      </w:r>
+      <w:r>
+        <w:t xml:space="preserve">, receives the action instead of performing it,</w:t>
+      </w:r>
+      <w:r>
+        <w:t xml:space="preserve"> </w:t>
+      </w:r>
+      <w:r>
+        <w:t xml:space="preserve">so the sentence is in passive voice.</w:t>
+      </w:r>
+    </w:p>
+    <w:bookmarkEnd w:id="23"/>
+    <w:bookmarkEnd w:id="24"/>
+    <w:bookmarkStart w:id="29" w:name="order-general-definition-then-examples"/>
     <w:p>
       <w:pPr>
         <w:pStyle w:val="Heading2"/>
@@ -2298,7 +2748,7 @@
         <w:t xml:space="preserve">would give these blocks, in this order:</w:t>
       </w:r>
     </w:p>
-    <w:bookmarkStart w:id="19" w:name="def-rss"/>
+    <w:bookmarkStart w:id="25" w:name="def-rss"/>
     <w:p>
       <w:pPr>
         <w:pStyle w:val="BodyText"/>
@@ -2416,8 +2866,8 @@
         </m:oMath>
       </m:oMathPara>
     </w:p>
-    <w:bookmarkEnd w:id="19"/>
-    <w:bookmarkStart w:id="20" w:name="exm-rss-line"/>
+    <w:bookmarkEnd w:id="25"/>
+    <w:bookmarkStart w:id="26" w:name="exm-rss-line"/>
     <w:p>
       <w:pPr>
         <w:pStyle w:val="FirstParagraph"/>
@@ -2427,7 +2877,7 @@
           <w:b/>
           <w:bCs/>
         </w:rPr>
-        <w:t xml:space="preserve">Example 3 (Residual sum of squares of a straight line)</w:t>
+        <w:t xml:space="preserve">Example 9 (Residual sum of squares of a straight line)</w:t>
       </w:r>
       <w:r>
         <w:t xml:space="preserve"> </w:t>
@@ -2739,8 +3189,8 @@
         <w:t xml:space="preserve">.</w:t>
       </w:r>
     </w:p>
-    <w:bookmarkEnd w:id="20"/>
-    <w:bookmarkStart w:id="21" w:name="exm-rss-three-points"/>
+    <w:bookmarkEnd w:id="26"/>
+    <w:bookmarkStart w:id="27" w:name="exm-rss-three-points"/>
     <w:p>
       <w:pPr>
         <w:pStyle w:val="BodyText"/>
@@ -2750,7 +3200,7 @@
           <w:b/>
           <w:bCs/>
         </w:rPr>
-        <w:t xml:space="preserve">Example 4 (Residual sum of squares of a line through three points)</w:t>
+        <w:t xml:space="preserve">Example 10 (Residual sum of squares of a line through three points)</w:t>
       </w:r>
       <w:r>
         <w:t xml:space="preserve"> </w:t>
@@ -2926,7 +3376,7 @@
           <w:rPr>
             <w:rStyle w:val="Hyperlink"/>
           </w:rPr>
-          <w:t xml:space="preserve">Example 3</w:t>
+          <w:t xml:space="preserve">Example 9</w:t>
         </w:r>
       </w:hyperlink>
       <w:r>
@@ -3029,12 +3479,156 @@
         <w:t xml:space="preserve">.</w:t>
       </w:r>
     </w:p>
-    <w:bookmarkEnd w:id="21"/>
+    <w:bookmarkEnd w:id="27"/>
+    <w:bookmarkStart w:id="28" w:name="exm-not-rss"/>
     <w:p>
       <w:pPr>
         <w:pStyle w:val="BodyText"/>
       </w:pPr>
       <w:r>
+        <w:rPr>
+          <w:b/>
+          <w:bCs/>
+        </w:rPr>
+        <w:t xml:space="preserve">Example 11 (A sum of squares that is not a residual sum of squares)</w:t>
+      </w:r>
+      <w:r>
+        <w:t xml:space="preserve"> </w:t>
+      </w:r>
+      <w:r>
+        <w:t xml:space="preserve">For the same three points,</w:t>
+      </w:r>
+      <w:r>
+        <w:t xml:space="preserve"> </w:t>
+      </w:r>
+      <w:r>
+        <w:t xml:space="preserve">the sum of squared deviations of</w:t>
+      </w:r>
+      <w:r>
+        <w:t xml:space="preserve"> </w:t>
+      </w:r>
+      <m:oMath>
+        <m:sSub>
+          <m:e>
+            <m:r>
+              <m:t>y</m:t>
+            </m:r>
+          </m:e>
+          <m:sub>
+            <m:r>
+              <m:t>i</m:t>
+            </m:r>
+          </m:sub>
+        </m:sSub>
+      </m:oMath>
+      <w:r>
+        <w:t xml:space="preserve"> </w:t>
+      </w:r>
+      <w:r>
+        <w:t xml:space="preserve">from their mean,</w:t>
+      </w:r>
+      <w:r>
+        <w:t xml:space="preserve"> </w:t>
+      </w:r>
+      <m:oMath>
+        <m:r>
+          <m:t>5</m:t>
+        </m:r>
+        <m:r>
+          <m:rPr>
+            <m:sty m:val="p"/>
+          </m:rPr>
+          <m:t>/</m:t>
+        </m:r>
+        <m:r>
+          <m:t>3</m:t>
+        </m:r>
+      </m:oMath>
+      <w:r>
+        <w:t xml:space="preserve">,</w:t>
+      </w:r>
+      <w:r>
+        <w:t xml:space="preserve"> </w:t>
+      </w:r>
+      <w:r>
+        <w:t xml:space="preserve">is</w:t>
+      </w:r>
+      <w:r>
+        <w:t xml:space="preserve"> </w:t>
+      </w:r>
+      <m:oMath>
+        <m:r>
+          <m:t>2</m:t>
+        </m:r>
+        <m:r>
+          <m:rPr>
+            <m:sty m:val="p"/>
+          </m:rPr>
+          <m:t>/</m:t>
+        </m:r>
+        <m:r>
+          <m:t>3</m:t>
+        </m:r>
+      </m:oMath>
+      <w:r>
+        <w:t xml:space="preserve">.</w:t>
+      </w:r>
+      <w:r>
+        <w:t xml:space="preserve"> </w:t>
+      </w:r>
+      <w:r>
+        <w:t xml:space="preserve">That quantity is the total sum of squares,</w:t>
+      </w:r>
+      <w:r>
+        <w:t xml:space="preserve"> </w:t>
+      </w:r>
+      <w:r>
+        <w:t xml:space="preserve">not the residual sum of squares (</w:t>
+      </w:r>
+      <w:hyperlink w:anchor="def-rss">
+        <w:r>
+          <w:rPr>
+            <w:rStyle w:val="Hyperlink"/>
+          </w:rPr>
+          <w:t xml:space="preserve">Definition 5</w:t>
+        </w:r>
+      </w:hyperlink>
+      <w:r>
+        <w:t xml:space="preserve">) of the line in</w:t>
+      </w:r>
+      <w:r>
+        <w:t xml:space="preserve"> </w:t>
+      </w:r>
+      <w:hyperlink w:anchor="exm-rss-three-points">
+        <w:r>
+          <w:rPr>
+            <w:rStyle w:val="Hyperlink"/>
+          </w:rPr>
+          <w:t xml:space="preserve">Example 10</w:t>
+        </w:r>
+      </w:hyperlink>
+      <w:r>
+        <w:t xml:space="preserve">,</w:t>
+      </w:r>
+      <w:r>
+        <w:t xml:space="preserve"> </w:t>
+      </w:r>
+      <w:r>
+        <w:t xml:space="preserve">because it measures spread around the mean</w:t>
+      </w:r>
+      <w:r>
+        <w:t xml:space="preserve"> </w:t>
+      </w:r>
+      <w:r>
+        <w:t xml:space="preserve">rather than around the line’s fitted values.</w:t>
+      </w:r>
+    </w:p>
+    <w:bookmarkEnd w:id="28"/>
+    <w:p>
+      <w:pPr>
+        <w:pStyle w:val="BodyText"/>
+      </w:pPr>
+      <w:r>
         <w:t xml:space="preserve">The definition stays one sentence and one equation,</w:t>
       </w:r>
       <w:r>
@@ -3053,11 +3647,23 @@
         <w:t xml:space="preserve"> </w:t>
       </w:r>
       <w:r>
-        <w:t xml:space="preserve">and the numerical case is a special case of the line, so it comes last.</w:t>
-      </w:r>
-    </w:p>
-    <w:bookmarkEnd w:id="22"/>
-    <w:bookmarkStart w:id="23" w:name="why-examples-matter"/>
+        <w:t xml:space="preserve">and the numerical case is a special case of the line, so it follows the line.</w:t>
+      </w:r>
+      <w:r>
+        <w:t xml:space="preserve"> </w:t>
+      </w:r>
+      <w:r>
+        <w:t xml:space="preserve">The counterexample comes after the examples,</w:t>
+      </w:r>
+      <w:r>
+        <w:t xml:space="preserve"> </w:t>
+      </w:r>
+      <w:r>
+        <w:t xml:space="preserve">once the reader knows what the definition covers.</w:t>
+      </w:r>
+    </w:p>
+    <w:bookmarkEnd w:id="29"/>
+    <w:bookmarkStart w:id="30" w:name="why-examples-matter"/>
     <w:p>
       <w:pPr>
         <w:pStyle w:val="Heading2"/>
@@ -3182,8 +3788,35 @@
         <w:t xml:space="preserve">than abstract definitions alone.</w:t>
       </w:r>
     </w:p>
-    <w:bookmarkEnd w:id="23"/>
-    <w:bookmarkStart w:id="24" w:name="common-pitfalls-to-avoid"/>
+    <w:p>
+      <w:pPr>
+        <w:numPr>
+          <w:ilvl w:val="0"/>
+          <w:numId w:val="1002"/>
+        </w:numPr>
+      </w:pPr>
+      <w:r>
+        <w:rPr>
+          <w:b/>
+          <w:bCs/>
+        </w:rPr>
+        <w:t xml:space="preserve">Boundaries:</w:t>
+      </w:r>
+      <w:r>
+        <w:t xml:space="preserve"> </w:t>
+      </w:r>
+      <w:r>
+        <w:t xml:space="preserve">Counterexamples show where a definition stops applying,</w:t>
+      </w:r>
+      <w:r>
+        <w:t xml:space="preserve"> </w:t>
+      </w:r>
+      <w:r>
+        <w:t xml:space="preserve">which is where readers most often misapply it.</w:t>
+      </w:r>
+    </w:p>
+    <w:bookmarkEnd w:id="30"/>
+    <w:bookmarkStart w:id="31" w:name="common-pitfalls-to-avoid"/>
     <w:p>
       <w:pPr>
         <w:pStyle w:val="Heading2"/>
@@ -3378,8 +4011,8 @@
         <w:t xml:space="preserve">of the definition they are meant to demonstrate.</w:t>
       </w:r>
     </w:p>
-    <w:bookmarkEnd w:id="24"/>
-    <w:bookmarkStart w:id="32" w:name="mathematical-statements-require-examples"/>
+    <w:bookmarkEnd w:id="31"/>
+    <w:bookmarkStart w:id="39" w:name="mathematical-statements-require-examples"/>
     <w:p>
       <w:pPr>
         <w:pStyle w:val="Heading2"/>
@@ -3432,7 +4065,7 @@
         <w:t xml:space="preserve">when readers can see concrete instances.</w:t>
       </w:r>
     </w:p>
-    <w:bookmarkStart w:id="26" w:name="using-theorem-environments-in-quarto"/>
+    <w:bookmarkStart w:id="33" w:name="using-theorem-environments-in-quarto"/>
     <w:p>
       <w:pPr>
         <w:pStyle w:val="Heading3"/>
@@ -3725,7 +4358,7 @@
       <w:r>
         <w:t xml:space="preserve"> </w:t>
       </w:r>
-      <w:hyperlink r:id="rId25">
+      <w:hyperlink r:id="rId32">
         <w:r>
           <w:rPr>
             <w:rStyle w:val="Hyperlink"/>
@@ -3852,8 +4485,8 @@
         <w:t xml:space="preserve">.</w:t>
       </w:r>
     </w:p>
-    <w:bookmarkEnd w:id="26"/>
-    <w:bookmarkStart w:id="31" w:name="example-pythagorean-theorem"/>
+    <w:bookmarkEnd w:id="33"/>
+    <w:bookmarkStart w:id="38" w:name="example-pythagorean-theorem"/>
     <w:p>
       <w:pPr>
         <w:pStyle w:val="Heading3"/>
@@ -3862,7 +4495,7 @@
         <w:t xml:space="preserve">6.2 Example: Pythagorean theorem</w:t>
       </w:r>
     </w:p>
-    <w:bookmarkStart w:id="27" w:name="thm-pythagoras"/>
+    <w:bookmarkStart w:id="34" w:name="thm-pythagoras"/>
     <w:p>
       <w:pPr>
         <w:pStyle w:val="FirstParagraph"/>
@@ -3953,8 +4586,8 @@
         </m:oMath>
       </m:oMathPara>
     </w:p>
-    <w:bookmarkEnd w:id="27"/>
-    <w:bookmarkStart w:id="28" w:name="exm-pythagoras"/>
+    <w:bookmarkEnd w:id="34"/>
+    <w:bookmarkStart w:id="35" w:name="exm-pythagoras"/>
     <w:p>
       <w:pPr>
         <w:pStyle w:val="FirstParagraph"/>
@@ -3964,7 +4597,7 @@
           <w:b/>
           <w:bCs/>
         </w:rPr>
-        <w:t xml:space="preserve">Example 5 (Pythagorean theorem example)</w:t>
+        <w:t xml:space="preserve">Example 12 (Pythagorean theorem example)</w:t>
       </w:r>
       <w:r>
         <w:t xml:space="preserve"> </w:t>
@@ -4056,8 +4689,8 @@
         <w:t xml:space="preserve">.</w:t>
       </w:r>
     </w:p>
-    <w:bookmarkEnd w:id="28"/>
-    <w:bookmarkStart w:id="29" w:name="def-postulate"/>
+    <w:bookmarkEnd w:id="35"/>
+    <w:bookmarkStart w:id="36" w:name="def-postulate"/>
     <w:p>
       <w:pPr>
         <w:pStyle w:val="BodyText"/>
@@ -4098,8 +4731,8 @@
         <w:t xml:space="preserve">serving as a starting point for further reasoning.</w:t>
       </w:r>
     </w:p>
-    <w:bookmarkEnd w:id="29"/>
-    <w:bookmarkStart w:id="30" w:name="exm-parallel-postulate"/>
+    <w:bookmarkEnd w:id="36"/>
+    <w:bookmarkStart w:id="37" w:name="exm-parallel-postulate"/>
     <w:p>
       <w:pPr>
         <w:pStyle w:val="BodyText"/>
@@ -4109,7 +4742,7 @@
           <w:b/>
           <w:bCs/>
         </w:rPr>
-        <w:t xml:space="preserve">Example 6 (Euclid’s parallel postulate)</w:t>
+        <w:t xml:space="preserve">Example 13 (Euclid’s parallel postulate)</w:t>
       </w:r>
       <w:r>
         <w:t xml:space="preserve"> </w:t>
@@ -4202,10 +4835,10 @@
         <w:t xml:space="preserve">.</w:t>
       </w:r>
     </w:p>
-    <w:bookmarkEnd w:id="30"/>
-    <w:bookmarkEnd w:id="31"/>
-    <w:bookmarkEnd w:id="32"/>
-    <w:bookmarkStart w:id="40" w:name="Xe6c88c177e563d1f046037569009a36fd08f4bd"/>
+    <w:bookmarkEnd w:id="37"/>
+    <w:bookmarkEnd w:id="38"/>
+    <w:bookmarkEnd w:id="39"/>
+    <w:bookmarkStart w:id="47" w:name="Xe6c88c177e563d1f046037569009a36fd08f4bd"/>
     <w:p>
       <w:pPr>
         <w:pStyle w:val="Heading2"/>
@@ -4468,7 +5101,7 @@
       <w:r>
         <w:t xml:space="preserve"> </w:t>
       </w:r>
-      <w:hyperlink r:id="rId33">
+      <w:hyperlink r:id="rId40">
         <w:r>
           <w:rPr>
             <w:rStyle w:val="Hyperlink"/>
@@ -4719,7 +5352,7 @@
         <w:t xml:space="preserve">is an ordinary step, not the pattern to avoid.</w:t>
       </w:r>
     </w:p>
-    <w:bookmarkStart w:id="34" w:name="def-sample-mean"/>
+    <w:bookmarkStart w:id="41" w:name="def-sample-mean"/>
     <w:p>
       <w:pPr>
         <w:pStyle w:val="FirstParagraph"/>
@@ -4904,8 +5537,8 @@
         </m:oMath>
       </m:oMathPara>
     </w:p>
-    <w:bookmarkEnd w:id="34"/>
-    <w:bookmarkStart w:id="35" w:name="exr-sum-deviations"/>
+    <w:bookmarkEnd w:id="41"/>
+    <w:bookmarkStart w:id="42" w:name="exr-sum-deviations"/>
     <w:p>
       <w:pPr>
         <w:pStyle w:val="FirstParagraph"/>
@@ -5048,8 +5681,8 @@
         <w:t xml:space="preserve">).</w:t>
       </w:r>
     </w:p>
-    <w:bookmarkEnd w:id="35"/>
-    <w:bookmarkStart w:id="36" w:name="sol-sum-deviations"/>
+    <w:bookmarkEnd w:id="42"/>
+    <w:bookmarkStart w:id="43" w:name="sol-sum-deviations"/>
     <w:p>
       <w:pPr>
         <w:pStyle w:val="BodyText"/>
@@ -5500,8 +6133,8 @@
         </m:oMath>
       </m:oMathPara>
     </w:p>
-    <w:bookmarkEnd w:id="36"/>
-    <w:bookmarkStart w:id="37" w:name="thm-sum-deviations"/>
+    <w:bookmarkEnd w:id="43"/>
+    <w:bookmarkStart w:id="44" w:name="thm-sum-deviations"/>
     <w:p>
       <w:pPr>
         <w:pStyle w:val="FirstParagraph"/>
@@ -5707,7 +6340,7 @@
         </m:oMath>
       </m:oMathPara>
     </w:p>
-    <w:bookmarkEnd w:id="37"/>
+    <w:bookmarkEnd w:id="44"/>
     <w:p>
       <w:pPr>
         <w:pStyle w:val="FirstParagraph"/>
@@ -5737,7 +6370,7 @@
         <w:t xml:space="preserve">derives this result.</w:t>
       </w:r>
     </w:p>
-    <w:bookmarkStart w:id="38" w:name="exm-derivation-direction"/>
+    <w:bookmarkStart w:id="45" w:name="exm-derivation-direction"/>
     <w:p>
       <w:pPr>
         <w:pStyle w:val="BodyText"/>
@@ -5747,7 +6380,7 @@
           <w:b/>
           <w:bCs/>
         </w:rPr>
-        <w:t xml:space="preserve">Example 7 (Deriving an equality from the side that simplifies)</w:t>
+        <w:t xml:space="preserve">Example 14 (Deriving an equality from the side that simplifies)</w:t>
       </w:r>
       <w:r>
         <w:t xml:space="preserve"> </w:t>
@@ -6801,7 +7434,7 @@
       <w:r>
         <w:t xml:space="preserve"> </w:t>
       </w:r>
-      <w:hyperlink r:id="rId33">
+      <w:hyperlink r:id="rId40">
         <w:r>
           <w:rPr>
             <w:rStyle w:val="Hyperlink"/>
@@ -6813,8 +7446,8 @@
         <w:t xml:space="preserve">).</w:t>
       </w:r>
     </w:p>
-    <w:bookmarkEnd w:id="38"/>
-    <w:bookmarkStart w:id="39" w:name="exm-one-result-per-theorem"/>
+    <w:bookmarkEnd w:id="45"/>
+    <w:bookmarkStart w:id="46" w:name="exm-one-result-per-theorem"/>
     <w:p>
       <w:pPr>
         <w:pStyle w:val="BodyText"/>
@@ -6824,7 +7457,7 @@
           <w:b/>
           <w:bCs/>
         </w:rPr>
-        <w:t xml:space="preserve">Example 8 (Splitting a theorem that states two results)</w:t>
+        <w:t xml:space="preserve">Example 15 (Splitting a theorem that states two results)</w:t>
       </w:r>
       <w:r>
         <w:t xml:space="preserve"> </w:t>
@@ -7298,8 +7931,8 @@
         <w:t xml:space="preserve">and a later step that uses only the first can cite only the first.</w:t>
       </w:r>
     </w:p>
-    <w:bookmarkEnd w:id="39"/>
-    <w:bookmarkEnd w:id="40"/>
+    <w:bookmarkEnd w:id="46"/>
+    <w:bookmarkEnd w:id="47"/>
     <w:sectPr>
       <w:footnotePr>
         <w:numRestart w:val="eachSect"/>

</xml_diff>

<commit_message>
Deploying to gh-pages from @ Morrison-Lab/psw@d1fe12d54878b52ed38fa1251f64c8efda785bc4 🚀
</commit_message>
<xml_diff>
--- a/chapters/defining-terms.docx
+++ b/chapters/defining-terms.docx
@@ -15,7 +15,7 @@
         <w:pStyle w:val="Date"/>
       </w:pPr>
       <w:r>
-        <w:t xml:space="preserve">Last modified: 2026-10-05 19:13:31 (UTC)</w:t>
+        <w:t xml:space="preserve">Last modified: 2026-10-05 19:21:40 (UTC)</w:t>
       </w:r>
     </w:p>
     <w:p>
@@ -1623,6 +1623,406 @@
       </w:r>
       <w:r>
         <w:t xml:space="preserve">and hides that the model is a statement about the outcome’s distribution.</w:t>
+      </w:r>
+    </w:p>
+    <w:p>
+      <w:pPr>
+        <w:numPr>
+          <w:ilvl w:val="0"/>
+          <w:numId w:val="1001"/>
+        </w:numPr>
+      </w:pPr>
+      <w:r>
+        <w:rPr>
+          <w:b/>
+          <w:bCs/>
+        </w:rPr>
+        <w:t xml:space="preserve">Define a probability distribution by its density or mass function:</w:t>
+      </w:r>
+      <w:r>
+        <w:t xml:space="preserve"> </w:t>
+      </w:r>
+      <w:r>
+        <w:t xml:space="preserve">Define a named distribution directly,</w:t>
+      </w:r>
+      <w:r>
+        <w:t xml:space="preserve"> </w:t>
+      </w:r>
+      <w:r>
+        <w:t xml:space="preserve">by its probability density function (pdf) or probability mass function (pmf)</w:t>
+      </w:r>
+      <w:r>
+        <w:t xml:space="preserve"> </w:t>
+      </w:r>
+      <w:r>
+        <w:t xml:space="preserve">and its support.</w:t>
+      </w:r>
+      <w:r>
+        <w:t xml:space="preserve"> </w:t>
+      </w:r>
+      <w:r>
+        <w:t xml:space="preserve">State any relationship to other distributions as a theorem</w:t>
+      </w:r>
+      <w:r>
+        <w:t xml:space="preserve"> </w:t>
+      </w:r>
+      <w:r>
+        <w:t xml:space="preserve">proved from those definitions.</w:t>
+      </w:r>
+      <w:r>
+        <w:t xml:space="preserve"> </w:t>
+      </w:r>
+      <w:r>
+        <w:t xml:space="preserve">For example, define the chi-square distribution with</w:t>
+      </w:r>
+      <w:r>
+        <w:t xml:space="preserve"> </w:t>
+      </w:r>
+      <m:oMath>
+        <m:r>
+          <m:t>k</m:t>
+        </m:r>
+      </m:oMath>
+      <w:r>
+        <w:t xml:space="preserve"> </w:t>
+      </w:r>
+      <w:r>
+        <w:t xml:space="preserve">degrees of freedom</w:t>
+      </w:r>
+      <w:r>
+        <w:t xml:space="preserve"> </w:t>
+      </w:r>
+      <w:r>
+        <w:t xml:space="preserve">by its pdf</w:t>
+      </w:r>
+    </w:p>
+    <w:p>
+      <w:pPr>
+        <w:pStyle w:val="BodyText"/>
+      </w:pPr>
+      <m:oMathPara>
+        <m:oMathParaPr>
+          <m:jc m:val="center"/>
+        </m:oMathParaPr>
+        <m:oMath>
+          <m:r>
+            <m:t>f</m:t>
+          </m:r>
+          <m:r>
+            <m:rPr>
+              <m:sty m:val="p"/>
+            </m:rPr>
+            <m:t>(</m:t>
+          </m:r>
+          <m:r>
+            <m:t>x</m:t>
+          </m:r>
+          <m:r>
+            <m:rPr>
+              <m:sty m:val="p"/>
+            </m:rPr>
+            <m:t>)</m:t>
+          </m:r>
+          <m:box>
+            <m:boxPr>
+              <m:opEmu m:val="on"/>
+            </m:boxPr>
+            <m:e>
+              <m:r>
+                <m:rPr>
+                  <m:sty m:val="p"/>
+                </m:rPr>
+                <m:t>:=</m:t>
+              </m:r>
+            </m:e>
+          </m:box>
+          <m:f>
+            <m:fPr>
+              <m:type m:val="bar"/>
+            </m:fPr>
+            <m:num>
+              <m:sSup>
+                <m:e>
+                  <m:r>
+                    <m:t>x</m:t>
+                  </m:r>
+                </m:e>
+                <m:sup>
+                  <m:r>
+                    <m:t>k</m:t>
+                  </m:r>
+                  <m:r>
+                    <m:rPr>
+                      <m:sty m:val="p"/>
+                    </m:rPr>
+                    <m:t>/</m:t>
+                  </m:r>
+                  <m:r>
+                    <m:t>2</m:t>
+                  </m:r>
+                  <m:r>
+                    <m:rPr>
+                      <m:sty m:val="p"/>
+                    </m:rPr>
+                    <m:t>−</m:t>
+                  </m:r>
+                  <m:r>
+                    <m:t>1</m:t>
+                  </m:r>
+                </m:sup>
+              </m:sSup>
+              <m:sSup>
+                <m:e>
+                  <m:r>
+                    <m:t>e</m:t>
+                  </m:r>
+                </m:e>
+                <m:sup>
+                  <m:r>
+                    <m:rPr>
+                      <m:sty m:val="p"/>
+                    </m:rPr>
+                    <m:t>−</m:t>
+                  </m:r>
+                  <m:r>
+                    <m:t>x</m:t>
+                  </m:r>
+                  <m:r>
+                    <m:rPr>
+                      <m:sty m:val="p"/>
+                    </m:rPr>
+                    <m:t>/</m:t>
+                  </m:r>
+                  <m:r>
+                    <m:t>2</m:t>
+                  </m:r>
+                </m:sup>
+              </m:sSup>
+            </m:num>
+            <m:den>
+              <m:sSup>
+                <m:e>
+                  <m:r>
+                    <m:t>2</m:t>
+                  </m:r>
+                </m:e>
+                <m:sup>
+                  <m:r>
+                    <m:t>k</m:t>
+                  </m:r>
+                  <m:r>
+                    <m:rPr>
+                      <m:sty m:val="p"/>
+                    </m:rPr>
+                    <m:t>/</m:t>
+                  </m:r>
+                  <m:r>
+                    <m:t>2</m:t>
+                  </m:r>
+                </m:sup>
+              </m:sSup>
+              <m:r>
+                <m:t> </m:t>
+              </m:r>
+              <m:r>
+                <m:rPr>
+                  <m:sty m:val="p"/>
+                </m:rPr>
+                <m:t>Γ</m:t>
+              </m:r>
+              <m:r>
+                <m:rPr>
+                  <m:sty m:val="p"/>
+                </m:rPr>
+                <m:t>(</m:t>
+              </m:r>
+              <m:r>
+                <m:t>k</m:t>
+              </m:r>
+              <m:r>
+                <m:rPr>
+                  <m:sty m:val="p"/>
+                </m:rPr>
+                <m:t>/</m:t>
+              </m:r>
+              <m:r>
+                <m:t>2</m:t>
+              </m:r>
+              <m:r>
+                <m:rPr>
+                  <m:sty m:val="p"/>
+                </m:rPr>
+                <m:t>)</m:t>
+              </m:r>
+            </m:den>
+          </m:f>
+          <m:r>
+            <m:rPr>
+              <m:sty m:val="p"/>
+            </m:rPr>
+            <m:t>,</m:t>
+          </m:r>
+          <m:r>
+            <m:t> </m:t>
+          </m:r>
+          <m:r>
+            <m:t>x</m:t>
+          </m:r>
+          <m:r>
+            <m:rPr>
+              <m:sty m:val="p"/>
+            </m:rPr>
+            <m:t>∈</m:t>
+          </m:r>
+          <m:r>
+            <m:rPr>
+              <m:sty m:val="p"/>
+            </m:rPr>
+            <m:t>(</m:t>
+          </m:r>
+          <m:r>
+            <m:t>0</m:t>
+          </m:r>
+          <m:r>
+            <m:rPr>
+              <m:sty m:val="p"/>
+            </m:rPr>
+            <m:t>,</m:t>
+          </m:r>
+          <m:r>
+            <m:rPr>
+              <m:sty m:val="p"/>
+            </m:rPr>
+            <m:t>∞</m:t>
+          </m:r>
+          <m:r>
+            <m:rPr>
+              <m:sty m:val="p"/>
+            </m:rPr>
+            <m:t>)</m:t>
+          </m:r>
+          <m:r>
+            <m:rPr>
+              <m:sty m:val="p"/>
+            </m:rPr>
+            <m:t>,</m:t>
+          </m:r>
+        </m:oMath>
+      </m:oMathPara>
+    </w:p>
+    <w:p>
+      <w:pPr>
+        <w:numPr>
+          <w:ilvl w:val="0"/>
+          <w:numId w:val="1000"/>
+        </w:numPr>
+      </w:pPr>
+      <w:r>
+        <w:t xml:space="preserve">and state as a theorem that, for a positive integer</w:t>
+      </w:r>
+      <w:r>
+        <w:t xml:space="preserve"> </w:t>
+      </w:r>
+      <m:oMath>
+        <m:r>
+          <m:t>k</m:t>
+        </m:r>
+      </m:oMath>
+      <w:r>
+        <w:t xml:space="preserve">,</w:t>
+      </w:r>
+      <w:r>
+        <w:t xml:space="preserve"> </w:t>
+      </w:r>
+      <w:r>
+        <w:t xml:space="preserve">the sum of the squares of</w:t>
+      </w:r>
+      <w:r>
+        <w:t xml:space="preserve"> </w:t>
+      </w:r>
+      <m:oMath>
+        <m:r>
+          <m:t>k</m:t>
+        </m:r>
+      </m:oMath>
+      <w:r>
+        <w:t xml:space="preserve"> </w:t>
+      </w:r>
+      <w:r>
+        <w:t xml:space="preserve">independent standard normal random variables</w:t>
+      </w:r>
+      <w:r>
+        <w:t xml:space="preserve"> </w:t>
+      </w:r>
+      <w:r>
+        <w:t xml:space="preserve">has this distribution.</w:t>
+      </w:r>
+      <w:r>
+        <w:t xml:space="preserve"> </w:t>
+      </w:r>
+      <w:r>
+        <w:t xml:space="preserve">The density is defined for every real</w:t>
+      </w:r>
+      <w:r>
+        <w:t xml:space="preserve"> </w:t>
+      </w:r>
+      <m:oMath>
+        <m:r>
+          <m:t>k</m:t>
+        </m:r>
+        <m:r>
+          <m:rPr>
+            <m:sty m:val="p"/>
+          </m:rPr>
+          <m:t>&gt;</m:t>
+        </m:r>
+        <m:r>
+          <m:t>0</m:t>
+        </m:r>
+      </m:oMath>
+      <w:r>
+        <w:t xml:space="preserve">;</w:t>
+      </w:r>
+      <w:r>
+        <w:t xml:space="preserve"> </w:t>
+      </w:r>
+      <w:r>
+        <w:t xml:space="preserve">the theorem covers only integer</w:t>
+      </w:r>
+      <w:r>
+        <w:t xml:space="preserve"> </w:t>
+      </w:r>
+      <m:oMath>
+        <m:r>
+          <m:t>k</m:t>
+        </m:r>
+      </m:oMath>
+      <w:r>
+        <w:t xml:space="preserve">.</w:t>
+      </w:r>
+      <w:r>
+        <w:t xml:space="preserve"> </w:t>
+      </w:r>
+      <w:r>
+        <w:t xml:space="preserve">Defining the chi-square distribution as that sum</w:t>
+      </w:r>
+      <w:r>
+        <w:t xml:space="preserve"> </w:t>
+      </w:r>
+      <w:r>
+        <w:t xml:space="preserve">turns a result into a definition,</w:t>
+      </w:r>
+      <w:r>
+        <w:t xml:space="preserve"> </w:t>
+      </w:r>
+      <w:r>
+        <w:t xml:space="preserve">and leaves the reader without the density</w:t>
+      </w:r>
+      <w:r>
+        <w:t xml:space="preserve"> </w:t>
+      </w:r>
+      <w:r>
+        <w:t xml:space="preserve">that later calculations need.</w:t>
       </w:r>
     </w:p>
     <w:p>

</xml_diff>

<commit_message>
Deploying to gh-pages from @ Morrison-Lab/psw@1d2aa6e0204dd22ff33184b8d00fc8f7fe9d3eeb 🚀
</commit_message>
<xml_diff>
--- a/chapters/defining-terms.docx
+++ b/chapters/defining-terms.docx
@@ -15,7 +15,7 @@
         <w:pStyle w:val="Date"/>
       </w:pPr>
       <w:r>
-        <w:t xml:space="preserve">Last modified: 2026-10-05 21:53:36 (UTC)</w:t>
+        <w:t xml:space="preserve">Last modified: 2026-10-06 23:46:06 (UTC)</w:t>
       </w:r>
     </w:p>
     <w:p>
@@ -2577,6 +2577,799 @@
       </w:hyperlink>
       <w:r>
         <w:t xml:space="preserve">).</w:t>
+      </w:r>
+    </w:p>
+    <w:p>
+      <w:pPr>
+        <w:numPr>
+          <w:ilvl w:val="0"/>
+          <w:numId w:val="1001"/>
+        </w:numPr>
+      </w:pPr>
+      <w:r>
+        <w:rPr>
+          <w:b/>
+          <w:bCs/>
+        </w:rPr>
+        <w:t xml:space="preserve">Distinguish estimands from estimators:</w:t>
+      </w:r>
+      <w:r>
+        <w:t xml:space="preserve"> </w:t>
+      </w:r>
+      <w:r>
+        <w:t xml:space="preserve">An</w:t>
+      </w:r>
+      <w:r>
+        <w:t xml:space="preserve"> </w:t>
+      </w:r>
+      <w:r>
+        <w:rPr>
+          <w:i/>
+          <w:iCs/>
+        </w:rPr>
+        <w:t xml:space="preserve">estimand</w:t>
+      </w:r>
+      <w:r>
+        <w:t xml:space="preserve"> </w:t>
+      </w:r>
+      <w:r>
+        <w:t xml:space="preserve">is the quantity a study is after,</w:t>
+      </w:r>
+      <w:r>
+        <w:t xml:space="preserve"> </w:t>
+      </w:r>
+      <w:r>
+        <w:t xml:space="preserve">defined on the population or the data-generating distribution;</w:t>
+      </w:r>
+      <w:r>
+        <w:t xml:space="preserve"> </w:t>
+      </w:r>
+      <w:r>
+        <w:t xml:space="preserve">an</w:t>
+      </w:r>
+      <w:r>
+        <w:t xml:space="preserve"> </w:t>
+      </w:r>
+      <w:r>
+        <w:rPr>
+          <w:i/>
+          <w:iCs/>
+        </w:rPr>
+        <w:t xml:space="preserve">estimator</w:t>
+      </w:r>
+      <w:r>
+        <w:t xml:space="preserve"> </w:t>
+      </w:r>
+      <w:r>
+        <w:t xml:space="preserve">is the rule that computes an estimate of it from a sample.</w:t>
+      </w:r>
+      <w:r>
+        <w:t xml:space="preserve"> </w:t>
+      </w:r>
+      <w:r>
+        <w:t xml:space="preserve">Define a quantity first as its estimand,</w:t>
+      </w:r>
+      <w:r>
+        <w:t xml:space="preserve"> </w:t>
+      </w:r>
+      <w:r>
+        <w:t xml:space="preserve">then give the estimator that targets it,</w:t>
+      </w:r>
+      <w:r>
+        <w:t xml:space="preserve"> </w:t>
+      </w:r>
+      <w:r>
+        <w:t xml:space="preserve">and keep the two in separate notation (for example,</w:t>
+      </w:r>
+      <w:r>
+        <w:t xml:space="preserve"> </w:t>
+      </w:r>
+      <m:oMath>
+        <m:r>
+          <m:t>θ</m:t>
+        </m:r>
+      </m:oMath>
+      <w:r>
+        <w:t xml:space="preserve"> </w:t>
+      </w:r>
+      <w:r>
+        <w:t xml:space="preserve">and</w:t>
+      </w:r>
+      <w:r>
+        <w:t xml:space="preserve"> </w:t>
+      </w:r>
+      <m:oMath>
+        <m:acc>
+          <m:accPr>
+            <m:chr m:val="̂"/>
+          </m:accPr>
+          <m:e>
+            <m:r>
+              <m:t>θ</m:t>
+            </m:r>
+          </m:e>
+        </m:acc>
+      </m:oMath>
+      <w:r>
+        <w:t xml:space="preserve">).</w:t>
+      </w:r>
+      <w:r>
+        <w:t xml:space="preserve"> </w:t>
+      </w:r>
+      <w:r>
+        <w:t xml:space="preserve">A definition that gives only the sample formula</w:t>
+      </w:r>
+      <w:r>
+        <w:t xml:space="preserve"> </w:t>
+      </w:r>
+      <w:r>
+        <w:t xml:space="preserve">hides what the formula estimates,</w:t>
+      </w:r>
+      <w:r>
+        <w:t xml:space="preserve"> </w:t>
+      </w:r>
+      <w:r>
+        <w:t xml:space="preserve">and invites the reader to treat one sample’s value as the quantity itself.</w:t>
+      </w:r>
+      <w:r>
+        <w:t xml:space="preserve"> </w:t>
+      </w:r>
+      <w:r>
+        <w:t xml:space="preserve">When several related quantities are defined together,</w:t>
+      </w:r>
+      <w:r>
+        <w:t xml:space="preserve"> </w:t>
+      </w:r>
+      <w:r>
+        <w:t xml:space="preserve">give a table with one row per quantity and a column each for its name,</w:t>
+      </w:r>
+      <w:r>
+        <w:t xml:space="preserve"> </w:t>
+      </w:r>
+      <w:r>
+        <w:t xml:space="preserve">its estimand and its estimator.</w:t>
+      </w:r>
+      <w:r>
+        <w:t xml:space="preserve"> </w:t>
+      </w:r>
+      <w:r>
+        <w:t xml:space="preserve">For a binary classifier with prediction</w:t>
+      </w:r>
+      <w:r>
+        <w:t xml:space="preserve"> </w:t>
+      </w:r>
+      <m:oMath>
+        <m:acc>
+          <m:accPr>
+            <m:chr m:val="̂"/>
+          </m:accPr>
+          <m:e>
+            <m:r>
+              <m:t>Y</m:t>
+            </m:r>
+          </m:e>
+        </m:acc>
+      </m:oMath>
+      <w:r>
+        <w:t xml:space="preserve"> </w:t>
+      </w:r>
+      <w:r>
+        <w:t xml:space="preserve">of the true class</w:t>
+      </w:r>
+      <w:r>
+        <w:t xml:space="preserve"> </w:t>
+      </w:r>
+      <m:oMath>
+        <m:r>
+          <m:t>Y</m:t>
+        </m:r>
+      </m:oMath>
+      <w:r>
+        <w:t xml:space="preserve">,</w:t>
+      </w:r>
+      <w:r>
+        <w:t xml:space="preserve"> </w:t>
+      </w:r>
+      <w:r>
+        <w:t xml:space="preserve">and counts</w:t>
+      </w:r>
+      <w:r>
+        <w:t xml:space="preserve"> </w:t>
+      </w:r>
+      <m:oMath>
+        <m:r>
+          <m:rPr>
+            <m:nor/>
+            <m:sty m:val="p"/>
+          </m:rPr>
+          <m:t>TP</m:t>
+        </m:r>
+      </m:oMath>
+      <w:r>
+        <w:t xml:space="preserve">,</w:t>
+      </w:r>
+      <w:r>
+        <w:t xml:space="preserve"> </w:t>
+      </w:r>
+      <m:oMath>
+        <m:r>
+          <m:rPr>
+            <m:nor/>
+            <m:sty m:val="p"/>
+          </m:rPr>
+          <m:t>FP</m:t>
+        </m:r>
+      </m:oMath>
+      <w:r>
+        <w:t xml:space="preserve">,</w:t>
+      </w:r>
+      <w:r>
+        <w:t xml:space="preserve"> </w:t>
+      </w:r>
+      <m:oMath>
+        <m:r>
+          <m:rPr>
+            <m:nor/>
+            <m:sty m:val="p"/>
+          </m:rPr>
+          <m:t>FN</m:t>
+        </m:r>
+      </m:oMath>
+      <w:r>
+        <w:t xml:space="preserve"> </w:t>
+      </w:r>
+      <w:r>
+        <w:t xml:space="preserve">and</w:t>
+      </w:r>
+      <w:r>
+        <w:t xml:space="preserve"> </w:t>
+      </w:r>
+      <m:oMath>
+        <m:r>
+          <m:rPr>
+            <m:nor/>
+            <m:sty m:val="p"/>
+          </m:rPr>
+          <m:t>TN</m:t>
+        </m:r>
+      </m:oMath>
+      <w:r>
+        <w:t xml:space="preserve"> </w:t>
+      </w:r>
+      <w:r>
+        <w:t xml:space="preserve">from a test set of size</w:t>
+      </w:r>
+      <w:r>
+        <w:t xml:space="preserve"> </w:t>
+      </w:r>
+      <m:oMath>
+        <m:r>
+          <m:t>n</m:t>
+        </m:r>
+      </m:oMath>
+      <w:r>
+        <w:t xml:space="preserve">:</w:t>
+      </w:r>
+    </w:p>
+    <w:tbl>
+      <w:tblPr>
+        <w:tblStyle w:val="Table"/>
+        <w:tblW w:type="pct" w:w="5000"/>
+        <w:jc w:val="left"/>
+        <w:tblInd w:w="720" w:type="dxa"/>
+        <w:tblLayout w:type="fixed"/>
+        <w:tblLook w:firstRow="1" w:lastRow="0" w:firstColumn="0" w:lastColumn="0" w:noHBand="0" w:noVBand="0" w:val="0020"/>
+      </w:tblPr>
+      <w:tblGrid>
+        <w:gridCol w:w="2640"/>
+        <w:gridCol w:w="2640"/>
+        <w:gridCol w:w="2640"/>
+      </w:tblGrid>
+      <w:tr>
+        <w:trPr>
+          <w:tblHeader w:val="on"/>
+        </w:trPr>
+        <w:tc>
+          <w:tcPr/>
+          <w:p>
+            <w:pPr>
+              <w:pStyle w:val="Compact"/>
+            </w:pPr>
+            <w:r>
+              <w:t xml:space="preserve">Name</w:t>
+            </w:r>
+          </w:p>
+        </w:tc>
+        <w:tc>
+          <w:tcPr/>
+          <w:p>
+            <w:pPr>
+              <w:pStyle w:val="Compact"/>
+            </w:pPr>
+            <w:r>
+              <w:t xml:space="preserve">Estimand</w:t>
+            </w:r>
+          </w:p>
+        </w:tc>
+        <w:tc>
+          <w:tcPr/>
+          <w:p>
+            <w:pPr>
+              <w:pStyle w:val="Compact"/>
+            </w:pPr>
+            <w:r>
+              <w:t xml:space="preserve">Estimator</w:t>
+            </w:r>
+          </w:p>
+        </w:tc>
+      </w:tr>
+      <w:tr>
+        <w:tc>
+          <w:tcPr/>
+          <w:p>
+            <w:pPr>
+              <w:pStyle w:val="Compact"/>
+            </w:pPr>
+            <w:r>
+              <w:t xml:space="preserve">Accuracy</w:t>
+            </w:r>
+          </w:p>
+        </w:tc>
+        <w:tc>
+          <w:tcPr/>
+          <w:p>
+            <w:pPr>
+              <w:pStyle w:val="Compact"/>
+            </w:pPr>
+            <m:oMath>
+              <m:r>
+                <m:rPr>
+                  <m:sty m:val="p"/>
+                </m:rPr>
+                <m:t>Pr</m:t>
+              </m:r>
+              <m:r>
+                <m:rPr>
+                  <m:sty m:val="p"/>
+                </m:rPr>
+                <m:t>(</m:t>
+              </m:r>
+              <m:acc>
+                <m:accPr>
+                  <m:chr m:val="̂"/>
+                </m:accPr>
+                <m:e>
+                  <m:r>
+                    <m:t>Y</m:t>
+                  </m:r>
+                </m:e>
+              </m:acc>
+              <m:r>
+                <m:rPr>
+                  <m:sty m:val="p"/>
+                </m:rPr>
+                <m:t>=</m:t>
+              </m:r>
+              <m:r>
+                <m:t>Y</m:t>
+              </m:r>
+              <m:r>
+                <m:rPr>
+                  <m:sty m:val="p"/>
+                </m:rPr>
+                <m:t>)</m:t>
+              </m:r>
+            </m:oMath>
+            <w:r>
+              <w:t xml:space="preserve">​</w:t>
+            </w:r>
+          </w:p>
+        </w:tc>
+        <w:tc>
+          <w:tcPr/>
+          <w:p>
+            <w:pPr>
+              <w:pStyle w:val="Compact"/>
+            </w:pPr>
+            <m:oMath>
+              <m:r>
+                <m:rPr>
+                  <m:sty m:val="p"/>
+                </m:rPr>
+                <m:t>(</m:t>
+              </m:r>
+              <m:r>
+                <m:rPr>
+                  <m:nor/>
+                  <m:sty m:val="p"/>
+                </m:rPr>
+                <m:t>TP</m:t>
+              </m:r>
+              <m:r>
+                <m:rPr>
+                  <m:sty m:val="p"/>
+                </m:rPr>
+                <m:t>+</m:t>
+              </m:r>
+              <m:r>
+                <m:rPr>
+                  <m:nor/>
+                  <m:sty m:val="p"/>
+                </m:rPr>
+                <m:t>TN</m:t>
+              </m:r>
+              <m:r>
+                <m:rPr>
+                  <m:sty m:val="p"/>
+                </m:rPr>
+                <m:t>)</m:t>
+              </m:r>
+              <m:r>
+                <m:rPr>
+                  <m:sty m:val="p"/>
+                </m:rPr>
+                <m:t>/</m:t>
+              </m:r>
+              <m:r>
+                <m:t>n</m:t>
+              </m:r>
+            </m:oMath>
+            <w:r>
+              <w:t xml:space="preserve">​</w:t>
+            </w:r>
+          </w:p>
+        </w:tc>
+      </w:tr>
+      <w:tr>
+        <w:tc>
+          <w:tcPr/>
+          <w:p>
+            <w:pPr>
+              <w:pStyle w:val="Compact"/>
+            </w:pPr>
+            <w:r>
+              <w:t xml:space="preserve">Precision</w:t>
+            </w:r>
+          </w:p>
+        </w:tc>
+        <w:tc>
+          <w:tcPr/>
+          <w:p>
+            <w:pPr>
+              <w:pStyle w:val="Compact"/>
+            </w:pPr>
+            <m:oMath>
+              <m:r>
+                <m:rPr>
+                  <m:sty m:val="p"/>
+                </m:rPr>
+                <m:t>Pr</m:t>
+              </m:r>
+              <m:r>
+                <m:rPr>
+                  <m:sty m:val="p"/>
+                </m:rPr>
+                <m:t>(</m:t>
+              </m:r>
+              <m:r>
+                <m:t>Y</m:t>
+              </m:r>
+              <m:r>
+                <m:rPr>
+                  <m:sty m:val="p"/>
+                </m:rPr>
+                <m:t>=</m:t>
+              </m:r>
+              <m:r>
+                <m:t>1</m:t>
+              </m:r>
+              <m:r>
+                <m:rPr>
+                  <m:sty m:val="p"/>
+                </m:rPr>
+                <m:t>∣</m:t>
+              </m:r>
+              <m:acc>
+                <m:accPr>
+                  <m:chr m:val="̂"/>
+                </m:accPr>
+                <m:e>
+                  <m:r>
+                    <m:t>Y</m:t>
+                  </m:r>
+                </m:e>
+              </m:acc>
+              <m:r>
+                <m:rPr>
+                  <m:sty m:val="p"/>
+                </m:rPr>
+                <m:t>=</m:t>
+              </m:r>
+              <m:r>
+                <m:t>1</m:t>
+              </m:r>
+              <m:r>
+                <m:rPr>
+                  <m:sty m:val="p"/>
+                </m:rPr>
+                <m:t>)</m:t>
+              </m:r>
+            </m:oMath>
+            <w:r>
+              <w:t xml:space="preserve">​</w:t>
+            </w:r>
+          </w:p>
+        </w:tc>
+        <w:tc>
+          <w:tcPr/>
+          <w:p>
+            <w:pPr>
+              <w:pStyle w:val="Compact"/>
+            </w:pPr>
+            <m:oMath>
+              <m:r>
+                <m:rPr>
+                  <m:nor/>
+                  <m:sty m:val="p"/>
+                </m:rPr>
+                <m:t>TP</m:t>
+              </m:r>
+              <m:r>
+                <m:rPr>
+                  <m:sty m:val="p"/>
+                </m:rPr>
+                <m:t>/</m:t>
+              </m:r>
+              <m:r>
+                <m:rPr>
+                  <m:sty m:val="p"/>
+                </m:rPr>
+                <m:t>(</m:t>
+              </m:r>
+              <m:r>
+                <m:rPr>
+                  <m:nor/>
+                  <m:sty m:val="p"/>
+                </m:rPr>
+                <m:t>TP</m:t>
+              </m:r>
+              <m:r>
+                <m:rPr>
+                  <m:sty m:val="p"/>
+                </m:rPr>
+                <m:t>+</m:t>
+              </m:r>
+              <m:r>
+                <m:rPr>
+                  <m:nor/>
+                  <m:sty m:val="p"/>
+                </m:rPr>
+                <m:t>FP</m:t>
+              </m:r>
+              <m:r>
+                <m:rPr>
+                  <m:sty m:val="p"/>
+                </m:rPr>
+                <m:t>)</m:t>
+              </m:r>
+            </m:oMath>
+            <w:r>
+              <w:t xml:space="preserve">​</w:t>
+            </w:r>
+          </w:p>
+        </w:tc>
+      </w:tr>
+      <w:tr>
+        <w:tc>
+          <w:tcPr/>
+          <w:p>
+            <w:pPr>
+              <w:pStyle w:val="Compact"/>
+            </w:pPr>
+            <w:r>
+              <w:t xml:space="preserve">Recall</w:t>
+            </w:r>
+          </w:p>
+        </w:tc>
+        <w:tc>
+          <w:tcPr/>
+          <w:p>
+            <w:pPr>
+              <w:pStyle w:val="Compact"/>
+            </w:pPr>
+            <m:oMath>
+              <m:r>
+                <m:rPr>
+                  <m:sty m:val="p"/>
+                </m:rPr>
+                <m:t>Pr</m:t>
+              </m:r>
+              <m:r>
+                <m:rPr>
+                  <m:sty m:val="p"/>
+                </m:rPr>
+                <m:t>(</m:t>
+              </m:r>
+              <m:acc>
+                <m:accPr>
+                  <m:chr m:val="̂"/>
+                </m:accPr>
+                <m:e>
+                  <m:r>
+                    <m:t>Y</m:t>
+                  </m:r>
+                </m:e>
+              </m:acc>
+              <m:r>
+                <m:rPr>
+                  <m:sty m:val="p"/>
+                </m:rPr>
+                <m:t>=</m:t>
+              </m:r>
+              <m:r>
+                <m:t>1</m:t>
+              </m:r>
+              <m:r>
+                <m:rPr>
+                  <m:sty m:val="p"/>
+                </m:rPr>
+                <m:t>∣</m:t>
+              </m:r>
+              <m:r>
+                <m:t>Y</m:t>
+              </m:r>
+              <m:r>
+                <m:rPr>
+                  <m:sty m:val="p"/>
+                </m:rPr>
+                <m:t>=</m:t>
+              </m:r>
+              <m:r>
+                <m:t>1</m:t>
+              </m:r>
+              <m:r>
+                <m:rPr>
+                  <m:sty m:val="p"/>
+                </m:rPr>
+                <m:t>)</m:t>
+              </m:r>
+            </m:oMath>
+            <w:r>
+              <w:t xml:space="preserve">​</w:t>
+            </w:r>
+          </w:p>
+        </w:tc>
+        <w:tc>
+          <w:tcPr/>
+          <w:p>
+            <w:pPr>
+              <w:pStyle w:val="Compact"/>
+            </w:pPr>
+            <m:oMath>
+              <m:r>
+                <m:rPr>
+                  <m:nor/>
+                  <m:sty m:val="p"/>
+                </m:rPr>
+                <m:t>TP</m:t>
+              </m:r>
+              <m:r>
+                <m:rPr>
+                  <m:sty m:val="p"/>
+                </m:rPr>
+                <m:t>/</m:t>
+              </m:r>
+              <m:r>
+                <m:rPr>
+                  <m:sty m:val="p"/>
+                </m:rPr>
+                <m:t>(</m:t>
+              </m:r>
+              <m:r>
+                <m:rPr>
+                  <m:nor/>
+                  <m:sty m:val="p"/>
+                </m:rPr>
+                <m:t>TP</m:t>
+              </m:r>
+              <m:r>
+                <m:rPr>
+                  <m:sty m:val="p"/>
+                </m:rPr>
+                <m:t>+</m:t>
+              </m:r>
+              <m:r>
+                <m:rPr>
+                  <m:nor/>
+                  <m:sty m:val="p"/>
+                </m:rPr>
+                <m:t>FN</m:t>
+              </m:r>
+              <m:r>
+                <m:rPr>
+                  <m:sty m:val="p"/>
+                </m:rPr>
+                <m:t>)</m:t>
+              </m:r>
+            </m:oMath>
+            <w:r>
+              <w:t xml:space="preserve">​</w:t>
+            </w:r>
+          </w:p>
+        </w:tc>
+      </w:tr>
+    </w:tbl>
+    <w:p>
+      <w:pPr>
+        <w:numPr>
+          <w:ilvl w:val="0"/>
+          <w:numId w:val="1000"/>
+        </w:numPr>
+      </w:pPr>
+      <w:r>
+        <w:t xml:space="preserve">The precision of a classifier is a property of the classifier</w:t>
+      </w:r>
+      <w:r>
+        <w:t xml:space="preserve"> </w:t>
+      </w:r>
+      <w:r>
+        <w:t xml:space="preserve">and the population it is used on;</w:t>
+      </w:r>
+      <w:r>
+        <w:t xml:space="preserve"> </w:t>
+      </w:r>
+      <m:oMath>
+        <m:r>
+          <m:rPr>
+            <m:nor/>
+            <m:sty m:val="p"/>
+          </m:rPr>
+          <m:t>TP</m:t>
+        </m:r>
+        <m:r>
+          <m:rPr>
+            <m:sty m:val="p"/>
+          </m:rPr>
+          <m:t>/</m:t>
+        </m:r>
+        <m:r>
+          <m:rPr>
+            <m:sty m:val="p"/>
+          </m:rPr>
+          <m:t>(</m:t>
+        </m:r>
+        <m:r>
+          <m:rPr>
+            <m:nor/>
+            <m:sty m:val="p"/>
+          </m:rPr>
+          <m:t>TP</m:t>
+        </m:r>
+        <m:r>
+          <m:rPr>
+            <m:sty m:val="p"/>
+          </m:rPr>
+          <m:t>+</m:t>
+        </m:r>
+        <m:r>
+          <m:rPr>
+            <m:nor/>
+            <m:sty m:val="p"/>
+          </m:rPr>
+          <m:t>FP</m:t>
+        </m:r>
+        <m:r>
+          <m:rPr>
+            <m:sty m:val="p"/>
+          </m:rPr>
+          <m:t>)</m:t>
+        </m:r>
+      </m:oMath>
+      <w:r>
+        <w:t xml:space="preserve"> </w:t>
+      </w:r>
+      <w:r>
+        <w:t xml:space="preserve">is one test set’s estimate of it.</w:t>
       </w:r>
     </w:p>
     <w:bookmarkEnd w:id="17"/>

</xml_diff>

<commit_message>
Deploying to gh-pages from @ Morrison-Lab/psw@85817f37e7ef6474883cc37b4353503aa5e8b172 🚀
</commit_message>
<xml_diff>
--- a/chapters/defining-terms.docx
+++ b/chapters/defining-terms.docx
@@ -15,7 +15,7 @@
         <w:pStyle w:val="Date"/>
       </w:pPr>
       <w:r>
-        <w:t xml:space="preserve">Last modified: 2026-10-09 10:13:16 (PDT)</w:t>
+        <w:t xml:space="preserve">Last modified: 2026-10-09 10:37:21 (PDT)</w:t>
       </w:r>
     </w:p>
     <w:p>
@@ -4208,185 +4208,195 @@
       <w:r>
         <w:t xml:space="preserve">) is a function of the two coefficients:</w:t>
       </w:r>
-      <w:r>
-        <w:t xml:space="preserve"> </w:t>
-      </w:r>
-      <m:oMath>
-        <m:r>
-          <m:rPr>
-            <m:nor/>
-            <m:sty m:val="p"/>
-          </m:rPr>
-          <m:t>RSS</m:t>
-        </m:r>
-        <m:r>
-          <m:rPr>
-            <m:sty m:val="p"/>
-          </m:rPr>
-          <m:t>(</m:t>
-        </m:r>
-        <m:sSub>
-          <m:e>
-            <m:r>
-              <m:t>β</m:t>
-            </m:r>
-          </m:e>
-          <m:sub>
-            <m:r>
-              <m:t>0</m:t>
-            </m:r>
-          </m:sub>
-        </m:sSub>
-        <m:r>
-          <m:rPr>
-            <m:sty m:val="p"/>
-          </m:rPr>
-          <m:t>,</m:t>
-        </m:r>
-        <m:sSub>
-          <m:e>
-            <m:r>
-              <m:t>β</m:t>
-            </m:r>
-          </m:e>
-          <m:sub>
-            <m:r>
-              <m:t>x</m:t>
-            </m:r>
-          </m:sub>
-        </m:sSub>
-        <m:r>
-          <m:rPr>
-            <m:sty m:val="p"/>
-          </m:rPr>
-          <m:t>)</m:t>
-        </m:r>
-        <m:r>
-          <m:rPr>
-            <m:sty m:val="p"/>
-          </m:rPr>
-          <m:t>=</m:t>
-        </m:r>
-        <m:nary>
-          <m:naryPr>
-            <m:chr m:val="∑"/>
-            <m:limLoc m:val="undOvr"/>
-            <m:subHide m:val="off"/>
-            <m:supHide m:val="off"/>
-          </m:naryPr>
-          <m:sub>
-            <m:r>
-              <m:t>i</m:t>
-            </m:r>
-            <m:r>
-              <m:rPr>
-                <m:sty m:val="p"/>
-              </m:rPr>
-              <m:t>=</m:t>
-            </m:r>
-            <m:r>
-              <m:t>1</m:t>
-            </m:r>
-          </m:sub>
-          <m:sup>
-            <m:r>
-              <m:t>n</m:t>
-            </m:r>
-          </m:sup>
-          <m:e>
-            <m:r>
-              <m:rPr>
-                <m:sty m:val="p"/>
-              </m:rPr>
-              <m:t>(</m:t>
-            </m:r>
-          </m:e>
-        </m:nary>
-        <m:sSub>
-          <m:e>
-            <m:r>
-              <m:t>y</m:t>
-            </m:r>
-          </m:e>
-          <m:sub>
-            <m:r>
-              <m:t>i</m:t>
-            </m:r>
-          </m:sub>
-        </m:sSub>
-        <m:r>
-          <m:rPr>
-            <m:sty m:val="p"/>
-          </m:rPr>
-          <m:t>−</m:t>
-        </m:r>
-        <m:sSub>
-          <m:e>
-            <m:r>
-              <m:t>β</m:t>
-            </m:r>
-          </m:e>
-          <m:sub>
-            <m:r>
-              <m:t>0</m:t>
-            </m:r>
-          </m:sub>
-        </m:sSub>
-        <m:r>
-          <m:rPr>
-            <m:sty m:val="p"/>
-          </m:rPr>
-          <m:t>−</m:t>
-        </m:r>
-        <m:sSub>
-          <m:e>
-            <m:r>
-              <m:t>β</m:t>
-            </m:r>
-          </m:e>
-          <m:sub>
-            <m:r>
-              <m:t>x</m:t>
-            </m:r>
-          </m:sub>
-        </m:sSub>
-        <m:sSub>
-          <m:e>
-            <m:r>
-              <m:t>x</m:t>
-            </m:r>
-          </m:e>
-          <m:sub>
-            <m:r>
-              <m:t>i</m:t>
-            </m:r>
-          </m:sub>
-        </m:sSub>
-        <m:sSup>
-          <m:e>
-            <m:r>
-              <m:rPr>
-                <m:sty m:val="p"/>
-              </m:rPr>
-              <m:t>)</m:t>
-            </m:r>
-          </m:e>
-          <m:sup>
-            <m:r>
-              <m:t>2</m:t>
-            </m:r>
-          </m:sup>
-        </m:sSup>
-      </m:oMath>
-      <w:r>
-        <w:t xml:space="preserve">.</w:t>
-      </w:r>
+    </w:p>
+    <w:p>
+      <w:pPr>
+        <w:pStyle w:val="BodyText"/>
+      </w:pPr>
+      <m:oMathPara>
+        <m:oMathParaPr>
+          <m:jc m:val="center"/>
+        </m:oMathParaPr>
+        <m:oMath>
+          <m:r>
+            <m:rPr>
+              <m:nor/>
+              <m:sty m:val="p"/>
+            </m:rPr>
+            <m:t>RSS</m:t>
+          </m:r>
+          <m:r>
+            <m:rPr>
+              <m:sty m:val="p"/>
+            </m:rPr>
+            <m:t>(</m:t>
+          </m:r>
+          <m:sSub>
+            <m:e>
+              <m:r>
+                <m:t>β</m:t>
+              </m:r>
+            </m:e>
+            <m:sub>
+              <m:r>
+                <m:t>0</m:t>
+              </m:r>
+            </m:sub>
+          </m:sSub>
+          <m:r>
+            <m:rPr>
+              <m:sty m:val="p"/>
+            </m:rPr>
+            <m:t>,</m:t>
+          </m:r>
+          <m:sSub>
+            <m:e>
+              <m:r>
+                <m:t>β</m:t>
+              </m:r>
+            </m:e>
+            <m:sub>
+              <m:r>
+                <m:t>x</m:t>
+              </m:r>
+            </m:sub>
+          </m:sSub>
+          <m:r>
+            <m:rPr>
+              <m:sty m:val="p"/>
+            </m:rPr>
+            <m:t>)</m:t>
+          </m:r>
+          <m:r>
+            <m:rPr>
+              <m:sty m:val="p"/>
+            </m:rPr>
+            <m:t>=</m:t>
+          </m:r>
+          <m:nary>
+            <m:naryPr>
+              <m:chr m:val="∑"/>
+              <m:limLoc m:val="undOvr"/>
+              <m:subHide m:val="off"/>
+              <m:supHide m:val="off"/>
+            </m:naryPr>
+            <m:sub>
+              <m:r>
+                <m:t>i</m:t>
+              </m:r>
+              <m:r>
+                <m:rPr>
+                  <m:sty m:val="p"/>
+                </m:rPr>
+                <m:t>=</m:t>
+              </m:r>
+              <m:r>
+                <m:t>1</m:t>
+              </m:r>
+            </m:sub>
+            <m:sup>
+              <m:r>
+                <m:t>n</m:t>
+              </m:r>
+            </m:sup>
+            <m:e>
+              <m:r>
+                <m:rPr>
+                  <m:sty m:val="p"/>
+                </m:rPr>
+                <m:t>(</m:t>
+              </m:r>
+            </m:e>
+          </m:nary>
+          <m:sSub>
+            <m:e>
+              <m:r>
+                <m:t>y</m:t>
+              </m:r>
+            </m:e>
+            <m:sub>
+              <m:r>
+                <m:t>i</m:t>
+              </m:r>
+            </m:sub>
+          </m:sSub>
+          <m:r>
+            <m:rPr>
+              <m:sty m:val="p"/>
+            </m:rPr>
+            <m:t>−</m:t>
+          </m:r>
+          <m:sSub>
+            <m:e>
+              <m:r>
+                <m:t>β</m:t>
+              </m:r>
+            </m:e>
+            <m:sub>
+              <m:r>
+                <m:t>0</m:t>
+              </m:r>
+            </m:sub>
+          </m:sSub>
+          <m:r>
+            <m:rPr>
+              <m:sty m:val="p"/>
+            </m:rPr>
+            <m:t>−</m:t>
+          </m:r>
+          <m:sSub>
+            <m:e>
+              <m:r>
+                <m:t>β</m:t>
+              </m:r>
+            </m:e>
+            <m:sub>
+              <m:r>
+                <m:t>x</m:t>
+              </m:r>
+            </m:sub>
+          </m:sSub>
+          <m:sSub>
+            <m:e>
+              <m:r>
+                <m:t>x</m:t>
+              </m:r>
+            </m:e>
+            <m:sub>
+              <m:r>
+                <m:t>i</m:t>
+              </m:r>
+            </m:sub>
+          </m:sSub>
+          <m:sSup>
+            <m:e>
+              <m:r>
+                <m:rPr>
+                  <m:sty m:val="p"/>
+                </m:rPr>
+                <m:t>)</m:t>
+              </m:r>
+            </m:e>
+            <m:sup>
+              <m:r>
+                <m:t>2</m:t>
+              </m:r>
+            </m:sup>
+          </m:sSup>
+          <m:r>
+            <m:rPr>
+              <m:sty m:val="p"/>
+            </m:rPr>
+            <m:t>.</m:t>
+          </m:r>
+        </m:oMath>
+      </m:oMathPara>
     </w:p>
     <w:bookmarkEnd w:id="26"/>
     <w:bookmarkStart w:id="27" w:name="exm-rss-three-points"/>
     <w:p>
       <w:pPr>
-        <w:pStyle w:val="BodyText"/>
+        <w:pStyle w:val="FirstParagraph"/>
       </w:pPr>
       <w:r>
         <w:rPr>
@@ -5798,95 +5808,122 @@
       <w:r>
         <w:t xml:space="preserve">For a triangle with sides 3, 4, and 5:</w:t>
       </w:r>
-      <w:r>
-        <w:t xml:space="preserve"> </w:t>
-      </w:r>
-      <m:oMath>
-        <m:sSup>
-          <m:e>
-            <m:r>
-              <m:t>3</m:t>
-            </m:r>
-          </m:e>
-          <m:sup>
-            <m:r>
-              <m:t>2</m:t>
-            </m:r>
-          </m:sup>
-        </m:sSup>
-        <m:r>
-          <m:rPr>
-            <m:sty m:val="p"/>
-          </m:rPr>
-          <m:t>+</m:t>
-        </m:r>
-        <m:sSup>
-          <m:e>
-            <m:r>
-              <m:t>4</m:t>
-            </m:r>
-          </m:e>
-          <m:sup>
-            <m:r>
-              <m:t>2</m:t>
-            </m:r>
-          </m:sup>
-        </m:sSup>
-        <m:r>
-          <m:rPr>
-            <m:sty m:val="p"/>
-          </m:rPr>
-          <m:t>=</m:t>
-        </m:r>
-        <m:r>
-          <m:t>9</m:t>
-        </m:r>
-        <m:r>
-          <m:rPr>
-            <m:sty m:val="p"/>
-          </m:rPr>
-          <m:t>+</m:t>
-        </m:r>
-        <m:r>
-          <m:t>16</m:t>
-        </m:r>
-        <m:r>
-          <m:rPr>
-            <m:sty m:val="p"/>
-          </m:rPr>
-          <m:t>=</m:t>
-        </m:r>
-        <m:r>
-          <m:t>25</m:t>
-        </m:r>
-        <m:r>
-          <m:rPr>
-            <m:sty m:val="p"/>
-          </m:rPr>
-          <m:t>=</m:t>
-        </m:r>
-        <m:sSup>
-          <m:e>
-            <m:r>
-              <m:t>5</m:t>
-            </m:r>
-          </m:e>
-          <m:sup>
-            <m:r>
-              <m:t>2</m:t>
-            </m:r>
-          </m:sup>
-        </m:sSup>
-      </m:oMath>
-      <w:r>
-        <w:t xml:space="preserve">.</w:t>
-      </w:r>
+    </w:p>
+    <w:p>
+      <w:pPr>
+        <w:pStyle w:val="BodyText"/>
+      </w:pPr>
+      <m:oMathPara>
+        <m:oMathParaPr>
+          <m:jc m:val="center"/>
+        </m:oMathParaPr>
+        <m:oMath>
+          <m:eqArr>
+            <m:e>
+              <m:sSup>
+                <m:e>
+                  <m:r>
+                    <m:t>3</m:t>
+                  </m:r>
+                </m:e>
+                <m:sup>
+                  <m:r>
+                    <m:t>2</m:t>
+                  </m:r>
+                </m:sup>
+              </m:sSup>
+              <m:r>
+                <m:rPr>
+                  <m:sty m:val="p"/>
+                </m:rPr>
+                <m:t>+</m:t>
+              </m:r>
+              <m:sSup>
+                <m:e>
+                  <m:r>
+                    <m:t>4</m:t>
+                  </m:r>
+                </m:e>
+                <m:sup>
+                  <m:r>
+                    <m:t>2</m:t>
+                  </m:r>
+                </m:sup>
+              </m:sSup>
+              <m:r>
+                <m:t>&amp;</m:t>
+              </m:r>
+              <m:r>
+                <m:rPr>
+                  <m:sty m:val="p"/>
+                </m:rPr>
+                <m:t>=</m:t>
+              </m:r>
+              <m:r>
+                <m:t>9</m:t>
+              </m:r>
+              <m:r>
+                <m:rPr>
+                  <m:sty m:val="p"/>
+                </m:rPr>
+                <m:t>+</m:t>
+              </m:r>
+              <m:r>
+                <m:t>16</m:t>
+              </m:r>
+            </m:e>
+            <m:e>
+              <m:r>
+                <m:t>&amp;</m:t>
+              </m:r>
+              <m:r>
+                <m:rPr>
+                  <m:sty m:val="p"/>
+                </m:rPr>
+                <m:t>=</m:t>
+              </m:r>
+              <m:r>
+                <m:t>25</m:t>
+              </m:r>
+            </m:e>
+            <m:e>
+              <m:r>
+                <m:t>&amp;</m:t>
+              </m:r>
+              <m:r>
+                <m:rPr>
+                  <m:sty m:val="p"/>
+                </m:rPr>
+                <m:t>=</m:t>
+              </m:r>
+              <m:sSup>
+                <m:e>
+                  <m:r>
+                    <m:t>5</m:t>
+                  </m:r>
+                </m:e>
+                <m:sup>
+                  <m:r>
+                    <m:t>2</m:t>
+                  </m:r>
+                </m:sup>
+              </m:sSup>
+              <m:r>
+                <m:rPr>
+                  <m:sty m:val="p"/>
+                </m:rPr>
+                <m:t>.</m:t>
+              </m:r>
+            </m:e>
+          </m:eqArr>
+        </m:oMath>
+      </m:oMathPara>
     </w:p>
     <w:bookmarkEnd w:id="35"/>
     <w:bookmarkStart w:id="36" w:name="def-postulate"/>
     <w:p>
       <w:pPr>
-        <w:pStyle w:val="BodyText"/>
+        <w:pStyle w:val="FirstParagraph"/>
       </w:pPr>
       <w:r>
         <w:rPr>
@@ -6749,95 +6786,107 @@
       <w:r>
         <w:t xml:space="preserve">Show that</w:t>
       </w:r>
-      <w:r>
-        <w:t xml:space="preserve"> </w:t>
-      </w:r>
-      <m:oMath>
-        <m:nary>
-          <m:naryPr>
-            <m:chr m:val="∑"/>
-            <m:limLoc m:val="undOvr"/>
-            <m:subHide m:val="off"/>
-            <m:supHide m:val="off"/>
-          </m:naryPr>
-          <m:sub>
-            <m:r>
-              <m:t>i</m:t>
-            </m:r>
-            <m:r>
-              <m:rPr>
-                <m:sty m:val="p"/>
-              </m:rPr>
-              <m:t>=</m:t>
-            </m:r>
-            <m:r>
-              <m:t>1</m:t>
-            </m:r>
-          </m:sub>
-          <m:sup>
-            <m:r>
-              <m:t>n</m:t>
-            </m:r>
-          </m:sup>
-          <m:e>
-            <m:r>
-              <m:rPr>
-                <m:sty m:val="p"/>
-              </m:rPr>
-              <m:t>(</m:t>
-            </m:r>
-          </m:e>
-        </m:nary>
-        <m:sSub>
-          <m:e>
-            <m:r>
-              <m:t>x</m:t>
-            </m:r>
-          </m:e>
-          <m:sub>
-            <m:r>
-              <m:t>i</m:t>
-            </m:r>
-          </m:sub>
-        </m:sSub>
-        <m:r>
-          <m:rPr>
-            <m:sty m:val="p"/>
-          </m:rPr>
-          <m:t>−</m:t>
-        </m:r>
-        <m:acc>
-          <m:accPr>
-            <m:chr m:val="‾"/>
-          </m:accPr>
-          <m:e>
-            <m:r>
-              <m:t>x</m:t>
-            </m:r>
-          </m:e>
-        </m:acc>
-        <m:r>
-          <m:rPr>
-            <m:sty m:val="p"/>
-          </m:rPr>
-          <m:t>)</m:t>
-        </m:r>
-        <m:r>
-          <m:rPr>
-            <m:sty m:val="p"/>
-          </m:rPr>
-          <m:t>=</m:t>
-        </m:r>
-        <m:r>
-          <m:t>0</m:t>
-        </m:r>
-      </m:oMath>
-      <w:r>
-        <w:t xml:space="preserve">,</w:t>
-      </w:r>
-      <w:r>
-        <w:t xml:space="preserve"> </w:t>
-      </w:r>
+    </w:p>
+    <w:p>
+      <w:pPr>
+        <w:pStyle w:val="BodyText"/>
+      </w:pPr>
+      <m:oMathPara>
+        <m:oMathParaPr>
+          <m:jc m:val="center"/>
+        </m:oMathParaPr>
+        <m:oMath>
+          <m:nary>
+            <m:naryPr>
+              <m:chr m:val="∑"/>
+              <m:limLoc m:val="undOvr"/>
+              <m:subHide m:val="off"/>
+              <m:supHide m:val="off"/>
+            </m:naryPr>
+            <m:sub>
+              <m:r>
+                <m:t>i</m:t>
+              </m:r>
+              <m:r>
+                <m:rPr>
+                  <m:sty m:val="p"/>
+                </m:rPr>
+                <m:t>=</m:t>
+              </m:r>
+              <m:r>
+                <m:t>1</m:t>
+              </m:r>
+            </m:sub>
+            <m:sup>
+              <m:r>
+                <m:t>n</m:t>
+              </m:r>
+            </m:sup>
+            <m:e>
+              <m:r>
+                <m:rPr>
+                  <m:sty m:val="p"/>
+                </m:rPr>
+                <m:t>(</m:t>
+              </m:r>
+            </m:e>
+          </m:nary>
+          <m:sSub>
+            <m:e>
+              <m:r>
+                <m:t>x</m:t>
+              </m:r>
+            </m:e>
+            <m:sub>
+              <m:r>
+                <m:t>i</m:t>
+              </m:r>
+            </m:sub>
+          </m:sSub>
+          <m:r>
+            <m:rPr>
+              <m:sty m:val="p"/>
+            </m:rPr>
+            <m:t>−</m:t>
+          </m:r>
+          <m:acc>
+            <m:accPr>
+              <m:chr m:val="‾"/>
+            </m:accPr>
+            <m:e>
+              <m:r>
+                <m:t>x</m:t>
+              </m:r>
+            </m:e>
+          </m:acc>
+          <m:r>
+            <m:rPr>
+              <m:sty m:val="p"/>
+            </m:rPr>
+            <m:t>)</m:t>
+          </m:r>
+          <m:r>
+            <m:rPr>
+              <m:sty m:val="p"/>
+            </m:rPr>
+            <m:t>=</m:t>
+          </m:r>
+          <m:r>
+            <m:t>0</m:t>
+          </m:r>
+          <m:r>
+            <m:rPr>
+              <m:sty m:val="p"/>
+            </m:rPr>
+            <m:t>,</m:t>
+          </m:r>
+        </m:oMath>
+      </m:oMathPara>
+    </w:p>
+    <w:p>
+      <w:pPr>
+        <w:pStyle w:val="FirstParagraph"/>
+      </w:pPr>
       <w:r>
         <w:t xml:space="preserve">where</w:t>
       </w:r>

</xml_diff>

<commit_message>
Deploying to gh-pages from @ Morrison-Lab/psw@4a92df2b201359c768a0f006d450fa5aff91b83c 🚀
</commit_message>
<xml_diff>
--- a/chapters/defining-terms.docx
+++ b/chapters/defining-terms.docx
@@ -15,7 +15,7 @@
         <w:pStyle w:val="Date"/>
       </w:pPr>
       <w:r>
-        <w:t xml:space="preserve">Last modified: 2026-10-10 00:01:24 (PDT)</w:t>
+        <w:t xml:space="preserve">Last modified: 2026-10-10 12:03:39 (PDT)</w:t>
       </w:r>
     </w:p>
     <w:p>
@@ -2172,6 +2172,153 @@
       </w:r>
       <w:r>
         <w:t xml:space="preserve">Place the definition immediately before or after the term’s first appearance.</w:t>
+      </w:r>
+    </w:p>
+    <w:p>
+      <w:pPr>
+        <w:numPr>
+          <w:ilvl w:val="0"/>
+          <w:numId w:val="1001"/>
+        </w:numPr>
+      </w:pPr>
+      <w:r>
+        <w:rPr>
+          <w:b/>
+          <w:bCs/>
+        </w:rPr>
+        <w:t xml:space="preserve">Do not presuppose what the reader has not met:</w:t>
+      </w:r>
+      <w:r>
+        <w:t xml:space="preserve"> </w:t>
+      </w:r>
+      <w:r>
+        <w:t xml:space="preserve">A definite noun phrase, one that starts with</w:t>
+      </w:r>
+      <w:r>
+        <w:t xml:space="preserve"> </w:t>
+      </w:r>
+      <w:r>
+        <w:t xml:space="preserve">“the”</w:t>
+      </w:r>
+      <w:r>
+        <w:t xml:space="preserve">,</w:t>
+      </w:r>
+      <w:r>
+        <w:t xml:space="preserve"> </w:t>
+      </w:r>
+      <w:r>
+        <w:t xml:space="preserve">presupposes that the reader already knows what it refers to.</w:t>
+      </w:r>
+      <w:r>
+        <w:t xml:space="preserve"> </w:t>
+      </w:r>
+      <w:r>
+        <w:t xml:space="preserve">“Fit a line to the synthetic data”</w:t>
+      </w:r>
+      <w:r>
+        <w:t xml:space="preserve"> </w:t>
+      </w:r>
+      <w:r>
+        <w:t xml:space="preserve">is unjustified</w:t>
+      </w:r>
+      <w:r>
+        <w:t xml:space="preserve"> </w:t>
+      </w:r>
+      <w:r>
+        <w:t xml:space="preserve">if no earlier sentence has said which data these are, or where they came from.</w:t>
+      </w:r>
+      <w:r>
+        <w:t xml:space="preserve"> </w:t>
+      </w:r>
+      <w:r>
+        <w:t xml:space="preserve">Check each</w:t>
+      </w:r>
+      <w:r>
+        <w:t xml:space="preserve"> </w:t>
+      </w:r>
+      <w:r>
+        <w:t xml:space="preserve">“the …”</w:t>
+      </w:r>
+      <w:r>
+        <w:t xml:space="preserve"> </w:t>
+      </w:r>
+      <w:r>
+        <w:t xml:space="preserve">phrase for a referent the reader has already seen.</w:t>
+      </w:r>
+      <w:r>
+        <w:t xml:space="preserve"> </w:t>
+      </w:r>
+      <w:r>
+        <w:t xml:space="preserve">If there is none, introduce the referent first,</w:t>
+      </w:r>
+      <w:r>
+        <w:t xml:space="preserve"> </w:t>
+      </w:r>
+      <w:r>
+        <w:t xml:space="preserve">or write</w:t>
+      </w:r>
+      <w:r>
+        <w:t xml:space="preserve"> </w:t>
+      </w:r>
+      <w:r>
+        <w:t xml:space="preserve">“a”</w:t>
+      </w:r>
+      <w:r>
+        <w:t xml:space="preserve"> </w:t>
+      </w:r>
+      <w:r>
+        <w:t xml:space="preserve">or</w:t>
+      </w:r>
+      <w:r>
+        <w:t xml:space="preserve"> </w:t>
+      </w:r>
+      <w:r>
+        <w:t xml:space="preserve">“some”</w:t>
+      </w:r>
+      <w:r>
+        <w:t xml:space="preserve"> </w:t>
+      </w:r>
+      <w:r>
+        <w:t xml:space="preserve">in place of</w:t>
+      </w:r>
+      <w:r>
+        <w:t xml:space="preserve"> </w:t>
+      </w:r>
+      <w:r>
+        <w:t xml:space="preserve">“the”</w:t>
+      </w:r>
+      <w:r>
+        <w:t xml:space="preserve">.</w:t>
+      </w:r>
+      <w:r>
+        <w:t xml:space="preserve"> </w:t>
+      </w:r>
+      <w:r>
+        <w:t xml:space="preserve">Then link each definite noun phrase to what it refers to,</w:t>
+      </w:r>
+      <w:r>
+        <w:t xml:space="preserve"> </w:t>
+      </w:r>
+      <w:r>
+        <w:t xml:space="preserve">with a cross-reference such as</w:t>
+      </w:r>
+      <w:r>
+        <w:t xml:space="preserve"> </w:t>
+      </w:r>
+      <w:r>
+        <w:rPr>
+          <w:rStyle w:val="VerbatimChar"/>
+        </w:rPr>
+        <w:t xml:space="preserve">[the synthetic data](#exm-synthetic-data)</w:t>
+      </w:r>
+      <w:r>
+        <w:t xml:space="preserve">,</w:t>
+      </w:r>
+      <w:r>
+        <w:t xml:space="preserve"> </w:t>
+      </w:r>
+      <w:r>
+        <w:t xml:space="preserve">so that a reader who has forgotten or skipped the referent can find it.</w:t>
       </w:r>
     </w:p>
     <w:p>

</xml_diff>

<commit_message>
Deploying to gh-pages from @ Morrison-Lab/psw@f812a5c67f7f4071bcf429ff76032f493ae2086c 🚀
</commit_message>
<xml_diff>
--- a/chapters/defining-terms.docx
+++ b/chapters/defining-terms.docx
@@ -15,7 +15,7 @@
         <w:pStyle w:val="Date"/>
       </w:pPr>
       <w:r>
-        <w:t xml:space="preserve">Last modified: 2026-10-12 20:18:49 (PDT)</w:t>
+        <w:t xml:space="preserve">Last modified: 2026-10-12 22:10:26 (PDT)</w:t>
       </w:r>
     </w:p>
     <w:p>
@@ -2878,6 +2878,60 @@
       </w:r>
       <w:r>
         <w:t xml:space="preserve">and invites the reader to treat one sample’s value as the quantity itself.</w:t>
+      </w:r>
+      <w:r>
+        <w:t xml:space="preserve"> </w:t>
+      </w:r>
+      <w:r>
+        <w:t xml:space="preserve">Keep that order across the whole document, not only within one definition:</w:t>
+      </w:r>
+      <w:r>
+        <w:t xml:space="preserve"> </w:t>
+      </w:r>
+      <w:r>
+        <w:t xml:space="preserve">the estimand’s definition, with its exercise and example,</w:t>
+      </w:r>
+      <w:r>
+        <w:t xml:space="preserve"> </w:t>
+      </w:r>
+      <w:r>
+        <w:t xml:space="preserve">comes before the estimator’s, and the estimator’s definition links back to it.</w:t>
+      </w:r>
+      <w:r>
+        <w:t xml:space="preserve"> </w:t>
+      </w:r>
+      <w:r>
+        <w:t xml:space="preserve">For example, define the risk of a model, its expected loss on new data,</w:t>
+      </w:r>
+      <w:r>
+        <w:t xml:space="preserve"> </w:t>
+      </w:r>
+      <w:r>
+        <w:t xml:space="preserve">before the empirical risk, its average loss on the training data;</w:t>
+      </w:r>
+      <w:r>
+        <w:t xml:space="preserve"> </w:t>
+      </w:r>
+      <w:r>
+        <w:t xml:space="preserve">define the population mean before the sample mean,</w:t>
+      </w:r>
+      <w:r>
+        <w:t xml:space="preserve"> </w:t>
+      </w:r>
+      <w:r>
+        <w:t xml:space="preserve">and a parameter before its maximum likelihood estimate.</w:t>
+      </w:r>
+      <w:r>
+        <w:t xml:space="preserve"> </w:t>
+      </w:r>
+      <w:r>
+        <w:t xml:space="preserve">Reading the estimator first leaves the reader with a formula</w:t>
+      </w:r>
+      <w:r>
+        <w:t xml:space="preserve"> </w:t>
+      </w:r>
+      <w:r>
+        <w:t xml:space="preserve">and no answer to the question of what it is for.</w:t>
       </w:r>
       <w:r>
         <w:t xml:space="preserve"> </w:t>

</xml_diff>

<commit_message>
Deploying to gh-pages from @ Morrison-Lab/psw@fe66a53aba6bb746e9d5f00aa7ac9a9bf8eb9140 🚀
</commit_message>
<xml_diff>
--- a/chapters/defining-terms.docx
+++ b/chapters/defining-terms.docx
@@ -15,7 +15,7 @@
         <w:pStyle w:val="Date"/>
       </w:pPr>
       <w:r>
-        <w:t xml:space="preserve">Last modified: 2026-10-14 13:15:37 (PDT)</w:t>
+        <w:t xml:space="preserve">Last modified: 2026-10-15 00:56:17 (PDT)</w:t>
       </w:r>
     </w:p>
     <w:p>
@@ -2695,6 +2695,39 @@
       </w:r>
       <w:r>
         <w:t xml:space="preserve">and bold each where it first appears in the definition.</w:t>
+      </w:r>
+      <w:r>
+        <w:t xml:space="preserve"> </w:t>
+      </w:r>
+      <w:r>
+        <w:t xml:space="preserve">This covers the names other sources use, such as a textbook’s,</w:t>
+      </w:r>
+      <w:r>
+        <w:t xml:space="preserve"> </w:t>
+      </w:r>
+      <w:r>
+        <w:t xml:space="preserve">which belong in the title and in bold too,</w:t>
+      </w:r>
+      <w:r>
+        <w:t xml:space="preserve"> </w:t>
+      </w:r>
+      <w:r>
+        <w:t xml:space="preserve">as in</w:t>
+      </w:r>
+      <w:r>
+        <w:t xml:space="preserve"> </w:t>
+      </w:r>
+      <w:r>
+        <w:t xml:space="preserve">“Risk (expected loss, population risk, true risk,</w:t>
+      </w:r>
+      <w:r>
+        <w:t xml:space="preserve"> </w:t>
+      </w:r>
+      <w:r>
+        <w:t xml:space="preserve">generalization error, expected prediction error)”</w:t>
+      </w:r>
+      <w:r>
+        <w:t xml:space="preserve">.</w:t>
       </w:r>
       <w:r>
         <w:t xml:space="preserve"> </w:t>

</xml_diff>

<commit_message>
Deploying to gh-pages from @ Morrison-Lab/psw@efc9f73836fcd434a81b274d1960ff65c80d7df6 🚀
</commit_message>
<xml_diff>
--- a/chapters/defining-terms.docx
+++ b/chapters/defining-terms.docx
@@ -15,7 +15,7 @@
         <w:pStyle w:val="Date"/>
       </w:pPr>
       <w:r>
-        <w:t xml:space="preserve">Last modified: 2026-10-16 02:49:17 (PDT)</w:t>
+        <w:t xml:space="preserve">Last modified: 2026-10-16 02:56:58 (PDT)</w:t>
       </w:r>
     </w:p>
     <w:p>
@@ -2172,6 +2172,57 @@
       </w:r>
       <w:r>
         <w:t xml:space="preserve">Place the definition immediately before or after the term’s first appearance.</w:t>
+      </w:r>
+    </w:p>
+    <w:p>
+      <w:pPr>
+        <w:numPr>
+          <w:ilvl w:val="0"/>
+          <w:numId w:val="1001"/>
+        </w:numPr>
+      </w:pPr>
+      <w:r>
+        <w:rPr>
+          <w:b/>
+          <w:bCs/>
+        </w:rPr>
+        <w:t xml:space="preserve">Link every technical term to its formal definition at its first use in each div:</w:t>
+      </w:r>
+      <w:r>
+        <w:t xml:space="preserve"> </w:t>
+      </w:r>
+      <w:r>
+        <w:t xml:space="preserve">Inside a definition, theorem, example or other div,</w:t>
+      </w:r>
+      <w:r>
+        <w:t xml:space="preserve"> </w:t>
+      </w:r>
+      <w:r>
+        <w:t xml:space="preserve">link a technical term the first time it appears in that div.</w:t>
+      </w:r>
+      <w:r>
+        <w:t xml:space="preserve"> </w:t>
+      </w:r>
+      <w:r>
+        <w:t xml:space="preserve">Outside divs, link it the first time it appears in each prose passage.</w:t>
+      </w:r>
+      <w:r>
+        <w:t xml:space="preserve"> </w:t>
+      </w:r>
+      <w:r>
+        <w:t xml:space="preserve">A link in an earlier div does not carry over,</w:t>
+      </w:r>
+      <w:r>
+        <w:t xml:space="preserve"> </w:t>
+      </w:r>
+      <w:r>
+        <w:t xml:space="preserve">because readers jump into the middle of a page.</w:t>
+      </w:r>
+      <w:r>
+        <w:t xml:space="preserve"> </w:t>
+      </w:r>
+      <w:r>
+        <w:t xml:space="preserve">Link once per div or passage, not at every mention.</w:t>
       </w:r>
     </w:p>
     <w:p>

</xml_diff>

<commit_message>
Deploying to gh-pages from @ Morrison-Lab/psw@d32268044d3769ad186a42401606587ae7ce0c8e 🚀
</commit_message>
<xml_diff>
--- a/chapters/defining-terms.docx
+++ b/chapters/defining-terms.docx
@@ -15,7 +15,7 @@
         <w:pStyle w:val="Date"/>
       </w:pPr>
       <w:r>
-        <w:t xml:space="preserve">Last modified: 2026-10-16 03:18:47 (PDT)</w:t>
+        <w:t xml:space="preserve">Last modified: 2026-10-16 03:24:22 (PDT)</w:t>
       </w:r>
     </w:p>
     <w:p>
@@ -2186,7 +2186,7 @@
           <w:b/>
           <w:bCs/>
         </w:rPr>
-        <w:t xml:space="preserve">Link every technical term to its formal definition at its first use in each div:</w:t>
+        <w:t xml:space="preserve">Define and link every technical term at its first use in each div:</w:t>
       </w:r>
       <w:r>
         <w:t xml:space="preserve"> </w:t>
@@ -2198,7 +2198,7 @@
         <w:t xml:space="preserve"> </w:t>
       </w:r>
       <w:r>
-        <w:t xml:space="preserve">link a technical term the first time it appears in that div.</w:t>
+        <w:t xml:space="preserve">link a technical term to its formal definition the first time it appears in that div.</w:t>
       </w:r>
       <w:r>
         <w:t xml:space="preserve"> </w:t>
@@ -2223,6 +2223,48 @@
       </w:r>
       <w:r>
         <w:t xml:space="preserve">Link once per div or passage, not at every mention.</w:t>
+      </w:r>
+      <w:r>
+        <w:t xml:space="preserve"> </w:t>
+      </w:r>
+      <w:r>
+        <w:t xml:space="preserve">If the term has no formal definition yet,</w:t>
+      </w:r>
+      <w:r>
+        <w:t xml:space="preserve"> </w:t>
+      </w:r>
+      <w:r>
+        <w:t xml:space="preserve">write the definition in its own definition div,</w:t>
+      </w:r>
+      <w:r>
+        <w:t xml:space="preserve"> </w:t>
+      </w:r>
+      <w:r>
+        <w:t xml:space="preserve">then link to it.</w:t>
+      </w:r>
+      <w:r>
+        <w:t xml:space="preserve"> </w:t>
+      </w:r>
+      <w:r>
+        <w:t xml:space="preserve">In a series of related documents, such as course notes,</w:t>
+      </w:r>
+      <w:r>
+        <w:t xml:space="preserve"> </w:t>
+      </w:r>
+      <w:r>
+        <w:t xml:space="preserve">first look for a definition in an earlier document</w:t>
+      </w:r>
+      <w:r>
+        <w:t xml:space="preserve"> </w:t>
+      </w:r>
+      <w:r>
+        <w:t xml:space="preserve">and link to it if one exists.</w:t>
+      </w:r>
+      <w:r>
+        <w:t xml:space="preserve"> </w:t>
+      </w:r>
+      <w:r>
+        <w:t xml:space="preserve">Otherwise write the definition in the earliest document that needs the term.</w:t>
       </w:r>
     </w:p>
     <w:p>

</xml_diff>

<commit_message>
Deploying to gh-pages from @ Morrison-Lab/psw@dc12c37300898432c422c4dc79426c2366a968b9 🚀
</commit_message>
<xml_diff>
--- a/chapters/defining-terms.docx
+++ b/chapters/defining-terms.docx
@@ -15,7 +15,7 @@
         <w:pStyle w:val="Date"/>
       </w:pPr>
       <w:r>
-        <w:t xml:space="preserve">Last modified: 2026-10-16 03:24:22 (PDT)</w:t>
+        <w:t xml:space="preserve">Last modified: 2026-10-16 03:37:27 (PDT)</w:t>
       </w:r>
     </w:p>
     <w:p>
@@ -657,16 +657,21 @@
         <w:t xml:space="preserve"> </w:t>
       </w:r>
       <m:oMath>
-        <m:acc>
-          <m:accPr>
-            <m:chr m:val="⃗"/>
-          </m:accPr>
+        <m:limLow>
           <m:e>
             <m:r>
               <m:t>θ</m:t>
             </m:r>
           </m:e>
-        </m:acc>
+          <m:lim>
+            <m:r>
+              <m:rPr>
+                <m:sty m:val="p"/>
+              </m:rPr>
+              <m:t>∼</m:t>
+            </m:r>
+          </m:lim>
+        </m:limLow>
       </m:oMath>
       <w:r>
         <w:t xml:space="preserve"> </w:t>
@@ -684,16 +689,21 @@
         <w:t xml:space="preserve"> </w:t>
       </w:r>
       <m:oMath>
-        <m:acc>
-          <m:accPr>
-            <m:chr m:val="⃗"/>
-          </m:accPr>
+        <m:limLow>
           <m:e>
             <m:r>
               <m:t>θ</m:t>
             </m:r>
           </m:e>
-        </m:acc>
+          <m:lim>
+            <m:r>
+              <m:rPr>
+                <m:sty m:val="p"/>
+              </m:rPr>
+              <m:t>∼</m:t>
+            </m:r>
+          </m:lim>
+        </m:limLow>
       </m:oMath>
       <w:r>
         <w:t xml:space="preserve"> </w:t>
@@ -752,16 +762,21 @@
               <m:chr m:val="̂"/>
             </m:accPr>
             <m:e>
-              <m:acc>
-                <m:accPr>
-                  <m:chr m:val="⃗"/>
-                </m:accPr>
+              <m:limLow>
                 <m:e>
                   <m:r>
                     <m:t>θ</m:t>
                   </m:r>
                 </m:e>
-              </m:acc>
+                <m:lim>
+                  <m:r>
+                    <m:rPr>
+                      <m:sty m:val="p"/>
+                    </m:rPr>
+                    <m:t>∼</m:t>
+                  </m:r>
+                </m:lim>
+              </m:limLow>
             </m:e>
           </m:acc>
           <m:box>
@@ -793,16 +808,21 @@
               </m:r>
             </m:e>
             <m:lim>
-              <m:acc>
-                <m:accPr>
-                  <m:chr m:val="⃗"/>
-                </m:accPr>
+              <m:limLow>
                 <m:e>
                   <m:r>
                     <m:t>θ</m:t>
                   </m:r>
                 </m:e>
-              </m:acc>
+                <m:lim>
+                  <m:r>
+                    <m:rPr>
+                      <m:sty m:val="p"/>
+                    </m:rPr>
+                    <m:t>∼</m:t>
+                  </m:r>
+                </m:lim>
+              </m:limLow>
             </m:lim>
           </m:limLow>
           <m:r>
@@ -818,16 +838,21 @@
             </m:rPr>
             <m:t>(</m:t>
           </m:r>
-          <m:acc>
-            <m:accPr>
-              <m:chr m:val="⃗"/>
-            </m:accPr>
+          <m:limLow>
             <m:e>
               <m:r>
                 <m:t>θ</m:t>
               </m:r>
             </m:e>
-          </m:acc>
+            <m:lim>
+              <m:r>
+                <m:rPr>
+                  <m:sty m:val="p"/>
+                </m:rPr>
+                <m:t>∼</m:t>
+              </m:r>
+            </m:lim>
+          </m:limLow>
           <m:r>
             <m:rPr>
               <m:sty m:val="p"/>

</xml_diff>

<commit_message>
Deploying to gh-pages from @ Morrison-Lab/psw@b4841a05e9b8c5be145eafc920f1763da19bcff4 🚀
</commit_message>
<xml_diff>
--- a/chapters/defining-terms.docx
+++ b/chapters/defining-terms.docx
@@ -15,7 +15,7 @@
         <w:pStyle w:val="Date"/>
       </w:pPr>
       <w:r>
-        <w:t xml:space="preserve">Last modified: 2026-10-16 03:37:27 (PDT)</w:t>
+        <w:t xml:space="preserve">Last modified: 2026-10-16 03:42:31 (PDT)</w:t>
       </w:r>
     </w:p>
     <w:p>
@@ -3801,14 +3801,29 @@
         <w:t xml:space="preserve"> </w:t>
       </w:r>
       <w:r>
-        <w:t xml:space="preserve">is an estimator of the mean function value at</w:t>
+        <w:t xml:space="preserve">is an estimator of the mean function value</w:t>
       </w:r>
       <w:r>
         <w:t xml:space="preserve"> </w:t>
       </w:r>
       <m:oMath>
         <m:r>
+          <m:t>μ</m:t>
+        </m:r>
+        <m:r>
+          <m:rPr>
+            <m:sty m:val="p"/>
+          </m:rPr>
+          <m:t>(</m:t>
+        </m:r>
+        <m:r>
           <m:t>x</m:t>
+        </m:r>
+        <m:r>
+          <m:rPr>
+            <m:sty m:val="p"/>
+          </m:rPr>
+          <m:t>)</m:t>
         </m:r>
       </m:oMath>
       <w:r>

</xml_diff>

<commit_message>
Deploying to gh-pages from @ Morrison-Lab/psw@601c76da5651d11a54086b2d9b6303b42febaf55 🚀
</commit_message>
<xml_diff>
--- a/chapters/defining-terms.docx
+++ b/chapters/defining-terms.docx
@@ -15,7 +15,7 @@
         <w:pStyle w:val="Date"/>
       </w:pPr>
       <w:r>
-        <w:t xml:space="preserve">Last modified: 2026-10-16 04:52:23 (PDT)</w:t>
+        <w:t xml:space="preserve">Last modified: 2026-10-16 04:57:30 (PDT)</w:t>
       </w:r>
     </w:p>
     <w:p>
@@ -3959,6 +3959,385 @@
       </w:r>
       <w:r>
         <w:t xml:space="preserve">and never leave the target implicit.</w:t>
+      </w:r>
+    </w:p>
+    <w:p>
+      <w:pPr>
+        <w:numPr>
+          <w:ilvl w:val="0"/>
+          <w:numId w:val="1001"/>
+        </w:numPr>
+      </w:pPr>
+      <w:r>
+        <w:rPr>
+          <w:b/>
+          <w:bCs/>
+        </w:rPr>
+        <w:t xml:space="preserve">Qualify</w:t>
+      </w:r>
+      <w:r>
+        <w:rPr>
+          <w:b/>
+          <w:bCs/>
+        </w:rPr>
+        <w:t xml:space="preserve"> </w:t>
+      </w:r>
+      <w:r>
+        <w:rPr>
+          <w:b/>
+          <w:bCs/>
+        </w:rPr>
+        <w:t xml:space="preserve">“mean”</w:t>
+      </w:r>
+      <w:r>
+        <w:rPr>
+          <w:b/>
+          <w:bCs/>
+        </w:rPr>
+        <w:t xml:space="preserve">,</w:t>
+      </w:r>
+      <w:r>
+        <w:rPr>
+          <w:b/>
+          <w:bCs/>
+        </w:rPr>
+        <w:t xml:space="preserve"> </w:t>
+      </w:r>
+      <w:r>
+        <w:rPr>
+          <w:b/>
+          <w:bCs/>
+        </w:rPr>
+        <w:t xml:space="preserve">“average”</w:t>
+      </w:r>
+      <w:r>
+        <w:rPr>
+          <w:b/>
+          <w:bCs/>
+        </w:rPr>
+        <w:t xml:space="preserve"> </w:t>
+      </w:r>
+      <w:r>
+        <w:rPr>
+          <w:b/>
+          <w:bCs/>
+        </w:rPr>
+        <w:t xml:space="preserve">and their shorthands as population or sample:</w:t>
+      </w:r>
+      <w:r>
+        <w:t xml:space="preserve"> </w:t>
+      </w:r>
+      <w:r>
+        <w:t xml:space="preserve">A bare</w:t>
+      </w:r>
+      <w:r>
+        <w:t xml:space="preserve"> </w:t>
+      </w:r>
+      <w:r>
+        <w:t xml:space="preserve">“mean”</w:t>
+      </w:r>
+      <w:r>
+        <w:t xml:space="preserve"> </w:t>
+      </w:r>
+      <w:r>
+        <w:t xml:space="preserve">or</w:t>
+      </w:r>
+      <w:r>
+        <w:t xml:space="preserve"> </w:t>
+      </w:r>
+      <w:r>
+        <w:t xml:space="preserve">“average”</w:t>
+      </w:r>
+      <w:r>
+        <w:t xml:space="preserve"> </w:t>
+      </w:r>
+      <w:r>
+        <w:t xml:space="preserve">does not say whether it is a quantity of the population</w:t>
+      </w:r>
+      <w:r>
+        <w:t xml:space="preserve"> </w:t>
+      </w:r>
+      <w:r>
+        <w:t xml:space="preserve">or a value computed from one sample.</w:t>
+      </w:r>
+      <w:r>
+        <w:t xml:space="preserve"> </w:t>
+      </w:r>
+      <w:r>
+        <w:t xml:space="preserve">Write</w:t>
+      </w:r>
+      <w:r>
+        <w:t xml:space="preserve"> </w:t>
+      </w:r>
+      <w:r>
+        <w:t xml:space="preserve">“population mean”</w:t>
+      </w:r>
+      <w:r>
+        <w:t xml:space="preserve"> </w:t>
+      </w:r>
+      <w:r>
+        <w:t xml:space="preserve">for the expected value of a distribution,</w:t>
+      </w:r>
+      <w:r>
+        <w:t xml:space="preserve"> </w:t>
+      </w:r>
+      <w:r>
+        <w:t xml:space="preserve">and</w:t>
+      </w:r>
+      <w:r>
+        <w:t xml:space="preserve"> </w:t>
+      </w:r>
+      <w:r>
+        <w:t xml:space="preserve">“sample mean”</w:t>
+      </w:r>
+      <w:r>
+        <w:t xml:space="preserve"> </w:t>
+      </w:r>
+      <w:r>
+        <w:t xml:space="preserve">for the average of the observed values;</w:t>
+      </w:r>
+      <w:r>
+        <w:t xml:space="preserve"> </w:t>
+      </w:r>
+      <w:r>
+        <w:t xml:space="preserve">write</w:t>
+      </w:r>
+      <w:r>
+        <w:t xml:space="preserve"> </w:t>
+      </w:r>
+      <w:r>
+        <w:t xml:space="preserve">“population average”</w:t>
+      </w:r>
+      <w:r>
+        <w:t xml:space="preserve"> </w:t>
+      </w:r>
+      <w:r>
+        <w:t xml:space="preserve">and</w:t>
+      </w:r>
+      <w:r>
+        <w:t xml:space="preserve"> </w:t>
+      </w:r>
+      <w:r>
+        <w:t xml:space="preserve">“sample average”</w:t>
+      </w:r>
+      <w:r>
+        <w:t xml:space="preserve"> </w:t>
+      </w:r>
+      <w:r>
+        <w:t xml:space="preserve">in the same way.</w:t>
+      </w:r>
+      <w:r>
+        <w:t xml:space="preserve"> </w:t>
+      </w:r>
+      <w:r>
+        <w:t xml:space="preserve">Prefer</w:t>
+      </w:r>
+      <w:r>
+        <w:t xml:space="preserve"> </w:t>
+      </w:r>
+      <w:r>
+        <w:t xml:space="preserve">“mean”</w:t>
+      </w:r>
+      <w:r>
+        <w:t xml:space="preserve"> </w:t>
+      </w:r>
+      <w:r>
+        <w:t xml:space="preserve">with the qualifier to</w:t>
+      </w:r>
+      <w:r>
+        <w:t xml:space="preserve"> </w:t>
+      </w:r>
+      <w:r>
+        <w:t xml:space="preserve">“average”</w:t>
+      </w:r>
+      <w:r>
+        <w:t xml:space="preserve">.</w:t>
+      </w:r>
+      <w:r>
+        <w:t xml:space="preserve"> </w:t>
+      </w:r>
+      <w:r>
+        <w:t xml:space="preserve">The same holds for shorthands:</w:t>
+      </w:r>
+      <w:r>
+        <w:t xml:space="preserve"> </w:t>
+      </w:r>
+      <w:r>
+        <w:t xml:space="preserve">write pMSE and sMSE, pRMSE and sRMSE, and pMAE and sMAE,</w:t>
+      </w:r>
+      <w:r>
+        <w:t xml:space="preserve"> </w:t>
+      </w:r>
+      <w:r>
+        <w:t xml:space="preserve">with a leading p for the population version and s for the sample version,</w:t>
+      </w:r>
+      <w:r>
+        <w:t xml:space="preserve"> </w:t>
+      </w:r>
+      <w:r>
+        <w:t xml:space="preserve">and never a bare MSE, RMSE or MAE.</w:t>
+      </w:r>
+      <w:r>
+        <w:t xml:space="preserve"> </w:t>
+      </w:r>
+      <w:r>
+        <w:t xml:space="preserve">Spelled out, the same words apply:</w:t>
+      </w:r>
+      <w:r>
+        <w:t xml:space="preserve"> </w:t>
+      </w:r>
+      <w:r>
+        <w:t xml:space="preserve">“population mean squared error”</w:t>
+      </w:r>
+      <w:r>
+        <w:t xml:space="preserve">,</w:t>
+      </w:r>
+      <w:r>
+        <w:t xml:space="preserve"> </w:t>
+      </w:r>
+      <w:r>
+        <w:t xml:space="preserve">“sample root mean squared error”</w:t>
+      </w:r>
+      <w:r>
+        <w:t xml:space="preserve">,</w:t>
+      </w:r>
+      <w:r>
+        <w:t xml:space="preserve"> </w:t>
+      </w:r>
+      <w:r>
+        <w:t xml:space="preserve">“population mean absolute error”</w:t>
+      </w:r>
+      <w:r>
+        <w:t xml:space="preserve">.</w:t>
+      </w:r>
+      <w:r>
+        <w:t xml:space="preserve"> </w:t>
+      </w:r>
+      <w:r>
+        <w:t xml:space="preserve">Define each shorthand once, at first use, as</w:t>
+      </w:r>
+      <w:r>
+        <w:t xml:space="preserve"> </w:t>
+      </w:r>
+      <w:r>
+        <w:t xml:space="preserve">“population mean squared error (pMSE)”</w:t>
+      </w:r>
+      <w:r>
+        <w:t xml:space="preserve">.</w:t>
+      </w:r>
+      <w:r>
+        <w:t xml:space="preserve"> </w:t>
+      </w:r>
+      <w:r>
+        <w:t xml:space="preserve">A term that already says which, such as</w:t>
+      </w:r>
+      <w:r>
+        <w:t xml:space="preserve"> </w:t>
+      </w:r>
+      <w:r>
+        <w:t xml:space="preserve">“mean function”</w:t>
+      </w:r>
+      <w:r>
+        <w:t xml:space="preserve"> </w:t>
+      </w:r>
+      <w:r>
+        <w:t xml:space="preserve">or</w:t>
+      </w:r>
+      <w:r>
+        <w:t xml:space="preserve"> </w:t>
+      </w:r>
+      <w:r>
+        <w:t xml:space="preserve">“running mean”</w:t>
+      </w:r>
+      <w:r>
+        <w:t xml:space="preserve">, needs no extra word,</w:t>
+      </w:r>
+      <w:r>
+        <w:t xml:space="preserve"> </w:t>
+      </w:r>
+      <w:r>
+        <w:t xml:space="preserve">and neither does expected value notation such as</w:t>
+      </w:r>
+      <w:r>
+        <w:t xml:space="preserve"> </w:t>
+      </w:r>
+      <m:oMath>
+        <m:r>
+          <m:rPr>
+            <m:sty m:val="p"/>
+          </m:rPr>
+          <m:t>E</m:t>
+        </m:r>
+        <m:r>
+          <m:t>​</m:t>
+        </m:r>
+        <m:d>
+          <m:dPr>
+            <m:begChr m:val="["/>
+            <m:sepChr m:val=""/>
+            <m:endChr m:val="]"/>
+            <m:grow/>
+          </m:dPr>
+          <m:e>
+            <m:r>
+              <m:t>Y</m:t>
+            </m:r>
+          </m:e>
+        </m:d>
+        <m:r>
+          <m:t>​</m:t>
+        </m:r>
+      </m:oMath>
+      <w:r>
+        <w:t xml:space="preserve">.</w:t>
+      </w:r>
+      <w:r>
+        <w:t xml:space="preserve"> </w:t>
+      </w:r>
+      <w:r>
+        <w:t xml:space="preserve">For example, write</w:t>
+      </w:r>
+      <w:r>
+        <w:t xml:space="preserve"> </w:t>
+      </w:r>
+      <w:r>
+        <w:t xml:space="preserve">“the sample mean of the training outcomes estimates the population mean of the outcome”</w:t>
+      </w:r>
+      <w:r>
+        <w:t xml:space="preserve">,</w:t>
+      </w:r>
+      <w:r>
+        <w:t xml:space="preserve"> </w:t>
+      </w:r>
+      <w:r>
+        <w:t xml:space="preserve">not</w:t>
+      </w:r>
+      <w:r>
+        <w:t xml:space="preserve"> </w:t>
+      </w:r>
+      <w:r>
+        <w:t xml:space="preserve">“the mean estimates the mean”</w:t>
+      </w:r>
+      <w:r>
+        <w:t xml:space="preserve">.</w:t>
+      </w:r>
+      <w:r>
+        <w:t xml:space="preserve"> </w:t>
+      </w:r>
+      <w:r>
+        <w:t xml:space="preserve">Drop the qualifier only when it is completely clear from context,</w:t>
+      </w:r>
+      <w:r>
+        <w:t xml:space="preserve"> </w:t>
+      </w:r>
+      <w:r>
+        <w:t xml:space="preserve">such as inside a definition that has just said which one it concerns.</w:t>
+      </w:r>
+      <w:r>
+        <w:t xml:space="preserve"> </w:t>
+      </w:r>
+      <w:r>
+        <w:t xml:space="preserve">When in doubt, keep it.</w:t>
       </w:r>
     </w:p>
     <w:bookmarkEnd w:id="17"/>

</xml_diff>

<commit_message>
Deploying to gh-pages from @ Morrison-Lab/psw@9ad715b98765822706f91ae894a6896ad0fb1c86 🚀
</commit_message>
<xml_diff>
--- a/chapters/defining-terms.docx
+++ b/chapters/defining-terms.docx
@@ -15,7 +15,7 @@
         <w:pStyle w:val="Date"/>
       </w:pPr>
       <w:r>
-        <w:t xml:space="preserve">Last modified: 2026-10-16 05:10:12 (PDT)</w:t>
+        <w:t xml:space="preserve">Last modified: 2026-10-16 09:59:07 (PDT)</w:t>
       </w:r>
     </w:p>
     <w:p>
@@ -6063,6 +6063,65 @@
       </w:r>
       <w:r>
         <w:t xml:space="preserve">using only the words necessary to communicate meaning clearly.”</w:t>
+      </w:r>
+    </w:p>
+    <w:p>
+      <w:pPr>
+        <w:numPr>
+          <w:ilvl w:val="0"/>
+          <w:numId w:val="1000"/>
+        </w:numPr>
+      </w:pPr>
+      <w:r>
+        <w:t xml:space="preserve">Qualifying the term does not make the definition less circular.</w:t>
+      </w:r>
+      <w:r>
+        <w:t xml:space="preserve"> </w:t>
+      </w:r>
+      <w:r>
+        <w:t xml:space="preserve">“A new observation relative to a training set</w:t>
+      </w:r>
+      <w:r>
+        <w:t xml:space="preserve"> </w:t>
+      </w:r>
+      <w:r>
+        <w:t xml:space="preserve">is a new observation when …”</w:t>
+      </w:r>
+      <w:r>
+        <w:t xml:space="preserve"> </w:t>
+      </w:r>
+      <w:r>
+        <w:t xml:space="preserve">still uses the term in its own definition.</w:t>
+      </w:r>
+      <w:r>
+        <w:t xml:space="preserve"> </w:t>
+      </w:r>
+      <w:r>
+        <w:t xml:space="preserve">Define it directly instead:</w:t>
+      </w:r>
+      <w:r>
+        <w:t xml:space="preserve"> </w:t>
+      </w:r>
+      <w:r>
+        <w:t xml:space="preserve">“A new observation relative to a training set</w:t>
+      </w:r>
+      <w:r>
+        <w:t xml:space="preserve"> </w:t>
+      </w:r>
+      <w:r>
+        <w:t xml:space="preserve">is a covariate value and an outcome</w:t>
+      </w:r>
+      <w:r>
+        <w:t xml:space="preserve"> </w:t>
+      </w:r>
+      <w:r>
+        <w:t xml:space="preserve">drawn from the same population as the training observations</w:t>
+      </w:r>
+      <w:r>
+        <w:t xml:space="preserve"> </w:t>
+      </w:r>
+      <w:r>
+        <w:t xml:space="preserve">and independent of them.”</w:t>
       </w:r>
     </w:p>
     <w:p>

</xml_diff>

<commit_message>
Deploying to gh-pages from @ Morrison-Lab/psw@939bb97f588b3b7dcd5b55a65eecbbbb19e10b6d 🚀
</commit_message>
<xml_diff>
--- a/chapters/defining-terms.docx
+++ b/chapters/defining-terms.docx
@@ -15,7 +15,7 @@
         <w:pStyle w:val="Date"/>
       </w:pPr>
       <w:r>
-        <w:t xml:space="preserve">Last modified: 2026-10-16 10:07:11 (PDT)</w:t>
+        <w:t xml:space="preserve">Last modified: 2026-10-16 10:12:22 (PDT)</w:t>
       </w:r>
     </w:p>
     <w:p>
@@ -2290,6 +2290,117 @@
       </w:r>
       <w:r>
         <w:t xml:space="preserve">Otherwise write the definition in the earliest document that needs the term.</w:t>
+      </w:r>
+      <w:r>
+        <w:t xml:space="preserve"> </w:t>
+      </w:r>
+      <w:r>
+        <w:t xml:space="preserve">A passage is the prose outside divs between one heading and the next,</w:t>
+      </w:r>
+      <w:r>
+        <w:t xml:space="preserve"> </w:t>
+      </w:r>
+      <w:r>
+        <w:t xml:space="preserve">and each div counts separately from the passage around it</w:t>
+      </w:r>
+      <w:r>
+        <w:t xml:space="preserve"> </w:t>
+      </w:r>
+      <w:r>
+        <w:t xml:space="preserve">and from every other div.</w:t>
+      </w:r>
+      <w:r>
+        <w:t xml:space="preserve"> </w:t>
+      </w:r>
+      <w:r>
+        <w:t xml:space="preserve">For example, if a div defines noise as the outcome minus the</w:t>
+      </w:r>
+      <w:r>
+        <w:t xml:space="preserve"> </w:t>
+      </w:r>
+      <w:r>
+        <w:t xml:space="preserve">“true function”</w:t>
+      </w:r>
+      <w:r>
+        <w:t xml:space="preserve">,</w:t>
+      </w:r>
+      <w:r>
+        <w:t xml:space="preserve"> </w:t>
+      </w:r>
+      <w:r>
+        <w:t xml:space="preserve">link the term as</w:t>
+      </w:r>
+      <w:r>
+        <w:t xml:space="preserve"> </w:t>
+      </w:r>
+      <w:r>
+        <w:rPr>
+          <w:rStyle w:val="VerbatimChar"/>
+        </w:rPr>
+        <w:t xml:space="preserve">[true function](#def-true-function)</w:t>
+      </w:r>
+      <w:r>
+        <w:t xml:space="preserve">,</w:t>
+      </w:r>
+      <w:r>
+        <w:t xml:space="preserve"> </w:t>
+      </w:r>
+      <w:r>
+        <w:t xml:space="preserve">and first add a definition div with that ID if the document lacks one.</w:t>
+      </w:r>
+      <w:r>
+        <w:t xml:space="preserve"> </w:t>
+      </w:r>
+      <w:r>
+        <w:t xml:space="preserve">A counterexample: the definition of noise links</w:t>
+      </w:r>
+      <w:r>
+        <w:t xml:space="preserve"> </w:t>
+      </w:r>
+      <w:r>
+        <w:t xml:space="preserve">“mean”</w:t>
+      </w:r>
+      <w:r>
+        <w:t xml:space="preserve">.</w:t>
+      </w:r>
+      <w:r>
+        <w:t xml:space="preserve"> </w:t>
+      </w:r>
+      <w:r>
+        <w:t xml:space="preserve">The example block after it also uses</w:t>
+      </w:r>
+      <w:r>
+        <w:t xml:space="preserve"> </w:t>
+      </w:r>
+      <w:r>
+        <w:t xml:space="preserve">“mean”</w:t>
+      </w:r>
+      <w:r>
+        <w:t xml:space="preserve">,</w:t>
+      </w:r>
+      <w:r>
+        <w:t xml:space="preserve"> </w:t>
+      </w:r>
+      <w:r>
+        <w:t xml:space="preserve">but without a link, wrongly assuming the earlier link carries over.</w:t>
+      </w:r>
+      <w:r>
+        <w:t xml:space="preserve"> </w:t>
+      </w:r>
+      <w:r>
+        <w:t xml:space="preserve">The example block should link</w:t>
+      </w:r>
+      <w:r>
+        <w:t xml:space="preserve"> </w:t>
+      </w:r>
+      <w:r>
+        <w:t xml:space="preserve">“mean”</w:t>
+      </w:r>
+      <w:r>
+        <w:t xml:space="preserve"> </w:t>
+      </w:r>
+      <w:r>
+        <w:t xml:space="preserve">at its own first use.</w:t>
       </w:r>
     </w:p>
     <w:p>

</xml_diff>

<commit_message>
Deploying to gh-pages from @ Morrison-Lab/psw@d8ee63b031ba55f8e92d843c0622d30313217d2d 🚀
</commit_message>
<xml_diff>
--- a/chapters/defining-terms.docx
+++ b/chapters/defining-terms.docx
@@ -15,7 +15,7 @@
         <w:pStyle w:val="Date"/>
       </w:pPr>
       <w:r>
-        <w:t xml:space="preserve">Last modified: 2026-10-16 10:12:22 (PDT)</w:t>
+        <w:t xml:space="preserve">Last modified: 2026-10-16 10:17:24 (PDT)</w:t>
       </w:r>
     </w:p>
     <w:p>
@@ -490,7 +490,7 @@
       </w:r>
     </w:p>
     <w:bookmarkEnd w:id="15"/>
-    <w:bookmarkStart w:id="17" w:name="guidelines-for-defining-terms"/>
+    <w:bookmarkStart w:id="18" w:name="guidelines-for-defining-terms"/>
     <w:p>
       <w:pPr>
         <w:pStyle w:val="Heading2"/>
@@ -2820,7 +2820,600 @@
       <w:r>
         <w:t xml:space="preserve">including a term defined in passing.</w:t>
       </w:r>
-    </w:p>
+      <w:r>
+        <w:t xml:space="preserve"> </w:t>
+      </w:r>
+      <w:r>
+        <w:t xml:space="preserve">Give closely related terms separate divs too:</w:t>
+      </w:r>
+      <w:r>
+        <w:t xml:space="preserve"> </w:t>
+      </w:r>
+      <w:r>
+        <w:t xml:space="preserve">only full synonyms share one (see</w:t>
+      </w:r>
+      <w:r>
+        <w:t xml:space="preserve"> </w:t>
+      </w:r>
+      <w:r>
+        <w:rPr>
+          <w:i/>
+          <w:iCs/>
+        </w:rPr>
+        <w:t xml:space="preserve">Name the synonyms</w:t>
+      </w:r>
+      <w:r>
+        <w:t xml:space="preserve"> </w:t>
+      </w:r>
+      <w:r>
+        <w:t xml:space="preserve">below).</w:t>
+      </w:r>
+      <w:r>
+        <w:t xml:space="preserve"> </w:t>
+      </w:r>
+      <w:r>
+        <w:t xml:space="preserve">For example, the left and right distributive laws are two properties,</w:t>
+      </w:r>
+      <w:r>
+        <w:t xml:space="preserve"> </w:t>
+      </w:r>
+      <w:r>
+        <w:t xml:space="preserve">each with its own identifier, example and exercise,</w:t>
+      </w:r>
+      <w:r>
+        <w:t xml:space="preserve"> </w:t>
+      </w:r>
+      <w:r>
+        <w:t xml:space="preserve">so define them in two divs.</w:t>
+      </w:r>
+      <w:r>
+        <w:t xml:space="preserve"> </w:t>
+      </w:r>
+      <w:r>
+        <w:t xml:space="preserve">A reader who needs one of them can then link to exactly that one.</w:t>
+      </w:r>
+    </w:p>
+    <w:bookmarkStart w:id="16" w:name="exm-one-definition-per-div"/>
+    <w:p>
+      <w:pPr>
+        <w:numPr>
+          <w:ilvl w:val="0"/>
+          <w:numId w:val="1000"/>
+        </w:numPr>
+      </w:pPr>
+      <w:r>
+        <w:rPr>
+          <w:b/>
+          <w:bCs/>
+        </w:rPr>
+        <w:t xml:space="preserve">Example 5 (Splitting two related definitions)</w:t>
+      </w:r>
+      <w:r>
+        <w:t xml:space="preserve"> </w:t>
+      </w:r>
+      <w:r>
+        <w:t xml:space="preserve"> </w:t>
+      </w:r>
+    </w:p>
+    <w:p>
+      <w:pPr>
+        <w:pStyle w:val="BlockText"/>
+        <w:numPr>
+          <w:ilvl w:val="0"/>
+          <w:numId w:val="1000"/>
+        </w:numPr>
+      </w:pPr>
+      <w:r>
+        <w:t xml:space="preserve">❌</w:t>
+      </w:r>
+      <w:r>
+        <w:t xml:space="preserve"> </w:t>
+      </w:r>
+      <w:r>
+        <w:rPr>
+          <w:b/>
+          <w:bCs/>
+        </w:rPr>
+        <w:t xml:space="preserve">Definition (distributive laws).</w:t>
+      </w:r>
+      <w:r>
+        <w:t xml:space="preserve"> </w:t>
+      </w:r>
+      <w:r>
+        <w:t xml:space="preserve">Multiplication</w:t>
+      </w:r>
+      <w:r>
+        <w:t xml:space="preserve"> </w:t>
+      </w:r>
+      <w:r>
+        <w:rPr>
+          <w:i/>
+          <w:iCs/>
+        </w:rPr>
+        <w:t xml:space="preserve">distributes over addition on the left</w:t>
+      </w:r>
+      <w:r>
+        <w:t xml:space="preserve"> </w:t>
+      </w:r>
+      <w:r>
+        <w:t xml:space="preserve">if</w:t>
+      </w:r>
+      <w:r>
+        <w:t xml:space="preserve"> </w:t>
+      </w:r>
+      <m:oMath>
+        <m:r>
+          <m:t>a</m:t>
+        </m:r>
+        <m:r>
+          <m:rPr>
+            <m:sty m:val="p"/>
+          </m:rPr>
+          <m:t>(</m:t>
+        </m:r>
+        <m:r>
+          <m:t>b</m:t>
+        </m:r>
+        <m:r>
+          <m:rPr>
+            <m:sty m:val="p"/>
+          </m:rPr>
+          <m:t>+</m:t>
+        </m:r>
+        <m:r>
+          <m:t>c</m:t>
+        </m:r>
+        <m:r>
+          <m:rPr>
+            <m:sty m:val="p"/>
+          </m:rPr>
+          <m:t>)</m:t>
+        </m:r>
+        <m:r>
+          <m:rPr>
+            <m:sty m:val="p"/>
+          </m:rPr>
+          <m:t>=</m:t>
+        </m:r>
+        <m:r>
+          <m:t>a</m:t>
+        </m:r>
+        <m:r>
+          <m:t>b</m:t>
+        </m:r>
+        <m:r>
+          <m:rPr>
+            <m:sty m:val="p"/>
+          </m:rPr>
+          <m:t>+</m:t>
+        </m:r>
+        <m:r>
+          <m:t>a</m:t>
+        </m:r>
+        <m:r>
+          <m:t>c</m:t>
+        </m:r>
+      </m:oMath>
+      <w:r>
+        <w:t xml:space="preserve"> </w:t>
+      </w:r>
+      <w:r>
+        <w:t xml:space="preserve">and</w:t>
+      </w:r>
+      <w:r>
+        <w:t xml:space="preserve"> </w:t>
+      </w:r>
+      <w:r>
+        <w:rPr>
+          <w:i/>
+          <w:iCs/>
+        </w:rPr>
+        <w:t xml:space="preserve">on the right</w:t>
+      </w:r>
+      <w:r>
+        <w:t xml:space="preserve"> </w:t>
+      </w:r>
+      <w:r>
+        <w:t xml:space="preserve">if</w:t>
+      </w:r>
+      <w:r>
+        <w:t xml:space="preserve"> </w:t>
+      </w:r>
+      <m:oMath>
+        <m:r>
+          <m:rPr>
+            <m:sty m:val="p"/>
+          </m:rPr>
+          <m:t>(</m:t>
+        </m:r>
+        <m:r>
+          <m:t>a</m:t>
+        </m:r>
+        <m:r>
+          <m:rPr>
+            <m:sty m:val="p"/>
+          </m:rPr>
+          <m:t>+</m:t>
+        </m:r>
+        <m:r>
+          <m:t>b</m:t>
+        </m:r>
+        <m:r>
+          <m:rPr>
+            <m:sty m:val="p"/>
+          </m:rPr>
+          <m:t>)</m:t>
+        </m:r>
+        <m:r>
+          <m:t>c</m:t>
+        </m:r>
+        <m:r>
+          <m:rPr>
+            <m:sty m:val="p"/>
+          </m:rPr>
+          <m:t>=</m:t>
+        </m:r>
+        <m:r>
+          <m:t>a</m:t>
+        </m:r>
+        <m:r>
+          <m:t>c</m:t>
+        </m:r>
+        <m:r>
+          <m:rPr>
+            <m:sty m:val="p"/>
+          </m:rPr>
+          <m:t>+</m:t>
+        </m:r>
+        <m:r>
+          <m:t>b</m:t>
+        </m:r>
+        <m:r>
+          <m:t>c</m:t>
+        </m:r>
+      </m:oMath>
+      <w:r>
+        <w:t xml:space="preserve">.</w:t>
+      </w:r>
+    </w:p>
+    <w:p>
+      <w:pPr>
+        <w:pStyle w:val="BlockText"/>
+        <w:numPr>
+          <w:ilvl w:val="0"/>
+          <w:numId w:val="1000"/>
+        </w:numPr>
+      </w:pPr>
+      <w:r>
+        <w:t xml:space="preserve">✅</w:t>
+      </w:r>
+      <w:r>
+        <w:t xml:space="preserve"> </w:t>
+      </w:r>
+      <w:r>
+        <w:rPr>
+          <w:b/>
+          <w:bCs/>
+        </w:rPr>
+        <w:t xml:space="preserve">Definition (left distributivity).</w:t>
+      </w:r>
+      <w:r>
+        <w:t xml:space="preserve"> </w:t>
+      </w:r>
+      <w:r>
+        <w:t xml:space="preserve">Multiplication</w:t>
+      </w:r>
+      <w:r>
+        <w:t xml:space="preserve"> </w:t>
+      </w:r>
+      <w:r>
+        <w:rPr>
+          <w:i/>
+          <w:iCs/>
+        </w:rPr>
+        <w:t xml:space="preserve">distributes over addition on the left</w:t>
+      </w:r>
+      <w:r>
+        <w:t xml:space="preserve"> </w:t>
+      </w:r>
+      <w:r>
+        <w:t xml:space="preserve">if</w:t>
+      </w:r>
+      <w:r>
+        <w:t xml:space="preserve"> </w:t>
+      </w:r>
+      <m:oMath>
+        <m:r>
+          <m:t>a</m:t>
+        </m:r>
+        <m:r>
+          <m:rPr>
+            <m:sty m:val="p"/>
+          </m:rPr>
+          <m:t>(</m:t>
+        </m:r>
+        <m:r>
+          <m:t>b</m:t>
+        </m:r>
+        <m:r>
+          <m:rPr>
+            <m:sty m:val="p"/>
+          </m:rPr>
+          <m:t>+</m:t>
+        </m:r>
+        <m:r>
+          <m:t>c</m:t>
+        </m:r>
+        <m:r>
+          <m:rPr>
+            <m:sty m:val="p"/>
+          </m:rPr>
+          <m:t>)</m:t>
+        </m:r>
+        <m:r>
+          <m:rPr>
+            <m:sty m:val="p"/>
+          </m:rPr>
+          <m:t>=</m:t>
+        </m:r>
+        <m:r>
+          <m:t>a</m:t>
+        </m:r>
+        <m:r>
+          <m:t>b</m:t>
+        </m:r>
+        <m:r>
+          <m:rPr>
+            <m:sty m:val="p"/>
+          </m:rPr>
+          <m:t>+</m:t>
+        </m:r>
+        <m:r>
+          <m:t>a</m:t>
+        </m:r>
+        <m:r>
+          <m:t>c</m:t>
+        </m:r>
+      </m:oMath>
+      <w:r>
+        <w:t xml:space="preserve"> </w:t>
+      </w:r>
+      <w:r>
+        <w:t xml:space="preserve">for all</w:t>
+      </w:r>
+      <w:r>
+        <w:t xml:space="preserve"> </w:t>
+      </w:r>
+      <m:oMath>
+        <m:r>
+          <m:t>a</m:t>
+        </m:r>
+      </m:oMath>
+      <w:r>
+        <w:t xml:space="preserve">,</w:t>
+      </w:r>
+      <w:r>
+        <w:t xml:space="preserve"> </w:t>
+      </w:r>
+      <m:oMath>
+        <m:r>
+          <m:t>b</m:t>
+        </m:r>
+      </m:oMath>
+      <w:r>
+        <w:t xml:space="preserve"> </w:t>
+      </w:r>
+      <w:r>
+        <w:t xml:space="preserve">and</w:t>
+      </w:r>
+      <w:r>
+        <w:t xml:space="preserve"> </w:t>
+      </w:r>
+      <m:oMath>
+        <m:r>
+          <m:t>c</m:t>
+        </m:r>
+      </m:oMath>
+      <w:r>
+        <w:t xml:space="preserve">.</w:t>
+      </w:r>
+    </w:p>
+    <w:p>
+      <w:pPr>
+        <w:pStyle w:val="BlockText"/>
+        <w:numPr>
+          <w:ilvl w:val="0"/>
+          <w:numId w:val="1000"/>
+        </w:numPr>
+      </w:pPr>
+      <w:r>
+        <w:t xml:space="preserve">✅</w:t>
+      </w:r>
+      <w:r>
+        <w:t xml:space="preserve"> </w:t>
+      </w:r>
+      <w:r>
+        <w:rPr>
+          <w:b/>
+          <w:bCs/>
+        </w:rPr>
+        <w:t xml:space="preserve">Definition (right distributivity).</w:t>
+      </w:r>
+      <w:r>
+        <w:t xml:space="preserve"> </w:t>
+      </w:r>
+      <w:r>
+        <w:t xml:space="preserve">Multiplication</w:t>
+      </w:r>
+      <w:r>
+        <w:t xml:space="preserve"> </w:t>
+      </w:r>
+      <w:r>
+        <w:rPr>
+          <w:i/>
+          <w:iCs/>
+        </w:rPr>
+        <w:t xml:space="preserve">distributes over addition on the right</w:t>
+      </w:r>
+      <w:r>
+        <w:t xml:space="preserve"> </w:t>
+      </w:r>
+      <w:r>
+        <w:t xml:space="preserve">if</w:t>
+      </w:r>
+      <w:r>
+        <w:t xml:space="preserve"> </w:t>
+      </w:r>
+      <m:oMath>
+        <m:r>
+          <m:rPr>
+            <m:sty m:val="p"/>
+          </m:rPr>
+          <m:t>(</m:t>
+        </m:r>
+        <m:r>
+          <m:t>a</m:t>
+        </m:r>
+        <m:r>
+          <m:rPr>
+            <m:sty m:val="p"/>
+          </m:rPr>
+          <m:t>+</m:t>
+        </m:r>
+        <m:r>
+          <m:t>b</m:t>
+        </m:r>
+        <m:r>
+          <m:rPr>
+            <m:sty m:val="p"/>
+          </m:rPr>
+          <m:t>)</m:t>
+        </m:r>
+        <m:r>
+          <m:t>c</m:t>
+        </m:r>
+        <m:r>
+          <m:rPr>
+            <m:sty m:val="p"/>
+          </m:rPr>
+          <m:t>=</m:t>
+        </m:r>
+        <m:r>
+          <m:t>a</m:t>
+        </m:r>
+        <m:r>
+          <m:t>c</m:t>
+        </m:r>
+        <m:r>
+          <m:rPr>
+            <m:sty m:val="p"/>
+          </m:rPr>
+          <m:t>+</m:t>
+        </m:r>
+        <m:r>
+          <m:t>b</m:t>
+        </m:r>
+        <m:r>
+          <m:t>c</m:t>
+        </m:r>
+      </m:oMath>
+      <w:r>
+        <w:t xml:space="preserve"> </w:t>
+      </w:r>
+      <w:r>
+        <w:t xml:space="preserve">for all</w:t>
+      </w:r>
+      <w:r>
+        <w:t xml:space="preserve"> </w:t>
+      </w:r>
+      <m:oMath>
+        <m:r>
+          <m:t>a</m:t>
+        </m:r>
+      </m:oMath>
+      <w:r>
+        <w:t xml:space="preserve">,</w:t>
+      </w:r>
+      <w:r>
+        <w:t xml:space="preserve"> </w:t>
+      </w:r>
+      <m:oMath>
+        <m:r>
+          <m:t>b</m:t>
+        </m:r>
+      </m:oMath>
+      <w:r>
+        <w:t xml:space="preserve"> </w:t>
+      </w:r>
+      <w:r>
+        <w:t xml:space="preserve">and</w:t>
+      </w:r>
+      <w:r>
+        <w:t xml:space="preserve"> </w:t>
+      </w:r>
+      <m:oMath>
+        <m:r>
+          <m:t>c</m:t>
+        </m:r>
+      </m:oMath>
+      <w:r>
+        <w:t xml:space="preserve">.</w:t>
+      </w:r>
+    </w:p>
+    <w:p>
+      <w:pPr>
+        <w:numPr>
+          <w:ilvl w:val="0"/>
+          <w:numId w:val="1000"/>
+        </w:numPr>
+      </w:pPr>
+      <w:r>
+        <w:t xml:space="preserve">The first block cannot be linked to as</w:t>
+      </w:r>
+      <w:r>
+        <w:t xml:space="preserve"> </w:t>
+      </w:r>
+      <w:r>
+        <w:t xml:space="preserve">“left distributivity”</w:t>
+      </w:r>
+      <w:r>
+        <w:t xml:space="preserve"> </w:t>
+      </w:r>
+      <w:r>
+        <w:t xml:space="preserve">without also pointing at the other law,</w:t>
+      </w:r>
+      <w:r>
+        <w:t xml:space="preserve"> </w:t>
+      </w:r>
+      <w:r>
+        <w:t xml:space="preserve">and one example cannot illustrate both.</w:t>
+      </w:r>
+      <w:r>
+        <w:t xml:space="preserve"> </w:t>
+      </w:r>
+      <w:r>
+        <w:t xml:space="preserve">For numbers, right distributivity follows from left distributivity because multiplication commutes,</w:t>
+      </w:r>
+      <w:r>
+        <w:t xml:space="preserve"> </w:t>
+      </w:r>
+      <w:r>
+        <w:t xml:space="preserve">so one example checks both.</w:t>
+      </w:r>
+      <w:r>
+        <w:t xml:space="preserve"> </w:t>
+      </w:r>
+      <w:r>
+        <w:t xml:space="preserve">Matrix multiplication does not commute, so establishing one law does not establish the other,</w:t>
+      </w:r>
+      <w:r>
+        <w:t xml:space="preserve"> </w:t>
+      </w:r>
+      <w:r>
+        <w:t xml:space="preserve">and each needs its own example.</w:t>
+      </w:r>
+    </w:p>
+    <w:bookmarkEnd w:id="16"/>
     <w:p>
       <w:pPr>
         <w:numPr>
@@ -2997,7 +3590,7 @@
       <w:r>
         <w:t xml:space="preserve"> </w:t>
       </w:r>
-      <w:hyperlink r:id="rId16">
+      <w:hyperlink r:id="rId17">
         <w:r>
           <w:rPr>
             <w:rStyle w:val="Hyperlink"/>
@@ -4451,8 +5044,8 @@
         <w:t xml:space="preserve">When in doubt, keep it.</w:t>
       </w:r>
     </w:p>
-    <w:bookmarkEnd w:id="17"/>
-    <w:bookmarkStart w:id="24" w:name="examples-of-term-definitions"/>
+    <w:bookmarkEnd w:id="18"/>
+    <w:bookmarkStart w:id="25" w:name="examples-of-term-definitions"/>
     <w:p>
       <w:pPr>
         <w:pStyle w:val="Heading2"/>
@@ -4469,7 +5062,7 @@
         <w:t xml:space="preserve">Here are examples of well-defined terms:</w:t>
       </w:r>
     </w:p>
-    <w:bookmarkStart w:id="18" w:name="def-confidence-interval"/>
+    <w:bookmarkStart w:id="19" w:name="def-confidence-interval"/>
     <w:p>
       <w:pPr>
         <w:pStyle w:val="BodyText"/>
@@ -4706,8 +5299,8 @@
         </m:oMath>
       </m:oMathPara>
     </w:p>
-    <w:bookmarkEnd w:id="18"/>
-    <w:bookmarkStart w:id="19" w:name="exm-confidence-interval"/>
+    <w:bookmarkEnd w:id="19"/>
+    <w:bookmarkStart w:id="20" w:name="exm-confidence-interval"/>
     <w:p>
       <w:pPr>
         <w:pStyle w:val="FirstParagraph"/>
@@ -4717,7 +5310,7 @@
           <w:b/>
           <w:bCs/>
         </w:rPr>
-        <w:t xml:space="preserve">Example 5 (A confidence interval for mean height)</w:t>
+        <w:t xml:space="preserve">Example 6 (A confidence interval for mean height)</w:t>
       </w:r>
       <w:r>
         <w:t xml:space="preserve"> </w:t>
@@ -4749,8 +5342,8 @@
         <w:t xml:space="preserve">we are 95% confident that the true population mean height falls within this range.</w:t>
       </w:r>
     </w:p>
-    <w:bookmarkEnd w:id="19"/>
-    <w:bookmarkStart w:id="20" w:name="exm-not-confidence-interval"/>
+    <w:bookmarkEnd w:id="20"/>
+    <w:bookmarkStart w:id="21" w:name="exm-not-confidence-interval"/>
     <w:p>
       <w:pPr>
         <w:pStyle w:val="BodyText"/>
@@ -4760,7 +5353,7 @@
           <w:b/>
           <w:bCs/>
         </w:rPr>
-        <w:t xml:space="preserve">Example 6 (A range that is not a confidence interval for the mean)</w:t>
+        <w:t xml:space="preserve">Example 7 (A range that is not a confidence interval for the mean)</w:t>
       </w:r>
       <w:r>
         <w:t xml:space="preserve"> </w:t>
@@ -4810,8 +5403,8 @@
         <w:t xml:space="preserve">and it does not shrink as the sample grows.</w:t>
       </w:r>
     </w:p>
-    <w:bookmarkEnd w:id="20"/>
-    <w:bookmarkStart w:id="21" w:name="def-active-voice"/>
+    <w:bookmarkEnd w:id="21"/>
+    <w:bookmarkStart w:id="22" w:name="def-active-voice"/>
     <w:p>
       <w:pPr>
         <w:pStyle w:val="BodyText"/>
@@ -4840,8 +5433,8 @@
         <w:t xml:space="preserve">is a sentence structure where the subject performs the action expressed by the verb.</w:t>
       </w:r>
     </w:p>
-    <w:bookmarkEnd w:id="21"/>
-    <w:bookmarkStart w:id="22" w:name="exm-active-voice"/>
+    <w:bookmarkEnd w:id="22"/>
+    <w:bookmarkStart w:id="23" w:name="exm-active-voice"/>
     <w:p>
       <w:pPr>
         <w:pStyle w:val="BodyText"/>
@@ -4851,7 +5444,7 @@
           <w:b/>
           <w:bCs/>
         </w:rPr>
-        <w:t xml:space="preserve">Example 7 (A sentence in active voice)</w:t>
+        <w:t xml:space="preserve">Example 8 (A sentence in active voice)</w:t>
       </w:r>
       <w:r>
         <w:t xml:space="preserve"> </w:t>
@@ -4901,8 +5494,8 @@
         <w:t xml:space="preserve">.</w:t>
       </w:r>
     </w:p>
-    <w:bookmarkEnd w:id="22"/>
-    <w:bookmarkStart w:id="23" w:name="exm-passive-voice"/>
+    <w:bookmarkEnd w:id="23"/>
+    <w:bookmarkStart w:id="24" w:name="exm-passive-voice"/>
     <w:p>
       <w:pPr>
         <w:pStyle w:val="BodyText"/>
@@ -4912,7 +5505,7 @@
           <w:b/>
           <w:bCs/>
         </w:rPr>
-        <w:t xml:space="preserve">Example 8 (A sentence that is not in active voice)</w:t>
+        <w:t xml:space="preserve">Example 9 (A sentence that is not in active voice)</w:t>
       </w:r>
       <w:r>
         <w:t xml:space="preserve"> </w:t>
@@ -4965,9 +5558,9 @@
         <w:t xml:space="preserve">so the sentence is in passive voice.</w:t>
       </w:r>
     </w:p>
-    <w:bookmarkEnd w:id="23"/>
     <w:bookmarkEnd w:id="24"/>
-    <w:bookmarkStart w:id="29" w:name="order-general-definition-then-examples"/>
+    <w:bookmarkEnd w:id="25"/>
+    <w:bookmarkStart w:id="30" w:name="order-general-definition-then-examples"/>
     <w:p>
       <w:pPr>
         <w:pStyle w:val="Heading2"/>
@@ -5020,7 +5613,7 @@
         <w:t xml:space="preserve">would give these blocks, in this order:</w:t>
       </w:r>
     </w:p>
-    <w:bookmarkStart w:id="25" w:name="def-rss"/>
+    <w:bookmarkStart w:id="26" w:name="def-rss"/>
     <w:p>
       <w:pPr>
         <w:pStyle w:val="BodyText"/>
@@ -5138,8 +5731,8 @@
         </m:oMath>
       </m:oMathPara>
     </w:p>
-    <w:bookmarkEnd w:id="25"/>
-    <w:bookmarkStart w:id="26" w:name="exm-rss-line"/>
+    <w:bookmarkEnd w:id="26"/>
+    <w:bookmarkStart w:id="27" w:name="exm-rss-line"/>
     <w:p>
       <w:pPr>
         <w:pStyle w:val="FirstParagraph"/>
@@ -5149,7 +5742,7 @@
           <w:b/>
           <w:bCs/>
         </w:rPr>
-        <w:t xml:space="preserve">Example 9 (Residual sum of squares of a straight line)</w:t>
+        <w:t xml:space="preserve">Example 10 (Residual sum of squares of a straight line)</w:t>
       </w:r>
       <w:r>
         <w:t xml:space="preserve"> </w:t>
@@ -5471,8 +6064,8 @@
         </m:oMath>
       </m:oMathPara>
     </w:p>
-    <w:bookmarkEnd w:id="26"/>
-    <w:bookmarkStart w:id="27" w:name="exm-rss-three-points"/>
+    <w:bookmarkEnd w:id="27"/>
+    <w:bookmarkStart w:id="28" w:name="exm-rss-three-points"/>
     <w:p>
       <w:pPr>
         <w:pStyle w:val="FirstParagraph"/>
@@ -5482,7 +6075,7 @@
           <w:b/>
           <w:bCs/>
         </w:rPr>
-        <w:t xml:space="preserve">Example 10 (Residual sum of squares of a line through three points)</w:t>
+        <w:t xml:space="preserve">Example 11 (Residual sum of squares of a line through three points)</w:t>
       </w:r>
       <w:r>
         <w:t xml:space="preserve"> </w:t>
@@ -5658,7 +6251,7 @@
           <w:rPr>
             <w:rStyle w:val="Hyperlink"/>
           </w:rPr>
-          <w:t xml:space="preserve">Example 9</w:t>
+          <w:t xml:space="preserve">Example 10</w:t>
         </w:r>
       </w:hyperlink>
       <w:r>
@@ -5761,8 +6354,8 @@
         <w:t xml:space="preserve">.</w:t>
       </w:r>
     </w:p>
-    <w:bookmarkEnd w:id="27"/>
-    <w:bookmarkStart w:id="28" w:name="exm-not-rss"/>
+    <w:bookmarkEnd w:id="28"/>
+    <w:bookmarkStart w:id="29" w:name="exm-not-rss"/>
     <w:p>
       <w:pPr>
         <w:pStyle w:val="BodyText"/>
@@ -5772,7 +6365,7 @@
           <w:b/>
           <w:bCs/>
         </w:rPr>
-        <w:t xml:space="preserve">Example 11 (A sum of squares that is not a residual sum of squares)</w:t>
+        <w:t xml:space="preserve">Example 12 (A sum of squares that is not a residual sum of squares)</w:t>
       </w:r>
       <w:r>
         <w:t xml:space="preserve"> </w:t>
@@ -5886,7 +6479,7 @@
           <w:rPr>
             <w:rStyle w:val="Hyperlink"/>
           </w:rPr>
-          <w:t xml:space="preserve">Example 10</w:t>
+          <w:t xml:space="preserve">Example 11</w:t>
         </w:r>
       </w:hyperlink>
       <w:r>
@@ -5905,7 +6498,7 @@
         <w:t xml:space="preserve">rather than around the line’s fitted values.</w:t>
       </w:r>
     </w:p>
-    <w:bookmarkEnd w:id="28"/>
+    <w:bookmarkEnd w:id="29"/>
     <w:p>
       <w:pPr>
         <w:pStyle w:val="BodyText"/>
@@ -5944,8 +6537,8 @@
         <w:t xml:space="preserve">once the reader knows what the definition covers.</w:t>
       </w:r>
     </w:p>
-    <w:bookmarkEnd w:id="29"/>
-    <w:bookmarkStart w:id="30" w:name="why-examples-matter"/>
+    <w:bookmarkEnd w:id="30"/>
+    <w:bookmarkStart w:id="31" w:name="why-examples-matter"/>
     <w:p>
       <w:pPr>
         <w:pStyle w:val="Heading2"/>
@@ -6097,8 +6690,8 @@
         <w:t xml:space="preserve">which is where readers most often misapply it.</w:t>
       </w:r>
     </w:p>
-    <w:bookmarkEnd w:id="30"/>
-    <w:bookmarkStart w:id="31" w:name="common-pitfalls-to-avoid"/>
+    <w:bookmarkEnd w:id="31"/>
+    <w:bookmarkStart w:id="32" w:name="common-pitfalls-to-avoid"/>
     <w:p>
       <w:pPr>
         <w:pStyle w:val="Heading2"/>
@@ -6352,8 +6945,8 @@
         <w:t xml:space="preserve">of the definition they are meant to demonstrate.</w:t>
       </w:r>
     </w:p>
-    <w:bookmarkEnd w:id="31"/>
-    <w:bookmarkStart w:id="39" w:name="mathematical-statements-require-examples"/>
+    <w:bookmarkEnd w:id="32"/>
+    <w:bookmarkStart w:id="40" w:name="mathematical-statements-require-examples"/>
     <w:p>
       <w:pPr>
         <w:pStyle w:val="Heading2"/>
@@ -6406,7 +6999,7 @@
         <w:t xml:space="preserve">when readers can see concrete instances.</w:t>
       </w:r>
     </w:p>
-    <w:bookmarkStart w:id="33" w:name="using-theorem-environments-in-quarto"/>
+    <w:bookmarkStart w:id="34" w:name="using-theorem-environments-in-quarto"/>
     <w:p>
       <w:pPr>
         <w:pStyle w:val="Heading3"/>
@@ -6699,7 +7292,7 @@
       <w:r>
         <w:t xml:space="preserve"> </w:t>
       </w:r>
-      <w:hyperlink r:id="rId32">
+      <w:hyperlink r:id="rId33">
         <w:r>
           <w:rPr>
             <w:rStyle w:val="Hyperlink"/>
@@ -6826,8 +7419,8 @@
         <w:t xml:space="preserve">.</w:t>
       </w:r>
     </w:p>
-    <w:bookmarkEnd w:id="33"/>
-    <w:bookmarkStart w:id="38" w:name="example-pythagorean-theorem"/>
+    <w:bookmarkEnd w:id="34"/>
+    <w:bookmarkStart w:id="39" w:name="example-pythagorean-theorem"/>
     <w:p>
       <w:pPr>
         <w:pStyle w:val="Heading3"/>
@@ -6836,7 +7429,7 @@
         <w:t xml:space="preserve">6.2 Example: Pythagorean theorem</w:t>
       </w:r>
     </w:p>
-    <w:bookmarkStart w:id="34" w:name="thm-pythagoras"/>
+    <w:bookmarkStart w:id="35" w:name="thm-pythagoras"/>
     <w:p>
       <w:pPr>
         <w:pStyle w:val="FirstParagraph"/>
@@ -6927,8 +7520,8 @@
         </m:oMath>
       </m:oMathPara>
     </w:p>
-    <w:bookmarkEnd w:id="34"/>
-    <w:bookmarkStart w:id="35" w:name="exm-pythagoras"/>
+    <w:bookmarkEnd w:id="35"/>
+    <w:bookmarkStart w:id="36" w:name="exm-pythagoras"/>
     <w:p>
       <w:pPr>
         <w:pStyle w:val="FirstParagraph"/>
@@ -6938,7 +7531,7 @@
           <w:b/>
           <w:bCs/>
         </w:rPr>
-        <w:t xml:space="preserve">Example 12 (Pythagorean theorem example)</w:t>
+        <w:t xml:space="preserve">Example 13 (Pythagorean theorem example)</w:t>
       </w:r>
       <w:r>
         <w:t xml:space="preserve"> </w:t>
@@ -7057,8 +7650,8 @@
         </m:oMath>
       </m:oMathPara>
     </w:p>
-    <w:bookmarkEnd w:id="35"/>
-    <w:bookmarkStart w:id="36" w:name="def-postulate"/>
+    <w:bookmarkEnd w:id="36"/>
+    <w:bookmarkStart w:id="37" w:name="def-postulate"/>
     <w:p>
       <w:pPr>
         <w:pStyle w:val="FirstParagraph"/>
@@ -7112,8 +7705,8 @@
         <w:t xml:space="preserve">serving as a starting point for further reasoning.</w:t>
       </w:r>
     </w:p>
-    <w:bookmarkEnd w:id="36"/>
-    <w:bookmarkStart w:id="37" w:name="exm-parallel-postulate"/>
+    <w:bookmarkEnd w:id="37"/>
+    <w:bookmarkStart w:id="38" w:name="exm-parallel-postulate"/>
     <w:p>
       <w:pPr>
         <w:pStyle w:val="BodyText"/>
@@ -7123,7 +7716,7 @@
           <w:b/>
           <w:bCs/>
         </w:rPr>
-        <w:t xml:space="preserve">Example 13 (Euclid’s parallel postulate)</w:t>
+        <w:t xml:space="preserve">Example 14 (Euclid’s parallel postulate)</w:t>
       </w:r>
       <w:r>
         <w:t xml:space="preserve"> </w:t>
@@ -7216,10 +7809,10 @@
         <w:t xml:space="preserve">.</w:t>
       </w:r>
     </w:p>
-    <w:bookmarkEnd w:id="37"/>
     <w:bookmarkEnd w:id="38"/>
     <w:bookmarkEnd w:id="39"/>
-    <w:bookmarkStart w:id="47" w:name="Xe6c88c177e563d1f046037569009a36fd08f4bd"/>
+    <w:bookmarkEnd w:id="40"/>
+    <w:bookmarkStart w:id="48" w:name="Xe6c88c177e563d1f046037569009a36fd08f4bd"/>
     <w:p>
       <w:pPr>
         <w:pStyle w:val="Heading2"/>
@@ -7482,7 +8075,7 @@
       <w:r>
         <w:t xml:space="preserve"> </w:t>
       </w:r>
-      <w:hyperlink r:id="rId40">
+      <w:hyperlink r:id="rId41">
         <w:r>
           <w:rPr>
             <w:rStyle w:val="Hyperlink"/>
@@ -7733,7 +8326,7 @@
         <w:t xml:space="preserve">is an ordinary step, not the pattern to avoid.</w:t>
       </w:r>
     </w:p>
-    <w:bookmarkStart w:id="41" w:name="def-sample-mean"/>
+    <w:bookmarkStart w:id="42" w:name="def-sample-mean"/>
     <w:p>
       <w:pPr>
         <w:pStyle w:val="FirstParagraph"/>
@@ -7918,8 +8511,8 @@
         </m:oMath>
       </m:oMathPara>
     </w:p>
-    <w:bookmarkEnd w:id="41"/>
-    <w:bookmarkStart w:id="42" w:name="exr-sum-deviations"/>
+    <w:bookmarkEnd w:id="42"/>
+    <w:bookmarkStart w:id="43" w:name="exr-sum-deviations"/>
     <w:p>
       <w:pPr>
         <w:pStyle w:val="FirstParagraph"/>
@@ -8074,8 +8667,8 @@
         <w:t xml:space="preserve">).</w:t>
       </w:r>
     </w:p>
-    <w:bookmarkEnd w:id="42"/>
-    <w:bookmarkStart w:id="43" w:name="sol-sum-deviations"/>
+    <w:bookmarkEnd w:id="43"/>
+    <w:bookmarkStart w:id="44" w:name="sol-sum-deviations"/>
     <w:p>
       <w:pPr>
         <w:pStyle w:val="BodyText"/>
@@ -8526,8 +9119,8 @@
         </m:oMath>
       </m:oMathPara>
     </w:p>
-    <w:bookmarkEnd w:id="43"/>
-    <w:bookmarkStart w:id="44" w:name="thm-sum-deviations"/>
+    <w:bookmarkEnd w:id="44"/>
+    <w:bookmarkStart w:id="45" w:name="thm-sum-deviations"/>
     <w:p>
       <w:pPr>
         <w:pStyle w:val="FirstParagraph"/>
@@ -8733,7 +9326,7 @@
         </m:oMath>
       </m:oMathPara>
     </w:p>
-    <w:bookmarkEnd w:id="44"/>
+    <w:bookmarkEnd w:id="45"/>
     <w:p>
       <w:pPr>
         <w:pStyle w:val="FirstParagraph"/>
@@ -8763,7 +9356,7 @@
         <w:t xml:space="preserve">derives this result.</w:t>
       </w:r>
     </w:p>
-    <w:bookmarkStart w:id="45" w:name="exm-derivation-direction"/>
+    <w:bookmarkStart w:id="46" w:name="exm-derivation-direction"/>
     <w:p>
       <w:pPr>
         <w:pStyle w:val="BodyText"/>
@@ -8773,7 +9366,7 @@
           <w:b/>
           <w:bCs/>
         </w:rPr>
-        <w:t xml:space="preserve">Example 14 (Deriving an equality from the side that simplifies)</w:t>
+        <w:t xml:space="preserve">Example 15 (Deriving an equality from the side that simplifies)</w:t>
       </w:r>
       <w:r>
         <w:t xml:space="preserve"> </w:t>
@@ -9827,7 +10420,7 @@
       <w:r>
         <w:t xml:space="preserve"> </w:t>
       </w:r>
-      <w:hyperlink r:id="rId40">
+      <w:hyperlink r:id="rId41">
         <w:r>
           <w:rPr>
             <w:rStyle w:val="Hyperlink"/>
@@ -9839,8 +10432,8 @@
         <w:t xml:space="preserve">).</w:t>
       </w:r>
     </w:p>
-    <w:bookmarkEnd w:id="45"/>
-    <w:bookmarkStart w:id="46" w:name="exm-one-result-per-theorem"/>
+    <w:bookmarkEnd w:id="46"/>
+    <w:bookmarkStart w:id="47" w:name="exm-one-result-per-theorem"/>
     <w:p>
       <w:pPr>
         <w:pStyle w:val="BodyText"/>
@@ -9850,7 +10443,7 @@
           <w:b/>
           <w:bCs/>
         </w:rPr>
-        <w:t xml:space="preserve">Example 15 (Splitting a theorem that states two results)</w:t>
+        <w:t xml:space="preserve">Example 16 (Splitting a theorem that states two results)</w:t>
       </w:r>
       <w:r>
         <w:t xml:space="preserve"> </w:t>
@@ -10324,8 +10917,8 @@
         <w:t xml:space="preserve">and a later step that uses only the first can cite only the first.</w:t>
       </w:r>
     </w:p>
-    <w:bookmarkEnd w:id="46"/>
     <w:bookmarkEnd w:id="47"/>
+    <w:bookmarkEnd w:id="48"/>
     <w:sectPr>
       <w:footnotePr>
         <w:numRestart w:val="eachSect"/>

</xml_diff>

<commit_message>
Deploying to gh-pages from @ Morrison-Lab/psw@9f54d0f46fa14edf8934670d99393369cace1bdf 🚀
</commit_message>
<xml_diff>
--- a/chapters/defining-terms.docx
+++ b/chapters/defining-terms.docx
@@ -15,7 +15,7 @@
         <w:pStyle w:val="Date"/>
       </w:pPr>
       <w:r>
-        <w:t xml:space="preserve">Last modified: 2026-10-16 10:30:48 (PDT)</w:t>
+        <w:t xml:space="preserve">Last modified: 2026-10-16 10:35:43 (PDT)</w:t>
       </w:r>
     </w:p>
     <w:p>
@@ -2197,6 +2197,198 @@
       </w:r>
       <w:r>
         <w:t xml:space="preserve">Place the definition immediately before or after the term’s first appearance.</w:t>
+      </w:r>
+    </w:p>
+    <w:p>
+      <w:pPr>
+        <w:numPr>
+          <w:ilvl w:val="0"/>
+          <w:numId w:val="1001"/>
+        </w:numPr>
+      </w:pPr>
+      <w:r>
+        <w:rPr>
+          <w:b/>
+          <w:bCs/>
+        </w:rPr>
+        <w:t xml:space="preserve">Give every key term a formal definition in a</w:t>
+      </w:r>
+      <w:r>
+        <w:rPr>
+          <w:b/>
+          <w:bCs/>
+        </w:rPr>
+        <w:t xml:space="preserve"> </w:t>
+      </w:r>
+      <w:r>
+        <w:rPr>
+          <w:rStyle w:val="VerbatimChar"/>
+          <w:b/>
+          <w:bCs/>
+        </w:rPr>
+        <w:t xml:space="preserve">#def-</w:t>
+      </w:r>
+      <w:r>
+        <w:rPr>
+          <w:b/>
+          <w:bCs/>
+        </w:rPr>
+        <w:t xml:space="preserve"> </w:t>
+      </w:r>
+      <w:r>
+        <w:rPr>
+          <w:b/>
+          <w:bCs/>
+        </w:rPr>
+        <w:t xml:space="preserve">div:</w:t>
+      </w:r>
+      <w:r>
+        <w:t xml:space="preserve"> </w:t>
+      </w:r>
+      <w:r>
+        <w:t xml:space="preserve">A term that the document relies on needs its own definition div,</w:t>
+      </w:r>
+      <w:r>
+        <w:t xml:space="preserve"> </w:t>
+      </w:r>
+      <w:r>
+        <w:t xml:space="preserve">even if an exercise, a solution, an example or a sentence of prose</w:t>
+      </w:r>
+      <w:r>
+        <w:t xml:space="preserve"> </w:t>
+      </w:r>
+      <w:r>
+        <w:t xml:space="preserve">has already explained it.</w:t>
+      </w:r>
+      <w:r>
+        <w:t xml:space="preserve"> </w:t>
+      </w:r>
+      <w:r>
+        <w:t xml:space="preserve">An explanation inside an exercise or solution cannot be linked to as a definition,</w:t>
+      </w:r>
+      <w:r>
+        <w:t xml:space="preserve"> </w:t>
+      </w:r>
+      <w:r>
+        <w:t xml:space="preserve">and a student who skips the exercise never sees it.</w:t>
+      </w:r>
+      <w:r>
+        <w:t xml:space="preserve"> </w:t>
+      </w:r>
+      <w:r>
+        <w:t xml:space="preserve">Find the gaps by listing the terms the document uses,</w:t>
+      </w:r>
+      <w:r>
+        <w:t xml:space="preserve"> </w:t>
+      </w:r>
+      <w:r>
+        <w:t xml:space="preserve">such as the bolded phrases and the terms in section titles,</w:t>
+      </w:r>
+      <w:r>
+        <w:t xml:space="preserve"> </w:t>
+      </w:r>
+      <w:r>
+        <w:t xml:space="preserve">and checking that each one has a</w:t>
+      </w:r>
+      <w:r>
+        <w:t xml:space="preserve"> </w:t>
+      </w:r>
+      <w:r>
+        <w:rPr>
+          <w:rStyle w:val="VerbatimChar"/>
+        </w:rPr>
+        <w:t xml:space="preserve">#def-</w:t>
+      </w:r>
+      <w:r>
+        <w:t xml:space="preserve"> </w:t>
+      </w:r>
+      <w:r>
+        <w:t xml:space="preserve">div,</w:t>
+      </w:r>
+      <w:r>
+        <w:t xml:space="preserve"> </w:t>
+      </w:r>
+      <w:r>
+        <w:t xml:space="preserve">or a link to the page that has one.</w:t>
+      </w:r>
+      <w:r>
+        <w:t xml:space="preserve"> </w:t>
+      </w:r>
+      <w:r>
+        <w:t xml:space="preserve">This extends</w:t>
+      </w:r>
+      <w:r>
+        <w:t xml:space="preserve"> </w:t>
+      </w:r>
+      <w:r>
+        <w:rPr>
+          <w:i/>
+          <w:iCs/>
+        </w:rPr>
+        <w:t xml:space="preserve">Give each term its own definition block</w:t>
+      </w:r>
+      <w:r>
+        <w:t xml:space="preserve"> </w:t>
+      </w:r>
+      <w:r>
+        <w:t xml:space="preserve">below</w:t>
+      </w:r>
+      <w:r>
+        <w:t xml:space="preserve"> </w:t>
+      </w:r>
+      <w:r>
+        <w:t xml:space="preserve">from terms defined in passing to terms explained only in exercises.</w:t>
+      </w:r>
+      <w:r>
+        <w:t xml:space="preserve"> </w:t>
+      </w:r>
+      <w:r>
+        <w:t xml:space="preserve">For example, if</w:t>
+      </w:r>
+      <w:r>
+        <w:t xml:space="preserve"> </w:t>
+      </w:r>
+      <w:r>
+        <w:t xml:space="preserve">“loss function”</w:t>
+      </w:r>
+      <w:r>
+        <w:t xml:space="preserve"> </w:t>
+      </w:r>
+      <w:r>
+        <w:t xml:space="preserve">first appears in an exercise</w:t>
+      </w:r>
+      <w:r>
+        <w:t xml:space="preserve"> </w:t>
+      </w:r>
+      <w:r>
+        <w:t xml:space="preserve">that asks students to compute one,</w:t>
+      </w:r>
+      <w:r>
+        <w:t xml:space="preserve"> </w:t>
+      </w:r>
+      <w:r>
+        <w:t xml:space="preserve">add a</w:t>
+      </w:r>
+      <w:r>
+        <w:t xml:space="preserve"> </w:t>
+      </w:r>
+      <w:r>
+        <w:rPr>
+          <w:rStyle w:val="VerbatimChar"/>
+        </w:rPr>
+        <w:t xml:space="preserve">#def-loss-function</w:t>
+      </w:r>
+      <w:r>
+        <w:t xml:space="preserve"> </w:t>
+      </w:r>
+      <w:r>
+        <w:t xml:space="preserve">div before the exercise,</w:t>
+      </w:r>
+      <w:r>
+        <w:t xml:space="preserve"> </w:t>
+      </w:r>
+      <w:r>
+        <w:t xml:space="preserve">and link the exercise’s mentions to it.</w:t>
       </w:r>
     </w:p>
     <w:p>

</xml_diff>

<commit_message>
Deploying to gh-pages from @ Morrison-Lab/psw@62f4de75541af61655ae797dd8b4fed9fa469db8 🚀
</commit_message>
<xml_diff>
--- a/chapters/defining-terms.docx
+++ b/chapters/defining-terms.docx
@@ -15,7 +15,7 @@
         <w:pStyle w:val="Date"/>
       </w:pPr>
       <w:r>
-        <w:t xml:space="preserve">Last modified: 2026-10-16 10:41:10 (PDT)</w:t>
+        <w:t xml:space="preserve">Last modified: 2026-10-16 16:33:26 (PDT)</w:t>
       </w:r>
     </w:p>
     <w:p>
@@ -2048,6 +2048,102 @@
       </w:r>
       <w:r>
         <w:t xml:space="preserve">that later calculations need.</w:t>
+      </w:r>
+    </w:p>
+    <w:p>
+      <w:pPr>
+        <w:numPr>
+          <w:ilvl w:val="0"/>
+          <w:numId w:val="1001"/>
+        </w:numPr>
+      </w:pPr>
+      <w:r>
+        <w:rPr>
+          <w:b/>
+          <w:bCs/>
+        </w:rPr>
+        <w:t xml:space="preserve">Define a term directly, not as a modification of another term:</w:t>
+      </w:r>
+      <w:r>
+        <w:t xml:space="preserve"> </w:t>
+      </w:r>
+      <w:r>
+        <w:t xml:space="preserve">State what the term is, in its own words and symbols.</w:t>
+      </w:r>
+      <w:r>
+        <w:t xml:space="preserve"> </w:t>
+      </w:r>
+      <w:r>
+        <w:t xml:space="preserve">Do not make the reader recall a different term</w:t>
+      </w:r>
+      <w:r>
+        <w:t xml:space="preserve"> </w:t>
+      </w:r>
+      <w:r>
+        <w:t xml:space="preserve">and then apply a list of changes to it.</w:t>
+      </w:r>
+      <w:r>
+        <w:t xml:space="preserve"> </w:t>
+      </w:r>
+      <w:r>
+        <w:t xml:space="preserve">For example, define the expected prediction error</w:t>
+      </w:r>
+      <w:r>
+        <w:t xml:space="preserve"> </w:t>
+      </w:r>
+      <w:r>
+        <w:t xml:space="preserve">as the population mean of the squared prediction error</w:t>
+      </w:r>
+      <w:r>
+        <w:t xml:space="preserve"> </w:t>
+      </w:r>
+      <w:r>
+        <w:t xml:space="preserve">over training sets and new observations,</w:t>
+      </w:r>
+      <w:r>
+        <w:t xml:space="preserve"> </w:t>
+      </w:r>
+      <w:r>
+        <w:t xml:space="preserve">rather than as</w:t>
+      </w:r>
+      <w:r>
+        <w:t xml:space="preserve"> </w:t>
+      </w:r>
+      <w:r>
+        <w:t xml:space="preserve">“the sample mean squared error of predictions,</w:t>
+      </w:r>
+      <w:r>
+        <w:t xml:space="preserve"> </w:t>
+      </w:r>
+      <w:r>
+        <w:t xml:space="preserve">with the average over observations replaced by an expectation”</w:t>
+      </w:r>
+      <w:r>
+        <w:t xml:space="preserve">.</w:t>
+      </w:r>
+      <w:r>
+        <w:t xml:space="preserve"> </w:t>
+      </w:r>
+      <w:r>
+        <w:t xml:space="preserve">The second wording makes the reader build a term</w:t>
+      </w:r>
+      <w:r>
+        <w:t xml:space="preserve"> </w:t>
+      </w:r>
+      <w:r>
+        <w:t xml:space="preserve">that the definition then discards.</w:t>
+      </w:r>
+      <w:r>
+        <w:t xml:space="preserve"> </w:t>
+      </w:r>
+      <w:r>
+        <w:t xml:space="preserve">Link a related term when it helps,</w:t>
+      </w:r>
+      <w:r>
+        <w:t xml:space="preserve"> </w:t>
+      </w:r>
+      <w:r>
+        <w:t xml:space="preserve">and relate the two in an example or a remark after the definition.</w:t>
       </w:r>
     </w:p>
     <w:p>

</xml_diff>

<commit_message>
Deploying to gh-pages from @ Morrison-Lab/psw@9481711c200d80f6a47add1f790f64aa3cb28916 🚀
</commit_message>
<xml_diff>
--- a/chapters/defining-terms.docx
+++ b/chapters/defining-terms.docx
@@ -15,7 +15,7 @@
         <w:pStyle w:val="Date"/>
       </w:pPr>
       <w:r>
-        <w:t xml:space="preserve">Last modified: 2026-10-16 17:01:04 (PDT)</w:t>
+        <w:t xml:space="preserve">Last modified: 2026-10-16 18:54:21 (PDT)</w:t>
       </w:r>
     </w:p>
     <w:p>
@@ -2499,6 +2499,137 @@
           <w:b/>
           <w:bCs/>
         </w:rPr>
+        <w:t xml:space="preserve">Pair each technical term with its mathematical symbol:</w:t>
+      </w:r>
+      <w:r>
+        <w:t xml:space="preserve"> </w:t>
+      </w:r>
+      <w:r>
+        <w:t xml:space="preserve">Whenever a definition, an example or a list names a quantity in words,</w:t>
+      </w:r>
+      <w:r>
+        <w:t xml:space="preserve"> </w:t>
+      </w:r>
+      <w:r>
+        <w:t xml:space="preserve">write its symbol beside the name.</w:t>
+      </w:r>
+      <w:r>
+        <w:t xml:space="preserve"> </w:t>
+      </w:r>
+      <w:r>
+        <w:t xml:space="preserve">For example, write</w:t>
+      </w:r>
+      <w:r>
+        <w:t xml:space="preserve"> </w:t>
+      </w:r>
+      <w:r>
+        <w:t xml:space="preserve">“the slope</w:t>
+      </w:r>
+      <w:r>
+        <w:t xml:space="preserve"> </w:t>
+      </w:r>
+      <m:oMath>
+        <m:sSub>
+          <m:e>
+            <m:r>
+              <m:t>β</m:t>
+            </m:r>
+          </m:e>
+          <m:sub>
+            <m:r>
+              <m:t>x</m:t>
+            </m:r>
+          </m:sub>
+        </m:sSub>
+      </m:oMath>
+      <w:r>
+        <w:t xml:space="preserve">”</w:t>
+      </w:r>
+      <w:r>
+        <w:t xml:space="preserve"> </w:t>
+      </w:r>
+      <w:r>
+        <w:t xml:space="preserve">and</w:t>
+      </w:r>
+      <w:r>
+        <w:t xml:space="preserve"> </w:t>
+      </w:r>
+      <w:r>
+        <w:t xml:space="preserve">“the residual sum of squares</w:t>
+      </w:r>
+      <w:r>
+        <w:t xml:space="preserve"> </w:t>
+      </w:r>
+      <m:oMath>
+        <m:r>
+          <m:rPr>
+            <m:nor/>
+            <m:sty m:val="p"/>
+          </m:rPr>
+          <m:t>RSS</m:t>
+        </m:r>
+      </m:oMath>
+      <w:r>
+        <w:t xml:space="preserve">”</w:t>
+      </w:r>
+      <w:r>
+        <w:t xml:space="preserve">,</w:t>
+      </w:r>
+      <w:r>
+        <w:t xml:space="preserve"> </w:t>
+      </w:r>
+      <w:r>
+        <w:t xml:space="preserve">not</w:t>
+      </w:r>
+      <w:r>
+        <w:t xml:space="preserve"> </w:t>
+      </w:r>
+      <w:r>
+        <w:t xml:space="preserve">“the slope”</w:t>
+      </w:r>
+      <w:r>
+        <w:t xml:space="preserve"> </w:t>
+      </w:r>
+      <w:r>
+        <w:t xml:space="preserve">and</w:t>
+      </w:r>
+      <w:r>
+        <w:t xml:space="preserve"> </w:t>
+      </w:r>
+      <w:r>
+        <w:t xml:space="preserve">“the residual sum of squares”</w:t>
+      </w:r>
+      <w:r>
+        <w:t xml:space="preserve"> </w:t>
+      </w:r>
+      <w:r>
+        <w:t xml:space="preserve">alone.</w:t>
+      </w:r>
+      <w:r>
+        <w:t xml:space="preserve"> </w:t>
+      </w:r>
+      <w:r>
+        <w:t xml:space="preserve">The words tell the reader what the quantity means,</w:t>
+      </w:r>
+      <w:r>
+        <w:t xml:space="preserve"> </w:t>
+      </w:r>
+      <w:r>
+        <w:t xml:space="preserve">and the symbol tells the reader which letters stand for it in the equations that follow.</w:t>
+      </w:r>
+    </w:p>
+    <w:p>
+      <w:pPr>
+        <w:numPr>
+          <w:ilvl w:val="0"/>
+          <w:numId w:val="1001"/>
+        </w:numPr>
+      </w:pPr>
+      <w:r>
+        <w:rPr>
+          <w:b/>
+          <w:bCs/>
+        </w:rPr>
         <w:t xml:space="preserve">Define and link every technical term at its first use in each div:</w:t>
       </w:r>
       <w:r>
@@ -2554,6 +2685,18 @@
       </w:r>
       <w:r>
         <w:t xml:space="preserve">then link to it.</w:t>
+      </w:r>
+      <w:r>
+        <w:t xml:space="preserve"> </w:t>
+      </w:r>
+      <w:r>
+        <w:t xml:space="preserve">Never define a term inline inside another div,</w:t>
+      </w:r>
+      <w:r>
+        <w:t xml:space="preserve"> </w:t>
+      </w:r>
+      <w:r>
+        <w:t xml:space="preserve">because an inline definition cannot be linked to from anywhere else.</w:t>
       </w:r>
       <w:r>
         <w:t xml:space="preserve"> </w:t>

</xml_diff>

<commit_message>
Deploying to gh-pages from @ Morrison-Lab/psw@4cc300288108bbd3fb2eb948fbd8ba76be41c500 🚀
</commit_message>
<xml_diff>
--- a/chapters/defining-terms.docx
+++ b/chapters/defining-terms.docx
@@ -15,7 +15,7 @@
         <w:pStyle w:val="Date"/>
       </w:pPr>
       <w:r>
-        <w:t xml:space="preserve">Last modified: 2026-10-16 22:47:07 (PDT)</w:t>
+        <w:t xml:space="preserve">Last modified: 2026-10-17 00:34:59 (PDT)</w:t>
       </w:r>
     </w:p>
     <w:p>
@@ -656,23 +656,9 @@
       <w:r>
         <w:t xml:space="preserve"> </w:t>
       </w:r>
-      <m:oMath>
-        <m:limLow>
-          <m:e>
-            <m:r>
-              <m:t>θ</m:t>
-            </m:r>
-          </m:e>
-          <m:lim>
-            <m:r>
-              <m:rPr>
-                <m:sty m:val="p"/>
-              </m:rPr>
-              <m:t>∼</m:t>
-            </m:r>
-          </m:lim>
-        </m:limLow>
-      </m:oMath>
+      <w:r>
+        <w:t xml:space="preserve">$\mathord{\smash[b]{\underset{\raise.3ex\hbox{$\scriptstyle\sim$}}{\theta}}\vphantom{\theta}}$</w:t>
+      </w:r>
       <w:r>
         <w:t xml:space="preserve"> </w:t>
       </w:r>
@@ -688,23 +674,9 @@
       <w:r>
         <w:t xml:space="preserve"> </w:t>
       </w:r>
-      <m:oMath>
-        <m:limLow>
-          <m:e>
-            <m:r>
-              <m:t>θ</m:t>
-            </m:r>
-          </m:e>
-          <m:lim>
-            <m:r>
-              <m:rPr>
-                <m:sty m:val="p"/>
-              </m:rPr>
-              <m:t>∼</m:t>
-            </m:r>
-          </m:lim>
-        </m:limLow>
-      </m:oMath>
+      <w:r>
+        <w:t xml:space="preserve">$\mathord{\smash[b]{\underset{\raise.3ex\hbox{$\scriptstyle\sim$}}{\theta}}\vphantom{\theta}}$</w:t>
+      </w:r>
       <w:r>
         <w:t xml:space="preserve"> </w:t>
       </w:r>
@@ -752,121 +724,9 @@
       <w:pPr>
         <w:pStyle w:val="BodyText"/>
       </w:pPr>
-      <m:oMathPara>
-        <m:oMathParaPr>
-          <m:jc m:val="center"/>
-        </m:oMathParaPr>
-        <m:oMath>
-          <m:acc>
-            <m:accPr>
-              <m:chr m:val="̂"/>
-            </m:accPr>
-            <m:e>
-              <m:limLow>
-                <m:e>
-                  <m:r>
-                    <m:t>θ</m:t>
-                  </m:r>
-                </m:e>
-                <m:lim>
-                  <m:r>
-                    <m:rPr>
-                      <m:sty m:val="p"/>
-                    </m:rPr>
-                    <m:t>∼</m:t>
-                  </m:r>
-                </m:lim>
-              </m:limLow>
-            </m:e>
-          </m:acc>
-          <m:box>
-            <m:boxPr>
-              <m:opEmu m:val="on"/>
-            </m:boxPr>
-            <m:e>
-              <m:r>
-                <m:rPr>
-                  <m:sty m:val="p"/>
-                </m:rPr>
-                <m:t>:=</m:t>
-              </m:r>
-            </m:e>
-          </m:box>
-          <m:r>
-            <m:rPr>
-              <m:sty m:val="p"/>
-            </m:rPr>
-            <m:t>arg</m:t>
-          </m:r>
-          <m:limLow>
-            <m:e>
-              <m:r>
-                <m:rPr>
-                  <m:sty m:val="p"/>
-                </m:rPr>
-                <m:t>min</m:t>
-              </m:r>
-            </m:e>
-            <m:lim>
-              <m:limLow>
-                <m:e>
-                  <m:r>
-                    <m:t>θ</m:t>
-                  </m:r>
-                </m:e>
-                <m:lim>
-                  <m:r>
-                    <m:rPr>
-                      <m:sty m:val="p"/>
-                    </m:rPr>
-                    <m:t>∼</m:t>
-                  </m:r>
-                </m:lim>
-              </m:limLow>
-            </m:lim>
-          </m:limLow>
-          <m:r>
-            <m:rPr>
-              <m:nor/>
-              <m:sty m:val="p"/>
-            </m:rPr>
-            <m:t>RSS</m:t>
-          </m:r>
-          <m:r>
-            <m:rPr>
-              <m:sty m:val="p"/>
-            </m:rPr>
-            <m:t>(</m:t>
-          </m:r>
-          <m:limLow>
-            <m:e>
-              <m:r>
-                <m:t>θ</m:t>
-              </m:r>
-            </m:e>
-            <m:lim>
-              <m:r>
-                <m:rPr>
-                  <m:sty m:val="p"/>
-                </m:rPr>
-                <m:t>∼</m:t>
-              </m:r>
-            </m:lim>
-          </m:limLow>
-          <m:r>
-            <m:rPr>
-              <m:sty m:val="p"/>
-            </m:rPr>
-            <m:t>)</m:t>
-          </m:r>
-          <m:r>
-            <m:rPr>
-              <m:sty m:val="p"/>
-            </m:rPr>
-            <m:t>,</m:t>
-          </m:r>
-        </m:oMath>
-      </m:oMathPara>
+      <w:r>
+        <w:t xml:space="preserve">$$\hat{\mathord{\smash[b]{\underset{\raise.3ex\hbox{$\scriptstyle\sim$}}{\theta}}\vphantom{\theta}}} := \arg\min_{\mathord{\smash[b]{\underset{\raise.3ex\hbox{$\scriptstyle\sim$}}{\theta}}\vphantom{\theta}}} \text{RSS}(\mathord{\smash[b]{\underset{\raise.3ex\hbox{$\scriptstyle\sim$}}{\theta}}\vphantom{\theta}}),$$</w:t>
+      </w:r>
     </w:p>
     <w:p>
       <w:pPr>
@@ -5094,6 +4954,317 @@
       </w:r>
       <w:r>
         <w:t xml:space="preserve">and never leave the target implicit.</w:t>
+      </w:r>
+    </w:p>
+    <w:p>
+      <w:pPr>
+        <w:numPr>
+          <w:ilvl w:val="0"/>
+          <w:numId w:val="1001"/>
+        </w:numPr>
+      </w:pPr>
+      <w:r>
+        <w:rPr>
+          <w:b/>
+          <w:bCs/>
+        </w:rPr>
+        <w:t xml:space="preserve">Make the fitted model the subject, not the fitting procedure:</w:t>
+      </w:r>
+      <w:r>
+        <w:t xml:space="preserve"> </w:t>
+      </w:r>
+      <w:r>
+        <w:t xml:space="preserve">A prediction, an error, a bias and a variance</w:t>
+      </w:r>
+      <w:r>
+        <w:t xml:space="preserve"> </w:t>
+      </w:r>
+      <w:r>
+        <w:t xml:space="preserve">are all properties of fitted models, so a sentence about them has a fitted model as its subject,</w:t>
+      </w:r>
+      <w:r>
+        <w:t xml:space="preserve"> </w:t>
+      </w:r>
+      <w:r>
+        <w:t xml:space="preserve">and a choice among candidates is a choice among fitted models.</w:t>
+      </w:r>
+      <w:r>
+        <w:t xml:space="preserve"> </w:t>
+      </w:r>
+      <w:r>
+        <w:t xml:space="preserve">Write</w:t>
+      </w:r>
+      <w:r>
+        <w:t xml:space="preserve"> </w:t>
+      </w:r>
+      <w:r>
+        <w:t xml:space="preserve">“the fitted model predicts”</w:t>
+      </w:r>
+      <w:r>
+        <w:t xml:space="preserve">,</w:t>
+      </w:r>
+      <w:r>
+        <w:t xml:space="preserve"> </w:t>
+      </w:r>
+      <w:r>
+        <w:t xml:space="preserve">“the prediction of the fitted model at</w:t>
+      </w:r>
+      <w:r>
+        <w:t xml:space="preserve"> </w:t>
+      </w:r>
+      <m:oMath>
+        <m:r>
+          <m:t>x</m:t>
+        </m:r>
+      </m:oMath>
+      <w:r>
+        <w:t xml:space="preserve">”</w:t>
+      </w:r>
+      <w:r>
+        <w:t xml:space="preserve">,</w:t>
+      </w:r>
+      <w:r>
+        <w:t xml:space="preserve"> </w:t>
+      </w:r>
+      <w:r>
+        <w:t xml:space="preserve">and</w:t>
+      </w:r>
+      <w:r>
+        <w:t xml:space="preserve"> </w:t>
+      </w:r>
+      <w:r>
+        <w:t xml:space="preserve">“choose among fitted models”</w:t>
+      </w:r>
+      <w:r>
+        <w:t xml:space="preserve">,</w:t>
+      </w:r>
+      <w:r>
+        <w:t xml:space="preserve"> </w:t>
+      </w:r>
+      <w:r>
+        <w:t xml:space="preserve">and never</w:t>
+      </w:r>
+      <w:r>
+        <w:t xml:space="preserve"> </w:t>
+      </w:r>
+      <w:r>
+        <w:t xml:space="preserve">“the procedure predicts”</w:t>
+      </w:r>
+      <w:r>
+        <w:t xml:space="preserve"> </w:t>
+      </w:r>
+      <w:r>
+        <w:t xml:space="preserve">or</w:t>
+      </w:r>
+      <w:r>
+        <w:t xml:space="preserve"> </w:t>
+      </w:r>
+      <w:r>
+        <w:t xml:space="preserve">“choose among procedures”</w:t>
+      </w:r>
+      <w:r>
+        <w:t xml:space="preserve">.</w:t>
+      </w:r>
+      <w:r>
+        <w:t xml:space="preserve"> </w:t>
+      </w:r>
+      <w:r>
+        <w:t xml:space="preserve">Name the fitting procedure only when the sentence is about how a fitted model is built:</w:t>
+      </w:r>
+      <w:r>
+        <w:t xml:space="preserve"> </w:t>
+      </w:r>
+      <w:r>
+        <w:t xml:space="preserve">the inputs that the procedure needs, what it costs,</w:t>
+      </w:r>
+      <w:r>
+        <w:t xml:space="preserve"> </w:t>
+      </w:r>
+      <w:r>
+        <w:t xml:space="preserve">or an expectation over the training sets to which it is applied.</w:t>
+      </w:r>
+      <w:r>
+        <w:t xml:space="preserve"> </w:t>
+      </w:r>
+      <w:r>
+        <w:t xml:space="preserve">In math, write</w:t>
+      </w:r>
+      <w:r>
+        <w:t xml:space="preserve"> </w:t>
+      </w:r>
+      <m:oMath>
+        <m:r>
+          <m:t>g</m:t>
+        </m:r>
+        <m:r>
+          <m:t>​</m:t>
+        </m:r>
+        <m:d>
+          <m:dPr>
+            <m:begChr m:val="("/>
+            <m:sepChr m:val=""/>
+            <m:endChr m:val=")"/>
+            <m:grow/>
+          </m:dPr>
+          <m:e>
+            <m:sSub>
+              <m:e>
+                <m:r>
+                  <m:rPr>
+                    <m:scr m:val="script"/>
+                    <m:sty m:val="p"/>
+                  </m:rPr>
+                  <m:t>D</m:t>
+                </m:r>
+              </m:e>
+              <m:sub>
+                <m:r>
+                  <m:rPr>
+                    <m:nor/>
+                    <m:sty m:val="p"/>
+                  </m:rPr>
+                  <m:t>train</m:t>
+                </m:r>
+              </m:sub>
+            </m:sSub>
+          </m:e>
+        </m:d>
+        <m:r>
+          <m:t>​</m:t>
+        </m:r>
+      </m:oMath>
+      <w:r>
+        <w:t xml:space="preserve"> </w:t>
+      </w:r>
+      <w:r>
+        <w:t xml:space="preserve">for the fitted model,</w:t>
+      </w:r>
+      <w:r>
+        <w:t xml:space="preserve"> </w:t>
+      </w:r>
+      <w:r>
+        <w:t xml:space="preserve">and</w:t>
+      </w:r>
+      <w:r>
+        <w:t xml:space="preserve"> </w:t>
+      </w:r>
+      <m:oMath>
+        <m:r>
+          <m:t>g</m:t>
+        </m:r>
+      </m:oMath>
+      <w:r>
+        <w:t xml:space="preserve"> </w:t>
+      </w:r>
+      <w:r>
+        <w:t xml:space="preserve">only for the procedure itself.</w:t>
+      </w:r>
+      <w:r>
+        <w:t xml:space="preserve"> </w:t>
+      </w:r>
+      <w:r>
+        <w:t xml:space="preserve">For example, write</w:t>
+      </w:r>
+      <w:r>
+        <w:t xml:space="preserve"> </w:t>
+      </w:r>
+      <w:r>
+        <w:t xml:space="preserve">“the bias of the prediction</w:t>
+      </w:r>
+      <w:r>
+        <w:t xml:space="preserve"> </w:t>
+      </w:r>
+      <m:oMath>
+        <m:r>
+          <m:t>g</m:t>
+        </m:r>
+        <m:r>
+          <m:t>​</m:t>
+        </m:r>
+        <m:d>
+          <m:dPr>
+            <m:begChr m:val="("/>
+            <m:sepChr m:val=""/>
+            <m:endChr m:val=")"/>
+            <m:grow/>
+          </m:dPr>
+          <m:e>
+            <m:sSub>
+              <m:e>
+                <m:r>
+                  <m:rPr>
+                    <m:scr m:val="script"/>
+                    <m:sty m:val="p"/>
+                  </m:rPr>
+                  <m:t>D</m:t>
+                </m:r>
+              </m:e>
+              <m:sub>
+                <m:r>
+                  <m:rPr>
+                    <m:nor/>
+                    <m:sty m:val="p"/>
+                  </m:rPr>
+                  <m:t>train</m:t>
+                </m:r>
+              </m:sub>
+            </m:sSub>
+          </m:e>
+        </m:d>
+        <m:r>
+          <m:t>​</m:t>
+        </m:r>
+        <m:r>
+          <m:t>​</m:t>
+        </m:r>
+        <m:d>
+          <m:dPr>
+            <m:begChr m:val="("/>
+            <m:sepChr m:val=""/>
+            <m:endChr m:val=")"/>
+            <m:grow/>
+          </m:dPr>
+          <m:e>
+            <m:r>
+              <m:t>x</m:t>
+            </m:r>
+          </m:e>
+        </m:d>
+        <m:r>
+          <m:t>​</m:t>
+        </m:r>
+      </m:oMath>
+      <w:r>
+        <w:t xml:space="preserve">”</w:t>
+      </w:r>
+      <w:r>
+        <w:t xml:space="preserve">,</w:t>
+      </w:r>
+      <w:r>
+        <w:t xml:space="preserve"> </w:t>
+      </w:r>
+      <w:r>
+        <w:t xml:space="preserve">not</w:t>
+      </w:r>
+      <w:r>
+        <w:t xml:space="preserve"> </w:t>
+      </w:r>
+      <w:r>
+        <w:t xml:space="preserve">“the bias of</w:t>
+      </w:r>
+      <w:r>
+        <w:t xml:space="preserve"> </w:t>
+      </w:r>
+      <m:oMath>
+        <m:r>
+          <m:t>g</m:t>
+        </m:r>
+      </m:oMath>
+      <w:r>
+        <w:t xml:space="preserve">”</w:t>
+      </w:r>
+      <w:r>
+        <w:t xml:space="preserve">.</w:t>
       </w:r>
     </w:p>
     <w:p>

</xml_diff>

<commit_message>
Deploying to gh-pages from @ Morrison-Lab/psw@ef68a3092d1d05eecd2a416b7eb8313437646440 🚀
</commit_message>
<xml_diff>
--- a/chapters/defining-terms.docx
+++ b/chapters/defining-terms.docx
@@ -15,7 +15,7 @@
         <w:pStyle w:val="Date"/>
       </w:pPr>
       <w:r>
-        <w:t xml:space="preserve">Last modified: 2026-10-17 01:12:37 (PDT)</w:t>
+        <w:t xml:space="preserve">Last modified: 2026-10-17 02:03:16 (PDT)</w:t>
       </w:r>
     </w:p>
     <w:p>
@@ -5175,9 +5175,158 @@
         <w:t xml:space="preserve"> </w:t>
       </w:r>
       <m:oMath>
+        <m:acc>
+          <m:accPr>
+            <m:chr m:val="̂"/>
+          </m:accPr>
+          <m:e>
+            <m:r>
+              <m:t>y</m:t>
+            </m:r>
+          </m:e>
+        </m:acc>
+      </m:oMath>
+      <w:r>
+        <w:t xml:space="preserve">”</w:t>
+      </w:r>
+      <w:r>
+        <w:t xml:space="preserve">,</w:t>
+      </w:r>
+      <w:r>
+        <w:t xml:space="preserve"> </w:t>
+      </w:r>
+      <w:r>
+        <w:t xml:space="preserve">not</w:t>
+      </w:r>
+      <w:r>
+        <w:t xml:space="preserve"> </w:t>
+      </w:r>
+      <w:r>
+        <w:t xml:space="preserve">“the bias of</w:t>
+      </w:r>
+      <w:r>
+        <w:t xml:space="preserve"> </w:t>
+      </w:r>
+      <m:oMath>
         <m:r>
           <m:t>g</m:t>
         </m:r>
+      </m:oMath>
+      <w:r>
+        <w:t xml:space="preserve">”</w:t>
+      </w:r>
+      <w:r>
+        <w:t xml:space="preserve">.</w:t>
+      </w:r>
+    </w:p>
+    <w:p>
+      <w:pPr>
+        <w:numPr>
+          <w:ilvl w:val="0"/>
+          <w:numId w:val="1001"/>
+        </w:numPr>
+      </w:pPr>
+      <w:r>
+        <w:rPr>
+          <w:b/>
+          <w:bCs/>
+        </w:rPr>
+        <w:t xml:space="preserve">Write a predicted value with the predicted-value macro:</w:t>
+      </w:r>
+      <w:r>
+        <w:t xml:space="preserve"> </w:t>
+      </w:r>
+      <w:r>
+        <w:t xml:space="preserve">A predicted value is the fitted model applied to a covariate value,</w:t>
+      </w:r>
+      <w:r>
+        <w:t xml:space="preserve"> </w:t>
+      </w:r>
+      <w:r>
+        <w:t xml:space="preserve">so write it with a predicted-value macro</w:t>
+      </w:r>
+      <w:r>
+        <w:t xml:space="preserve"> </w:t>
+      </w:r>
+      <w:r>
+        <w:t xml:space="preserve">and not as the procedure applied to a covariate value and a training set.</w:t>
+      </w:r>
+      <w:r>
+        <w:t xml:space="preserve"> </w:t>
+      </w:r>
+      <w:r>
+        <w:t xml:space="preserve">The macro</w:t>
+      </w:r>
+      <w:r>
+        <w:t xml:space="preserve"> </w:t>
+      </w:r>
+      <w:r>
+        <w:rPr>
+          <w:rStyle w:val="VerbatimChar"/>
+        </w:rPr>
+        <w:t xml:space="preserve">\predval</w:t>
+      </w:r>
+      <w:r>
+        <w:t xml:space="preserve"> </w:t>
+      </w:r>
+      <w:r>
+        <w:t xml:space="preserve">takes no argument and prints the predicted value of the outcome</w:t>
+      </w:r>
+      <w:r>
+        <w:t xml:space="preserve"> </w:t>
+      </w:r>
+      <w:r>
+        <w:t xml:space="preserve">at the covariate value that the sentence is about.</w:t>
+      </w:r>
+      <w:r>
+        <w:t xml:space="preserve"> </w:t>
+      </w:r>
+      <w:r>
+        <w:t xml:space="preserve">The macro</w:t>
+      </w:r>
+      <w:r>
+        <w:t xml:space="preserve"> </w:t>
+      </w:r>
+      <w:r>
+        <w:rPr>
+          <w:rStyle w:val="VerbatimChar"/>
+        </w:rPr>
+        <w:t xml:space="preserve">\predvalf{x}</w:t>
+      </w:r>
+      <w:r>
+        <w:t xml:space="preserve"> </w:t>
+      </w:r>
+      <w:r>
+        <w:t xml:space="preserve">takes a covariate value</w:t>
+      </w:r>
+      <w:r>
+        <w:t xml:space="preserve"> </w:t>
+      </w:r>
+      <m:oMath>
+        <m:r>
+          <m:t>x</m:t>
+        </m:r>
+      </m:oMath>
+      <w:r>
+        <w:t xml:space="preserve"> </w:t>
+      </w:r>
+      <w:r>
+        <w:t xml:space="preserve">and prints the prediction</w:t>
+      </w:r>
+      <w:r>
+        <w:t xml:space="preserve"> </w:t>
+      </w:r>
+      <m:oMath>
+        <m:acc>
+          <m:accPr>
+            <m:chr m:val="̂"/>
+          </m:accPr>
+          <m:e>
+            <m:r>
+              <m:t>y</m:t>
+            </m:r>
+          </m:e>
+        </m:acc>
         <m:r>
           <m:t>​</m:t>
         </m:r>
@@ -5189,6 +5338,352 @@
             <m:grow/>
           </m:dPr>
           <m:e>
+            <m:r>
+              <m:t>x</m:t>
+            </m:r>
+          </m:e>
+        </m:d>
+        <m:r>
+          <m:t>​</m:t>
+        </m:r>
+      </m:oMath>
+      <w:r>
+        <w:t xml:space="preserve">,</w:t>
+      </w:r>
+      <w:r>
+        <w:t xml:space="preserve"> </w:t>
+      </w:r>
+      <w:r>
+        <w:t xml:space="preserve">a value of the outcome’s type.</w:t>
+      </w:r>
+      <w:r>
+        <w:t xml:space="preserve"> </w:t>
+      </w:r>
+      <w:r>
+        <w:t xml:space="preserve">The macro</w:t>
+      </w:r>
+      <w:r>
+        <w:t xml:space="preserve"> </w:t>
+      </w:r>
+      <w:r>
+        <w:rPr>
+          <w:rStyle w:val="VerbatimChar"/>
+        </w:rPr>
+        <w:t xml:space="preserve">\candpredvalf{l}{x}</w:t>
+      </w:r>
+      <w:r>
+        <w:t xml:space="preserve"> </w:t>
+      </w:r>
+      <w:r>
+        <w:t xml:space="preserve">takes a candidate index</w:t>
+      </w:r>
+      <w:r>
+        <w:t xml:space="preserve"> </w:t>
+      </w:r>
+      <m:oMath>
+        <m:r>
+          <m:t>l</m:t>
+        </m:r>
+      </m:oMath>
+      <w:r>
+        <w:t xml:space="preserve"> </w:t>
+      </w:r>
+      <w:r>
+        <w:t xml:space="preserve">and a covariate value</w:t>
+      </w:r>
+      <w:r>
+        <w:t xml:space="preserve"> </w:t>
+      </w:r>
+      <m:oMath>
+        <m:r>
+          <m:t>x</m:t>
+        </m:r>
+      </m:oMath>
+      <w:r>
+        <w:t xml:space="preserve">,</w:t>
+      </w:r>
+      <w:r>
+        <w:t xml:space="preserve"> </w:t>
+      </w:r>
+      <w:r>
+        <w:t xml:space="preserve">and prints the prediction of candidate</w:t>
+      </w:r>
+      <w:r>
+        <w:t xml:space="preserve"> </w:t>
+      </w:r>
+      <m:oMath>
+        <m:r>
+          <m:t>l</m:t>
+        </m:r>
+      </m:oMath>
+      <w:r>
+        <w:t xml:space="preserve">’s fitted model at</w:t>
+      </w:r>
+      <w:r>
+        <w:t xml:space="preserve"> </w:t>
+      </w:r>
+      <m:oMath>
+        <m:r>
+          <m:t>x</m:t>
+        </m:r>
+      </m:oMath>
+      <w:r>
+        <w:t xml:space="preserve">.</w:t>
+      </w:r>
+      <w:r>
+        <w:t xml:space="preserve"> </w:t>
+      </w:r>
+      <w:r>
+        <w:t xml:space="preserve">Suppress the covariate value where it is not salient:</w:t>
+      </w:r>
+      <w:r>
+        <w:t xml:space="preserve"> </w:t>
+      </w:r>
+      <w:r>
+        <w:t xml:space="preserve">write</w:t>
+      </w:r>
+      <w:r>
+        <w:t xml:space="preserve"> </w:t>
+      </w:r>
+      <w:r>
+        <w:rPr>
+          <w:rStyle w:val="VerbatimChar"/>
+        </w:rPr>
+        <w:t xml:space="preserve">\predval</w:t>
+      </w:r>
+      <w:r>
+        <w:t xml:space="preserve"> </w:t>
+      </w:r>
+      <w:r>
+        <w:t xml:space="preserve">when the sentence is not about which covariate value the prediction is at,</w:t>
+      </w:r>
+      <w:r>
+        <w:t xml:space="preserve"> </w:t>
+      </w:r>
+      <w:r>
+        <w:t xml:space="preserve">and</w:t>
+      </w:r>
+      <w:r>
+        <w:t xml:space="preserve"> </w:t>
+      </w:r>
+      <w:r>
+        <w:rPr>
+          <w:rStyle w:val="VerbatimChar"/>
+        </w:rPr>
+        <w:t xml:space="preserve">\predvalf</w:t>
+      </w:r>
+      <w:r>
+        <w:t xml:space="preserve"> </w:t>
+      </w:r>
+      <w:r>
+        <w:t xml:space="preserve">or</w:t>
+      </w:r>
+      <w:r>
+        <w:t xml:space="preserve"> </w:t>
+      </w:r>
+      <w:r>
+        <w:rPr>
+          <w:rStyle w:val="VerbatimChar"/>
+        </w:rPr>
+        <w:t xml:space="preserve">\candpredvalf</w:t>
+      </w:r>
+      <w:r>
+        <w:t xml:space="preserve"> </w:t>
+      </w:r>
+      <w:r>
+        <w:t xml:space="preserve">only when the covariate value matters,</w:t>
+      </w:r>
+      <w:r>
+        <w:t xml:space="preserve"> </w:t>
+      </w:r>
+      <w:r>
+        <w:t xml:space="preserve">such as when comparing predictions at two covariate values or averaging a prediction over them.</w:t>
+      </w:r>
+      <w:r>
+        <w:t xml:space="preserve"> </w:t>
+      </w:r>
+      <w:r>
+        <w:t xml:space="preserve">For example, write</w:t>
+      </w:r>
+      <w:r>
+        <w:t xml:space="preserve"> </w:t>
+      </w:r>
+      <m:oMath>
+        <m:acc>
+          <m:accPr>
+            <m:chr m:val="̂"/>
+          </m:accPr>
+          <m:e>
+            <m:r>
+              <m:t>y</m:t>
+            </m:r>
+          </m:e>
+        </m:acc>
+      </m:oMath>
+      <w:r>
+        <w:t xml:space="preserve"> </w:t>
+      </w:r>
+      <w:r>
+        <w:t xml:space="preserve">in</w:t>
+      </w:r>
+      <w:r>
+        <w:t xml:space="preserve"> </w:t>
+      </w:r>
+      <w:r>
+        <w:t xml:space="preserve">“the bias of the prediction</w:t>
+      </w:r>
+      <w:r>
+        <w:t xml:space="preserve"> </w:t>
+      </w:r>
+      <m:oMath>
+        <m:acc>
+          <m:accPr>
+            <m:chr m:val="̂"/>
+          </m:accPr>
+          <m:e>
+            <m:r>
+              <m:t>y</m:t>
+            </m:r>
+          </m:e>
+        </m:acc>
+      </m:oMath>
+      <w:r>
+        <w:t xml:space="preserve">”</w:t>
+      </w:r>
+      <w:r>
+        <w:t xml:space="preserve"> </w:t>
+      </w:r>
+      <w:r>
+        <w:t xml:space="preserve">when one covariate value is fixed throughout,</w:t>
+      </w:r>
+      <w:r>
+        <w:t xml:space="preserve"> </w:t>
+      </w:r>
+      <w:r>
+        <w:t xml:space="preserve">write</w:t>
+      </w:r>
+      <w:r>
+        <w:t xml:space="preserve"> </w:t>
+      </w:r>
+      <m:oMath>
+        <m:acc>
+          <m:accPr>
+            <m:chr m:val="̂"/>
+          </m:accPr>
+          <m:e>
+            <m:r>
+              <m:t>y</m:t>
+            </m:r>
+          </m:e>
+        </m:acc>
+        <m:r>
+          <m:t>​</m:t>
+        </m:r>
+        <m:d>
+          <m:dPr>
+            <m:begChr m:val="("/>
+            <m:sepChr m:val=""/>
+            <m:endChr m:val=")"/>
+            <m:grow/>
+          </m:dPr>
+          <m:e>
+            <m:r>
+              <m:t>x</m:t>
+            </m:r>
+          </m:e>
+        </m:d>
+        <m:r>
+          <m:t>​</m:t>
+        </m:r>
+      </m:oMath>
+      <w:r>
+        <w:t xml:space="preserve"> </w:t>
+      </w:r>
+      <w:r>
+        <w:t xml:space="preserve">and</w:t>
+      </w:r>
+      <w:r>
+        <w:t xml:space="preserve"> </w:t>
+      </w:r>
+      <m:oMath>
+        <m:sSub>
+          <m:e>
+            <m:acc>
+              <m:accPr>
+                <m:chr m:val="̂"/>
+              </m:accPr>
+              <m:e>
+                <m:r>
+                  <m:t>y</m:t>
+                </m:r>
+              </m:e>
+            </m:acc>
+          </m:e>
+          <m:sub>
+            <m:r>
+              <m:t>l</m:t>
+            </m:r>
+          </m:sub>
+        </m:sSub>
+        <m:r>
+          <m:t>​</m:t>
+        </m:r>
+        <m:d>
+          <m:dPr>
+            <m:begChr m:val="("/>
+            <m:sepChr m:val=""/>
+            <m:endChr m:val=")"/>
+            <m:grow/>
+          </m:dPr>
+          <m:e>
+            <m:r>
+              <m:t>x</m:t>
+            </m:r>
+          </m:e>
+        </m:d>
+        <m:r>
+          <m:t>​</m:t>
+        </m:r>
+      </m:oMath>
+      <w:r>
+        <w:t xml:space="preserve"> </w:t>
+      </w:r>
+      <w:r>
+        <w:t xml:space="preserve">when the covariate value is salient,</w:t>
+      </w:r>
+      <w:r>
+        <w:t xml:space="preserve"> </w:t>
+      </w:r>
+      <w:r>
+        <w:t xml:space="preserve">and never</w:t>
+      </w:r>
+      <w:r>
+        <w:t xml:space="preserve"> </w:t>
+      </w:r>
+      <m:oMath>
+        <m:r>
+          <m:t>g</m:t>
+        </m:r>
+        <m:r>
+          <m:t>​</m:t>
+        </m:r>
+        <m:d>
+          <m:dPr>
+            <m:begChr m:val="("/>
+            <m:sepChr m:val=""/>
+            <m:endChr m:val=")"/>
+            <m:grow/>
+          </m:dPr>
+          <m:e>
+            <m:r>
+              <m:t>x</m:t>
+            </m:r>
+            <m:r>
+              <m:rPr>
+                <m:sty m:val="p"/>
+              </m:rPr>
+              <m:t>;</m:t>
+            </m:r>
             <m:sSub>
               <m:e>
                 <m:r>
@@ -5214,6 +5709,29 @@
         <m:r>
           <m:t>​</m:t>
         </m:r>
+      </m:oMath>
+      <w:r>
+        <w:t xml:space="preserve"> </w:t>
+      </w:r>
+      <w:r>
+        <w:t xml:space="preserve">or</w:t>
+      </w:r>
+      <w:r>
+        <w:t xml:space="preserve"> </w:t>
+      </w:r>
+      <m:oMath>
+        <m:sSub>
+          <m:e>
+            <m:r>
+              <m:t>g</m:t>
+            </m:r>
+          </m:e>
+          <m:sub>
+            <m:r>
+              <m:t>l</m:t>
+            </m:r>
+          </m:sub>
+        </m:sSub>
         <m:r>
           <m:t>​</m:t>
         </m:r>
@@ -5228,41 +5746,38 @@
             <m:r>
               <m:t>x</m:t>
             </m:r>
+            <m:r>
+              <m:rPr>
+                <m:sty m:val="p"/>
+              </m:rPr>
+              <m:t>;</m:t>
+            </m:r>
+            <m:sSub>
+              <m:e>
+                <m:r>
+                  <m:rPr>
+                    <m:scr m:val="script"/>
+                    <m:sty m:val="p"/>
+                  </m:rPr>
+                  <m:t>D</m:t>
+                </m:r>
+              </m:e>
+              <m:sub>
+                <m:r>
+                  <m:rPr>
+                    <m:nor/>
+                    <m:sty m:val="p"/>
+                  </m:rPr>
+                  <m:t>train</m:t>
+                </m:r>
+              </m:sub>
+            </m:sSub>
           </m:e>
         </m:d>
         <m:r>
           <m:t>​</m:t>
         </m:r>
       </m:oMath>
-      <w:r>
-        <w:t xml:space="preserve">”</w:t>
-      </w:r>
-      <w:r>
-        <w:t xml:space="preserve">,</w:t>
-      </w:r>
-      <w:r>
-        <w:t xml:space="preserve"> </w:t>
-      </w:r>
-      <w:r>
-        <w:t xml:space="preserve">not</w:t>
-      </w:r>
-      <w:r>
-        <w:t xml:space="preserve"> </w:t>
-      </w:r>
-      <w:r>
-        <w:t xml:space="preserve">“the bias of</w:t>
-      </w:r>
-      <w:r>
-        <w:t xml:space="preserve"> </w:t>
-      </w:r>
-      <m:oMath>
-        <m:r>
-          <m:t>g</m:t>
-        </m:r>
-      </m:oMath>
-      <w:r>
-        <w:t xml:space="preserve">”</w:t>
-      </w:r>
       <w:r>
         <w:t xml:space="preserve">.</w:t>
       </w:r>

</xml_diff>

<commit_message>
Deploying to gh-pages from @ Morrison-Lab/psw@8b7d5f7769514b983fa12821d0f2120262eefe13 🚀
</commit_message>
<xml_diff>
--- a/chapters/defining-terms.docx
+++ b/chapters/defining-terms.docx
@@ -15,7 +15,7 @@
         <w:pStyle w:val="Date"/>
       </w:pPr>
       <w:r>
-        <w:t xml:space="preserve">Last modified: 2026-10-17 02:03:16 (PDT)</w:t>
+        <w:t xml:space="preserve">Last modified: 2026-10-17 02:10:28 (PDT)</w:t>
       </w:r>
     </w:p>
     <w:p>
@@ -4954,6 +4954,159 @@
       </w:r>
       <w:r>
         <w:t xml:space="preserve">and never leave the target implicit.</w:t>
+      </w:r>
+    </w:p>
+    <w:p>
+      <w:pPr>
+        <w:numPr>
+          <w:ilvl w:val="0"/>
+          <w:numId w:val="1001"/>
+        </w:numPr>
+      </w:pPr>
+      <w:r>
+        <w:rPr>
+          <w:b/>
+          <w:bCs/>
+        </w:rPr>
+        <w:t xml:space="preserve">Say which error:</w:t>
+      </w:r>
+      <w:r>
+        <w:t xml:space="preserve"> </w:t>
+      </w:r>
+      <w:r>
+        <w:t xml:space="preserve">A bare</w:t>
+      </w:r>
+      <w:r>
+        <w:t xml:space="preserve"> </w:t>
+      </w:r>
+      <w:r>
+        <w:t xml:space="preserve">“error”</w:t>
+      </w:r>
+      <w:r>
+        <w:t xml:space="preserve"> </w:t>
+      </w:r>
+      <w:r>
+        <w:t xml:space="preserve">does not say what is measured,</w:t>
+      </w:r>
+      <w:r>
+        <w:t xml:space="preserve"> </w:t>
+      </w:r>
+      <w:r>
+        <w:t xml:space="preserve">on which data,</w:t>
+      </w:r>
+      <w:r>
+        <w:t xml:space="preserve"> </w:t>
+      </w:r>
+      <w:r>
+        <w:t xml:space="preserve">or whether it is a value computed from one sample or an expectation.</w:t>
+      </w:r>
+      <w:r>
+        <w:t xml:space="preserve"> </w:t>
+      </w:r>
+      <w:r>
+        <w:t xml:space="preserve">Every use of</w:t>
+      </w:r>
+      <w:r>
+        <w:t xml:space="preserve"> </w:t>
+      </w:r>
+      <w:r>
+        <w:t xml:space="preserve">“error”</w:t>
+      </w:r>
+      <w:r>
+        <w:t xml:space="preserve"> </w:t>
+      </w:r>
+      <w:r>
+        <w:t xml:space="preserve">(and of</w:t>
+      </w:r>
+      <w:r>
+        <w:t xml:space="preserve"> </w:t>
+      </w:r>
+      <w:r>
+        <w:t xml:space="preserve">“loss”</w:t>
+      </w:r>
+      <w:r>
+        <w:t xml:space="preserve">) names three things:</w:t>
+      </w:r>
+      <w:r>
+        <w:t xml:space="preserve"> </w:t>
+      </w:r>
+      <w:r>
+        <w:t xml:space="preserve">the quantity measured, such as the squared prediction error;</w:t>
+      </w:r>
+      <w:r>
+        <w:t xml:space="preserve"> </w:t>
+      </w:r>
+      <w:r>
+        <w:t xml:space="preserve">the data that it is computed on, such as the training set, the validation set, the test set or the population;</w:t>
+      </w:r>
+      <w:r>
+        <w:t xml:space="preserve"> </w:t>
+      </w:r>
+      <w:r>
+        <w:t xml:space="preserve">and whether it is a sample value or an expectation.</w:t>
+      </w:r>
+      <w:r>
+        <w:t xml:space="preserve"> </w:t>
+      </w:r>
+      <w:r>
+        <w:t xml:space="preserve">For example, write</w:t>
+      </w:r>
+      <w:r>
+        <w:t xml:space="preserve"> </w:t>
+      </w:r>
+      <w:r>
+        <w:t xml:space="preserve">“the prediction error on the validation set”</w:t>
+      </w:r>
+      <w:r>
+        <w:t xml:space="preserve">,</w:t>
+      </w:r>
+      <w:r>
+        <w:t xml:space="preserve"> </w:t>
+      </w:r>
+      <w:r>
+        <w:t xml:space="preserve">or</w:t>
+      </w:r>
+      <w:r>
+        <w:t xml:space="preserve"> </w:t>
+      </w:r>
+      <w:r>
+        <w:t xml:space="preserve">“the expected squared prediction error”</w:t>
+      </w:r>
+      <w:r>
+        <w:t xml:space="preserve">,</w:t>
+      </w:r>
+      <w:r>
+        <w:t xml:space="preserve"> </w:t>
+      </w:r>
+      <w:r>
+        <w:t xml:space="preserve">and never</w:t>
+      </w:r>
+      <w:r>
+        <w:t xml:space="preserve"> </w:t>
+      </w:r>
+      <w:r>
+        <w:t xml:space="preserve">“the error”</w:t>
+      </w:r>
+      <w:r>
+        <w:t xml:space="preserve"> </w:t>
+      </w:r>
+      <w:r>
+        <w:t xml:space="preserve">or</w:t>
+      </w:r>
+      <w:r>
+        <w:t xml:space="preserve"> </w:t>
+      </w:r>
+      <w:r>
+        <w:t xml:space="preserve">“the smallest error”</w:t>
+      </w:r>
+      <w:r>
+        <w:t xml:space="preserve">.</w:t>
+      </w:r>
+      <w:r>
+        <w:t xml:space="preserve"> </w:t>
+      </w:r>
+      <w:r>
+        <w:t xml:space="preserve">A term that already carries all three, such as the generalization error, can stand alone after its definition.</w:t>
       </w:r>
     </w:p>
     <w:p>

</xml_diff>

<commit_message>
Deploying to gh-pages from @ Morrison-Lab/psw@89838c1db33c1f1a6a34d985ff00f09951d7d3f3 🚀
</commit_message>
<xml_diff>
--- a/chapters/defining-terms.docx
+++ b/chapters/defining-terms.docx
@@ -15,7 +15,7 @@
         <w:pStyle w:val="Date"/>
       </w:pPr>
       <w:r>
-        <w:t xml:space="preserve">Last modified: 2026-10-17 02:34:34 (PDT)</w:t>
+        <w:t xml:space="preserve">Last modified: 2026-10-17 02:39:13 (PDT)</w:t>
       </w:r>
     </w:p>
     <w:p>
@@ -5933,6 +5933,279 @@
       </m:oMath>
       <w:r>
         <w:t xml:space="preserve">.</w:t>
+      </w:r>
+    </w:p>
+    <w:p>
+      <w:pPr>
+        <w:numPr>
+          <w:ilvl w:val="0"/>
+          <w:numId w:val="1001"/>
+        </w:numPr>
+      </w:pPr>
+      <w:r>
+        <w:rPr>
+          <w:b/>
+          <w:bCs/>
+        </w:rPr>
+        <w:t xml:space="preserve">Apply a function to its argument with the macro’s f form:</w:t>
+      </w:r>
+      <w:r>
+        <w:t xml:space="preserve"> </w:t>
+      </w:r>
+      <w:r>
+        <w:t xml:space="preserve">Where a macro names a function, such as a fitting procedure,</w:t>
+      </w:r>
+      <w:r>
+        <w:t xml:space="preserve"> </w:t>
+      </w:r>
+      <w:r>
+        <w:t xml:space="preserve">the macro with an</w:t>
+      </w:r>
+      <w:r>
+        <w:t xml:space="preserve"> </w:t>
+      </w:r>
+      <w:r>
+        <w:rPr>
+          <w:rStyle w:val="VerbatimChar"/>
+        </w:rPr>
+        <w:t xml:space="preserve">f</w:t>
+      </w:r>
+      <w:r>
+        <w:t xml:space="preserve"> </w:t>
+      </w:r>
+      <w:r>
+        <w:t xml:space="preserve">ending applies it to its argument,</w:t>
+      </w:r>
+      <w:r>
+        <w:t xml:space="preserve"> </w:t>
+      </w:r>
+      <w:r>
+        <w:t xml:space="preserve">so write the application with that macro and not with a hand-typed</w:t>
+      </w:r>
+      <w:r>
+        <w:t xml:space="preserve"> </w:t>
+      </w:r>
+      <w:r>
+        <w:rPr>
+          <w:rStyle w:val="VerbatimChar"/>
+        </w:rPr>
+        <w:t xml:space="preserve">\paren</w:t>
+      </w:r>
+      <w:r>
+        <w:t xml:space="preserve">.</w:t>
+      </w:r>
+      <w:r>
+        <w:t xml:space="preserve"> </w:t>
+      </w:r>
+      <w:r>
+        <w:t xml:space="preserve">For example, write</w:t>
+      </w:r>
+      <w:r>
+        <w:t xml:space="preserve"> </w:t>
+      </w:r>
+      <m:oMath>
+        <m:r>
+          <m:t>g</m:t>
+        </m:r>
+        <m:r>
+          <m:t>​</m:t>
+        </m:r>
+        <m:d>
+          <m:dPr>
+            <m:begChr m:val="("/>
+            <m:sepChr m:val=""/>
+            <m:endChr m:val=")"/>
+            <m:grow/>
+          </m:dPr>
+          <m:e>
+            <m:sSub>
+              <m:e>
+                <m:r>
+                  <m:rPr>
+                    <m:scr m:val="script"/>
+                    <m:sty m:val="p"/>
+                  </m:rPr>
+                  <m:t>D</m:t>
+                </m:r>
+              </m:e>
+              <m:sub>
+                <m:r>
+                  <m:rPr>
+                    <m:nor/>
+                    <m:sty m:val="p"/>
+                  </m:rPr>
+                  <m:t>train</m:t>
+                </m:r>
+              </m:sub>
+            </m:sSub>
+          </m:e>
+        </m:d>
+        <m:r>
+          <m:t>​</m:t>
+        </m:r>
+      </m:oMath>
+      <w:r>
+        <w:t xml:space="preserve"> </w:t>
+      </w:r>
+      <w:r>
+        <w:t xml:space="preserve">for the fitted model that</w:t>
+      </w:r>
+      <w:r>
+        <w:t xml:space="preserve"> </w:t>
+      </w:r>
+      <m:oMath>
+        <m:r>
+          <m:t>g</m:t>
+        </m:r>
+      </m:oMath>
+      <w:r>
+        <w:t xml:space="preserve"> </w:t>
+      </w:r>
+      <w:r>
+        <w:t xml:space="preserve">gives on the training set</w:t>
+      </w:r>
+      <w:r>
+        <w:t xml:space="preserve"> </w:t>
+      </w:r>
+      <m:oMath>
+        <m:sSub>
+          <m:e>
+            <m:r>
+              <m:rPr>
+                <m:scr m:val="script"/>
+                <m:sty m:val="p"/>
+              </m:rPr>
+              <m:t>D</m:t>
+            </m:r>
+          </m:e>
+          <m:sub>
+            <m:r>
+              <m:rPr>
+                <m:nor/>
+                <m:sty m:val="p"/>
+              </m:rPr>
+              <m:t>train</m:t>
+            </m:r>
+          </m:sub>
+        </m:sSub>
+      </m:oMath>
+      <w:r>
+        <w:t xml:space="preserve">,</w:t>
+      </w:r>
+      <w:r>
+        <w:t xml:space="preserve"> </w:t>
+      </w:r>
+      <w:r>
+        <w:t xml:space="preserve">and never</w:t>
+      </w:r>
+      <w:r>
+        <w:t xml:space="preserve"> </w:t>
+      </w:r>
+      <m:oMath>
+        <m:r>
+          <m:t>g</m:t>
+        </m:r>
+        <m:r>
+          <m:t>​</m:t>
+        </m:r>
+        <m:d>
+          <m:dPr>
+            <m:begChr m:val="("/>
+            <m:sepChr m:val=""/>
+            <m:endChr m:val=")"/>
+            <m:grow/>
+          </m:dPr>
+          <m:e>
+            <m:sSub>
+              <m:e>
+                <m:r>
+                  <m:rPr>
+                    <m:scr m:val="script"/>
+                    <m:sty m:val="p"/>
+                  </m:rPr>
+                  <m:t>D</m:t>
+                </m:r>
+              </m:e>
+              <m:sub>
+                <m:r>
+                  <m:rPr>
+                    <m:nor/>
+                    <m:sty m:val="p"/>
+                  </m:rPr>
+                  <m:t>train</m:t>
+                </m:r>
+              </m:sub>
+            </m:sSub>
+          </m:e>
+        </m:d>
+        <m:r>
+          <m:t>​</m:t>
+        </m:r>
+      </m:oMath>
+      <w:r>
+        <w:t xml:space="preserve">.</w:t>
+      </w:r>
+      <w:r>
+        <w:t xml:space="preserve"> </w:t>
+      </w:r>
+      <w:r>
+        <w:t xml:space="preserve">Before adding an f form, check that no macro already prints the notation:</w:t>
+      </w:r>
+      <w:r>
+        <w:t xml:space="preserve"> </w:t>
+      </w:r>
+      <w:r>
+        <w:rPr>
+          <w:rStyle w:val="VerbatimChar"/>
+        </w:rPr>
+        <w:t xml:space="preserve">\candfitted{l}</w:t>
+      </w:r>
+      <w:r>
+        <w:t xml:space="preserve"> </w:t>
+      </w:r>
+      <w:r>
+        <w:t xml:space="preserve">already prints the fitted model of candidate</w:t>
+      </w:r>
+      <w:r>
+        <w:t xml:space="preserve"> </w:t>
+      </w:r>
+      <m:oMath>
+        <m:r>
+          <m:t>l</m:t>
+        </m:r>
+      </m:oMath>
+      <w:r>
+        <w:t xml:space="preserve">,</w:t>
+      </w:r>
+      <w:r>
+        <w:t xml:space="preserve"> </w:t>
+      </w:r>
+      <w:r>
+        <w:t xml:space="preserve">and a second macro for the same notation is not an f form.</w:t>
+      </w:r>
+      <w:r>
+        <w:t xml:space="preserve"> </w:t>
+      </w:r>
+      <w:r>
+        <w:t xml:space="preserve">When no macro prints the notation,</w:t>
+      </w:r>
+      <w:r>
+        <w:t xml:space="preserve"> </w:t>
+      </w:r>
+      <w:r>
+        <w:t xml:space="preserve">add the f form in the macros repository first,</w:t>
+      </w:r>
+      <w:r>
+        <w:t xml:space="preserve"> </w:t>
+      </w:r>
+      <w:r>
+        <w:t xml:space="preserve">then bump the pin and use it,</w:t>
+      </w:r>
+      <w:r>
+        <w:t xml:space="preserve"> </w:t>
+      </w:r>
+      <w:r>
+        <w:t xml:space="preserve">as for any new macro.</w:t>
       </w:r>
     </w:p>
     <w:p>

</xml_diff>

<commit_message>
Deploying to gh-pages from @ Morrison-Lab/psw@5310b40cca447cac9d2c5af3835342c4b0d9adbc 🚀
</commit_message>
<xml_diff>
--- a/chapters/defining-terms.docx
+++ b/chapters/defining-terms.docx
@@ -15,7 +15,7 @@
         <w:pStyle w:val="Date"/>
       </w:pPr>
       <w:r>
-        <w:t xml:space="preserve">Last modified: 2026-10-17 02:39:13 (PDT)</w:t>
+        <w:t xml:space="preserve">Last modified: 2026-10-17 02:49:55 (PDT)</w:t>
       </w:r>
     </w:p>
     <w:p>
@@ -5246,20 +5246,20 @@
         <w:t xml:space="preserve"> </w:t>
       </w:r>
       <m:oMath>
-        <m:r>
-          <m:t>g</m:t>
-        </m:r>
-        <m:r>
-          <m:t>​</m:t>
-        </m:r>
-        <m:d>
-          <m:dPr>
-            <m:begChr m:val="("/>
-            <m:sepChr m:val=""/>
-            <m:endChr m:val=")"/>
-            <m:grow/>
-          </m:dPr>
+        <m:sSub>
           <m:e>
+            <m:acc>
+              <m:accPr>
+                <m:chr m:val="̂"/>
+              </m:accPr>
+              <m:e>
+                <m:r>
+                  <m:t>y</m:t>
+                </m:r>
+              </m:e>
+            </m:acc>
+          </m:e>
+          <m:sub>
             <m:sSub>
               <m:e>
                 <m:r>
@@ -5280,37 +5280,73 @@
                 </m:r>
               </m:sub>
             </m:sSub>
+          </m:sub>
+        </m:sSub>
+      </m:oMath>
+      <w:r>
+        <w:t xml:space="preserve"> </w:t>
+      </w:r>
+      <w:r>
+        <w:t xml:space="preserve">for the fitted model,</w:t>
+      </w:r>
+      <w:r>
+        <w:t xml:space="preserve"> </w:t>
+      </w:r>
+      <w:r>
+        <w:t xml:space="preserve">the model that the procedure produces from the training set,</w:t>
+      </w:r>
+      <w:r>
+        <w:t xml:space="preserve"> </w:t>
+      </w:r>
+      <w:r>
+        <w:t xml:space="preserve">and</w:t>
+      </w:r>
+      <w:r>
+        <w:t xml:space="preserve"> </w:t>
+      </w:r>
+      <m:oMath>
+        <m:r>
+          <m:t>g</m:t>
+        </m:r>
+      </m:oMath>
+      <w:r>
+        <w:t xml:space="preserve"> </w:t>
+      </w:r>
+      <w:r>
+        <w:t xml:space="preserve">only for the procedure itself.</w:t>
+      </w:r>
+      <w:r>
+        <w:t xml:space="preserve"> </w:t>
+      </w:r>
+      <w:r>
+        <w:t xml:space="preserve">Where the training set is not salient, write the fitted model as</w:t>
+      </w:r>
+      <w:r>
+        <w:t xml:space="preserve"> </w:t>
+      </w:r>
+      <m:oMath>
+        <m:acc>
+          <m:accPr>
+            <m:chr m:val="̂"/>
+          </m:accPr>
+          <m:e>
+            <m:r>
+              <m:t>y</m:t>
+            </m:r>
           </m:e>
-        </m:d>
-        <m:r>
-          <m:t>​</m:t>
-        </m:r>
+        </m:acc>
       </m:oMath>
       <w:r>
         <w:t xml:space="preserve"> </w:t>
       </w:r>
       <w:r>
-        <w:t xml:space="preserve">for the fitted model,</w:t>
-      </w:r>
-      <w:r>
-        <w:t xml:space="preserve"> </w:t>
-      </w:r>
-      <w:r>
-        <w:t xml:space="preserve">and</w:t>
-      </w:r>
-      <w:r>
-        <w:t xml:space="preserve"> </w:t>
-      </w:r>
-      <m:oMath>
-        <m:r>
-          <m:t>g</m:t>
-        </m:r>
-      </m:oMath>
-      <w:r>
-        <w:t xml:space="preserve"> </w:t>
-      </w:r>
-      <w:r>
-        <w:t xml:space="preserve">only for the procedure itself.</w:t>
+        <w:t xml:space="preserve">instead,</w:t>
+      </w:r>
+      <w:r>
+        <w:t xml:space="preserve"> </w:t>
+      </w:r>
+      <w:r>
+        <w:t xml:space="preserve">the symbol that the predicted-value bullet below builds on.</w:t>
       </w:r>
       <w:r>
         <w:t xml:space="preserve"> </w:t>

</xml_diff>

<commit_message>
Deploying to gh-pages from @ Morrison-Lab/psw@0cabf2fad0ee131bc0f27299606b97e363a7780d 🚀
</commit_message>
<xml_diff>
--- a/chapters/defining-terms.docx
+++ b/chapters/defining-terms.docx
@@ -15,7 +15,7 @@
         <w:pStyle w:val="Date"/>
       </w:pPr>
       <w:r>
-        <w:t xml:space="preserve">Last modified: 2026-10-18 14:45:14 (PDT)</w:t>
+        <w:t xml:space="preserve">Last modified: 2026-10-18 23:00:30 (PDT)</w:t>
       </w:r>
     </w:p>
     <w:p>
@@ -6185,6 +6185,180 @@
         <w:t xml:space="preserve"> </w:t>
       </w:r>
       <w:r>
+        <w:t xml:space="preserve">The same holds for an operator and every delimiter macro</w:t>
+      </w:r>
+      <w:r>
+        <w:t xml:space="preserve"> </w:t>
+      </w:r>
+      <w:r>
+        <w:t xml:space="preserve">(</w:t>
+      </w:r>
+      <w:r>
+        <w:rPr>
+          <w:rStyle w:val="VerbatimChar"/>
+        </w:rPr>
+        <w:t xml:space="preserve">\paren</w:t>
+      </w:r>
+      <w:r>
+        <w:t xml:space="preserve">,</w:t>
+      </w:r>
+      <w:r>
+        <w:t xml:space="preserve"> </w:t>
+      </w:r>
+      <w:r>
+        <w:rPr>
+          <w:rStyle w:val="VerbatimChar"/>
+        </w:rPr>
+        <w:t xml:space="preserve">\sb</w:t>
+      </w:r>
+      <w:r>
+        <w:t xml:space="preserve">,</w:t>
+      </w:r>
+      <w:r>
+        <w:t xml:space="preserve"> </w:t>
+      </w:r>
+      <w:r>
+        <w:rPr>
+          <w:rStyle w:val="VerbatimChar"/>
+        </w:rPr>
+        <w:t xml:space="preserve">\cb</w:t>
+      </w:r>
+      <w:r>
+        <w:t xml:space="preserve">,</w:t>
+      </w:r>
+      <w:r>
+        <w:t xml:space="preserve"> </w:t>
+      </w:r>
+      <w:r>
+        <w:rPr>
+          <w:rStyle w:val="VerbatimChar"/>
+        </w:rPr>
+        <w:t xml:space="preserve">\set</w:t>
+      </w:r>
+      <w:r>
+        <w:t xml:space="preserve">,</w:t>
+      </w:r>
+      <w:r>
+        <w:t xml:space="preserve"> </w:t>
+      </w:r>
+      <w:r>
+        <w:rPr>
+          <w:rStyle w:val="VerbatimChar"/>
+        </w:rPr>
+        <w:t xml:space="preserve">\abs</w:t>
+      </w:r>
+      <w:r>
+        <w:t xml:space="preserve">,</w:t>
+      </w:r>
+      <w:r>
+        <w:t xml:space="preserve"> </w:t>
+      </w:r>
+      <w:r>
+        <w:rPr>
+          <w:rStyle w:val="VerbatimChar"/>
+        </w:rPr>
+        <w:t xml:space="preserve">\norm</w:t>
+      </w:r>
+      <w:r>
+        <w:t xml:space="preserve"> </w:t>
+      </w:r>
+      <w:r>
+        <w:t xml:space="preserve">and</w:t>
+      </w:r>
+      <w:r>
+        <w:t xml:space="preserve"> </w:t>
+      </w:r>
+      <w:r>
+        <w:rPr>
+          <w:rStyle w:val="VerbatimChar"/>
+        </w:rPr>
+        <w:t xml:space="preserve">\angb</w:t>
+      </w:r>
+      <w:r>
+        <w:t xml:space="preserve">),</w:t>
+      </w:r>
+      <w:r>
+        <w:t xml:space="preserve"> </w:t>
+      </w:r>
+      <w:r>
+        <w:t xml:space="preserve">and for an alias of the operator:</w:t>
+      </w:r>
+      <w:r>
+        <w:t xml:space="preserve"> </w:t>
+      </w:r>
+      <w:r>
+        <w:t xml:space="preserve">write</w:t>
+      </w:r>
+      <w:r>
+        <w:t xml:space="preserve"> </w:t>
+      </w:r>
+      <m:oMath>
+        <m:r>
+          <m:rPr>
+            <m:sty m:val="p"/>
+          </m:rPr>
+          <m:t>E</m:t>
+        </m:r>
+        <m:r>
+          <m:t>​</m:t>
+        </m:r>
+        <m:d>
+          <m:dPr>
+            <m:begChr m:val="["/>
+            <m:sepChr m:val=""/>
+            <m:endChr m:val="]"/>
+            <m:grow/>
+          </m:dPr>
+          <m:e>
+            <m:r>
+              <m:t>y</m:t>
+            </m:r>
+          </m:e>
+        </m:d>
+        <m:r>
+          <m:t>​</m:t>
+        </m:r>
+      </m:oMath>
+      <w:r>
+        <w:t xml:space="preserve">, and never</w:t>
+      </w:r>
+      <w:r>
+        <w:t xml:space="preserve"> </w:t>
+      </w:r>
+      <m:oMath>
+        <m:r>
+          <m:rPr>
+            <m:sty m:val="p"/>
+          </m:rPr>
+          <m:t>E</m:t>
+        </m:r>
+        <m:r>
+          <m:t>​</m:t>
+        </m:r>
+        <m:d>
+          <m:dPr>
+            <m:begChr m:val="["/>
+            <m:sepChr m:val=""/>
+            <m:endChr m:val="]"/>
+            <m:grow/>
+          </m:dPr>
+          <m:e>
+            <m:r>
+              <m:t>y</m:t>
+            </m:r>
+          </m:e>
+        </m:d>
+        <m:r>
+          <m:t>​</m:t>
+        </m:r>
+      </m:oMath>
+      <w:r>
+        <w:t xml:space="preserve">.</w:t>
+      </w:r>
+      <w:r>
+        <w:t xml:space="preserve"> </w:t>
+      </w:r>
+      <w:r>
         <w:t xml:space="preserve">Before adding an f form, check that no macro already prints the notation:</w:t>
       </w:r>
       <w:r>
@@ -6229,7 +6403,7 @@
         <w:t xml:space="preserve"> </w:t>
       </w:r>
       <w:r>
-        <w:t xml:space="preserve">add the f form in the macros repository first,</w:t>
+        <w:t xml:space="preserve">create the f form in the macros repository first, in the same session,</w:t>
       </w:r>
       <w:r>
         <w:t xml:space="preserve"> </w:t>
@@ -6242,6 +6416,12 @@
       </w:r>
       <w:r>
         <w:t xml:space="preserve">as for any new macro.</w:t>
+      </w:r>
+      <w:r>
+        <w:t xml:space="preserve"> </w:t>
+      </w:r>
+      <w:r>
+        <w:t xml:space="preserve">A missing f form is never a reason to type the operator and the delimiter separately.</w:t>
       </w:r>
     </w:p>
     <w:p>

</xml_diff>

<commit_message>
Deploying to gh-pages from @ Morrison-Lab/psw@c9f3c807190de4e317b8677ee08190323fb7977d 🚀
</commit_message>
<xml_diff>
--- a/chapters/defining-terms.docx
+++ b/chapters/defining-terms.docx
@@ -15,7 +15,7 @@
         <w:pStyle w:val="Date"/>
       </w:pPr>
       <w:r>
-        <w:t xml:space="preserve">Last modified: 2026-10-19 10:00:51 (PDT)</w:t>
+        <w:t xml:space="preserve">Last modified: 2026-10-19 10:35:29 (PDT)</w:t>
       </w:r>
     </w:p>
     <w:p>
@@ -5406,6 +5406,165 @@
       </w:r>
       <w:r>
         <w:t xml:space="preserve">.</w:t>
+      </w:r>
+    </w:p>
+    <w:p>
+      <w:pPr>
+        <w:numPr>
+          <w:ilvl w:val="0"/>
+          <w:numId w:val="1001"/>
+        </w:numPr>
+      </w:pPr>
+      <w:r>
+        <w:rPr>
+          <w:b/>
+          <w:bCs/>
+        </w:rPr>
+        <w:t xml:space="preserve">Say</w:t>
+      </w:r>
+      <w:r>
+        <w:rPr>
+          <w:b/>
+          <w:bCs/>
+        </w:rPr>
+        <w:t xml:space="preserve"> </w:t>
+      </w:r>
+      <w:r>
+        <w:rPr>
+          <w:b/>
+          <w:bCs/>
+        </w:rPr>
+        <w:t xml:space="preserve">“fitted model”</w:t>
+      </w:r>
+      <w:r>
+        <w:rPr>
+          <w:b/>
+          <w:bCs/>
+        </w:rPr>
+        <w:t xml:space="preserve">, not</w:t>
+      </w:r>
+      <w:r>
+        <w:rPr>
+          <w:b/>
+          <w:bCs/>
+        </w:rPr>
+        <w:t xml:space="preserve"> </w:t>
+      </w:r>
+      <w:r>
+        <w:rPr>
+          <w:b/>
+          <w:bCs/>
+        </w:rPr>
+        <w:t xml:space="preserve">“prediction rule”</w:t>
+      </w:r>
+      <w:r>
+        <w:rPr>
+          <w:b/>
+          <w:bCs/>
+        </w:rPr>
+        <w:t xml:space="preserve">:</w:t>
+      </w:r>
+      <w:r>
+        <w:t xml:space="preserve"> </w:t>
+      </w:r>
+      <w:r>
+        <w:t xml:space="preserve">A fitted model that is used to predict outcomes is still a fitted model,</w:t>
+      </w:r>
+      <w:r>
+        <w:t xml:space="preserve"> </w:t>
+      </w:r>
+      <w:r>
+        <w:t xml:space="preserve">and a second name for one object makes readers wonder whether there are two objects,</w:t>
+      </w:r>
+      <w:r>
+        <w:t xml:space="preserve"> </w:t>
+      </w:r>
+      <w:r>
+        <w:t xml:space="preserve">so call it a fitted model every time.</w:t>
+      </w:r>
+      <w:r>
+        <w:t xml:space="preserve"> </w:t>
+      </w:r>
+      <w:r>
+        <w:t xml:space="preserve">Write</w:t>
+      </w:r>
+      <w:r>
+        <w:t xml:space="preserve"> </w:t>
+      </w:r>
+      <w:r>
+        <w:t xml:space="preserve">“the fitted model predicts”</w:t>
+      </w:r>
+      <w:r>
+        <w:t xml:space="preserve">,</w:t>
+      </w:r>
+      <w:r>
+        <w:t xml:space="preserve"> </w:t>
+      </w:r>
+      <w:r>
+        <w:t xml:space="preserve">and never</w:t>
+      </w:r>
+      <w:r>
+        <w:t xml:space="preserve"> </w:t>
+      </w:r>
+      <w:r>
+        <w:t xml:space="preserve">“the prediction rule predicts”</w:t>
+      </w:r>
+      <w:r>
+        <w:t xml:space="preserve">.</w:t>
+      </w:r>
+      <w:r>
+        <w:t xml:space="preserve"> </w:t>
+      </w:r>
+      <w:r>
+        <w:t xml:space="preserve">When a set of notes defines the fitted model,</w:t>
+      </w:r>
+      <w:r>
+        <w:t xml:space="preserve"> </w:t>
+      </w:r>
+      <w:r>
+        <w:t xml:space="preserve">“prediction rule”</w:t>
+      </w:r>
+      <w:r>
+        <w:t xml:space="preserve"> </w:t>
+      </w:r>
+      <w:r>
+        <w:t xml:space="preserve">belongs only in that definition, as an alias in bold and in the div title,</w:t>
+      </w:r>
+      <w:r>
+        <w:t xml:space="preserve"> </w:t>
+      </w:r>
+      <w:r>
+        <w:t xml:space="preserve">so that a reader who meets the alias elsewhere can find its meaning.</w:t>
+      </w:r>
+      <w:r>
+        <w:t xml:space="preserve"> </w:t>
+      </w:r>
+      <w:r>
+        <w:t xml:space="preserve">If the notes once defined</w:t>
+      </w:r>
+      <w:r>
+        <w:t xml:space="preserve"> </w:t>
+      </w:r>
+      <w:r>
+        <w:t xml:space="preserve">“prediction rule”</w:t>
+      </w:r>
+      <w:r>
+        <w:t xml:space="preserve"> </w:t>
+      </w:r>
+      <w:r>
+        <w:t xml:space="preserve">under its own anchor,</w:t>
+      </w:r>
+      <w:r>
+        <w:t xml:space="preserve"> </w:t>
+      </w:r>
+      <w:r>
+        <w:t xml:space="preserve">keep the old anchor as a span on the alias,</w:t>
+      </w:r>
+      <w:r>
+        <w:t xml:space="preserve"> </w:t>
+      </w:r>
+      <w:r>
+        <w:t xml:space="preserve">so that links to it still land there.</w:t>
       </w:r>
     </w:p>
     <w:p>

</xml_diff>

<commit_message>
Deploying to gh-pages from @ Morrison-Lab/psw@8d40893f0b8ca2675c26df23d4e681de3e52dcb6 🚀
</commit_message>
<xml_diff>
--- a/chapters/defining-terms.docx
+++ b/chapters/defining-terms.docx
@@ -15,7 +15,7 @@
         <w:pStyle w:val="Date"/>
       </w:pPr>
       <w:r>
-        <w:t xml:space="preserve">Last modified: 2026-10-19 10:35:29 (PDT)</w:t>
+        <w:t xml:space="preserve">Last modified: 2026-10-19 23:24:54 (PDT)</w:t>
       </w:r>
     </w:p>
     <w:p>
@@ -2839,6 +2839,66 @@
       </w:r>
       <w:r>
         <w:t xml:space="preserve">so that a reader who has forgotten or skipped the referent can find it.</w:t>
+      </w:r>
+      <w:r>
+        <w:t xml:space="preserve"> </w:t>
+      </w:r>
+      <w:r>
+        <w:t xml:space="preserve">Skip the link when the referent is introduced in the same div,</w:t>
+      </w:r>
+      <w:r>
+        <w:t xml:space="preserve"> </w:t>
+      </w:r>
+      <w:r>
+        <w:t xml:space="preserve">or in the same prose passage, as the phrase.</w:t>
+      </w:r>
+      <w:r>
+        <w:t xml:space="preserve"> </w:t>
+      </w:r>
+      <w:r>
+        <w:t xml:space="preserve">Inside a div, the antecedent has to be in that div:</w:t>
+      </w:r>
+      <w:r>
+        <w:t xml:space="preserve"> </w:t>
+      </w:r>
+      <w:r>
+        <w:t xml:space="preserve">an earlier div does not count,</w:t>
+      </w:r>
+      <w:r>
+        <w:t xml:space="preserve"> </w:t>
+      </w:r>
+      <w:r>
+        <w:t xml:space="preserve">because readers jump into the middle of a page.</w:t>
+      </w:r>
+      <w:r>
+        <w:t xml:space="preserve"> </w:t>
+      </w:r>
+      <w:r>
+        <w:t xml:space="preserve">For example, an exercise that says</w:t>
+      </w:r>
+      <w:r>
+        <w:t xml:space="preserve"> </w:t>
+      </w:r>
+      <w:r>
+        <w:t xml:space="preserve">“Explain the labels”</w:t>
+      </w:r>
+      <w:r>
+        <w:t xml:space="preserve"> </w:t>
+      </w:r>
+      <w:r>
+        <w:t xml:space="preserve">with no labels named in it</w:t>
+      </w:r>
+      <w:r>
+        <w:t xml:space="preserve"> </w:t>
+      </w:r>
+      <w:r>
+        <w:t xml:space="preserve">has no antecedent, even if an earlier exercise names some.</w:t>
+      </w:r>
+      <w:r>
+        <w:t xml:space="preserve"> </w:t>
+      </w:r>
+      <w:r>
+        <w:t xml:space="preserve">Name the labels in the exercise, or link them to where they are introduced.</w:t>
       </w:r>
     </w:p>
     <w:p>

</xml_diff>

<commit_message>
Deploying to gh-pages from @ Morrison-Lab/psw@77b3ee7827645c87d2b689cdde2cf8c4513e8f85 🚀
</commit_message>
<xml_diff>
--- a/chapters/defining-terms.docx
+++ b/chapters/defining-terms.docx
@@ -15,7 +15,7 @@
         <w:pStyle w:val="Date"/>
       </w:pPr>
       <w:r>
-        <w:t xml:space="preserve">Last modified: 2026-10-19 23:24:54 (PDT)</w:t>
+        <w:t xml:space="preserve">Last modified: 2026-10-19 23:30:24 (PDT)</w:t>
       </w:r>
     </w:p>
     <w:p>
@@ -35,7 +35,7 @@
         <w:t xml:space="preserve"> </w:t>
       </w:r>
       <w:r>
-        <w:t xml:space="preserve">concise definition immediately before or after its first use.</w:t>
+        <w:t xml:space="preserve">concise definition before its first use.</w:t>
       </w:r>
       <w:r>
         <w:t xml:space="preserve"> </w:t>
@@ -490,7 +490,7 @@
       </w:r>
     </w:p>
     <w:bookmarkEnd w:id="15"/>
-    <w:bookmarkStart w:id="18" w:name="guidelines-for-defining-terms"/>
+    <w:bookmarkStart w:id="19" w:name="guidelines-for-defining-terms"/>
     <w:p>
       <w:pPr>
         <w:pStyle w:val="Heading2"/>
@@ -2152,7 +2152,51 @@
         <w:t xml:space="preserve"> </w:t>
       </w:r>
       <w:r>
-        <w:t xml:space="preserve">Place the definition immediately before or after the term’s first appearance.</w:t>
+        <w:t xml:space="preserve">Place the definition of a term before the first definition, theorem or passage that relies on it,</w:t>
+      </w:r>
+      <w:r>
+        <w:t xml:space="preserve"> </w:t>
+      </w:r>
+      <w:r>
+        <w:t xml:space="preserve">so that every link to a definition points backward rather than forward</w:t>
+      </w:r>
+      <w:r>
+        <w:t xml:space="preserve"> </w:t>
+      </w:r>
+      <w:r>
+        <w:t xml:space="preserve">(see</w:t>
+      </w:r>
+      <w:r>
+        <w:t xml:space="preserve"> </w:t>
+      </w:r>
+      <w:hyperlink r:id="rId16">
+        <w:r>
+          <w:rPr>
+            <w:rStyle w:val="Hyperlink"/>
+          </w:rPr>
+          <w:t xml:space="preserve">Avoid forward references</w:t>
+        </w:r>
+      </w:hyperlink>
+      <w:r>
+        <w:t xml:space="preserve">).</w:t>
+      </w:r>
+      <w:r>
+        <w:t xml:space="preserve"> </w:t>
+      </w:r>
+      <w:r>
+        <w:t xml:space="preserve">When a definition or theorem uses a term whose definition comes later in the document,</w:t>
+      </w:r>
+      <w:r>
+        <w:t xml:space="preserve"> </w:t>
+      </w:r>
+      <w:r>
+        <w:t xml:space="preserve">reorder the content so the definition comes first;</w:t>
+      </w:r>
+      <w:r>
+        <w:t xml:space="preserve"> </w:t>
+      </w:r>
+      <w:r>
+        <w:t xml:space="preserve">do not remove the hyperlink to hide the forward reference.</w:t>
       </w:r>
     </w:p>
     <w:p>
@@ -3224,7 +3268,7 @@
         <w:t xml:space="preserve">A reader who needs one of them can then link to exactly that one.</w:t>
       </w:r>
     </w:p>
-    <w:bookmarkStart w:id="16" w:name="exm-one-definition-per-div"/>
+    <w:bookmarkStart w:id="17" w:name="exm-one-definition-per-div"/>
     <w:p>
       <w:pPr>
         <w:numPr>
@@ -3764,7 +3808,7 @@
         <w:t xml:space="preserve">and each needs its own example.</w:t>
       </w:r>
     </w:p>
-    <w:bookmarkEnd w:id="16"/>
+    <w:bookmarkEnd w:id="17"/>
     <w:p>
       <w:pPr>
         <w:numPr>
@@ -3941,7 +3985,7 @@
       <w:r>
         <w:t xml:space="preserve"> </w:t>
       </w:r>
-      <w:hyperlink r:id="rId17">
+      <w:hyperlink r:id="rId18">
         <w:r>
           <w:rPr>
             <w:rStyle w:val="Hyperlink"/>
@@ -7022,8 +7066,8 @@
         <w:t xml:space="preserve">When in doubt, keep it.</w:t>
       </w:r>
     </w:p>
-    <w:bookmarkEnd w:id="18"/>
-    <w:bookmarkStart w:id="25" w:name="examples-of-term-definitions"/>
+    <w:bookmarkEnd w:id="19"/>
+    <w:bookmarkStart w:id="26" w:name="examples-of-term-definitions"/>
     <w:p>
       <w:pPr>
         <w:pStyle w:val="Heading2"/>
@@ -7040,7 +7084,7 @@
         <w:t xml:space="preserve">Here are examples of well-defined terms:</w:t>
       </w:r>
     </w:p>
-    <w:bookmarkStart w:id="19" w:name="def-confidence-interval"/>
+    <w:bookmarkStart w:id="20" w:name="def-confidence-interval"/>
     <w:p>
       <w:pPr>
         <w:pStyle w:val="BodyText"/>
@@ -7277,8 +7321,8 @@
         </m:oMath>
       </m:oMathPara>
     </w:p>
-    <w:bookmarkEnd w:id="19"/>
-    <w:bookmarkStart w:id="20" w:name="exm-confidence-interval"/>
+    <w:bookmarkEnd w:id="20"/>
+    <w:bookmarkStart w:id="21" w:name="exm-confidence-interval"/>
     <w:p>
       <w:pPr>
         <w:pStyle w:val="FirstParagraph"/>
@@ -7320,8 +7364,8 @@
         <w:t xml:space="preserve">we are 95% confident that the true population mean height falls within this range.</w:t>
       </w:r>
     </w:p>
-    <w:bookmarkEnd w:id="20"/>
-    <w:bookmarkStart w:id="21" w:name="exm-not-confidence-interval"/>
+    <w:bookmarkEnd w:id="21"/>
+    <w:bookmarkStart w:id="22" w:name="exm-not-confidence-interval"/>
     <w:p>
       <w:pPr>
         <w:pStyle w:val="BodyText"/>
@@ -7381,8 +7425,8 @@
         <w:t xml:space="preserve">and it does not shrink as the sample grows.</w:t>
       </w:r>
     </w:p>
-    <w:bookmarkEnd w:id="21"/>
-    <w:bookmarkStart w:id="22" w:name="def-active-voice"/>
+    <w:bookmarkEnd w:id="22"/>
+    <w:bookmarkStart w:id="23" w:name="def-active-voice"/>
     <w:p>
       <w:pPr>
         <w:pStyle w:val="BodyText"/>
@@ -7411,8 +7455,8 @@
         <w:t xml:space="preserve">is a sentence structure where the subject performs the action expressed by the verb.</w:t>
       </w:r>
     </w:p>
-    <w:bookmarkEnd w:id="22"/>
-    <w:bookmarkStart w:id="23" w:name="exm-active-voice"/>
+    <w:bookmarkEnd w:id="23"/>
+    <w:bookmarkStart w:id="24" w:name="exm-active-voice"/>
     <w:p>
       <w:pPr>
         <w:pStyle w:val="BodyText"/>
@@ -7472,8 +7516,8 @@
         <w:t xml:space="preserve">.</w:t>
       </w:r>
     </w:p>
-    <w:bookmarkEnd w:id="23"/>
-    <w:bookmarkStart w:id="24" w:name="exm-passive-voice"/>
+    <w:bookmarkEnd w:id="24"/>
+    <w:bookmarkStart w:id="25" w:name="exm-passive-voice"/>
     <w:p>
       <w:pPr>
         <w:pStyle w:val="BodyText"/>
@@ -7536,9 +7580,9 @@
         <w:t xml:space="preserve">so the sentence is in passive voice.</w:t>
       </w:r>
     </w:p>
-    <w:bookmarkEnd w:id="24"/>
     <w:bookmarkEnd w:id="25"/>
-    <w:bookmarkStart w:id="30" w:name="order-general-definition-then-examples"/>
+    <w:bookmarkEnd w:id="26"/>
+    <w:bookmarkStart w:id="31" w:name="order-general-definition-then-examples"/>
     <w:p>
       <w:pPr>
         <w:pStyle w:val="Heading2"/>
@@ -7582,6 +7626,66 @@
         <w:t xml:space="preserve"> </w:t>
       </w:r>
       <w:r>
+        <w:t xml:space="preserve">When the special cases have their own definitions,</w:t>
+      </w:r>
+      <w:r>
+        <w:t xml:space="preserve"> </w:t>
+      </w:r>
+      <w:r>
+        <w:t xml:space="preserve">define the general concept first from prerequisite terms defined before it,</w:t>
+      </w:r>
+      <w:r>
+        <w:t xml:space="preserve"> </w:t>
+      </w:r>
+      <w:r>
+        <w:t xml:space="preserve">and then define the special cases after it.</w:t>
+      </w:r>
+      <w:r>
+        <w:t xml:space="preserve"> </w:t>
+      </w:r>
+      <w:r>
+        <w:t xml:space="preserve">Do not define the general concept by listing the special-case definitions that follow it,</w:t>
+      </w:r>
+      <w:r>
+        <w:t xml:space="preserve"> </w:t>
+      </w:r>
+      <w:r>
+        <w:t xml:space="preserve">or move the general definition after its special cases:</w:t>
+      </w:r>
+      <w:r>
+        <w:t xml:space="preserve"> </w:t>
+      </w:r>
+      <w:r>
+        <w:t xml:space="preserve">define the prerequisite terms first</w:t>
+      </w:r>
+      <w:r>
+        <w:t xml:space="preserve"> </w:t>
+      </w:r>
+      <w:r>
+        <w:t xml:space="preserve">(for example, define lower and upper bounds first,</w:t>
+      </w:r>
+      <w:r>
+        <w:t xml:space="preserve"> </w:t>
+      </w:r>
+      <w:r>
+        <w:t xml:space="preserve">then define an interval as a subset of the real numbers between two bounds,</w:t>
+      </w:r>
+      <w:r>
+        <w:t xml:space="preserve"> </w:t>
+      </w:r>
+      <w:r>
+        <w:t xml:space="preserve">possibly including one or both bounds,</w:t>
+      </w:r>
+      <w:r>
+        <w:t xml:space="preserve"> </w:t>
+      </w:r>
+      <w:r>
+        <w:t xml:space="preserve">and then define closed, open and half-open intervals).</w:t>
+      </w:r>
+      <w:r>
+        <w:t xml:space="preserve"> </w:t>
+      </w:r>
+      <w:r>
         <w:t xml:space="preserve">For example, a statistics text that defines the residual sum of squares</w:t>
       </w:r>
       <w:r>
@@ -7591,7 +7695,7 @@
         <w:t xml:space="preserve">would give these blocks, in this order:</w:t>
       </w:r>
     </w:p>
-    <w:bookmarkStart w:id="26" w:name="def-rss"/>
+    <w:bookmarkStart w:id="27" w:name="def-rss"/>
     <w:p>
       <w:pPr>
         <w:pStyle w:val="BodyText"/>
@@ -7709,8 +7813,8 @@
         </m:oMath>
       </m:oMathPara>
     </w:p>
-    <w:bookmarkEnd w:id="26"/>
-    <w:bookmarkStart w:id="27" w:name="exm-rss-line"/>
+    <w:bookmarkEnd w:id="27"/>
+    <w:bookmarkStart w:id="28" w:name="exm-rss-line"/>
     <w:p>
       <w:pPr>
         <w:pStyle w:val="FirstParagraph"/>
@@ -8042,8 +8146,8 @@
         </m:oMath>
       </m:oMathPara>
     </w:p>
-    <w:bookmarkEnd w:id="27"/>
-    <w:bookmarkStart w:id="28" w:name="exm-rss-three-points"/>
+    <w:bookmarkEnd w:id="28"/>
+    <w:bookmarkStart w:id="29" w:name="exm-rss-three-points"/>
     <w:p>
       <w:pPr>
         <w:pStyle w:val="FirstParagraph"/>
@@ -8332,8 +8436,8 @@
         <w:t xml:space="preserve">.</w:t>
       </w:r>
     </w:p>
-    <w:bookmarkEnd w:id="28"/>
-    <w:bookmarkStart w:id="29" w:name="exm-not-rss"/>
+    <w:bookmarkEnd w:id="29"/>
+    <w:bookmarkStart w:id="30" w:name="exm-not-rss"/>
     <w:p>
       <w:pPr>
         <w:pStyle w:val="BodyText"/>
@@ -8476,7 +8580,7 @@
         <w:t xml:space="preserve">rather than around the line’s fitted values.</w:t>
       </w:r>
     </w:p>
-    <w:bookmarkEnd w:id="29"/>
+    <w:bookmarkEnd w:id="30"/>
     <w:p>
       <w:pPr>
         <w:pStyle w:val="BodyText"/>
@@ -8515,14 +8619,448 @@
         <w:t xml:space="preserve">once the reader knows what the definition covers.</w:t>
       </w:r>
     </w:p>
-    <w:bookmarkEnd w:id="30"/>
-    <w:bookmarkStart w:id="31" w:name="why-examples-matter"/>
+    <w:bookmarkEnd w:id="31"/>
+    <w:bookmarkStart w:id="35" w:name="X35ef0536ddd4dcadf17366e9cbbad09e6282954"/>
     <w:p>
       <w:pPr>
         <w:pStyle w:val="Heading2"/>
       </w:pPr>
       <w:r>
-        <w:t xml:space="preserve">4 Why examples matter</w:t>
+        <w:t xml:space="preserve">4 Give a defined quantity its expression and its prose reading</w:t>
+      </w:r>
+    </w:p>
+    <w:p>
+      <w:pPr>
+        <w:pStyle w:val="FirstParagraph"/>
+      </w:pPr>
+      <w:r>
+        <w:t xml:space="preserve">When a term names a quantity with a mathematical form,</w:t>
+      </w:r>
+      <w:r>
+        <w:t xml:space="preserve"> </w:t>
+      </w:r>
+      <w:r>
+        <w:t xml:space="preserve">the definition states the expression</w:t>
+      </w:r>
+      <w:r>
+        <w:t xml:space="preserve"> </w:t>
+      </w:r>
+      <w:r>
+        <w:t xml:space="preserve">and then reads it aloud in a prose sentence that says the same thing.</w:t>
+      </w:r>
+      <w:r>
+        <w:t xml:space="preserve"> </w:t>
+      </w:r>
+      <w:r>
+        <w:t xml:space="preserve">The expression makes the definition exact.</w:t>
+      </w:r>
+      <w:r>
+        <w:t xml:space="preserve"> </w:t>
+      </w:r>
+      <w:r>
+        <w:t xml:space="preserve">The prose reading lets the reader check that they understood it.</w:t>
+      </w:r>
+      <w:r>
+        <w:t xml:space="preserve"> </w:t>
+      </w:r>
+      <w:r>
+        <w:t xml:space="preserve">The two must match</w:t>
+      </w:r>
+      <w:r>
+        <w:t xml:space="preserve"> </w:t>
+      </w:r>
+      <w:r>
+        <w:t xml:space="preserve">(see</w:t>
+      </w:r>
+      <w:r>
+        <w:t xml:space="preserve"> </w:t>
+      </w:r>
+      <w:hyperlink r:id="rId32">
+        <w:r>
+          <w:rPr>
+            <w:rStyle w:val="Hyperlink"/>
+          </w:rPr>
+          <w:t xml:space="preserve">Make the prose say what the formula says</w:t>
+        </w:r>
+      </w:hyperlink>
+      <w:r>
+        <w:t xml:space="preserve">).</w:t>
+      </w:r>
+      <w:r>
+        <w:t xml:space="preserve"> </w:t>
+      </w:r>
+      <w:r>
+        <w:t xml:space="preserve">A term with no mathematical form, such as active voice, keeps its prose definition alone.</w:t>
+      </w:r>
+    </w:p>
+    <w:bookmarkStart w:id="33" w:name="def-variance-expression-and-prose"/>
+    <w:p>
+      <w:pPr>
+        <w:pStyle w:val="BodyText"/>
+      </w:pPr>
+      <w:r>
+        <w:rPr>
+          <w:b/>
+          <w:bCs/>
+        </w:rPr>
+        <w:t xml:space="preserve">Definition 6 (Variance, with its expression and its prose reading)</w:t>
+      </w:r>
+      <w:r>
+        <w:t xml:space="preserve"> </w:t>
+      </w:r>
+      <w:r>
+        <w:t xml:space="preserve">The</w:t>
+      </w:r>
+      <w:r>
+        <w:t xml:space="preserve"> </w:t>
+      </w:r>
+      <w:r>
+        <w:rPr>
+          <w:b/>
+          <w:bCs/>
+        </w:rPr>
+        <w:t xml:space="preserve">variance</w:t>
+      </w:r>
+      <w:r>
+        <w:t xml:space="preserve"> </w:t>
+      </w:r>
+      <w:r>
+        <w:t xml:space="preserve">of a random variable</w:t>
+      </w:r>
+      <w:r>
+        <w:t xml:space="preserve"> </w:t>
+      </w:r>
+      <m:oMath>
+        <m:r>
+          <m:t>X</m:t>
+        </m:r>
+      </m:oMath>
+      <w:r>
+        <w:t xml:space="preserve"> </w:t>
+      </w:r>
+      <w:r>
+        <w:t xml:space="preserve">is</w:t>
+      </w:r>
+    </w:p>
+    <w:p>
+      <w:pPr>
+        <w:pStyle w:val="BodyText"/>
+      </w:pPr>
+      <m:oMathPara>
+        <m:oMathParaPr>
+          <m:jc m:val="center"/>
+        </m:oMathParaPr>
+        <m:oMath>
+          <m:r>
+            <m:rPr>
+              <m:sty m:val="p"/>
+            </m:rPr>
+            <m:t>Var</m:t>
+          </m:r>
+          <m:r>
+            <m:t>​</m:t>
+          </m:r>
+          <m:d>
+            <m:dPr>
+              <m:begChr m:val="("/>
+              <m:sepChr m:val=""/>
+              <m:endChr m:val=")"/>
+              <m:grow/>
+            </m:dPr>
+            <m:e>
+              <m:r>
+                <m:t>X</m:t>
+              </m:r>
+            </m:e>
+          </m:d>
+          <m:r>
+            <m:t>​</m:t>
+          </m:r>
+          <m:r>
+            <m:rPr>
+              <m:sty m:val="p"/>
+            </m:rPr>
+            <m:t>=</m:t>
+          </m:r>
+          <m:r>
+            <m:rPr>
+              <m:sty m:val="p"/>
+            </m:rPr>
+            <m:t>E</m:t>
+          </m:r>
+          <m:r>
+            <m:t>​</m:t>
+          </m:r>
+          <m:d>
+            <m:dPr>
+              <m:begChr m:val="["/>
+              <m:sepChr m:val=""/>
+              <m:endChr m:val="]"/>
+              <m:grow/>
+            </m:dPr>
+            <m:e>
+              <m:r>
+                <m:t>​</m:t>
+              </m:r>
+              <m:d>
+                <m:dPr>
+                  <m:begChr m:val="("/>
+                  <m:sepChr m:val=""/>
+                  <m:endChr m:val=")"/>
+                  <m:grow/>
+                </m:dPr>
+                <m:e>
+                  <m:r>
+                    <m:t>X</m:t>
+                  </m:r>
+                  <m:r>
+                    <m:rPr>
+                      <m:sty m:val="p"/>
+                    </m:rPr>
+                    <m:t>−</m:t>
+                  </m:r>
+                  <m:r>
+                    <m:rPr>
+                      <m:sty m:val="p"/>
+                    </m:rPr>
+                    <m:t>E</m:t>
+                  </m:r>
+                  <m:r>
+                    <m:t>​</m:t>
+                  </m:r>
+                  <m:d>
+                    <m:dPr>
+                      <m:begChr m:val="["/>
+                      <m:sepChr m:val=""/>
+                      <m:endChr m:val="]"/>
+                      <m:grow/>
+                    </m:dPr>
+                    <m:e>
+                      <m:r>
+                        <m:t>X</m:t>
+                      </m:r>
+                    </m:e>
+                  </m:d>
+                  <m:r>
+                    <m:t>​</m:t>
+                  </m:r>
+                </m:e>
+              </m:d>
+              <m:sSup>
+                <m:e>
+                  <m:r>
+                    <m:t>​</m:t>
+                  </m:r>
+                </m:e>
+                <m:sup>
+                  <m:r>
+                    <m:t>2</m:t>
+                  </m:r>
+                </m:sup>
+              </m:sSup>
+            </m:e>
+          </m:d>
+          <m:r>
+            <m:t>​</m:t>
+          </m:r>
+          <m:r>
+            <m:rPr>
+              <m:sty m:val="p"/>
+            </m:rPr>
+            <m:t>.</m:t>
+          </m:r>
+        </m:oMath>
+      </m:oMathPara>
+    </w:p>
+    <w:p>
+      <w:pPr>
+        <w:pStyle w:val="FirstParagraph"/>
+      </w:pPr>
+      <w:r>
+        <w:t xml:space="preserve">In words, it is the population mean of the squared deviation of</w:t>
+      </w:r>
+      <w:r>
+        <w:t xml:space="preserve"> </w:t>
+      </w:r>
+      <m:oMath>
+        <m:r>
+          <m:t>X</m:t>
+        </m:r>
+      </m:oMath>
+      <w:r>
+        <w:t xml:space="preserve"> </w:t>
+      </w:r>
+      <w:r>
+        <w:t xml:space="preserve">from its population mean.</w:t>
+      </w:r>
+    </w:p>
+    <w:bookmarkEnd w:id="33"/>
+    <w:bookmarkStart w:id="34" w:name="exm-not-expression-and-prose"/>
+    <w:p>
+      <w:pPr>
+        <w:pStyle w:val="BodyText"/>
+      </w:pPr>
+      <w:r>
+        <w:rPr>
+          <w:b/>
+          <w:bCs/>
+        </w:rPr>
+        <w:t xml:space="preserve">Example 13 (A definition that gives only one of the two)</w:t>
+      </w:r>
+      <w:r>
+        <w:t xml:space="preserve"> </w:t>
+      </w:r>
+      <w:r>
+        <w:t xml:space="preserve">“The variance is how spread out</w:t>
+      </w:r>
+      <w:r>
+        <w:t xml:space="preserve"> </w:t>
+      </w:r>
+      <m:oMath>
+        <m:r>
+          <m:t>X</m:t>
+        </m:r>
+      </m:oMath>
+      <w:r>
+        <w:t xml:space="preserve"> </w:t>
+      </w:r>
+      <w:r>
+        <w:t xml:space="preserve">is”</w:t>
+      </w:r>
+      <w:r>
+        <w:t xml:space="preserve"> </w:t>
+      </w:r>
+      <w:r>
+        <w:t xml:space="preserve">gives no expression, so a reader cannot compute it.</w:t>
+      </w:r>
+      <w:r>
+        <w:t xml:space="preserve"> </w:t>
+      </w:r>
+      <w:r>
+        <w:t xml:space="preserve">“The variance is</w:t>
+      </w:r>
+      <w:r>
+        <w:t xml:space="preserve"> </w:t>
+      </w:r>
+      <m:oMath>
+        <m:r>
+          <m:rPr>
+            <m:sty m:val="p"/>
+          </m:rPr>
+          <m:t>E</m:t>
+        </m:r>
+        <m:r>
+          <m:t>​</m:t>
+        </m:r>
+        <m:d>
+          <m:dPr>
+            <m:begChr m:val="["/>
+            <m:sepChr m:val=""/>
+            <m:endChr m:val="]"/>
+            <m:grow/>
+          </m:dPr>
+          <m:e>
+            <m:r>
+              <m:t>​</m:t>
+            </m:r>
+            <m:d>
+              <m:dPr>
+                <m:begChr m:val="("/>
+                <m:sepChr m:val=""/>
+                <m:endChr m:val=")"/>
+                <m:grow/>
+              </m:dPr>
+              <m:e>
+                <m:r>
+                  <m:t>X</m:t>
+                </m:r>
+                <m:r>
+                  <m:rPr>
+                    <m:sty m:val="p"/>
+                  </m:rPr>
+                  <m:t>−</m:t>
+                </m:r>
+                <m:r>
+                  <m:rPr>
+                    <m:sty m:val="p"/>
+                  </m:rPr>
+                  <m:t>E</m:t>
+                </m:r>
+                <m:r>
+                  <m:t>​</m:t>
+                </m:r>
+                <m:d>
+                  <m:dPr>
+                    <m:begChr m:val="["/>
+                    <m:sepChr m:val=""/>
+                    <m:endChr m:val="]"/>
+                    <m:grow/>
+                  </m:dPr>
+                  <m:e>
+                    <m:r>
+                      <m:t>X</m:t>
+                    </m:r>
+                  </m:e>
+                </m:d>
+                <m:r>
+                  <m:t>​</m:t>
+                </m:r>
+              </m:e>
+            </m:d>
+            <m:sSup>
+              <m:e>
+                <m:r>
+                  <m:t>​</m:t>
+                </m:r>
+              </m:e>
+              <m:sup>
+                <m:r>
+                  <m:t>2</m:t>
+                </m:r>
+              </m:sup>
+            </m:sSup>
+          </m:e>
+        </m:d>
+        <m:r>
+          <m:t>​</m:t>
+        </m:r>
+      </m:oMath>
+      <w:r>
+        <w:t xml:space="preserve">”</w:t>
+      </w:r>
+      <w:r>
+        <w:t xml:space="preserve"> </w:t>
+      </w:r>
+      <w:r>
+        <w:t xml:space="preserve">gives no reading, so a reader cannot check their understanding.</w:t>
+      </w:r>
+      <w:r>
+        <w:t xml:space="preserve"> </w:t>
+      </w:r>
+      <w:hyperlink w:anchor="def-variance-expression-and-prose">
+        <w:r>
+          <w:rPr>
+            <w:rStyle w:val="Hyperlink"/>
+          </w:rPr>
+          <w:t xml:space="preserve">Definition 6</w:t>
+        </w:r>
+      </w:hyperlink>
+      <w:r>
+        <w:t xml:space="preserve"> </w:t>
+      </w:r>
+      <w:r>
+        <w:t xml:space="preserve">gives both.</w:t>
+      </w:r>
+    </w:p>
+    <w:bookmarkEnd w:id="34"/>
+    <w:bookmarkEnd w:id="35"/>
+    <w:bookmarkStart w:id="36" w:name="why-examples-matter"/>
+    <w:p>
+      <w:pPr>
+        <w:pStyle w:val="Heading2"/>
+      </w:pPr>
+      <w:r>
+        <w:t xml:space="preserve">5 Why examples matter</w:t>
       </w:r>
     </w:p>
     <w:p>
@@ -8668,14 +9206,14 @@
         <w:t xml:space="preserve">which is where readers most often misapply it.</w:t>
       </w:r>
     </w:p>
-    <w:bookmarkEnd w:id="31"/>
-    <w:bookmarkStart w:id="32" w:name="common-pitfalls-to-avoid"/>
+    <w:bookmarkEnd w:id="36"/>
+    <w:bookmarkStart w:id="37" w:name="common-pitfalls-to-avoid"/>
     <w:p>
       <w:pPr>
         <w:pStyle w:val="Heading2"/>
       </w:pPr>
       <w:r>
-        <w:t xml:space="preserve">5 Common pitfalls to avoid</w:t>
+        <w:t xml:space="preserve">6 Common pitfalls to avoid</w:t>
       </w:r>
     </w:p>
     <w:p>
@@ -8923,14 +9461,14 @@
         <w:t xml:space="preserve">of the definition they are meant to demonstrate.</w:t>
       </w:r>
     </w:p>
-    <w:bookmarkEnd w:id="32"/>
-    <w:bookmarkStart w:id="40" w:name="mathematical-statements-require-examples"/>
+    <w:bookmarkEnd w:id="37"/>
+    <w:bookmarkStart w:id="45" w:name="mathematical-statements-require-examples"/>
     <w:p>
       <w:pPr>
         <w:pStyle w:val="Heading2"/>
       </w:pPr>
       <w:r>
-        <w:t xml:space="preserve">6 Mathematical statements require examples</w:t>
+        <w:t xml:space="preserve">7 Mathematical statements require examples</w:t>
       </w:r>
     </w:p>
     <w:p>
@@ -8977,13 +9515,13 @@
         <w:t xml:space="preserve">when readers can see concrete instances.</w:t>
       </w:r>
     </w:p>
-    <w:bookmarkStart w:id="34" w:name="using-theorem-environments-in-quarto"/>
+    <w:bookmarkStart w:id="39" w:name="using-theorem-environments-in-quarto"/>
     <w:p>
       <w:pPr>
         <w:pStyle w:val="Heading3"/>
       </w:pPr>
       <w:r>
-        <w:t xml:space="preserve">6.1 Using theorem environments in Quarto</w:t>
+        <w:t xml:space="preserve">7.1 Using theorem environments in Quarto</w:t>
       </w:r>
     </w:p>
     <w:p>
@@ -9270,7 +9808,7 @@
       <w:r>
         <w:t xml:space="preserve"> </w:t>
       </w:r>
-      <w:hyperlink r:id="rId33">
+      <w:hyperlink r:id="rId38">
         <w:r>
           <w:rPr>
             <w:rStyle w:val="Hyperlink"/>
@@ -9397,17 +9935,17 @@
         <w:t xml:space="preserve">.</w:t>
       </w:r>
     </w:p>
-    <w:bookmarkEnd w:id="34"/>
-    <w:bookmarkStart w:id="39" w:name="example-pythagorean-theorem"/>
+    <w:bookmarkEnd w:id="39"/>
+    <w:bookmarkStart w:id="44" w:name="example-pythagorean-theorem"/>
     <w:p>
       <w:pPr>
         <w:pStyle w:val="Heading3"/>
       </w:pPr>
       <w:r>
-        <w:t xml:space="preserve">6.2 Example: Pythagorean theorem</w:t>
-      </w:r>
-    </w:p>
-    <w:bookmarkStart w:id="35" w:name="thm-pythagoras"/>
+        <w:t xml:space="preserve">7.2 Example: Pythagorean theorem</w:t>
+      </w:r>
+    </w:p>
+    <w:bookmarkStart w:id="40" w:name="thm-pythagoras"/>
     <w:p>
       <w:pPr>
         <w:pStyle w:val="FirstParagraph"/>
@@ -9498,8 +10036,8 @@
         </m:oMath>
       </m:oMathPara>
     </w:p>
-    <w:bookmarkEnd w:id="35"/>
-    <w:bookmarkStart w:id="36" w:name="exm-pythagoras"/>
+    <w:bookmarkEnd w:id="40"/>
+    <w:bookmarkStart w:id="41" w:name="exm-pythagoras"/>
     <w:p>
       <w:pPr>
         <w:pStyle w:val="FirstParagraph"/>
@@ -9509,7 +10047,7 @@
           <w:b/>
           <w:bCs/>
         </w:rPr>
-        <w:t xml:space="preserve">Example 13 (Pythagorean theorem example)</w:t>
+        <w:t xml:space="preserve">Example 14 (Pythagorean theorem example)</w:t>
       </w:r>
       <w:r>
         <w:t xml:space="preserve"> </w:t>
@@ -9628,8 +10166,8 @@
         </m:oMath>
       </m:oMathPara>
     </w:p>
-    <w:bookmarkEnd w:id="36"/>
-    <w:bookmarkStart w:id="37" w:name="def-postulate"/>
+    <w:bookmarkEnd w:id="41"/>
+    <w:bookmarkStart w:id="42" w:name="def-postulate"/>
     <w:p>
       <w:pPr>
         <w:pStyle w:val="FirstParagraph"/>
@@ -9639,7 +10177,7 @@
           <w:b/>
           <w:bCs/>
         </w:rPr>
-        <w:t xml:space="preserve">Definition 6 (Postulate (axiom))</w:t>
+        <w:t xml:space="preserve">Definition 7 (Postulate (axiom))</w:t>
       </w:r>
       <w:r>
         <w:t xml:space="preserve"> </w:t>
@@ -9683,8 +10221,8 @@
         <w:t xml:space="preserve">serving as a starting point for further reasoning.</w:t>
       </w:r>
     </w:p>
-    <w:bookmarkEnd w:id="37"/>
-    <w:bookmarkStart w:id="38" w:name="exm-parallel-postulate"/>
+    <w:bookmarkEnd w:id="42"/>
+    <w:bookmarkStart w:id="43" w:name="exm-parallel-postulate"/>
     <w:p>
       <w:pPr>
         <w:pStyle w:val="BodyText"/>
@@ -9694,7 +10232,7 @@
           <w:b/>
           <w:bCs/>
         </w:rPr>
-        <w:t xml:space="preserve">Example 14 (Euclid’s parallel postulate)</w:t>
+        <w:t xml:space="preserve">Example 15 (Euclid’s parallel postulate)</w:t>
       </w:r>
       <w:r>
         <w:t xml:space="preserve"> </w:t>
@@ -9787,16 +10325,16 @@
         <w:t xml:space="preserve">.</w:t>
       </w:r>
     </w:p>
-    <w:bookmarkEnd w:id="38"/>
-    <w:bookmarkEnd w:id="39"/>
-    <w:bookmarkEnd w:id="40"/>
-    <w:bookmarkStart w:id="48" w:name="Xe6c88c177e563d1f046037569009a36fd08f4bd"/>
+    <w:bookmarkEnd w:id="43"/>
+    <w:bookmarkEnd w:id="44"/>
+    <w:bookmarkEnd w:id="45"/>
+    <w:bookmarkStart w:id="53" w:name="Xe6c88c177e563d1f046037569009a36fd08f4bd"/>
     <w:p>
       <w:pPr>
         <w:pStyle w:val="Heading2"/>
       </w:pPr>
       <w:r>
-        <w:t xml:space="preserve">7 Presenting a derivation: exercise, solution, theorem, proof</w:t>
+        <w:t xml:space="preserve">8 Presenting a derivation: exercise, solution, theorem, proof</w:t>
       </w:r>
     </w:p>
     <w:p>
@@ -10053,7 +10591,7 @@
       <w:r>
         <w:t xml:space="preserve"> </w:t>
       </w:r>
-      <w:hyperlink r:id="rId41">
+      <w:hyperlink r:id="rId46">
         <w:r>
           <w:rPr>
             <w:rStyle w:val="Hyperlink"/>
@@ -10304,7 +10842,7 @@
         <w:t xml:space="preserve">is an ordinary step, not the pattern to avoid.</w:t>
       </w:r>
     </w:p>
-    <w:bookmarkStart w:id="42" w:name="def-sample-mean"/>
+    <w:bookmarkStart w:id="47" w:name="def-sample-mean"/>
     <w:p>
       <w:pPr>
         <w:pStyle w:val="FirstParagraph"/>
@@ -10314,7 +10852,7 @@
           <w:b/>
           <w:bCs/>
         </w:rPr>
-        <w:t xml:space="preserve">Definition 7 (Sample mean)</w:t>
+        <w:t xml:space="preserve">Definition 8 (Sample mean)</w:t>
       </w:r>
       <w:r>
         <w:t xml:space="preserve"> </w:t>
@@ -10489,8 +11027,8 @@
         </m:oMath>
       </m:oMathPara>
     </w:p>
-    <w:bookmarkEnd w:id="42"/>
-    <w:bookmarkStart w:id="43" w:name="exr-sum-deviations"/>
+    <w:bookmarkEnd w:id="47"/>
+    <w:bookmarkStart w:id="48" w:name="exr-sum-deviations"/>
     <w:p>
       <w:pPr>
         <w:pStyle w:val="FirstParagraph"/>
@@ -10638,15 +11176,15 @@
           <w:rPr>
             <w:rStyle w:val="Hyperlink"/>
           </w:rPr>
-          <w:t xml:space="preserve">Definition 7</w:t>
+          <w:t xml:space="preserve">Definition 8</w:t>
         </w:r>
       </w:hyperlink>
       <w:r>
         <w:t xml:space="preserve">).</w:t>
       </w:r>
     </w:p>
-    <w:bookmarkEnd w:id="43"/>
-    <w:bookmarkStart w:id="44" w:name="sol-sum-deviations"/>
+    <w:bookmarkEnd w:id="48"/>
+    <w:bookmarkStart w:id="49" w:name="sol-sum-deviations"/>
     <w:p>
       <w:pPr>
         <w:pStyle w:val="BodyText"/>
@@ -11097,8 +11635,8 @@
         </m:oMath>
       </m:oMathPara>
     </w:p>
-    <w:bookmarkEnd w:id="44"/>
-    <w:bookmarkStart w:id="45" w:name="thm-sum-deviations"/>
+    <w:bookmarkEnd w:id="49"/>
+    <w:bookmarkStart w:id="50" w:name="thm-sum-deviations"/>
     <w:p>
       <w:pPr>
         <w:pStyle w:val="FirstParagraph"/>
@@ -11195,7 +11733,7 @@
           <w:rPr>
             <w:rStyle w:val="Hyperlink"/>
           </w:rPr>
-          <w:t xml:space="preserve">Definition 7</w:t>
+          <w:t xml:space="preserve">Definition 8</w:t>
         </w:r>
       </w:hyperlink>
       <w:r>
@@ -11304,7 +11842,7 @@
         </m:oMath>
       </m:oMathPara>
     </w:p>
-    <w:bookmarkEnd w:id="45"/>
+    <w:bookmarkEnd w:id="50"/>
     <w:p>
       <w:pPr>
         <w:pStyle w:val="FirstParagraph"/>
@@ -11334,7 +11872,7 @@
         <w:t xml:space="preserve">derives this result.</w:t>
       </w:r>
     </w:p>
-    <w:bookmarkStart w:id="46" w:name="exm-derivation-direction"/>
+    <w:bookmarkStart w:id="51" w:name="exm-derivation-direction"/>
     <w:p>
       <w:pPr>
         <w:pStyle w:val="BodyText"/>
@@ -11344,7 +11882,7 @@
           <w:b/>
           <w:bCs/>
         </w:rPr>
-        <w:t xml:space="preserve">Example 15 (Deriving an equality from the side that simplifies)</w:t>
+        <w:t xml:space="preserve">Example 16 (Deriving an equality from the side that simplifies)</w:t>
       </w:r>
       <w:r>
         <w:t xml:space="preserve"> </w:t>
@@ -12398,7 +12936,7 @@
       <w:r>
         <w:t xml:space="preserve"> </w:t>
       </w:r>
-      <w:hyperlink r:id="rId41">
+      <w:hyperlink r:id="rId46">
         <w:r>
           <w:rPr>
             <w:rStyle w:val="Hyperlink"/>
@@ -12410,8 +12948,8 @@
         <w:t xml:space="preserve">).</w:t>
       </w:r>
     </w:p>
-    <w:bookmarkEnd w:id="46"/>
-    <w:bookmarkStart w:id="47" w:name="exm-one-result-per-theorem"/>
+    <w:bookmarkEnd w:id="51"/>
+    <w:bookmarkStart w:id="52" w:name="exm-one-result-per-theorem"/>
     <w:p>
       <w:pPr>
         <w:pStyle w:val="BodyText"/>
@@ -12421,7 +12959,7 @@
           <w:b/>
           <w:bCs/>
         </w:rPr>
-        <w:t xml:space="preserve">Example 16 (Splitting a theorem that states two results)</w:t>
+        <w:t xml:space="preserve">Example 17 (Splitting a theorem that states two results)</w:t>
       </w:r>
       <w:r>
         <w:t xml:space="preserve"> </w:t>
@@ -12895,8 +13433,8 @@
         <w:t xml:space="preserve">and a later step that uses only the first can cite only the first.</w:t>
       </w:r>
     </w:p>
-    <w:bookmarkEnd w:id="47"/>
-    <w:bookmarkEnd w:id="48"/>
+    <w:bookmarkEnd w:id="52"/>
+    <w:bookmarkEnd w:id="53"/>
     <w:sectPr>
       <w:footnotePr>
         <w:numRestart w:val="eachSect"/>

</xml_diff>

<commit_message>
Deploying to gh-pages from @ Morrison-Lab/psw@ef6d56a076932e313aa6ccaad868898d71bbae1a 🚀
</commit_message>
<xml_diff>
--- a/chapters/defining-terms.docx
+++ b/chapters/defining-terms.docx
@@ -15,7 +15,7 @@
         <w:pStyle w:val="Date"/>
       </w:pPr>
       <w:r>
-        <w:t xml:space="preserve">Last modified: 2026-10-22 16:04:26 (PDT)</w:t>
+        <w:t xml:space="preserve">Last modified: 2026-10-22 20:23:53 (PDT)</w:t>
       </w:r>
     </w:p>
     <w:p>
@@ -5524,7 +5524,7 @@
           <w:b/>
           <w:bCs/>
         </w:rPr>
-        <w:t xml:space="preserve">Say</w:t>
+        <w:t xml:space="preserve">Use</w:t>
       </w:r>
       <w:r>
         <w:rPr>
@@ -5538,53 +5538,87 @@
           <w:b/>
           <w:bCs/>
         </w:rPr>
-        <w:t xml:space="preserve">“fitted model”</w:t>
+        <w:t xml:space="preserve">“prediction rule”</w:t>
       </w:r>
       <w:r>
         <w:rPr>
           <w:b/>
           <w:bCs/>
         </w:rPr>
-        <w:t xml:space="preserve">, not</w:t>
+        <w:t xml:space="preserve"> </w:t>
       </w:r>
       <w:r>
         <w:rPr>
           <w:b/>
           <w:bCs/>
         </w:rPr>
-        <w:t xml:space="preserve"> </w:t>
-      </w:r>
-      <w:r>
-        <w:rPr>
-          <w:b/>
-          <w:bCs/>
-        </w:rPr>
+        <w:t xml:space="preserve">only for a fitted model in its role as a predictor:</w:t>
+      </w:r>
+      <w:r>
+        <w:t xml:space="preserve"> </w:t>
+      </w:r>
+      <w:r>
+        <w:t xml:space="preserve">Not every fitted model is used to predict outcomes,</w:t>
+      </w:r>
+      <w:r>
+        <w:t xml:space="preserve"> </w:t>
+      </w:r>
+      <w:r>
+        <w:t xml:space="preserve">so</w:t>
+      </w:r>
+      <w:r>
+        <w:t xml:space="preserve"> </w:t>
+      </w:r>
+      <w:r>
         <w:t xml:space="preserve">“prediction rule”</w:t>
       </w:r>
       <w:r>
-        <w:rPr>
-          <w:b/>
-          <w:bCs/>
-        </w:rPr>
-        <w:t xml:space="preserve">:</w:t>
-      </w:r>
-      <w:r>
-        <w:t xml:space="preserve"> </w:t>
-      </w:r>
-      <w:r>
-        <w:t xml:space="preserve">A fitted model that is used to predict outcomes is still a fitted model,</w:t>
-      </w:r>
-      <w:r>
-        <w:t xml:space="preserve"> </w:t>
-      </w:r>
-      <w:r>
-        <w:t xml:space="preserve">and a second name for one object makes readers wonder whether there are two objects,</w:t>
-      </w:r>
-      <w:r>
-        <w:t xml:space="preserve"> </w:t>
-      </w:r>
-      <w:r>
-        <w:t xml:space="preserve">so call it a fitted model every time.</w:t>
+        <w:t xml:space="preserve"> </w:t>
+      </w:r>
+      <w:r>
+        <w:t xml:space="preserve">is a narrower term, not another name for</w:t>
+      </w:r>
+      <w:r>
+        <w:t xml:space="preserve"> </w:t>
+      </w:r>
+      <w:r>
+        <w:t xml:space="preserve">“fitted model”</w:t>
+      </w:r>
+      <w:r>
+        <w:t xml:space="preserve">.</w:t>
+      </w:r>
+      <w:r>
+        <w:t xml:space="preserve"> </w:t>
+      </w:r>
+      <w:r>
+        <w:t xml:space="preserve">Define it in its own</w:t>
+      </w:r>
+      <w:r>
+        <w:t xml:space="preserve"> </w:t>
+      </w:r>
+      <w:r>
+        <w:rPr>
+          <w:rStyle w:val="VerbatimChar"/>
+        </w:rPr>
+        <w:t xml:space="preserve">#def-prediction-rule</w:t>
+      </w:r>
+      <w:r>
+        <w:t xml:space="preserve"> </w:t>
+      </w:r>
+      <w:r>
+        <w:t xml:space="preserve">div</w:t>
+      </w:r>
+      <w:r>
+        <w:t xml:space="preserve"> </w:t>
+      </w:r>
+      <w:r>
+        <w:t xml:space="preserve">as a fitted model that is used to predict outcomes at a new covariate value,</w:t>
+      </w:r>
+      <w:r>
+        <w:t xml:space="preserve"> </w:t>
+      </w:r>
+      <w:r>
+        <w:t xml:space="preserve">and link it to that definition at its first use.</w:t>
       </w:r>
       <w:r>
         <w:t xml:space="preserve"> </w:t>
@@ -5596,6 +5630,60 @@
         <w:t xml:space="preserve"> </w:t>
       </w:r>
       <w:r>
+        <w:t xml:space="preserve">“the fitted model”</w:t>
+      </w:r>
+      <w:r>
+        <w:t xml:space="preserve"> </w:t>
+      </w:r>
+      <w:r>
+        <w:t xml:space="preserve">for a sentence about the model itself,</w:t>
+      </w:r>
+      <w:r>
+        <w:t xml:space="preserve"> </w:t>
+      </w:r>
+      <w:r>
+        <w:t xml:space="preserve">such as its form, its coefficients or its fit to the training set.</w:t>
+      </w:r>
+      <w:r>
+        <w:t xml:space="preserve"> </w:t>
+      </w:r>
+      <w:r>
+        <w:t xml:space="preserve">Write</w:t>
+      </w:r>
+      <w:r>
+        <w:t xml:space="preserve"> </w:t>
+      </w:r>
+      <w:r>
+        <w:t xml:space="preserve">“the prediction rule”</w:t>
+      </w:r>
+      <w:r>
+        <w:t xml:space="preserve"> </w:t>
+      </w:r>
+      <w:r>
+        <w:t xml:space="preserve">only where the sentence needs the role of predicting a new outcome</w:t>
+      </w:r>
+      <w:r>
+        <w:t xml:space="preserve"> </w:t>
+      </w:r>
+      <w:r>
+        <w:t xml:space="preserve">to tell it from other uses of the fitted model.</w:t>
+      </w:r>
+      <w:r>
+        <w:t xml:space="preserve"> </w:t>
+      </w:r>
+      <w:r>
+        <w:t xml:space="preserve">The verb does not change the term:</w:t>
+      </w:r>
+      <w:r>
+        <w:t xml:space="preserve"> </w:t>
+      </w:r>
+      <w:r>
+        <w:t xml:space="preserve">keep writing</w:t>
+      </w:r>
+      <w:r>
+        <w:t xml:space="preserve"> </w:t>
+      </w:r>
+      <w:r>
         <w:t xml:space="preserve">“the fitted model predicts”</w:t>
       </w:r>
       <w:r>
@@ -5605,13 +5693,46 @@
         <w:t xml:space="preserve"> </w:t>
       </w:r>
       <w:r>
-        <w:t xml:space="preserve">and never</w:t>
-      </w:r>
-      <w:r>
-        <w:t xml:space="preserve"> </w:t>
-      </w:r>
-      <w:r>
-        <w:t xml:space="preserve">“the prediction rule predicts”</w:t>
+        <w:t xml:space="preserve">as the bullet above requires.</w:t>
+      </w:r>
+      <w:r>
+        <w:t xml:space="preserve"> </w:t>
+      </w:r>
+      <w:r>
+        <w:t xml:space="preserve">For example, write</w:t>
+      </w:r>
+      <w:r>
+        <w:t xml:space="preserve"> </w:t>
+      </w:r>
+      <w:r>
+        <w:t xml:space="preserve">“the fitted model has slope 2”</w:t>
+      </w:r>
+      <w:r>
+        <w:t xml:space="preserve"> </w:t>
+      </w:r>
+      <w:r>
+        <w:t xml:space="preserve">and</w:t>
+      </w:r>
+      <w:r>
+        <w:t xml:space="preserve"> </w:t>
+      </w:r>
+      <w:r>
+        <w:t xml:space="preserve">“a clinic uses the prediction rule for new patients”</w:t>
+      </w:r>
+      <w:r>
+        <w:t xml:space="preserve">,</w:t>
+      </w:r>
+      <w:r>
+        <w:t xml:space="preserve"> </w:t>
+      </w:r>
+      <w:r>
+        <w:t xml:space="preserve">and not</w:t>
+      </w:r>
+      <w:r>
+        <w:t xml:space="preserve"> </w:t>
+      </w:r>
+      <w:r>
+        <w:t xml:space="preserve">“the prediction rule has slope 2”</w:t>
       </w:r>
       <w:r>
         <w:t xml:space="preserve">.</w:t>
@@ -5620,7 +5741,7 @@
         <w:t xml:space="preserve"> </w:t>
       </w:r>
       <w:r>
-        <w:t xml:space="preserve">When a set of notes defines the fitted model,</w:t>
+        <w:t xml:space="preserve">If the notes once defined</w:t>
       </w:r>
       <w:r>
         <w:t xml:space="preserve"> </w:t>
@@ -5632,37 +5753,13 @@
         <w:t xml:space="preserve"> </w:t>
       </w:r>
       <w:r>
-        <w:t xml:space="preserve">belongs only in that definition, as an alias in bold and in the div title,</w:t>
-      </w:r>
-      <w:r>
-        <w:t xml:space="preserve"> </w:t>
-      </w:r>
-      <w:r>
-        <w:t xml:space="preserve">so that a reader who meets the alias elsewhere can find its meaning.</w:t>
-      </w:r>
-      <w:r>
-        <w:t xml:space="preserve"> </w:t>
-      </w:r>
-      <w:r>
-        <w:t xml:space="preserve">If the notes once defined</w:t>
-      </w:r>
-      <w:r>
-        <w:t xml:space="preserve"> </w:t>
-      </w:r>
-      <w:r>
-        <w:t xml:space="preserve">“prediction rule”</w:t>
-      </w:r>
-      <w:r>
-        <w:t xml:space="preserve"> </w:t>
-      </w:r>
-      <w:r>
-        <w:t xml:space="preserve">under its own anchor,</w:t>
-      </w:r>
-      <w:r>
-        <w:t xml:space="preserve"> </w:t>
-      </w:r>
-      <w:r>
-        <w:t xml:space="preserve">keep the old anchor as a span on the alias,</w:t>
+        <w:t xml:space="preserve">as a span inside the fitted model’s definition,</w:t>
+      </w:r>
+      <w:r>
+        <w:t xml:space="preserve"> </w:t>
+      </w:r>
+      <w:r>
+        <w:t xml:space="preserve">keep that anchor on the new div,</w:t>
       </w:r>
       <w:r>
         <w:t xml:space="preserve"> </w:t>

</xml_diff>

<commit_message>
Deploying to gh-pages from @ Morrison-Lab/psw@6d1274b045e12bd4f680e33af35354f4e3d2c9a1 🚀
</commit_message>
<xml_diff>
--- a/chapters/defining-terms.docx
+++ b/chapters/defining-terms.docx
@@ -15,7 +15,7 @@
         <w:pStyle w:val="Date"/>
       </w:pPr>
       <w:r>
-        <w:t xml:space="preserve">Last modified: 2026-10-22 20:23:53 (PDT)</w:t>
+        <w:t xml:space="preserve">Last modified: 2026-10-23 00:08:24 (PDT)</w:t>
       </w:r>
     </w:p>
     <w:p>
@@ -11483,7 +11483,7 @@
                   <m:nor/>
                   <m:sty m:val="p"/>
                 </m:rPr>
-                <m:t>(split the sum)</m:t>
+                <m:t>(distribute the sum over the terms)</m:t>
               </m:r>
             </m:e>
             <m:e>

</xml_diff>

<commit_message>
Deploying to gh-pages from @ Morrison-Lab/psw@5f05ceb04bcb69739c3442adc1d397adf1225121 🚀
</commit_message>
<xml_diff>
--- a/chapters/defining-terms.docx
+++ b/chapters/defining-terms.docx
@@ -15,7 +15,7 @@
         <w:pStyle w:val="Date"/>
       </w:pPr>
       <w:r>
-        <w:t xml:space="preserve">Last modified: 2026-10-23 00:08:24 (PDT)</w:t>
+        <w:t xml:space="preserve">Last modified: 2026-10-23 00:13:07 (PDT)</w:t>
       </w:r>
     </w:p>
     <w:p>
@@ -1508,6 +1508,327 @@
       </w:r>
       <w:r>
         <w:t xml:space="preserve">and hides that the model is a statement about the outcome’s distribution.</w:t>
+      </w:r>
+    </w:p>
+    <w:p>
+      <w:pPr>
+        <w:numPr>
+          <w:ilvl w:val="0"/>
+          <w:numId w:val="1001"/>
+        </w:numPr>
+      </w:pPr>
+      <w:r>
+        <w:rPr>
+          <w:b/>
+          <w:bCs/>
+        </w:rPr>
+        <w:t xml:space="preserve">Define a new symbol by its most direct, literal meaning, and derive its other forms:</w:t>
+      </w:r>
+      <w:r>
+        <w:t xml:space="preserve"> </w:t>
+      </w:r>
+      <w:r>
+        <w:t xml:space="preserve">Define a shorthand symbol directly from the objects it summarizes,</w:t>
+      </w:r>
+      <w:r>
+        <w:t xml:space="preserve"> </w:t>
+      </w:r>
+      <w:r>
+        <w:t xml:space="preserve">then prove any equivalent form as a result.</w:t>
+      </w:r>
+      <w:r>
+        <w:t xml:space="preserve"> </w:t>
+      </w:r>
+      <w:r>
+        <w:t xml:space="preserve">For example, with deviations</w:t>
+      </w:r>
+      <w:r>
+        <w:t xml:space="preserve"> </w:t>
+      </w:r>
+      <m:oMath>
+        <m:sSub>
+          <m:e>
+            <m:r>
+              <m:t>δ</m:t>
+            </m:r>
+          </m:e>
+          <m:sub>
+            <m:r>
+              <m:t>i</m:t>
+            </m:r>
+          </m:sub>
+        </m:sSub>
+        <m:box>
+          <m:boxPr>
+            <m:opEmu m:val="on"/>
+          </m:boxPr>
+          <m:e>
+            <m:r>
+              <m:rPr>
+                <m:sty m:val="p"/>
+              </m:rPr>
+              <m:t>:=</m:t>
+            </m:r>
+          </m:e>
+        </m:box>
+        <m:sSub>
+          <m:e>
+            <m:r>
+              <m:t>y</m:t>
+            </m:r>
+          </m:e>
+          <m:sub>
+            <m:r>
+              <m:t>i</m:t>
+            </m:r>
+          </m:sub>
+        </m:sSub>
+        <m:r>
+          <m:rPr>
+            <m:sty m:val="p"/>
+          </m:rPr>
+          <m:t>−</m:t>
+        </m:r>
+        <m:r>
+          <m:t>μ</m:t>
+        </m:r>
+      </m:oMath>
+      <w:r>
+        <w:t xml:space="preserve"> </w:t>
+      </w:r>
+      <w:r>
+        <w:t xml:space="preserve">from the population mean</w:t>
+      </w:r>
+      <w:r>
+        <w:t xml:space="preserve"> </w:t>
+      </w:r>
+      <m:oMath>
+        <m:r>
+          <m:t>μ</m:t>
+        </m:r>
+      </m:oMath>
+      <w:r>
+        <w:t xml:space="preserve">,</w:t>
+      </w:r>
+      <w:r>
+        <w:t xml:space="preserve"> </w:t>
+      </w:r>
+      <w:r>
+        <w:t xml:space="preserve">define the sample mean of the deviations as</w:t>
+      </w:r>
+    </w:p>
+    <w:p>
+      <w:pPr>
+        <w:pStyle w:val="BodyText"/>
+      </w:pPr>
+      <m:oMathPara>
+        <m:oMathParaPr>
+          <m:jc m:val="center"/>
+        </m:oMathParaPr>
+        <m:oMath>
+          <m:acc>
+            <m:accPr>
+              <m:chr m:val="‾"/>
+            </m:accPr>
+            <m:e>
+              <m:r>
+                <m:t>δ</m:t>
+              </m:r>
+            </m:e>
+          </m:acc>
+          <m:box>
+            <m:boxPr>
+              <m:opEmu m:val="on"/>
+            </m:boxPr>
+            <m:e>
+              <m:r>
+                <m:rPr>
+                  <m:sty m:val="p"/>
+                </m:rPr>
+                <m:t>:=</m:t>
+              </m:r>
+            </m:e>
+          </m:box>
+          <m:f>
+            <m:fPr>
+              <m:type m:val="bar"/>
+            </m:fPr>
+            <m:num>
+              <m:r>
+                <m:t>1</m:t>
+              </m:r>
+            </m:num>
+            <m:den>
+              <m:r>
+                <m:t>n</m:t>
+              </m:r>
+            </m:den>
+          </m:f>
+          <m:nary>
+            <m:naryPr>
+              <m:chr m:val="∑"/>
+              <m:limLoc m:val="undOvr"/>
+              <m:subHide m:val="off"/>
+              <m:supHide m:val="off"/>
+            </m:naryPr>
+            <m:sub>
+              <m:r>
+                <m:t>i</m:t>
+              </m:r>
+              <m:r>
+                <m:rPr>
+                  <m:sty m:val="p"/>
+                </m:rPr>
+                <m:t>=</m:t>
+              </m:r>
+              <m:r>
+                <m:t>1</m:t>
+              </m:r>
+            </m:sub>
+            <m:sup>
+              <m:r>
+                <m:t>n</m:t>
+              </m:r>
+            </m:sup>
+            <m:e>
+              <m:sSub>
+                <m:e>
+                  <m:r>
+                    <m:t>δ</m:t>
+                  </m:r>
+                </m:e>
+                <m:sub>
+                  <m:r>
+                    <m:t>i</m:t>
+                  </m:r>
+                </m:sub>
+              </m:sSub>
+            </m:e>
+          </m:nary>
+          <m:r>
+            <m:rPr>
+              <m:sty m:val="p"/>
+            </m:rPr>
+            <m:t>,</m:t>
+          </m:r>
+        </m:oMath>
+      </m:oMathPara>
+    </w:p>
+    <w:p>
+      <w:pPr>
+        <w:numPr>
+          <w:ilvl w:val="0"/>
+          <w:numId w:val="1000"/>
+        </w:numPr>
+      </w:pPr>
+      <w:r>
+        <w:t xml:space="preserve">then show that</w:t>
+      </w:r>
+      <w:r>
+        <w:t xml:space="preserve"> </w:t>
+      </w:r>
+      <m:oMath>
+        <m:acc>
+          <m:accPr>
+            <m:chr m:val="‾"/>
+          </m:accPr>
+          <m:e>
+            <m:r>
+              <m:t>δ</m:t>
+            </m:r>
+          </m:e>
+        </m:acc>
+        <m:r>
+          <m:rPr>
+            <m:sty m:val="p"/>
+          </m:rPr>
+          <m:t>=</m:t>
+        </m:r>
+        <m:acc>
+          <m:accPr>
+            <m:chr m:val="‾"/>
+          </m:accPr>
+          <m:e>
+            <m:r>
+              <m:t>y</m:t>
+            </m:r>
+          </m:e>
+        </m:acc>
+        <m:r>
+          <m:rPr>
+            <m:sty m:val="p"/>
+          </m:rPr>
+          <m:t>−</m:t>
+        </m:r>
+        <m:r>
+          <m:t>μ</m:t>
+        </m:r>
+      </m:oMath>
+      <w:r>
+        <w:t xml:space="preserve">.</w:t>
+      </w:r>
+      <w:r>
+        <w:t xml:space="preserve"> </w:t>
+      </w:r>
+      <w:r>
+        <w:t xml:space="preserve">Defining</w:t>
+      </w:r>
+      <w:r>
+        <w:t xml:space="preserve"> </w:t>
+      </w:r>
+      <m:oMath>
+        <m:acc>
+          <m:accPr>
+            <m:chr m:val="‾"/>
+          </m:accPr>
+          <m:e>
+            <m:r>
+              <m:t>δ</m:t>
+            </m:r>
+          </m:e>
+        </m:acc>
+      </m:oMath>
+      <w:r>
+        <w:t xml:space="preserve"> </w:t>
+      </w:r>
+      <w:r>
+        <w:t xml:space="preserve">as</w:t>
+      </w:r>
+      <w:r>
+        <w:t xml:space="preserve"> </w:t>
+      </w:r>
+      <m:oMath>
+        <m:acc>
+          <m:accPr>
+            <m:chr m:val="‾"/>
+          </m:accPr>
+          <m:e>
+            <m:r>
+              <m:t>y</m:t>
+            </m:r>
+          </m:e>
+        </m:acc>
+        <m:r>
+          <m:rPr>
+            <m:sty m:val="p"/>
+          </m:rPr>
+          <m:t>−</m:t>
+        </m:r>
+        <m:r>
+          <m:t>μ</m:t>
+        </m:r>
+      </m:oMath>
+      <w:r>
+        <w:t xml:space="preserve"> </w:t>
+      </w:r>
+      <w:r>
+        <w:t xml:space="preserve">states a result in place of the meaning,</w:t>
+      </w:r>
+      <w:r>
+        <w:t xml:space="preserve"> </w:t>
+      </w:r>
+      <w:r>
+        <w:t xml:space="preserve">and hides that the symbol is a mean of the deviations.</w:t>
       </w:r>
     </w:p>
     <w:p>

</xml_diff>

<commit_message>
Deploying to gh-pages from @ Morrison-Lab/psw@d0c81c947733aeb4899712fa54326aea683a219b 🚀
</commit_message>
<xml_diff>
--- a/chapters/defining-terms.docx
+++ b/chapters/defining-terms.docx
@@ -15,7 +15,7 @@
         <w:pStyle w:val="Date"/>
       </w:pPr>
       <w:r>
-        <w:t xml:space="preserve">Last modified: 2026-10-23 13:27:37 (PDT)</w:t>
+        <w:t xml:space="preserve">Last modified: 2026-10-23 16:19:37 (PDT)</w:t>
       </w:r>
     </w:p>
     <w:p>
@@ -4217,13 +4217,19 @@
         <w:t xml:space="preserve"> </w:t>
       </w:r>
       <w:r>
-        <w:t xml:space="preserve">put all of them in the div title, as in</w:t>
-      </w:r>
-      <w:r>
-        <w:t xml:space="preserve"> </w:t>
-      </w:r>
-      <w:r>
-        <w:t xml:space="preserve">“Postulate (axiom)”</w:t>
+        <w:t xml:space="preserve">put all of them in the div title as a comma-separated list,</w:t>
+      </w:r>
+      <w:r>
+        <w:t xml:space="preserve"> </w:t>
+      </w:r>
+      <w:r>
+        <w:t xml:space="preserve">with the primary name first, as in</w:t>
+      </w:r>
+      <w:r>
+        <w:t xml:space="preserve"> </w:t>
+      </w:r>
+      <w:r>
+        <w:t xml:space="preserve">“Postulate, axiom”</w:t>
       </w:r>
       <w:r>
         <w:t xml:space="preserve">,</w:t>
@@ -4238,6 +4244,24 @@
         <w:t xml:space="preserve"> </w:t>
       </w:r>
       <w:r>
+        <w:t xml:space="preserve">Do not use parentheses or a phrase such as</w:t>
+      </w:r>
+      <w:r>
+        <w:t xml:space="preserve"> </w:t>
+      </w:r>
+      <w:r>
+        <w:t xml:space="preserve">“also called”</w:t>
+      </w:r>
+      <w:r>
+        <w:t xml:space="preserve"> </w:t>
+      </w:r>
+      <w:r>
+        <w:t xml:space="preserve">in the title.</w:t>
+      </w:r>
+      <w:r>
+        <w:t xml:space="preserve"> </w:t>
+      </w:r>
+      <w:r>
         <w:t xml:space="preserve">This covers the names other sources use, such as a textbook’s,</w:t>
       </w:r>
       <w:r>
@@ -4256,13 +4280,13 @@
         <w:t xml:space="preserve"> </w:t>
       </w:r>
       <w:r>
-        <w:t xml:space="preserve">“Risk (expected loss, population risk, true risk,</w:t>
-      </w:r>
-      <w:r>
-        <w:t xml:space="preserve"> </w:t>
-      </w:r>
-      <w:r>
-        <w:t xml:space="preserve">generalization error, expected prediction error)”</w:t>
+        <w:t xml:space="preserve">“Risk, expected loss, population risk, true risk,</w:t>
+      </w:r>
+      <w:r>
+        <w:t xml:space="preserve"> </w:t>
+      </w:r>
+      <w:r>
+        <w:t xml:space="preserve">generalization error, expected prediction error”</w:t>
       </w:r>
       <w:r>
         <w:t xml:space="preserve">.</w:t>

</xml_diff>

<commit_message>
Deploying to gh-pages from @ Morrison-Lab/psw@c5092d3d2dbca7ef92245107e7bde1d60fdf553b 🚀
</commit_message>
<xml_diff>
--- a/chapters/defining-terms.docx
+++ b/chapters/defining-terms.docx
@@ -15,7 +15,7 @@
         <w:pStyle w:val="Date"/>
       </w:pPr>
       <w:r>
-        <w:t xml:space="preserve">Last modified: 2026-10-23 16:19:37 (PDT)</w:t>
+        <w:t xml:space="preserve">Last modified: 2026-10-23 16:25:18 (PDT)</w:t>
       </w:r>
     </w:p>
     <w:p>
@@ -4340,6 +4340,173 @@
       </w:hyperlink>
       <w:r>
         <w:t xml:space="preserve">).</w:t>
+      </w:r>
+    </w:p>
+    <w:p>
+      <w:pPr>
+        <w:numPr>
+          <w:ilvl w:val="0"/>
+          <w:numId w:val="1001"/>
+        </w:numPr>
+      </w:pPr>
+      <w:r>
+        <w:rPr>
+          <w:b/>
+          <w:bCs/>
+        </w:rPr>
+        <w:t xml:space="preserve">Tell synonyms from hyponyms:</w:t>
+      </w:r>
+      <w:r>
+        <w:t xml:space="preserve"> </w:t>
+      </w:r>
+      <w:r>
+        <w:t xml:space="preserve">A</w:t>
+      </w:r>
+      <w:r>
+        <w:t xml:space="preserve"> </w:t>
+      </w:r>
+      <w:r>
+        <w:rPr>
+          <w:i/>
+          <w:iCs/>
+        </w:rPr>
+        <w:t xml:space="preserve">synonym</w:t>
+      </w:r>
+      <w:r>
+        <w:t xml:space="preserve"> </w:t>
+      </w:r>
+      <w:r>
+        <w:t xml:space="preserve">names the same concept as the primary term,</w:t>
+      </w:r>
+      <w:r>
+        <w:t xml:space="preserve"> </w:t>
+      </w:r>
+      <w:r>
+        <w:t xml:space="preserve">so it belongs in the div title.</w:t>
+      </w:r>
+      <w:r>
+        <w:t xml:space="preserve"> </w:t>
+      </w:r>
+      <w:r>
+        <w:t xml:space="preserve">A</w:t>
+      </w:r>
+      <w:r>
+        <w:t xml:space="preserve"> </w:t>
+      </w:r>
+      <w:r>
+        <w:rPr>
+          <w:i/>
+          <w:iCs/>
+        </w:rPr>
+        <w:t xml:space="preserve">hyponym</w:t>
+      </w:r>
+      <w:r>
+        <w:t xml:space="preserve"> </w:t>
+      </w:r>
+      <w:r>
+        <w:t xml:space="preserve">names a special case of another term,</w:t>
+      </w:r>
+      <w:r>
+        <w:t xml:space="preserve"> </w:t>
+      </w:r>
+      <w:r>
+        <w:t xml:space="preserve">such as</w:t>
+      </w:r>
+      <w:r>
+        <w:t xml:space="preserve"> </w:t>
+      </w:r>
+      <w:r>
+        <w:t xml:space="preserve">“linear regression”</w:t>
+      </w:r>
+      <w:r>
+        <w:t xml:space="preserve"> </w:t>
+      </w:r>
+      <w:r>
+        <w:t xml:space="preserve">for</w:t>
+      </w:r>
+      <w:r>
+        <w:t xml:space="preserve"> </w:t>
+      </w:r>
+      <w:r>
+        <w:t xml:space="preserve">“regression model”</w:t>
+      </w:r>
+      <w:r>
+        <w:t xml:space="preserve">,</w:t>
+      </w:r>
+      <w:r>
+        <w:t xml:space="preserve"> </w:t>
+      </w:r>
+      <w:r>
+        <w:t xml:space="preserve">so it is a different concept.</w:t>
+      </w:r>
+      <w:r>
+        <w:t xml:space="preserve"> </w:t>
+      </w:r>
+      <w:r>
+        <w:t xml:space="preserve">Give each hyponym its own</w:t>
+      </w:r>
+      <w:r>
+        <w:t xml:space="preserve"> </w:t>
+      </w:r>
+      <w:r>
+        <w:rPr>
+          <w:rStyle w:val="VerbatimChar"/>
+        </w:rPr>
+        <w:t xml:space="preserve">#def-</w:t>
+      </w:r>
+      <w:r>
+        <w:t xml:space="preserve"> </w:t>
+      </w:r>
+      <w:r>
+        <w:t xml:space="preserve">div,</w:t>
+      </w:r>
+      <w:r>
+        <w:t xml:space="preserve"> </w:t>
+      </w:r>
+      <w:r>
+        <w:t xml:space="preserve">and never put it in the title of the general term</w:t>
+      </w:r>
+      <w:r>
+        <w:t xml:space="preserve"> </w:t>
+      </w:r>
+      <w:r>
+        <w:t xml:space="preserve">or introduce it with</w:t>
+      </w:r>
+      <w:r>
+        <w:t xml:space="preserve"> </w:t>
+      </w:r>
+      <w:r>
+        <w:t xml:space="preserve">“also called”</w:t>
+      </w:r>
+      <w:r>
+        <w:t xml:space="preserve"> </w:t>
+      </w:r>
+      <w:r>
+        <w:t xml:space="preserve">(Ezra, 2026-10-23).</w:t>
+      </w:r>
+      <w:r>
+        <w:t xml:space="preserve"> </w:t>
+      </w:r>
+      <w:r>
+        <w:t xml:space="preserve">When unsure, check both directions.</w:t>
+      </w:r>
+      <w:r>
+        <w:t xml:space="preserve"> </w:t>
+      </w:r>
+      <w:r>
+        <w:t xml:space="preserve">Is every instance of the new term an instance of the old term?</w:t>
+      </w:r>
+      <w:r>
+        <w:t xml:space="preserve"> </w:t>
+      </w:r>
+      <w:r>
+        <w:t xml:space="preserve">Is every instance of the old term an instance of the new term?</w:t>
+      </w:r>
+      <w:r>
+        <w:t xml:space="preserve"> </w:t>
+      </w:r>
+      <w:r>
+        <w:t xml:space="preserve">If only the first holds, the new term is a hyponym.</w:t>
       </w:r>
     </w:p>
     <w:p>

</xml_diff>

<commit_message>
Deploying to gh-pages from @ Morrison-Lab/psw@7ac8189719919678f9ef270a862a43b0d153d3e1 🚀
</commit_message>
<xml_diff>
--- a/chapters/defining-terms.docx
+++ b/chapters/defining-terms.docx
@@ -15,7 +15,7 @@
         <w:pStyle w:val="Date"/>
       </w:pPr>
       <w:r>
-        <w:t xml:space="preserve">Last modified: 2026-10-23 16:25:18 (PDT)</w:t>
+        <w:t xml:space="preserve">Last modified: 2026-10-23 23:02:19 (PDT)</w:t>
       </w:r>
     </w:p>
     <w:p>
@@ -2841,6 +2841,108 @@
       </w:r>
       <w:r>
         <w:t xml:space="preserve">and the symbol tells the reader which letters stand for it in the equations that follow.</w:t>
+      </w:r>
+    </w:p>
+    <w:p>
+      <w:pPr>
+        <w:numPr>
+          <w:ilvl w:val="0"/>
+          <w:numId w:val="1001"/>
+        </w:numPr>
+      </w:pPr>
+      <w:r>
+        <w:rPr>
+          <w:b/>
+          <w:bCs/>
+        </w:rPr>
+        <w:t xml:space="preserve">Give a definition a symbol only when the object recurs in formulas:</w:t>
+      </w:r>
+      <w:r>
+        <w:t xml:space="preserve"> </w:t>
+      </w:r>
+      <w:r>
+        <w:t xml:space="preserve">Introduce a new symbol or macro for a defined term</w:t>
+      </w:r>
+      <w:r>
+        <w:t xml:space="preserve"> </w:t>
+      </w:r>
+      <w:r>
+        <w:t xml:space="preserve">when the term appears in at least two formulas.</w:t>
+      </w:r>
+      <w:r>
+        <w:t xml:space="preserve"> </w:t>
+      </w:r>
+      <w:r>
+        <w:t xml:space="preserve">A term that appears only in words, such as</w:t>
+      </w:r>
+      <w:r>
+        <w:t xml:space="preserve"> </w:t>
+      </w:r>
+      <w:r>
+        <w:t xml:space="preserve">“pairwise disjoint”</w:t>
+      </w:r>
+      <w:r>
+        <w:t xml:space="preserve">,</w:t>
+      </w:r>
+      <w:r>
+        <w:t xml:space="preserve"> </w:t>
+      </w:r>
+      <w:r>
+        <w:t xml:space="preserve">needs no symbol.</w:t>
+      </w:r>
+      <w:r>
+        <w:t xml:space="preserve"> </w:t>
+      </w:r>
+      <w:r>
+        <w:t xml:space="preserve">A term that recurs in formulas, such as a level set, needs one,</w:t>
+      </w:r>
+      <w:r>
+        <w:t xml:space="preserve"> </w:t>
+      </w:r>
+      <w:r>
+        <w:t xml:space="preserve">so the reader sees the same object written the same way each time.</w:t>
+      </w:r>
+      <w:r>
+        <w:t xml:space="preserve"> </w:t>
+      </w:r>
+      <w:r>
+        <w:t xml:space="preserve">Define the symbol by the term’s most literal meaning,</w:t>
+      </w:r>
+      <w:r>
+        <w:t xml:space="preserve"> </w:t>
+      </w:r>
+      <w:r>
+        <w:t xml:space="preserve">such as the preimage of a single value for a level set.</w:t>
+      </w:r>
+      <w:r>
+        <w:t xml:space="preserve"> </w:t>
+      </w:r>
+      <w:r>
+        <w:t xml:space="preserve">No check can decide this rule,</w:t>
+      </w:r>
+      <w:r>
+        <w:t xml:space="preserve"> </w:t>
+      </w:r>
+      <w:r>
+        <w:t xml:space="preserve">because whether a term</w:t>
+      </w:r>
+      <w:r>
+        <w:t xml:space="preserve"> </w:t>
+      </w:r>
+      <w:r>
+        <w:t xml:space="preserve">“recurs”</w:t>
+      </w:r>
+      <w:r>
+        <w:t xml:space="preserve"> </w:t>
+      </w:r>
+      <w:r>
+        <w:t xml:space="preserve">depends on how the notes use it,</w:t>
+      </w:r>
+      <w:r>
+        <w:t xml:space="preserve"> </w:t>
+      </w:r>
+      <w:r>
+        <w:t xml:space="preserve">so a reviewer judges it.</w:t>
       </w:r>
     </w:p>
     <w:p>

</xml_diff>

<commit_message>
Deploying to gh-pages from @ Morrison-Lab/psw@24178792619adb8c99258ec3eb5e660b2446ea81 🚀
</commit_message>
<xml_diff>
--- a/chapters/defining-terms.docx
+++ b/chapters/defining-terms.docx
@@ -15,7 +15,7 @@
         <w:pStyle w:val="Date"/>
       </w:pPr>
       <w:r>
-        <w:t xml:space="preserve">Last modified: 2026-10-23 23:02:19 (PDT)</w:t>
+        <w:t xml:space="preserve">Last modified: 2026-10-24 17:51:57 (PDT)</w:t>
       </w:r>
     </w:p>
     <w:p>
@@ -490,7 +490,7 @@
       </w:r>
     </w:p>
     <w:bookmarkEnd w:id="15"/>
-    <w:bookmarkStart w:id="19" w:name="guidelines-for-defining-terms"/>
+    <w:bookmarkStart w:id="20" w:name="guidelines-for-defining-terms"/>
     <w:p>
       <w:pPr>
         <w:pStyle w:val="Heading2"/>
@@ -3173,6 +3173,140 @@
           <w:b/>
           <w:bCs/>
         </w:rPr>
+        <w:t xml:space="preserve">Link the longest defined phrase:</w:t>
+      </w:r>
+      <w:r>
+        <w:t xml:space="preserve"> </w:t>
+      </w:r>
+      <w:r>
+        <w:t xml:space="preserve">When a longer phrase has its own definition,</w:t>
+      </w:r>
+      <w:r>
+        <w:t xml:space="preserve"> </w:t>
+      </w:r>
+      <w:r>
+        <w:t xml:space="preserve">link the whole phrase to that definition,</w:t>
+      </w:r>
+      <w:r>
+        <w:t xml:space="preserve"> </w:t>
+      </w:r>
+      <w:r>
+        <w:t xml:space="preserve">not a shorter term inside it.</w:t>
+      </w:r>
+      <w:r>
+        <w:t xml:space="preserve"> </w:t>
+      </w:r>
+      <w:r>
+        <w:t xml:space="preserve">For example, link</w:t>
+      </w:r>
+      <w:r>
+        <w:t xml:space="preserve"> </w:t>
+      </w:r>
+      <w:r>
+        <w:rPr>
+          <w:rStyle w:val="VerbatimChar"/>
+        </w:rPr>
+        <w:t xml:space="preserve">[logistic regression](#def-logistic-regression)</w:t>
+      </w:r>
+      <w:r>
+        <w:t xml:space="preserve">,</w:t>
+      </w:r>
+      <w:r>
+        <w:t xml:space="preserve"> </w:t>
+      </w:r>
+      <w:r>
+        <w:t xml:space="preserve">not</w:t>
+      </w:r>
+      <w:r>
+        <w:t xml:space="preserve"> </w:t>
+      </w:r>
+      <w:r>
+        <w:t xml:space="preserve">“logistic</w:t>
+      </w:r>
+      <w:r>
+        <w:t xml:space="preserve"> </w:t>
+      </w:r>
+      <w:r>
+        <w:rPr>
+          <w:rStyle w:val="VerbatimChar"/>
+        </w:rPr>
+        <w:t xml:space="preserve">[regression](#def-regression)</w:t>
+      </w:r>
+      <w:r>
+        <w:t xml:space="preserve">”</w:t>
+      </w:r>
+      <w:r>
+        <w:t xml:space="preserve">.</w:t>
+      </w:r>
+      <w:r>
+        <w:t xml:space="preserve"> </w:t>
+      </w:r>
+      <w:r>
+        <w:t xml:space="preserve">The shorter term names a different concept,</w:t>
+      </w:r>
+      <w:r>
+        <w:t xml:space="preserve"> </w:t>
+      </w:r>
+      <w:r>
+        <w:t xml:space="preserve">so linking it sends the reader to the wrong definition.</w:t>
+      </w:r>
+      <w:r>
+        <w:t xml:space="preserve"> </w:t>
+      </w:r>
+      <w:r>
+        <w:t xml:space="preserve">Link the shorter term only where it stands alone.</w:t>
+      </w:r>
+      <w:r>
+        <w:t xml:space="preserve"> </w:t>
+      </w:r>
+      <w:r>
+        <w:t xml:space="preserve">The</w:t>
+      </w:r>
+      <w:r>
+        <w:t xml:space="preserve"> </w:t>
+      </w:r>
+      <w:r>
+        <w:rPr>
+          <w:rStyle w:val="VerbatimChar"/>
+        </w:rPr>
+        <w:t xml:space="preserve">check-term-links</w:t>
+      </w:r>
+      <w:r>
+        <w:t xml:space="preserve"> </w:t>
+      </w:r>
+      <w:r>
+        <w:t xml:space="preserve">check in</w:t>
+      </w:r>
+      <w:r>
+        <w:t xml:space="preserve"> </w:t>
+      </w:r>
+      <w:hyperlink r:id="rId17">
+        <w:r>
+          <w:rPr>
+            <w:rStyle w:val="Hyperlink"/>
+          </w:rPr>
+          <w:t xml:space="preserve">gha</w:t>
+        </w:r>
+      </w:hyperlink>
+      <w:r>
+        <w:t xml:space="preserve"> </w:t>
+      </w:r>
+      <w:r>
+        <w:t xml:space="preserve">flags a partial link.</w:t>
+      </w:r>
+    </w:p>
+    <w:p>
+      <w:pPr>
+        <w:numPr>
+          <w:ilvl w:val="0"/>
+          <w:numId w:val="1001"/>
+        </w:numPr>
+      </w:pPr>
+      <w:r>
+        <w:rPr>
+          <w:b/>
+          <w:bCs/>
+        </w:rPr>
         <w:t xml:space="preserve">Do not presuppose what the reader has not met:</w:t>
       </w:r>
       <w:r>
@@ -3691,7 +3825,7 @@
         <w:t xml:space="preserve">A reader who needs one of them can then link to exactly that one.</w:t>
       </w:r>
     </w:p>
-    <w:bookmarkStart w:id="17" w:name="exm-one-definition-per-div"/>
+    <w:bookmarkStart w:id="18" w:name="exm-one-definition-per-div"/>
     <w:p>
       <w:pPr>
         <w:numPr>
@@ -4231,7 +4365,7 @@
         <w:t xml:space="preserve">and each needs its own example.</w:t>
       </w:r>
     </w:p>
-    <w:bookmarkEnd w:id="17"/>
+    <w:bookmarkEnd w:id="18"/>
     <w:p>
       <w:pPr>
         <w:numPr>
@@ -4432,7 +4566,7 @@
       <w:r>
         <w:t xml:space="preserve"> </w:t>
       </w:r>
-      <w:hyperlink r:id="rId18">
+      <w:hyperlink r:id="rId19">
         <w:r>
           <w:rPr>
             <w:rStyle w:val="Hyperlink"/>
@@ -7777,8 +7911,8 @@
         <w:t xml:space="preserve">When in doubt, keep it.</w:t>
       </w:r>
     </w:p>
-    <w:bookmarkEnd w:id="19"/>
-    <w:bookmarkStart w:id="26" w:name="examples-of-term-definitions"/>
+    <w:bookmarkEnd w:id="20"/>
+    <w:bookmarkStart w:id="27" w:name="examples-of-term-definitions"/>
     <w:p>
       <w:pPr>
         <w:pStyle w:val="Heading2"/>
@@ -7795,7 +7929,7 @@
         <w:t xml:space="preserve">Here are examples of well-defined terms:</w:t>
       </w:r>
     </w:p>
-    <w:bookmarkStart w:id="20" w:name="def-confidence-interval"/>
+    <w:bookmarkStart w:id="21" w:name="def-confidence-interval"/>
     <w:p>
       <w:pPr>
         <w:pStyle w:val="BodyText"/>
@@ -8032,8 +8166,8 @@
         </m:oMath>
       </m:oMathPara>
     </w:p>
-    <w:bookmarkEnd w:id="20"/>
-    <w:bookmarkStart w:id="21" w:name="exm-confidence-interval"/>
+    <w:bookmarkEnd w:id="21"/>
+    <w:bookmarkStart w:id="22" w:name="exm-confidence-interval"/>
     <w:p>
       <w:pPr>
         <w:pStyle w:val="FirstParagraph"/>
@@ -8075,8 +8209,8 @@
         <w:t xml:space="preserve">we are 95% confident that the true population mean height falls within this range.</w:t>
       </w:r>
     </w:p>
-    <w:bookmarkEnd w:id="21"/>
-    <w:bookmarkStart w:id="22" w:name="exm-not-confidence-interval"/>
+    <w:bookmarkEnd w:id="22"/>
+    <w:bookmarkStart w:id="23" w:name="exm-not-confidence-interval"/>
     <w:p>
       <w:pPr>
         <w:pStyle w:val="BodyText"/>
@@ -8136,8 +8270,8 @@
         <w:t xml:space="preserve">and it does not shrink as the sample grows.</w:t>
       </w:r>
     </w:p>
-    <w:bookmarkEnd w:id="22"/>
-    <w:bookmarkStart w:id="23" w:name="def-active-voice"/>
+    <w:bookmarkEnd w:id="23"/>
+    <w:bookmarkStart w:id="24" w:name="def-active-voice"/>
     <w:p>
       <w:pPr>
         <w:pStyle w:val="BodyText"/>
@@ -8166,8 +8300,8 @@
         <w:t xml:space="preserve">is a sentence structure where the subject performs the action expressed by the verb.</w:t>
       </w:r>
     </w:p>
-    <w:bookmarkEnd w:id="23"/>
-    <w:bookmarkStart w:id="24" w:name="exm-active-voice"/>
+    <w:bookmarkEnd w:id="24"/>
+    <w:bookmarkStart w:id="25" w:name="exm-active-voice"/>
     <w:p>
       <w:pPr>
         <w:pStyle w:val="BodyText"/>
@@ -8227,8 +8361,8 @@
         <w:t xml:space="preserve">.</w:t>
       </w:r>
     </w:p>
-    <w:bookmarkEnd w:id="24"/>
-    <w:bookmarkStart w:id="25" w:name="exm-passive-voice"/>
+    <w:bookmarkEnd w:id="25"/>
+    <w:bookmarkStart w:id="26" w:name="exm-passive-voice"/>
     <w:p>
       <w:pPr>
         <w:pStyle w:val="BodyText"/>
@@ -8291,9 +8425,9 @@
         <w:t xml:space="preserve">so the sentence is in passive voice.</w:t>
       </w:r>
     </w:p>
-    <w:bookmarkEnd w:id="25"/>
     <w:bookmarkEnd w:id="26"/>
-    <w:bookmarkStart w:id="31" w:name="order-general-definition-then-examples"/>
+    <w:bookmarkEnd w:id="27"/>
+    <w:bookmarkStart w:id="32" w:name="order-general-definition-then-examples"/>
     <w:p>
       <w:pPr>
         <w:pStyle w:val="Heading2"/>
@@ -8406,7 +8540,7 @@
         <w:t xml:space="preserve">would give these blocks, in this order:</w:t>
       </w:r>
     </w:p>
-    <w:bookmarkStart w:id="27" w:name="def-rss"/>
+    <w:bookmarkStart w:id="28" w:name="def-rss"/>
     <w:p>
       <w:pPr>
         <w:pStyle w:val="BodyText"/>
@@ -8524,8 +8658,8 @@
         </m:oMath>
       </m:oMathPara>
     </w:p>
-    <w:bookmarkEnd w:id="27"/>
-    <w:bookmarkStart w:id="28" w:name="exm-rss-line"/>
+    <w:bookmarkEnd w:id="28"/>
+    <w:bookmarkStart w:id="29" w:name="exm-rss-line"/>
     <w:p>
       <w:pPr>
         <w:pStyle w:val="FirstParagraph"/>
@@ -8857,8 +8991,8 @@
         </m:oMath>
       </m:oMathPara>
     </w:p>
-    <w:bookmarkEnd w:id="28"/>
-    <w:bookmarkStart w:id="29" w:name="exm-rss-three-points"/>
+    <w:bookmarkEnd w:id="29"/>
+    <w:bookmarkStart w:id="30" w:name="exm-rss-three-points"/>
     <w:p>
       <w:pPr>
         <w:pStyle w:val="FirstParagraph"/>
@@ -9147,8 +9281,8 @@
         <w:t xml:space="preserve">.</w:t>
       </w:r>
     </w:p>
-    <w:bookmarkEnd w:id="29"/>
-    <w:bookmarkStart w:id="30" w:name="exm-not-rss"/>
+    <w:bookmarkEnd w:id="30"/>
+    <w:bookmarkStart w:id="31" w:name="exm-not-rss"/>
     <w:p>
       <w:pPr>
         <w:pStyle w:val="BodyText"/>
@@ -9291,7 +9425,7 @@
         <w:t xml:space="preserve">rather than around the line’s fitted values.</w:t>
       </w:r>
     </w:p>
-    <w:bookmarkEnd w:id="30"/>
+    <w:bookmarkEnd w:id="31"/>
     <w:p>
       <w:pPr>
         <w:pStyle w:val="BodyText"/>
@@ -9330,8 +9464,8 @@
         <w:t xml:space="preserve">once the reader knows what the definition covers.</w:t>
       </w:r>
     </w:p>
-    <w:bookmarkEnd w:id="31"/>
-    <w:bookmarkStart w:id="35" w:name="X35ef0536ddd4dcadf17366e9cbbad09e6282954"/>
+    <w:bookmarkEnd w:id="32"/>
+    <w:bookmarkStart w:id="36" w:name="X35ef0536ddd4dcadf17366e9cbbad09e6282954"/>
     <w:p>
       <w:pPr>
         <w:pStyle w:val="Heading2"/>
@@ -9386,7 +9520,7 @@
       <w:r>
         <w:t xml:space="preserve"> </w:t>
       </w:r>
-      <w:hyperlink r:id="rId32">
+      <w:hyperlink r:id="rId33">
         <w:r>
           <w:rPr>
             <w:rStyle w:val="Hyperlink"/>
@@ -9404,7 +9538,7 @@
         <w:t xml:space="preserve">A term with no mathematical form, such as active voice, keeps its prose definition alone.</w:t>
       </w:r>
     </w:p>
-    <w:bookmarkStart w:id="33" w:name="def-variance-expression-and-prose"/>
+    <w:bookmarkStart w:id="34" w:name="def-variance-expression-and-prose"/>
     <w:p>
       <w:pPr>
         <w:pStyle w:val="BodyText"/>
@@ -9605,8 +9739,8 @@
         <w:t xml:space="preserve">from its population mean.</w:t>
       </w:r>
     </w:p>
-    <w:bookmarkEnd w:id="33"/>
-    <w:bookmarkStart w:id="34" w:name="exm-not-expression-and-prose"/>
+    <w:bookmarkEnd w:id="34"/>
+    <w:bookmarkStart w:id="35" w:name="exm-not-expression-and-prose"/>
     <w:p>
       <w:pPr>
         <w:pStyle w:val="BodyText"/>
@@ -9763,9 +9897,9 @@
         <w:t xml:space="preserve">gives both.</w:t>
       </w:r>
     </w:p>
-    <w:bookmarkEnd w:id="34"/>
     <w:bookmarkEnd w:id="35"/>
-    <w:bookmarkStart w:id="36" w:name="why-examples-matter"/>
+    <w:bookmarkEnd w:id="36"/>
+    <w:bookmarkStart w:id="37" w:name="why-examples-matter"/>
     <w:p>
       <w:pPr>
         <w:pStyle w:val="Heading2"/>
@@ -9917,8 +10051,8 @@
         <w:t xml:space="preserve">which is where readers most often misapply it.</w:t>
       </w:r>
     </w:p>
-    <w:bookmarkEnd w:id="36"/>
-    <w:bookmarkStart w:id="37" w:name="common-pitfalls-to-avoid"/>
+    <w:bookmarkEnd w:id="37"/>
+    <w:bookmarkStart w:id="38" w:name="common-pitfalls-to-avoid"/>
     <w:p>
       <w:pPr>
         <w:pStyle w:val="Heading2"/>
@@ -10172,8 +10306,8 @@
         <w:t xml:space="preserve">of the definition they are meant to demonstrate.</w:t>
       </w:r>
     </w:p>
-    <w:bookmarkEnd w:id="37"/>
-    <w:bookmarkStart w:id="45" w:name="mathematical-statements-require-examples"/>
+    <w:bookmarkEnd w:id="38"/>
+    <w:bookmarkStart w:id="46" w:name="mathematical-statements-require-examples"/>
     <w:p>
       <w:pPr>
         <w:pStyle w:val="Heading2"/>
@@ -10226,7 +10360,7 @@
         <w:t xml:space="preserve">when readers can see concrete instances.</w:t>
       </w:r>
     </w:p>
-    <w:bookmarkStart w:id="39" w:name="using-theorem-environments-in-quarto"/>
+    <w:bookmarkStart w:id="40" w:name="using-theorem-environments-in-quarto"/>
     <w:p>
       <w:pPr>
         <w:pStyle w:val="Heading3"/>
@@ -10519,7 +10653,7 @@
       <w:r>
         <w:t xml:space="preserve"> </w:t>
       </w:r>
-      <w:hyperlink r:id="rId38">
+      <w:hyperlink r:id="rId39">
         <w:r>
           <w:rPr>
             <w:rStyle w:val="Hyperlink"/>
@@ -10646,8 +10780,8 @@
         <w:t xml:space="preserve">.</w:t>
       </w:r>
     </w:p>
-    <w:bookmarkEnd w:id="39"/>
-    <w:bookmarkStart w:id="44" w:name="example-pythagorean-theorem"/>
+    <w:bookmarkEnd w:id="40"/>
+    <w:bookmarkStart w:id="45" w:name="example-pythagorean-theorem"/>
     <w:p>
       <w:pPr>
         <w:pStyle w:val="Heading3"/>
@@ -10656,7 +10790,7 @@
         <w:t xml:space="preserve">7.2 Example: Pythagorean theorem</w:t>
       </w:r>
     </w:p>
-    <w:bookmarkStart w:id="40" w:name="thm-pythagoras"/>
+    <w:bookmarkStart w:id="41" w:name="thm-pythagoras"/>
     <w:p>
       <w:pPr>
         <w:pStyle w:val="FirstParagraph"/>
@@ -10747,8 +10881,8 @@
         </m:oMath>
       </m:oMathPara>
     </w:p>
-    <w:bookmarkEnd w:id="40"/>
-    <w:bookmarkStart w:id="41" w:name="exm-pythagoras"/>
+    <w:bookmarkEnd w:id="41"/>
+    <w:bookmarkStart w:id="42" w:name="exm-pythagoras"/>
     <w:p>
       <w:pPr>
         <w:pStyle w:val="FirstParagraph"/>
@@ -10877,8 +11011,8 @@
         </m:oMath>
       </m:oMathPara>
     </w:p>
-    <w:bookmarkEnd w:id="41"/>
-    <w:bookmarkStart w:id="42" w:name="def-postulate"/>
+    <w:bookmarkEnd w:id="42"/>
+    <w:bookmarkStart w:id="43" w:name="def-postulate"/>
     <w:p>
       <w:pPr>
         <w:pStyle w:val="FirstParagraph"/>
@@ -10932,8 +11066,8 @@
         <w:t xml:space="preserve">serving as a starting point for further reasoning.</w:t>
       </w:r>
     </w:p>
-    <w:bookmarkEnd w:id="42"/>
-    <w:bookmarkStart w:id="43" w:name="exm-parallel-postulate"/>
+    <w:bookmarkEnd w:id="43"/>
+    <w:bookmarkStart w:id="44" w:name="exm-parallel-postulate"/>
     <w:p>
       <w:pPr>
         <w:pStyle w:val="BodyText"/>
@@ -11036,10 +11170,10 @@
         <w:t xml:space="preserve">.</w:t>
       </w:r>
     </w:p>
-    <w:bookmarkEnd w:id="43"/>
     <w:bookmarkEnd w:id="44"/>
     <w:bookmarkEnd w:id="45"/>
-    <w:bookmarkStart w:id="53" w:name="Xe6c88c177e563d1f046037569009a36fd08f4bd"/>
+    <w:bookmarkEnd w:id="46"/>
+    <w:bookmarkStart w:id="54" w:name="Xe6c88c177e563d1f046037569009a36fd08f4bd"/>
     <w:p>
       <w:pPr>
         <w:pStyle w:val="Heading2"/>
@@ -11302,7 +11436,7 @@
       <w:r>
         <w:t xml:space="preserve"> </w:t>
       </w:r>
-      <w:hyperlink r:id="rId46">
+      <w:hyperlink r:id="rId47">
         <w:r>
           <w:rPr>
             <w:rStyle w:val="Hyperlink"/>
@@ -11553,7 +11687,7 @@
         <w:t xml:space="preserve">is an ordinary step, not the pattern to avoid.</w:t>
       </w:r>
     </w:p>
-    <w:bookmarkStart w:id="47" w:name="def-sample-mean"/>
+    <w:bookmarkStart w:id="48" w:name="def-sample-mean"/>
     <w:p>
       <w:pPr>
         <w:pStyle w:val="FirstParagraph"/>
@@ -11738,8 +11872,8 @@
         </m:oMath>
       </m:oMathPara>
     </w:p>
-    <w:bookmarkEnd w:id="47"/>
-    <w:bookmarkStart w:id="48" w:name="exr-sum-deviations"/>
+    <w:bookmarkEnd w:id="48"/>
+    <w:bookmarkStart w:id="49" w:name="exr-sum-deviations"/>
     <w:p>
       <w:pPr>
         <w:pStyle w:val="FirstParagraph"/>
@@ -11894,8 +12028,8 @@
         <w:t xml:space="preserve">).</w:t>
       </w:r>
     </w:p>
-    <w:bookmarkEnd w:id="48"/>
-    <w:bookmarkStart w:id="49" w:name="sol-sum-deviations"/>
+    <w:bookmarkEnd w:id="49"/>
+    <w:bookmarkStart w:id="50" w:name="sol-sum-deviations"/>
     <w:p>
       <w:pPr>
         <w:pStyle w:val="BodyText"/>
@@ -12346,8 +12480,8 @@
         </m:oMath>
       </m:oMathPara>
     </w:p>
-    <w:bookmarkEnd w:id="49"/>
-    <w:bookmarkStart w:id="50" w:name="thm-sum-deviations"/>
+    <w:bookmarkEnd w:id="50"/>
+    <w:bookmarkStart w:id="51" w:name="thm-sum-deviations"/>
     <w:p>
       <w:pPr>
         <w:pStyle w:val="FirstParagraph"/>
@@ -12553,7 +12687,7 @@
         </m:oMath>
       </m:oMathPara>
     </w:p>
-    <w:bookmarkEnd w:id="50"/>
+    <w:bookmarkEnd w:id="51"/>
     <w:p>
       <w:pPr>
         <w:pStyle w:val="FirstParagraph"/>
@@ -12583,7 +12717,7 @@
         <w:t xml:space="preserve">derives this result.</w:t>
       </w:r>
     </w:p>
-    <w:bookmarkStart w:id="51" w:name="exm-derivation-direction"/>
+    <w:bookmarkStart w:id="52" w:name="exm-derivation-direction"/>
     <w:p>
       <w:pPr>
         <w:pStyle w:val="BodyText"/>
@@ -13647,7 +13781,7 @@
       <w:r>
         <w:t xml:space="preserve"> </w:t>
       </w:r>
-      <w:hyperlink r:id="rId46">
+      <w:hyperlink r:id="rId47">
         <w:r>
           <w:rPr>
             <w:rStyle w:val="Hyperlink"/>
@@ -13659,8 +13793,8 @@
         <w:t xml:space="preserve">).</w:t>
       </w:r>
     </w:p>
-    <w:bookmarkEnd w:id="51"/>
-    <w:bookmarkStart w:id="52" w:name="exm-one-result-per-theorem"/>
+    <w:bookmarkEnd w:id="52"/>
+    <w:bookmarkStart w:id="53" w:name="exm-one-result-per-theorem"/>
     <w:p>
       <w:pPr>
         <w:pStyle w:val="BodyText"/>
@@ -14144,8 +14278,8 @@
         <w:t xml:space="preserve">and a later step that uses only the first can cite only the first.</w:t>
       </w:r>
     </w:p>
-    <w:bookmarkEnd w:id="52"/>
     <w:bookmarkEnd w:id="53"/>
+    <w:bookmarkEnd w:id="54"/>
     <w:sectPr>
       <w:footnotePr>
         <w:numRestart w:val="eachSect"/>

</xml_diff>

<commit_message>
Deploying to gh-pages from @ Morrison-Lab/psw@dcf630da58a6efd4b728e3da88851d09e47ccc84 🚀
</commit_message>
<xml_diff>
--- a/chapters/defining-terms.docx
+++ b/chapters/defining-terms.docx
@@ -15,7 +15,7 @@
         <w:pStyle w:val="Date"/>
       </w:pPr>
       <w:r>
-        <w:t xml:space="preserve">Last modified: 2026-10-24 17:51:57 (PDT)</w:t>
+        <w:t xml:space="preserve">Last modified: 2026-10-24 21:51:54 (PDT)</w:t>
       </w:r>
     </w:p>
     <w:p>
@@ -7403,6 +7403,7 @@
       <m:oMath>
         <m:r>
           <m:rPr>
+            <m:scr m:val="double-struck"/>
             <m:sty m:val="p"/>
           </m:rPr>
           <m:t>E</m:t>
@@ -7436,6 +7437,7 @@
       <m:oMath>
         <m:r>
           <m:rPr>
+            <m:scr m:val="double-struck"/>
             <m:sty m:val="p"/>
           </m:rPr>
           <m:t>E</m:t>
@@ -7835,6 +7837,7 @@
       <m:oMath>
         <m:r>
           <m:rPr>
+            <m:scr m:val="double-struck"/>
             <m:sty m:val="p"/>
           </m:rPr>
           <m:t>E</m:t>
@@ -9629,6 +9632,7 @@
           </m:r>
           <m:r>
             <m:rPr>
+              <m:scr m:val="double-struck"/>
               <m:sty m:val="p"/>
             </m:rPr>
             <m:t>E</m:t>
@@ -9666,6 +9670,7 @@
                   </m:r>
                   <m:r>
                     <m:rPr>
+                      <m:scr m:val="double-struck"/>
                       <m:sty m:val="p"/>
                     </m:rPr>
                     <m:t>E</m:t>
@@ -9790,6 +9795,7 @@
       <m:oMath>
         <m:r>
           <m:rPr>
+            <m:scr m:val="double-struck"/>
             <m:sty m:val="p"/>
           </m:rPr>
           <m:t>E</m:t>
@@ -9827,6 +9833,7 @@
                 </m:r>
                 <m:r>
                   <m:rPr>
+                    <m:scr m:val="double-struck"/>
                     <m:sty m:val="p"/>
                   </m:rPr>
                   <m:t>E</m:t>

</xml_diff>

<commit_message>
Deploying to gh-pages from @ Morrison-Lab/psw@01799c554c8455db0f5ae66a2d7e455e2c6fcb52 🚀
</commit_message>
<xml_diff>
--- a/chapters/defining-terms.docx
+++ b/chapters/defining-terms.docx
@@ -15,7 +15,7 @@
         <w:pStyle w:val="Date"/>
       </w:pPr>
       <w:r>
-        <w:t xml:space="preserve">Last modified: 2026-10-26 00:55:25 (PDT)</w:t>
+        <w:t xml:space="preserve">Last modified: 2026-10-26 01:27:11 (PDT)</w:t>
       </w:r>
     </w:p>
     <w:p>
@@ -2357,7 +2357,7 @@
         <w:t xml:space="preserve"> </w:t>
       </w:r>
       <w:r>
-        <w:t xml:space="preserve">not just for the first case the reader meets.</w:t>
+        <w:t xml:space="preserve">not just for the first case the reader encounters.</w:t>
       </w:r>
       <w:r>
         <w:t xml:space="preserve"> </w:t>
@@ -3307,7 +3307,7 @@
           <w:b/>
           <w:bCs/>
         </w:rPr>
-        <w:t xml:space="preserve">Do not presuppose what the reader has not met:</w:t>
+        <w:t xml:space="preserve">Do not presuppose what the reader has not encountered:</w:t>
       </w:r>
       <w:r>
         <w:t xml:space="preserve"> </w:t>
@@ -4549,7 +4549,7 @@
         <w:t xml:space="preserve"> </w:t>
       </w:r>
       <w:r>
-        <w:t xml:space="preserve">A reader who meets the other words in another source</w:t>
+        <w:t xml:space="preserve">A reader who encounters the other words in another source</w:t>
       </w:r>
       <w:r>
         <w:t xml:space="preserve"> </w:t>
@@ -11224,7 +11224,7 @@
         <w:t xml:space="preserve"> </w:t>
       </w:r>
       <w:r>
-        <w:t xml:space="preserve">The reader meets the question before the answer,</w:t>
+        <w:t xml:space="preserve">The reader encounters the question before the answer,</w:t>
       </w:r>
       <w:r>
         <w:t xml:space="preserve"> </w:t>

</xml_diff>

<commit_message>
Deploying to gh-pages from @ Morrison-Lab/psw@b9862cae11b2744dc1075654b68b347450c72fc9 🚀
</commit_message>
<xml_diff>
--- a/chapters/defining-terms.docx
+++ b/chapters/defining-terms.docx
@@ -15,7 +15,7 @@
         <w:pStyle w:val="Date"/>
       </w:pPr>
       <w:r>
-        <w:t xml:space="preserve">Last modified: 2026-10-26 10:59:23 (PDT)</w:t>
+        <w:t xml:space="preserve">Last modified: 2026-10-26 13:08:28 (PDT)</w:t>
       </w:r>
     </w:p>
     <w:p>
@@ -11180,7 +11180,7 @@
     <w:bookmarkEnd w:id="44"/>
     <w:bookmarkEnd w:id="45"/>
     <w:bookmarkEnd w:id="46"/>
-    <w:bookmarkStart w:id="54" w:name="Xe6c88c177e563d1f046037569009a36fd08f4bd"/>
+    <w:bookmarkStart w:id="55" w:name="Xe6c88c177e563d1f046037569009a36fd08f4bd"/>
     <w:p>
       <w:pPr>
         <w:pStyle w:val="Heading2"/>
@@ -11358,7 +11358,7 @@
           <w:b/>
           <w:bCs/>
         </w:rPr>
-        <w:t xml:space="preserve">The theorem states the result; the proof cites the exercises.</w:t>
+        <w:t xml:space="preserve">The theorem states the result; the proof cites results.</w:t>
       </w:r>
       <w:r>
         <w:t xml:space="preserve"> </w:t>
@@ -11370,13 +11370,45 @@
         <w:t xml:space="preserve"> </w:t>
       </w:r>
       <w:r>
-        <w:t xml:space="preserve">Its proof is a few sentences that cite the exercises it rests on,</w:t>
+        <w:t xml:space="preserve">Its proof is a few sentences that cite the results it rests on,</w:t>
       </w:r>
       <w:r>
         <w:t xml:space="preserve"> </w:t>
       </w:r>
       <w:r>
         <w:t xml:space="preserve">not a second copy of their working.</w:t>
+      </w:r>
+      <w:r>
+        <w:t xml:space="preserve"> </w:t>
+      </w:r>
+      <w:r>
+        <w:t xml:space="preserve">A proof that does no derivation of its own is one line citing the solution of the exercise that asks for the result,</w:t>
+      </w:r>
+      <w:r>
+        <w:t xml:space="preserve"> </w:t>
+      </w:r>
+      <w:r>
+        <w:t xml:space="preserve">and every later argument cites the theorem, never the solution</w:t>
+      </w:r>
+      <w:r>
+        <w:t xml:space="preserve"> </w:t>
+      </w:r>
+      <w:r>
+        <w:t xml:space="preserve">(see</w:t>
+      </w:r>
+      <w:r>
+        <w:t xml:space="preserve"> </w:t>
+      </w:r>
+      <w:hyperlink r:id="rId47">
+        <w:r>
+          <w:rPr>
+            <w:rStyle w:val="Hyperlink"/>
+          </w:rPr>
+          <w:t xml:space="preserve">Cite results, not solutions</w:t>
+        </w:r>
+      </w:hyperlink>
+      <w:r>
+        <w:t xml:space="preserve">).</w:t>
       </w:r>
     </w:p>
     <w:p>
@@ -11443,7 +11475,7 @@
       <w:r>
         <w:t xml:space="preserve"> </w:t>
       </w:r>
-      <w:hyperlink r:id="rId47">
+      <w:hyperlink r:id="rId48">
         <w:r>
           <w:rPr>
             <w:rStyle w:val="Hyperlink"/>
@@ -11510,7 +11542,7 @@
         <w:t xml:space="preserve"> </w:t>
       </w:r>
       <w:r>
-        <w:t xml:space="preserve">and each proof cites only the exercise it rests on.</w:t>
+        <w:t xml:space="preserve">and each proof cites only the result it rests on.</w:t>
       </w:r>
     </w:p>
     <w:p>
@@ -11694,7 +11726,7 @@
         <w:t xml:space="preserve">is an ordinary step, not the pattern to avoid.</w:t>
       </w:r>
     </w:p>
-    <w:bookmarkStart w:id="48" w:name="def-sample-mean"/>
+    <w:bookmarkStart w:id="49" w:name="def-sample-mean"/>
     <w:p>
       <w:pPr>
         <w:pStyle w:val="FirstParagraph"/>
@@ -11879,8 +11911,8 @@
         </m:oMath>
       </m:oMathPara>
     </w:p>
-    <w:bookmarkEnd w:id="48"/>
-    <w:bookmarkStart w:id="49" w:name="exr-sum-deviations"/>
+    <w:bookmarkEnd w:id="49"/>
+    <w:bookmarkStart w:id="50" w:name="exr-sum-deviations"/>
     <w:p>
       <w:pPr>
         <w:pStyle w:val="FirstParagraph"/>
@@ -12035,8 +12067,8 @@
         <w:t xml:space="preserve">).</w:t>
       </w:r>
     </w:p>
-    <w:bookmarkEnd w:id="49"/>
-    <w:bookmarkStart w:id="50" w:name="sol-sum-deviations"/>
+    <w:bookmarkEnd w:id="50"/>
+    <w:bookmarkStart w:id="51" w:name="sol-sum-deviations"/>
     <w:p>
       <w:pPr>
         <w:pStyle w:val="BodyText"/>
@@ -12487,8 +12519,8 @@
         </m:oMath>
       </m:oMathPara>
     </w:p>
-    <w:bookmarkEnd w:id="50"/>
-    <w:bookmarkStart w:id="51" w:name="thm-sum-deviations"/>
+    <w:bookmarkEnd w:id="51"/>
+    <w:bookmarkStart w:id="52" w:name="thm-sum-deviations"/>
     <w:p>
       <w:pPr>
         <w:pStyle w:val="FirstParagraph"/>
@@ -12694,7 +12726,7 @@
         </m:oMath>
       </m:oMathPara>
     </w:p>
-    <w:bookmarkEnd w:id="51"/>
+    <w:bookmarkEnd w:id="52"/>
     <w:p>
       <w:pPr>
         <w:pStyle w:val="FirstParagraph"/>
@@ -12724,7 +12756,7 @@
         <w:t xml:space="preserve">derives this result.</w:t>
       </w:r>
     </w:p>
-    <w:bookmarkStart w:id="52" w:name="exm-derivation-direction"/>
+    <w:bookmarkStart w:id="53" w:name="exm-derivation-direction"/>
     <w:p>
       <w:pPr>
         <w:pStyle w:val="BodyText"/>
@@ -13788,7 +13820,7 @@
       <w:r>
         <w:t xml:space="preserve"> </w:t>
       </w:r>
-      <w:hyperlink r:id="rId47">
+      <w:hyperlink r:id="rId48">
         <w:r>
           <w:rPr>
             <w:rStyle w:val="Hyperlink"/>
@@ -13800,8 +13832,8 @@
         <w:t xml:space="preserve">).</w:t>
       </w:r>
     </w:p>
-    <w:bookmarkEnd w:id="52"/>
-    <w:bookmarkStart w:id="53" w:name="exm-one-result-per-theorem"/>
+    <w:bookmarkEnd w:id="53"/>
+    <w:bookmarkStart w:id="54" w:name="exm-one-result-per-theorem"/>
     <w:p>
       <w:pPr>
         <w:pStyle w:val="BodyText"/>
@@ -14285,8 +14317,8 @@
         <w:t xml:space="preserve">and a later step that uses only the first can cite only the first.</w:t>
       </w:r>
     </w:p>
-    <w:bookmarkEnd w:id="53"/>
     <w:bookmarkEnd w:id="54"/>
+    <w:bookmarkEnd w:id="55"/>
     <w:sectPr>
       <w:footnotePr>
         <w:numRestart w:val="eachSect"/>

</xml_diff>

<commit_message>
Deploying to gh-pages from @ Morrison-Lab/psw@8c9a93cdedbc45287bdd5842bc8d238b710b3b87 🚀
</commit_message>
<xml_diff>
--- a/chapters/defining-terms.docx
+++ b/chapters/defining-terms.docx
@@ -15,7 +15,7 @@
         <w:pStyle w:val="Date"/>
       </w:pPr>
       <w:r>
-        <w:t xml:space="preserve">Last modified: 2026-10-26 14:13:25 (PDT)</w:t>
+        <w:t xml:space="preserve">Last modified: 2026-10-26 18:19:40 (PDT)</w:t>
       </w:r>
     </w:p>
     <w:p>
@@ -490,7 +490,7 @@
       </w:r>
     </w:p>
     <w:bookmarkEnd w:id="15"/>
-    <w:bookmarkStart w:id="20" w:name="guidelines-for-defining-terms"/>
+    <w:bookmarkStart w:id="21" w:name="guidelines-for-defining-terms"/>
     <w:p>
       <w:pPr>
         <w:pStyle w:val="Heading2"/>
@@ -3307,6 +3307,189 @@
           <w:b/>
           <w:bCs/>
         </w:rPr>
+        <w:t xml:space="preserve">Link the</w:t>
+      </w:r>
+      <w:r>
+        <w:rPr>
+          <w:b/>
+          <w:bCs/>
+        </w:rPr>
+        <w:t xml:space="preserve"> </w:t>
+      </w:r>
+      <w:hyperlink w:anchor="def-term">
+        <w:r>
+          <w:rPr>
+            <w:rStyle w:val="Hyperlink"/>
+            <w:b/>
+            <w:bCs/>
+          </w:rPr>
+          <w:t xml:space="preserve">term</w:t>
+        </w:r>
+      </w:hyperlink>
+      <w:r>
+        <w:rPr>
+          <w:b/>
+          <w:bCs/>
+        </w:rPr>
+        <w:t xml:space="preserve"> </w:t>
+      </w:r>
+      <w:r>
+        <w:rPr>
+          <w:b/>
+          <w:bCs/>
+        </w:rPr>
+        <w:t xml:space="preserve">where the sentence uses it, not in a parenthetical list:</w:t>
+      </w:r>
+      <w:r>
+        <w:t xml:space="preserve"> </w:t>
+      </w:r>
+      <w:r>
+        <w:t xml:space="preserve">Write the name as a link inside the sentence that needs it.</w:t>
+      </w:r>
+      <w:r>
+        <w:t xml:space="preserve"> </w:t>
+      </w:r>
+      <w:r>
+        <w:t xml:space="preserve">Do not name the concepts in the sentence and then list their definitions in a parenthetical after it.</w:t>
+      </w:r>
+      <w:r>
+        <w:t xml:space="preserve"> </w:t>
+      </w:r>
+      <w:r>
+        <w:t xml:space="preserve">For example, write</w:t>
+      </w:r>
+      <w:r>
+        <w:t xml:space="preserve"> </w:t>
+      </w:r>
+      <w:r>
+        <w:rPr>
+          <w:rStyle w:val="VerbatimChar"/>
+        </w:rPr>
+        <w:t xml:space="preserve">the error is the sum of its squared [bias](#def-bias), its [variance](#def-variance), and the [irreducible error](#def-irreducible-error)</w:t>
+      </w:r>
+      <w:r>
+        <w:t xml:space="preserve">,</w:t>
+      </w:r>
+      <w:r>
+        <w:t xml:space="preserve"> </w:t>
+      </w:r>
+      <w:r>
+        <w:t xml:space="preserve">not</w:t>
+      </w:r>
+      <w:r>
+        <w:t xml:space="preserve"> </w:t>
+      </w:r>
+      <w:r>
+        <w:rPr>
+          <w:rStyle w:val="VerbatimChar"/>
+        </w:rPr>
+        <w:t xml:space="preserve">the error is the sum of its squared bias, its variance, and the irreducible error (definitions: [bias](#def-bias), [variance](#def-variance), [irreducible error](#def-irreducible-error))</w:t>
+      </w:r>
+      <w:r>
+        <w:t xml:space="preserve">.</w:t>
+      </w:r>
+      <w:r>
+        <w:t xml:space="preserve"> </w:t>
+      </w:r>
+      <w:r>
+        <w:t xml:space="preserve">The parenthetical makes the reader read each term twice,</w:t>
+      </w:r>
+      <w:r>
+        <w:t xml:space="preserve"> </w:t>
+      </w:r>
+      <w:r>
+        <w:t xml:space="preserve">and it separates the link from the place where the term does its work.</w:t>
+      </w:r>
+      <w:r>
+        <w:t xml:space="preserve"> </w:t>
+      </w:r>
+      <w:r>
+        <w:t xml:space="preserve">If a term sits inside math, where a link cannot go,</w:t>
+      </w:r>
+      <w:r>
+        <w:t xml:space="preserve"> </w:t>
+      </w:r>
+      <w:r>
+        <w:t xml:space="preserve">name the term in words in the sentence and link those words.</w:t>
+      </w:r>
+      <w:r>
+        <w:t xml:space="preserve"> </w:t>
+      </w:r>
+      <w:r>
+        <w:t xml:space="preserve">The</w:t>
+      </w:r>
+      <w:r>
+        <w:t xml:space="preserve"> </w:t>
+      </w:r>
+      <w:r>
+        <w:rPr>
+          <w:rStyle w:val="VerbatimChar"/>
+        </w:rPr>
+        <w:t xml:space="preserve">check-quarto-prose</w:t>
+      </w:r>
+      <w:r>
+        <w:t xml:space="preserve"> </w:t>
+      </w:r>
+      <w:r>
+        <w:t xml:space="preserve">check in</w:t>
+      </w:r>
+      <w:r>
+        <w:t xml:space="preserve"> </w:t>
+      </w:r>
+      <w:hyperlink r:id="rId18">
+        <w:r>
+          <w:rPr>
+            <w:rStyle w:val="Hyperlink"/>
+          </w:rPr>
+          <w:t xml:space="preserve">gha</w:t>
+        </w:r>
+      </w:hyperlink>
+      <w:r>
+        <w:t xml:space="preserve"> </w:t>
+      </w:r>
+      <w:r>
+        <w:t xml:space="preserve">flags a parenthetical that opens with</w:t>
+      </w:r>
+      <w:r>
+        <w:t xml:space="preserve"> </w:t>
+      </w:r>
+      <w:r>
+        <w:rPr>
+          <w:rStyle w:val="VerbatimChar"/>
+        </w:rPr>
+        <w:t xml:space="preserve">(definition:</w:t>
+      </w:r>
+      <w:r>
+        <w:t xml:space="preserve"> </w:t>
+      </w:r>
+      <w:r>
+        <w:t xml:space="preserve">or</w:t>
+      </w:r>
+      <w:r>
+        <w:t xml:space="preserve"> </w:t>
+      </w:r>
+      <w:r>
+        <w:rPr>
+          <w:rStyle w:val="VerbatimChar"/>
+        </w:rPr>
+        <w:t xml:space="preserve">(definitions:</w:t>
+      </w:r>
+      <w:r>
+        <w:t xml:space="preserve">.</w:t>
+      </w:r>
+    </w:p>
+    <w:p>
+      <w:pPr>
+        <w:numPr>
+          <w:ilvl w:val="0"/>
+          <w:numId w:val="1001"/>
+        </w:numPr>
+      </w:pPr>
+      <w:r>
+        <w:rPr>
+          <w:b/>
+          <w:bCs/>
+        </w:rPr>
         <w:t xml:space="preserve">Do not presuppose what the reader has not encountered:</w:t>
       </w:r>
       <w:r>
@@ -3825,7 +4008,7 @@
         <w:t xml:space="preserve">A reader who needs one of them can then link to exactly that one.</w:t>
       </w:r>
     </w:p>
-    <w:bookmarkStart w:id="18" w:name="exm-one-definition-per-div"/>
+    <w:bookmarkStart w:id="19" w:name="exm-one-definition-per-div"/>
     <w:p>
       <w:pPr>
         <w:numPr>
@@ -4365,7 +4548,7 @@
         <w:t xml:space="preserve">and each needs its own example.</w:t>
       </w:r>
     </w:p>
-    <w:bookmarkEnd w:id="18"/>
+    <w:bookmarkEnd w:id="19"/>
     <w:p>
       <w:pPr>
         <w:numPr>
@@ -4566,7 +4749,7 @@
       <w:r>
         <w:t xml:space="preserve"> </w:t>
       </w:r>
-      <w:hyperlink r:id="rId19">
+      <w:hyperlink r:id="rId20">
         <w:r>
           <w:rPr>
             <w:rStyle w:val="Hyperlink"/>
@@ -7914,8 +8097,8 @@
         <w:t xml:space="preserve">When in doubt, keep it.</w:t>
       </w:r>
     </w:p>
-    <w:bookmarkEnd w:id="20"/>
-    <w:bookmarkStart w:id="27" w:name="examples-of-term-definitions"/>
+    <w:bookmarkEnd w:id="21"/>
+    <w:bookmarkStart w:id="28" w:name="examples-of-term-definitions"/>
     <w:p>
       <w:pPr>
         <w:pStyle w:val="Heading2"/>
@@ -7932,7 +8115,7 @@
         <w:t xml:space="preserve">Here are examples of well-defined terms:</w:t>
       </w:r>
     </w:p>
-    <w:bookmarkStart w:id="21" w:name="def-confidence-interval"/>
+    <w:bookmarkStart w:id="22" w:name="def-confidence-interval"/>
     <w:p>
       <w:pPr>
         <w:pStyle w:val="BodyText"/>
@@ -8169,8 +8352,8 @@
         </m:oMath>
       </m:oMathPara>
     </w:p>
-    <w:bookmarkEnd w:id="21"/>
-    <w:bookmarkStart w:id="22" w:name="exm-confidence-interval"/>
+    <w:bookmarkEnd w:id="22"/>
+    <w:bookmarkStart w:id="23" w:name="exm-confidence-interval"/>
     <w:p>
       <w:pPr>
         <w:pStyle w:val="FirstParagraph"/>
@@ -8212,8 +8395,8 @@
         <w:t xml:space="preserve">we are 95% confident that the true population mean height falls within this range.</w:t>
       </w:r>
     </w:p>
-    <w:bookmarkEnd w:id="22"/>
-    <w:bookmarkStart w:id="23" w:name="exm-not-confidence-interval"/>
+    <w:bookmarkEnd w:id="23"/>
+    <w:bookmarkStart w:id="24" w:name="exm-not-confidence-interval"/>
     <w:p>
       <w:pPr>
         <w:pStyle w:val="BodyText"/>
@@ -8273,8 +8456,8 @@
         <w:t xml:space="preserve">and it does not shrink as the sample grows.</w:t>
       </w:r>
     </w:p>
-    <w:bookmarkEnd w:id="23"/>
-    <w:bookmarkStart w:id="24" w:name="def-active-voice"/>
+    <w:bookmarkEnd w:id="24"/>
+    <w:bookmarkStart w:id="25" w:name="def-active-voice"/>
     <w:p>
       <w:pPr>
         <w:pStyle w:val="BodyText"/>
@@ -8303,8 +8486,8 @@
         <w:t xml:space="preserve">is a sentence structure where the subject performs the action expressed by the verb.</w:t>
       </w:r>
     </w:p>
-    <w:bookmarkEnd w:id="24"/>
-    <w:bookmarkStart w:id="25" w:name="exm-active-voice"/>
+    <w:bookmarkEnd w:id="25"/>
+    <w:bookmarkStart w:id="26" w:name="exm-active-voice"/>
     <w:p>
       <w:pPr>
         <w:pStyle w:val="BodyText"/>
@@ -8364,8 +8547,8 @@
         <w:t xml:space="preserve">.</w:t>
       </w:r>
     </w:p>
-    <w:bookmarkEnd w:id="25"/>
-    <w:bookmarkStart w:id="26" w:name="exm-passive-voice"/>
+    <w:bookmarkEnd w:id="26"/>
+    <w:bookmarkStart w:id="27" w:name="exm-passive-voice"/>
     <w:p>
       <w:pPr>
         <w:pStyle w:val="BodyText"/>
@@ -8428,9 +8611,9 @@
         <w:t xml:space="preserve">so the sentence is in passive voice.</w:t>
       </w:r>
     </w:p>
-    <w:bookmarkEnd w:id="26"/>
     <w:bookmarkEnd w:id="27"/>
-    <w:bookmarkStart w:id="32" w:name="order-general-definition-then-examples"/>
+    <w:bookmarkEnd w:id="28"/>
+    <w:bookmarkStart w:id="33" w:name="order-general-definition-then-examples"/>
     <w:p>
       <w:pPr>
         <w:pStyle w:val="Heading2"/>
@@ -8543,7 +8726,7 @@
         <w:t xml:space="preserve">would give these blocks, in this order:</w:t>
       </w:r>
     </w:p>
-    <w:bookmarkStart w:id="28" w:name="def-rss"/>
+    <w:bookmarkStart w:id="29" w:name="def-rss"/>
     <w:p>
       <w:pPr>
         <w:pStyle w:val="BodyText"/>
@@ -8661,8 +8844,8 @@
         </m:oMath>
       </m:oMathPara>
     </w:p>
-    <w:bookmarkEnd w:id="28"/>
-    <w:bookmarkStart w:id="29" w:name="exm-rss-line"/>
+    <w:bookmarkEnd w:id="29"/>
+    <w:bookmarkStart w:id="30" w:name="exm-rss-line"/>
     <w:p>
       <w:pPr>
         <w:pStyle w:val="FirstParagraph"/>
@@ -8994,8 +9177,8 @@
         </m:oMath>
       </m:oMathPara>
     </w:p>
-    <w:bookmarkEnd w:id="29"/>
-    <w:bookmarkStart w:id="30" w:name="exm-rss-three-points"/>
+    <w:bookmarkEnd w:id="30"/>
+    <w:bookmarkStart w:id="31" w:name="exm-rss-three-points"/>
     <w:p>
       <w:pPr>
         <w:pStyle w:val="FirstParagraph"/>
@@ -9284,8 +9467,8 @@
         <w:t xml:space="preserve">.</w:t>
       </w:r>
     </w:p>
-    <w:bookmarkEnd w:id="30"/>
-    <w:bookmarkStart w:id="31" w:name="exm-not-rss"/>
+    <w:bookmarkEnd w:id="31"/>
+    <w:bookmarkStart w:id="32" w:name="exm-not-rss"/>
     <w:p>
       <w:pPr>
         <w:pStyle w:val="BodyText"/>
@@ -9428,7 +9611,7 @@
         <w:t xml:space="preserve">rather than around the line’s fitted values.</w:t>
       </w:r>
     </w:p>
-    <w:bookmarkEnd w:id="31"/>
+    <w:bookmarkEnd w:id="32"/>
     <w:p>
       <w:pPr>
         <w:pStyle w:val="BodyText"/>
@@ -9467,8 +9650,8 @@
         <w:t xml:space="preserve">once the reader knows what the definition covers.</w:t>
       </w:r>
     </w:p>
-    <w:bookmarkEnd w:id="32"/>
-    <w:bookmarkStart w:id="36" w:name="X35ef0536ddd4dcadf17366e9cbbad09e6282954"/>
+    <w:bookmarkEnd w:id="33"/>
+    <w:bookmarkStart w:id="37" w:name="X35ef0536ddd4dcadf17366e9cbbad09e6282954"/>
     <w:p>
       <w:pPr>
         <w:pStyle w:val="Heading2"/>
@@ -9523,7 +9706,7 @@
       <w:r>
         <w:t xml:space="preserve"> </w:t>
       </w:r>
-      <w:hyperlink r:id="rId33">
+      <w:hyperlink r:id="rId34">
         <w:r>
           <w:rPr>
             <w:rStyle w:val="Hyperlink"/>
@@ -9541,7 +9724,7 @@
         <w:t xml:space="preserve">A term with no mathematical form, such as active voice, keeps its prose definition alone.</w:t>
       </w:r>
     </w:p>
-    <w:bookmarkStart w:id="34" w:name="def-variance-expression-and-prose"/>
+    <w:bookmarkStart w:id="35" w:name="def-variance-expression-and-prose"/>
     <w:p>
       <w:pPr>
         <w:pStyle w:val="BodyText"/>
@@ -9744,8 +9927,8 @@
         <w:t xml:space="preserve">from its population mean.</w:t>
       </w:r>
     </w:p>
-    <w:bookmarkEnd w:id="34"/>
-    <w:bookmarkStart w:id="35" w:name="exm-not-expression-and-prose"/>
+    <w:bookmarkEnd w:id="35"/>
+    <w:bookmarkStart w:id="36" w:name="exm-not-expression-and-prose"/>
     <w:p>
       <w:pPr>
         <w:pStyle w:val="BodyText"/>
@@ -9904,9 +10087,9 @@
         <w:t xml:space="preserve">gives both.</w:t>
       </w:r>
     </w:p>
-    <w:bookmarkEnd w:id="35"/>
     <w:bookmarkEnd w:id="36"/>
-    <w:bookmarkStart w:id="37" w:name="why-examples-matter"/>
+    <w:bookmarkEnd w:id="37"/>
+    <w:bookmarkStart w:id="38" w:name="why-examples-matter"/>
     <w:p>
       <w:pPr>
         <w:pStyle w:val="Heading2"/>
@@ -10058,8 +10241,8 @@
         <w:t xml:space="preserve">which is where readers most often misapply it.</w:t>
       </w:r>
     </w:p>
-    <w:bookmarkEnd w:id="37"/>
-    <w:bookmarkStart w:id="38" w:name="common-pitfalls-to-avoid"/>
+    <w:bookmarkEnd w:id="38"/>
+    <w:bookmarkStart w:id="39" w:name="common-pitfalls-to-avoid"/>
     <w:p>
       <w:pPr>
         <w:pStyle w:val="Heading2"/>
@@ -10313,8 +10496,8 @@
         <w:t xml:space="preserve">of the definition they are meant to demonstrate.</w:t>
       </w:r>
     </w:p>
-    <w:bookmarkEnd w:id="38"/>
-    <w:bookmarkStart w:id="46" w:name="mathematical-statements-require-examples"/>
+    <w:bookmarkEnd w:id="39"/>
+    <w:bookmarkStart w:id="47" w:name="mathematical-statements-require-examples"/>
     <w:p>
       <w:pPr>
         <w:pStyle w:val="Heading2"/>
@@ -10367,7 +10550,7 @@
         <w:t xml:space="preserve">when readers can see concrete instances.</w:t>
       </w:r>
     </w:p>
-    <w:bookmarkStart w:id="40" w:name="using-theorem-environments-in-quarto"/>
+    <w:bookmarkStart w:id="41" w:name="using-theorem-environments-in-quarto"/>
     <w:p>
       <w:pPr>
         <w:pStyle w:val="Heading3"/>
@@ -10660,7 +10843,7 @@
       <w:r>
         <w:t xml:space="preserve"> </w:t>
       </w:r>
-      <w:hyperlink r:id="rId39">
+      <w:hyperlink r:id="rId40">
         <w:r>
           <w:rPr>
             <w:rStyle w:val="Hyperlink"/>
@@ -10787,8 +10970,8 @@
         <w:t xml:space="preserve">.</w:t>
       </w:r>
     </w:p>
-    <w:bookmarkEnd w:id="40"/>
-    <w:bookmarkStart w:id="45" w:name="example-pythagorean-theorem"/>
+    <w:bookmarkEnd w:id="41"/>
+    <w:bookmarkStart w:id="46" w:name="example-pythagorean-theorem"/>
     <w:p>
       <w:pPr>
         <w:pStyle w:val="Heading3"/>
@@ -10797,7 +10980,7 @@
         <w:t xml:space="preserve">7.2 Example: Pythagorean theorem</w:t>
       </w:r>
     </w:p>
-    <w:bookmarkStart w:id="41" w:name="thm-pythagoras"/>
+    <w:bookmarkStart w:id="42" w:name="thm-pythagoras"/>
     <w:p>
       <w:pPr>
         <w:pStyle w:val="FirstParagraph"/>
@@ -10888,8 +11071,8 @@
         </m:oMath>
       </m:oMathPara>
     </w:p>
-    <w:bookmarkEnd w:id="41"/>
-    <w:bookmarkStart w:id="42" w:name="exm-pythagoras"/>
+    <w:bookmarkEnd w:id="42"/>
+    <w:bookmarkStart w:id="43" w:name="exm-pythagoras"/>
     <w:p>
       <w:pPr>
         <w:pStyle w:val="FirstParagraph"/>
@@ -11018,8 +11201,8 @@
         </m:oMath>
       </m:oMathPara>
     </w:p>
-    <w:bookmarkEnd w:id="42"/>
-    <w:bookmarkStart w:id="43" w:name="def-postulate"/>
+    <w:bookmarkEnd w:id="43"/>
+    <w:bookmarkStart w:id="44" w:name="def-postulate"/>
     <w:p>
       <w:pPr>
         <w:pStyle w:val="FirstParagraph"/>
@@ -11073,8 +11256,8 @@
         <w:t xml:space="preserve">serving as a starting point for further reasoning.</w:t>
       </w:r>
     </w:p>
-    <w:bookmarkEnd w:id="43"/>
-    <w:bookmarkStart w:id="44" w:name="exm-parallel-postulate"/>
+    <w:bookmarkEnd w:id="44"/>
+    <w:bookmarkStart w:id="45" w:name="exm-parallel-postulate"/>
     <w:p>
       <w:pPr>
         <w:pStyle w:val="BodyText"/>
@@ -11177,10 +11360,10 @@
         <w:t xml:space="preserve">.</w:t>
       </w:r>
     </w:p>
-    <w:bookmarkEnd w:id="44"/>
     <w:bookmarkEnd w:id="45"/>
     <w:bookmarkEnd w:id="46"/>
-    <w:bookmarkStart w:id="55" w:name="Xe6c88c177e563d1f046037569009a36fd08f4bd"/>
+    <w:bookmarkEnd w:id="47"/>
+    <w:bookmarkStart w:id="56" w:name="Xe6c88c177e563d1f046037569009a36fd08f4bd"/>
     <w:p>
       <w:pPr>
         <w:pStyle w:val="Heading2"/>
@@ -11399,7 +11582,7 @@
       <w:r>
         <w:t xml:space="preserve"> </w:t>
       </w:r>
-      <w:hyperlink r:id="rId47">
+      <w:hyperlink r:id="rId48">
         <w:r>
           <w:rPr>
             <w:rStyle w:val="Hyperlink"/>
@@ -11475,7 +11658,7 @@
       <w:r>
         <w:t xml:space="preserve"> </w:t>
       </w:r>
-      <w:hyperlink r:id="rId48">
+      <w:hyperlink r:id="rId49">
         <w:r>
           <w:rPr>
             <w:rStyle w:val="Hyperlink"/>
@@ -11726,7 +11909,7 @@
         <w:t xml:space="preserve">is an ordinary step, not the pattern to avoid.</w:t>
       </w:r>
     </w:p>
-    <w:bookmarkStart w:id="49" w:name="def-sample-mean"/>
+    <w:bookmarkStart w:id="50" w:name="def-sample-mean"/>
     <w:p>
       <w:pPr>
         <w:pStyle w:val="FirstParagraph"/>
@@ -11911,8 +12094,8 @@
         </m:oMath>
       </m:oMathPara>
     </w:p>
-    <w:bookmarkEnd w:id="49"/>
-    <w:bookmarkStart w:id="50" w:name="exr-sum-deviations"/>
+    <w:bookmarkEnd w:id="50"/>
+    <w:bookmarkStart w:id="51" w:name="exr-sum-deviations"/>
     <w:p>
       <w:pPr>
         <w:pStyle w:val="FirstParagraph"/>
@@ -12067,8 +12250,8 @@
         <w:t xml:space="preserve">).</w:t>
       </w:r>
     </w:p>
-    <w:bookmarkEnd w:id="50"/>
-    <w:bookmarkStart w:id="51" w:name="sol-sum-deviations"/>
+    <w:bookmarkEnd w:id="51"/>
+    <w:bookmarkStart w:id="52" w:name="sol-sum-deviations"/>
     <w:p>
       <w:pPr>
         <w:pStyle w:val="BodyText"/>
@@ -12519,8 +12702,8 @@
         </m:oMath>
       </m:oMathPara>
     </w:p>
-    <w:bookmarkEnd w:id="51"/>
-    <w:bookmarkStart w:id="52" w:name="thm-sum-deviations"/>
+    <w:bookmarkEnd w:id="52"/>
+    <w:bookmarkStart w:id="53" w:name="thm-sum-deviations"/>
     <w:p>
       <w:pPr>
         <w:pStyle w:val="FirstParagraph"/>
@@ -12726,7 +12909,7 @@
         </m:oMath>
       </m:oMathPara>
     </w:p>
-    <w:bookmarkEnd w:id="52"/>
+    <w:bookmarkEnd w:id="53"/>
     <w:p>
       <w:pPr>
         <w:pStyle w:val="FirstParagraph"/>
@@ -12756,7 +12939,7 @@
         <w:t xml:space="preserve">derives this result.</w:t>
       </w:r>
     </w:p>
-    <w:bookmarkStart w:id="53" w:name="exm-derivation-direction"/>
+    <w:bookmarkStart w:id="54" w:name="exm-derivation-direction"/>
     <w:p>
       <w:pPr>
         <w:pStyle w:val="BodyText"/>
@@ -13820,7 +14003,7 @@
       <w:r>
         <w:t xml:space="preserve"> </w:t>
       </w:r>
-      <w:hyperlink r:id="rId48">
+      <w:hyperlink r:id="rId49">
         <w:r>
           <w:rPr>
             <w:rStyle w:val="Hyperlink"/>
@@ -13832,8 +14015,8 @@
         <w:t xml:space="preserve">).</w:t>
       </w:r>
     </w:p>
-    <w:bookmarkEnd w:id="53"/>
-    <w:bookmarkStart w:id="54" w:name="exm-one-result-per-theorem"/>
+    <w:bookmarkEnd w:id="54"/>
+    <w:bookmarkStart w:id="55" w:name="exm-one-result-per-theorem"/>
     <w:p>
       <w:pPr>
         <w:pStyle w:val="BodyText"/>
@@ -14317,8 +14500,8 @@
         <w:t xml:space="preserve">and a later step that uses only the first can cite only the first.</w:t>
       </w:r>
     </w:p>
-    <w:bookmarkEnd w:id="54"/>
     <w:bookmarkEnd w:id="55"/>
+    <w:bookmarkEnd w:id="56"/>
     <w:sectPr>
       <w:footnotePr>
         <w:numRestart w:val="eachSect"/>

</xml_diff>

<commit_message>
Deploying to gh-pages from @ Morrison-Lab/psw@1729f81d2c1ce0726335d2f8aaad67e180140b67 🚀
</commit_message>
<xml_diff>
--- a/chapters/defining-terms.docx
+++ b/chapters/defining-terms.docx
@@ -15,7 +15,7 @@
         <w:pStyle w:val="Date"/>
       </w:pPr>
       <w:r>
-        <w:t xml:space="preserve">Last modified: 2026-10-27 13:10:13 (PDT)</w:t>
+        <w:t xml:space="preserve">Last modified: 2026-10-27 20:13:11 (PDT)</w:t>
       </w:r>
     </w:p>
     <w:p>
@@ -3365,7 +3365,7 @@
         <w:rPr>
           <w:rStyle w:val="VerbatimChar"/>
         </w:rPr>
-        <w:t xml:space="preserve">the error is the sum of its squared [bias](#def-bias), its [variance](#def-variance), and the [irreducible error](#def-irreducible-error)</w:t>
+        <w:t xml:space="preserve">the expected squared prediction error is the sum of the squared [bias](#def-bias), the [variance](#def-variance), and the [residual variance](#def-residual-variance)</w:t>
       </w:r>
       <w:r>
         <w:t xml:space="preserve">,</w:t>
@@ -3383,7 +3383,7 @@
         <w:rPr>
           <w:rStyle w:val="VerbatimChar"/>
         </w:rPr>
-        <w:t xml:space="preserve">the error is the sum of its squared bias, its variance, and the irreducible error (definitions: [bias](#def-bias), [variance](#def-variance), [irreducible error](#def-irreducible-error))</w:t>
+        <w:t xml:space="preserve">the expected squared prediction error is the sum of the squared bias, the variance, and the residual variance (definitions: [bias](#def-bias), [variance](#def-variance), [residual variance](#def-residual-variance))</w:t>
       </w:r>
       <w:r>
         <w:t xml:space="preserve">.</w:t>

</xml_diff>

<commit_message>
Deploying to gh-pages from @ Morrison-Lab/psw@5a66446db6e6145081415ad2df33bb28248570dc 🚀
</commit_message>
<xml_diff>
--- a/chapters/defining-terms.docx
+++ b/chapters/defining-terms.docx
@@ -15,7 +15,7 @@
         <w:pStyle w:val="Date"/>
       </w:pPr>
       <w:r>
-        <w:t xml:space="preserve">Last modified: 2026-10-27 21:52:02 (PDT)</w:t>
+        <w:t xml:space="preserve">Last modified: 2026-10-28 00:14:18 (PDT)</w:t>
       </w:r>
     </w:p>
     <w:p>
@@ -29,7 +29,24 @@
         <w:t xml:space="preserve"> </w:t>
       </w:r>
       <w:r>
-        <w:t xml:space="preserve">Every specialized term should have an explicit,</w:t>
+        <w:t xml:space="preserve">Every specialized</w:t>
+      </w:r>
+      <w:r>
+        <w:t xml:space="preserve"> </w:t>
+      </w:r>
+      <w:hyperlink w:anchor="def-term">
+        <w:r>
+          <w:rPr>
+            <w:rStyle w:val="Hyperlink"/>
+          </w:rPr>
+          <w:t xml:space="preserve">term</w:t>
+        </w:r>
+      </w:hyperlink>
+      <w:r>
+        <w:t xml:space="preserve"> </w:t>
+      </w:r>
+      <w:r>
+        <w:t xml:space="preserve">should have an explicit,</w:t>
       </w:r>
       <w:r>
         <w:t xml:space="preserve"> </w:t>
@@ -490,7 +507,7 @@
       </w:r>
     </w:p>
     <w:bookmarkEnd w:id="15"/>
-    <w:bookmarkStart w:id="21" w:name="guidelines-for-defining-terms"/>
+    <w:bookmarkStart w:id="22" w:name="guidelines-for-defining-terms"/>
     <w:p>
       <w:pPr>
         <w:pStyle w:val="Heading2"/>
@@ -504,7 +521,21 @@
         <w:pStyle w:val="FirstParagraph"/>
       </w:pPr>
       <w:r>
-        <w:t xml:space="preserve">Follow these principles when introducing new terms:</w:t>
+        <w:t xml:space="preserve">Follow these principles when introducing new</w:t>
+      </w:r>
+      <w:r>
+        <w:t xml:space="preserve"> </w:t>
+      </w:r>
+      <w:hyperlink w:anchor="def-term">
+        <w:r>
+          <w:rPr>
+            <w:rStyle w:val="Hyperlink"/>
+          </w:rPr>
+          <w:t xml:space="preserve">term</w:t>
+        </w:r>
+      </w:hyperlink>
+      <w:r>
+        <w:t xml:space="preserve">s:</w:t>
       </w:r>
     </w:p>
     <w:p>
@@ -1019,7 +1050,21 @@
         <w:t xml:space="preserve"> </w:t>
       </w:r>
       <w:r>
-        <w:t xml:space="preserve">centered on a named mean function.</w:t>
+        <w:t xml:space="preserve">centered on a named mean</w:t>
+      </w:r>
+      <w:r>
+        <w:t xml:space="preserve"> </w:t>
+      </w:r>
+      <w:hyperlink r:id="rId16">
+        <w:r>
+          <w:rPr>
+            <w:rStyle w:val="Hyperlink"/>
+          </w:rPr>
+          <w:t xml:space="preserve">function</w:t>
+        </w:r>
+      </w:hyperlink>
+      <w:r>
+        <w:t xml:space="preserve">.</w:t>
       </w:r>
       <w:r>
         <w:t xml:space="preserve"> </w:t>
@@ -1737,7 +1782,24 @@
         <w:t xml:space="preserve"> </w:t>
       </w:r>
       <w:r>
-        <w:t xml:space="preserve">from the population mean</w:t>
+        <w:t xml:space="preserve">from the</w:t>
+      </w:r>
+      <w:r>
+        <w:t xml:space="preserve"> </w:t>
+      </w:r>
+      <w:hyperlink w:anchor="def-population">
+        <w:r>
+          <w:rPr>
+            <w:rStyle w:val="Hyperlink"/>
+          </w:rPr>
+          <w:t xml:space="preserve">population</w:t>
+        </w:r>
+      </w:hyperlink>
+      <w:r>
+        <w:t xml:space="preserve"> </w:t>
+      </w:r>
+      <w:r>
+        <w:t xml:space="preserve">mean</w:t>
       </w:r>
       <w:r>
         <w:t xml:space="preserve"> </w:t>
@@ -1754,7 +1816,24 @@
         <w:t xml:space="preserve"> </w:t>
       </w:r>
       <w:r>
-        <w:t xml:space="preserve">define the sample mean of the deviations as</w:t>
+        <w:t xml:space="preserve">define the</w:t>
+      </w:r>
+      <w:r>
+        <w:t xml:space="preserve"> </w:t>
+      </w:r>
+      <w:hyperlink w:anchor="def-sample-mean">
+        <w:r>
+          <w:rPr>
+            <w:rStyle w:val="Hyperlink"/>
+          </w:rPr>
+          <w:t xml:space="preserve">sample mean</w:t>
+        </w:r>
+      </w:hyperlink>
+      <w:r>
+        <w:t xml:space="preserve"> </w:t>
+      </w:r>
+      <w:r>
+        <w:t xml:space="preserve">of the deviations as</w:t>
       </w:r>
     </w:p>
     <w:p>
@@ -2630,7 +2709,7 @@
       <w:r>
         <w:t xml:space="preserve"> </w:t>
       </w:r>
-      <w:hyperlink r:id="rId16">
+      <w:hyperlink r:id="rId17">
         <w:r>
           <w:rPr>
             <w:rStyle w:val="Hyperlink"/>
@@ -3420,162 +3499,6 @@
       <w:r>
         <w:t xml:space="preserve"> </w:t>
       </w:r>
-      <w:hyperlink r:id="rId17">
-        <w:r>
-          <w:rPr>
-            <w:rStyle w:val="Hyperlink"/>
-          </w:rPr>
-          <w:t xml:space="preserve">gha</w:t>
-        </w:r>
-      </w:hyperlink>
-      <w:r>
-        <w:t xml:space="preserve"> </w:t>
-      </w:r>
-      <w:r>
-        <w:t xml:space="preserve">flags a partial link.</w:t>
-      </w:r>
-    </w:p>
-    <w:p>
-      <w:pPr>
-        <w:numPr>
-          <w:ilvl w:val="0"/>
-          <w:numId w:val="1001"/>
-        </w:numPr>
-      </w:pPr>
-      <w:r>
-        <w:rPr>
-          <w:b/>
-          <w:bCs/>
-        </w:rPr>
-        <w:t xml:space="preserve">Link the</w:t>
-      </w:r>
-      <w:r>
-        <w:rPr>
-          <w:b/>
-          <w:bCs/>
-        </w:rPr>
-        <w:t xml:space="preserve"> </w:t>
-      </w:r>
-      <w:hyperlink w:anchor="def-term">
-        <w:r>
-          <w:rPr>
-            <w:rStyle w:val="Hyperlink"/>
-            <w:b/>
-            <w:bCs/>
-          </w:rPr>
-          <w:t xml:space="preserve">term</w:t>
-        </w:r>
-      </w:hyperlink>
-      <w:r>
-        <w:rPr>
-          <w:b/>
-          <w:bCs/>
-        </w:rPr>
-        <w:t xml:space="preserve"> </w:t>
-      </w:r>
-      <w:r>
-        <w:rPr>
-          <w:b/>
-          <w:bCs/>
-        </w:rPr>
-        <w:t xml:space="preserve">where the sentence uses it, not in a parenthetical list:</w:t>
-      </w:r>
-      <w:r>
-        <w:t xml:space="preserve"> </w:t>
-      </w:r>
-      <w:r>
-        <w:t xml:space="preserve">Write the name as a link inside the sentence that needs it.</w:t>
-      </w:r>
-      <w:r>
-        <w:t xml:space="preserve"> </w:t>
-      </w:r>
-      <w:r>
-        <w:t xml:space="preserve">Do not name the concepts in the sentence and then list their definitions in a parenthetical after it.</w:t>
-      </w:r>
-      <w:r>
-        <w:t xml:space="preserve"> </w:t>
-      </w:r>
-      <w:r>
-        <w:t xml:space="preserve">For example, write</w:t>
-      </w:r>
-      <w:r>
-        <w:t xml:space="preserve"> </w:t>
-      </w:r>
-      <w:r>
-        <w:rPr>
-          <w:rStyle w:val="VerbatimChar"/>
-        </w:rPr>
-        <w:t xml:space="preserve">the expected squared prediction error is the sum of the squared [bias](#def-bias), the [variance](#def-variance), and the [residual variance](#def-residual-variance)</w:t>
-      </w:r>
-      <w:r>
-        <w:t xml:space="preserve">,</w:t>
-      </w:r>
-      <w:r>
-        <w:t xml:space="preserve"> </w:t>
-      </w:r>
-      <w:r>
-        <w:t xml:space="preserve">not</w:t>
-      </w:r>
-      <w:r>
-        <w:t xml:space="preserve"> </w:t>
-      </w:r>
-      <w:r>
-        <w:rPr>
-          <w:rStyle w:val="VerbatimChar"/>
-        </w:rPr>
-        <w:t xml:space="preserve">the expected squared prediction error is the sum of the squared bias, the variance, and the residual variance (definitions: [bias](#def-bias), [variance](#def-variance), [residual variance](#def-residual-variance))</w:t>
-      </w:r>
-      <w:r>
-        <w:t xml:space="preserve">.</w:t>
-      </w:r>
-      <w:r>
-        <w:t xml:space="preserve"> </w:t>
-      </w:r>
-      <w:r>
-        <w:t xml:space="preserve">The parenthetical makes the reader read each term twice,</w:t>
-      </w:r>
-      <w:r>
-        <w:t xml:space="preserve"> </w:t>
-      </w:r>
-      <w:r>
-        <w:t xml:space="preserve">and it separates the link from the place where the term does its work.</w:t>
-      </w:r>
-      <w:r>
-        <w:t xml:space="preserve"> </w:t>
-      </w:r>
-      <w:r>
-        <w:t xml:space="preserve">If a term sits inside math, where a link cannot go,</w:t>
-      </w:r>
-      <w:r>
-        <w:t xml:space="preserve"> </w:t>
-      </w:r>
-      <w:r>
-        <w:t xml:space="preserve">name the term in words in the sentence and link those words.</w:t>
-      </w:r>
-      <w:r>
-        <w:t xml:space="preserve"> </w:t>
-      </w:r>
-      <w:r>
-        <w:t xml:space="preserve">The</w:t>
-      </w:r>
-      <w:r>
-        <w:t xml:space="preserve"> </w:t>
-      </w:r>
-      <w:r>
-        <w:rPr>
-          <w:rStyle w:val="VerbatimChar"/>
-        </w:rPr>
-        <w:t xml:space="preserve">check-quarto-prose</w:t>
-      </w:r>
-      <w:r>
-        <w:t xml:space="preserve"> </w:t>
-      </w:r>
-      <w:r>
-        <w:t xml:space="preserve">check in</w:t>
-      </w:r>
-      <w:r>
-        <w:t xml:space="preserve"> </w:t>
-      </w:r>
       <w:hyperlink r:id="rId18">
         <w:r>
           <w:rPr>
@@ -3588,6 +3511,134 @@
         <w:t xml:space="preserve"> </w:t>
       </w:r>
       <w:r>
+        <w:t xml:space="preserve">flags a partial link.</w:t>
+      </w:r>
+    </w:p>
+    <w:p>
+      <w:pPr>
+        <w:numPr>
+          <w:ilvl w:val="0"/>
+          <w:numId w:val="1001"/>
+        </w:numPr>
+      </w:pPr>
+      <w:r>
+        <w:rPr>
+          <w:b/>
+          <w:bCs/>
+        </w:rPr>
+        <w:t xml:space="preserve">Link the term where the sentence uses it, not in a parenthetical list:</w:t>
+      </w:r>
+      <w:r>
+        <w:t xml:space="preserve"> </w:t>
+      </w:r>
+      <w:r>
+        <w:t xml:space="preserve"> </w:t>
+      </w:r>
+      <w:r>
+        <w:t xml:space="preserve">Write the name as a link inside the sentence that needs it.</w:t>
+      </w:r>
+      <w:r>
+        <w:t xml:space="preserve"> </w:t>
+      </w:r>
+      <w:r>
+        <w:t xml:space="preserve">Do not name the concepts in the sentence and then list their definitions in a parenthetical after it.</w:t>
+      </w:r>
+      <w:r>
+        <w:t xml:space="preserve"> </w:t>
+      </w:r>
+      <w:r>
+        <w:t xml:space="preserve">For example, write</w:t>
+      </w:r>
+      <w:r>
+        <w:t xml:space="preserve"> </w:t>
+      </w:r>
+      <w:r>
+        <w:rPr>
+          <w:rStyle w:val="VerbatimChar"/>
+        </w:rPr>
+        <w:t xml:space="preserve">the expected squared prediction error is the sum of the squared [bias](#def-bias), the [variance](#def-variance), and the [residual variance](#def-residual-variance)</w:t>
+      </w:r>
+      <w:r>
+        <w:t xml:space="preserve">,</w:t>
+      </w:r>
+      <w:r>
+        <w:t xml:space="preserve"> </w:t>
+      </w:r>
+      <w:r>
+        <w:t xml:space="preserve">not</w:t>
+      </w:r>
+      <w:r>
+        <w:t xml:space="preserve"> </w:t>
+      </w:r>
+      <w:r>
+        <w:rPr>
+          <w:rStyle w:val="VerbatimChar"/>
+        </w:rPr>
+        <w:t xml:space="preserve">the expected squared prediction error is the sum of the squared bias, the variance, and the residual variance (definitions: [bias](#def-bias), [variance](#def-variance), [residual variance](#def-residual-variance))</w:t>
+      </w:r>
+      <w:r>
+        <w:t xml:space="preserve">.</w:t>
+      </w:r>
+      <w:r>
+        <w:t xml:space="preserve"> </w:t>
+      </w:r>
+      <w:r>
+        <w:t xml:space="preserve">The parenthetical makes the reader read each term twice,</w:t>
+      </w:r>
+      <w:r>
+        <w:t xml:space="preserve"> </w:t>
+      </w:r>
+      <w:r>
+        <w:t xml:space="preserve">and it separates the link from the place where the term does its work.</w:t>
+      </w:r>
+      <w:r>
+        <w:t xml:space="preserve"> </w:t>
+      </w:r>
+      <w:r>
+        <w:t xml:space="preserve">If a term sits inside math, where a link cannot go,</w:t>
+      </w:r>
+      <w:r>
+        <w:t xml:space="preserve"> </w:t>
+      </w:r>
+      <w:r>
+        <w:t xml:space="preserve">name the term in words in the sentence and link those words.</w:t>
+      </w:r>
+      <w:r>
+        <w:t xml:space="preserve"> </w:t>
+      </w:r>
+      <w:r>
+        <w:t xml:space="preserve">The</w:t>
+      </w:r>
+      <w:r>
+        <w:t xml:space="preserve"> </w:t>
+      </w:r>
+      <w:r>
+        <w:rPr>
+          <w:rStyle w:val="VerbatimChar"/>
+        </w:rPr>
+        <w:t xml:space="preserve">check-quarto-prose</w:t>
+      </w:r>
+      <w:r>
+        <w:t xml:space="preserve"> </w:t>
+      </w:r>
+      <w:r>
+        <w:t xml:space="preserve">check in</w:t>
+      </w:r>
+      <w:r>
+        <w:t xml:space="preserve"> </w:t>
+      </w:r>
+      <w:hyperlink r:id="rId19">
+        <w:r>
+          <w:rPr>
+            <w:rStyle w:val="Hyperlink"/>
+          </w:rPr>
+          <w:t xml:space="preserve">gha</w:t>
+        </w:r>
+      </w:hyperlink>
+      <w:r>
+        <w:t xml:space="preserve"> </w:t>
+      </w:r>
+      <w:r>
         <w:t xml:space="preserve">flags a parenthetical that opens with</w:t>
       </w:r>
       <w:r>
@@ -4148,7 +4199,7 @@
         <w:t xml:space="preserve">A reader who needs one of them can then link to exactly that one.</w:t>
       </w:r>
     </w:p>
-    <w:bookmarkStart w:id="19" w:name="exm-one-definition-per-div"/>
+    <w:bookmarkStart w:id="20" w:name="exm-one-definition-per-div"/>
     <w:p>
       <w:pPr>
         <w:numPr>
@@ -4688,7 +4739,7 @@
         <w:t xml:space="preserve">and each needs its own example.</w:t>
       </w:r>
     </w:p>
-    <w:bookmarkEnd w:id="19"/>
+    <w:bookmarkEnd w:id="20"/>
     <w:p>
       <w:pPr>
         <w:numPr>
@@ -4797,6 +4848,9 @@
         <w:t xml:space="preserve"> </w:t>
       </w:r>
       <w:r>
+        <w:t xml:space="preserve"> </w:t>
+      </w:r>
+      <w:r>
         <w:t xml:space="preserve">and bold each where it first appears in the definition.</w:t>
       </w:r>
       <w:r>
@@ -4889,7 +4943,7 @@
       <w:r>
         <w:t xml:space="preserve"> </w:t>
       </w:r>
-      <w:hyperlink r:id="rId20">
+      <w:hyperlink r:id="rId21">
         <w:r>
           <w:rPr>
             <w:rStyle w:val="Hyperlink"/>
@@ -6302,8 +6356,19 @@
         <w:t xml:space="preserve"> </w:t>
       </w:r>
       <w:r>
-        <w:t xml:space="preserve">A prediction, an error, a bias and a variance</w:t>
-      </w:r>
+        <w:t xml:space="preserve">A prediction, an error, a bias and a</w:t>
+      </w:r>
+      <w:r>
+        <w:t xml:space="preserve"> </w:t>
+      </w:r>
+      <w:hyperlink w:anchor="def-variance-expression-and-prose">
+        <w:r>
+          <w:rPr>
+            <w:rStyle w:val="Hyperlink"/>
+          </w:rPr>
+          <w:t xml:space="preserve">variance</w:t>
+        </w:r>
+      </w:hyperlink>
       <w:r>
         <w:t xml:space="preserve"> </w:t>
       </w:r>
@@ -8237,8 +8302,8 @@
         <w:t xml:space="preserve">When in doubt, keep it.</w:t>
       </w:r>
     </w:p>
-    <w:bookmarkEnd w:id="21"/>
-    <w:bookmarkStart w:id="28" w:name="examples-of-term-definitions"/>
+    <w:bookmarkEnd w:id="22"/>
+    <w:bookmarkStart w:id="29" w:name="examples-of-term-definitions"/>
     <w:p>
       <w:pPr>
         <w:pStyle w:val="Heading2"/>
@@ -8252,10 +8317,24 @@
         <w:pStyle w:val="FirstParagraph"/>
       </w:pPr>
       <w:r>
-        <w:t xml:space="preserve">Here are examples of well-defined terms:</w:t>
+        <w:t xml:space="preserve">Here are examples of well-defined</w:t>
+      </w:r>
+      <w:r>
+        <w:t xml:space="preserve"> </w:t>
+      </w:r>
+      <w:hyperlink w:anchor="def-term">
+        <w:r>
+          <w:rPr>
+            <w:rStyle w:val="Hyperlink"/>
+          </w:rPr>
+          <w:t xml:space="preserve">term</w:t>
+        </w:r>
+      </w:hyperlink>
+      <w:r>
+        <w:t xml:space="preserve">s:</w:t>
       </w:r>
     </w:p>
-    <w:bookmarkStart w:id="22" w:name="def-confidence-interval"/>
+    <w:bookmarkStart w:id="23" w:name="def-confidence-interval"/>
     <w:p>
       <w:pPr>
         <w:pStyle w:val="BodyText"/>
@@ -8492,8 +8571,8 @@
         </m:oMath>
       </m:oMathPara>
     </w:p>
-    <w:bookmarkEnd w:id="22"/>
-    <w:bookmarkStart w:id="23" w:name="exm-confidence-interval"/>
+    <w:bookmarkEnd w:id="23"/>
+    <w:bookmarkStart w:id="24" w:name="exm-confidence-interval"/>
     <w:p>
       <w:pPr>
         <w:pStyle w:val="FirstParagraph"/>
@@ -8535,8 +8614,8 @@
         <w:t xml:space="preserve">we are 95% confident that the true population mean height falls within this range.</w:t>
       </w:r>
     </w:p>
-    <w:bookmarkEnd w:id="23"/>
-    <w:bookmarkStart w:id="24" w:name="exm-not-confidence-interval"/>
+    <w:bookmarkEnd w:id="24"/>
+    <w:bookmarkStart w:id="25" w:name="exm-not-confidence-interval"/>
     <w:p>
       <w:pPr>
         <w:pStyle w:val="BodyText"/>
@@ -8596,8 +8675,8 @@
         <w:t xml:space="preserve">and it does not shrink as the sample grows.</w:t>
       </w:r>
     </w:p>
-    <w:bookmarkEnd w:id="24"/>
-    <w:bookmarkStart w:id="25" w:name="def-active-voice"/>
+    <w:bookmarkEnd w:id="25"/>
+    <w:bookmarkStart w:id="26" w:name="def-active-voice"/>
     <w:p>
       <w:pPr>
         <w:pStyle w:val="BodyText"/>
@@ -8626,8 +8705,8 @@
         <w:t xml:space="preserve">is a sentence structure where the subject performs the action expressed by the verb.</w:t>
       </w:r>
     </w:p>
-    <w:bookmarkEnd w:id="25"/>
-    <w:bookmarkStart w:id="26" w:name="exm-active-voice"/>
+    <w:bookmarkEnd w:id="26"/>
+    <w:bookmarkStart w:id="27" w:name="exm-active-voice"/>
     <w:p>
       <w:pPr>
         <w:pStyle w:val="BodyText"/>
@@ -8687,8 +8766,8 @@
         <w:t xml:space="preserve">.</w:t>
       </w:r>
     </w:p>
-    <w:bookmarkEnd w:id="26"/>
-    <w:bookmarkStart w:id="27" w:name="exm-passive-voice"/>
+    <w:bookmarkEnd w:id="27"/>
+    <w:bookmarkStart w:id="28" w:name="exm-passive-voice"/>
     <w:p>
       <w:pPr>
         <w:pStyle w:val="BodyText"/>
@@ -8751,9 +8830,9 @@
         <w:t xml:space="preserve">so the sentence is in passive voice.</w:t>
       </w:r>
     </w:p>
-    <w:bookmarkEnd w:id="27"/>
     <w:bookmarkEnd w:id="28"/>
-    <w:bookmarkStart w:id="33" w:name="order-general-definition-then-examples"/>
+    <w:bookmarkEnd w:id="29"/>
+    <w:bookmarkStart w:id="34" w:name="order-general-definition-then-examples"/>
     <w:p>
       <w:pPr>
         <w:pStyle w:val="Heading2"/>
@@ -8803,7 +8882,21 @@
         <w:t xml:space="preserve"> </w:t>
       </w:r>
       <w:r>
-        <w:t xml:space="preserve">define the general concept first from prerequisite terms defined before it,</w:t>
+        <w:t xml:space="preserve">define the general concept first from prerequisite</w:t>
+      </w:r>
+      <w:r>
+        <w:t xml:space="preserve"> </w:t>
+      </w:r>
+      <w:hyperlink w:anchor="def-term">
+        <w:r>
+          <w:rPr>
+            <w:rStyle w:val="Hyperlink"/>
+          </w:rPr>
+          <w:t xml:space="preserve">term</w:t>
+        </w:r>
+      </w:hyperlink>
+      <w:r>
+        <w:t xml:space="preserve">s defined before it,</w:t>
       </w:r>
       <w:r>
         <w:t xml:space="preserve"> </w:t>
@@ -8857,8 +8950,19 @@
         <w:t xml:space="preserve"> </w:t>
       </w:r>
       <w:r>
-        <w:t xml:space="preserve">For example, a statistics text that defines the residual sum of squares</w:t>
-      </w:r>
+        <w:t xml:space="preserve">For example, a statistics text that defines the</w:t>
+      </w:r>
+      <w:r>
+        <w:t xml:space="preserve"> </w:t>
+      </w:r>
+      <w:hyperlink w:anchor="def-rss">
+        <w:r>
+          <w:rPr>
+            <w:rStyle w:val="Hyperlink"/>
+          </w:rPr>
+          <w:t xml:space="preserve">residual sum of squares</w:t>
+        </w:r>
+      </w:hyperlink>
       <w:r>
         <w:t xml:space="preserve"> </w:t>
       </w:r>
@@ -8866,7 +8970,7 @@
         <w:t xml:space="preserve">would give these blocks, in this order:</w:t>
       </w:r>
     </w:p>
-    <w:bookmarkStart w:id="29" w:name="def-rss"/>
+    <w:bookmarkStart w:id="30" w:name="def-rss"/>
     <w:p>
       <w:pPr>
         <w:pStyle w:val="BodyText"/>
@@ -8984,8 +9088,8 @@
         </m:oMath>
       </m:oMathPara>
     </w:p>
-    <w:bookmarkEnd w:id="29"/>
-    <w:bookmarkStart w:id="30" w:name="exm-rss-line"/>
+    <w:bookmarkEnd w:id="30"/>
+    <w:bookmarkStart w:id="31" w:name="exm-rss-line"/>
     <w:p>
       <w:pPr>
         <w:pStyle w:val="FirstParagraph"/>
@@ -9317,8 +9421,8 @@
         </m:oMath>
       </m:oMathPara>
     </w:p>
-    <w:bookmarkEnd w:id="30"/>
-    <w:bookmarkStart w:id="31" w:name="exm-rss-three-points"/>
+    <w:bookmarkEnd w:id="31"/>
+    <w:bookmarkStart w:id="32" w:name="exm-rss-three-points"/>
     <w:p>
       <w:pPr>
         <w:pStyle w:val="FirstParagraph"/>
@@ -9607,8 +9711,8 @@
         <w:t xml:space="preserve">.</w:t>
       </w:r>
     </w:p>
-    <w:bookmarkEnd w:id="31"/>
-    <w:bookmarkStart w:id="32" w:name="exm-not-rss"/>
+    <w:bookmarkEnd w:id="32"/>
+    <w:bookmarkStart w:id="33" w:name="exm-not-rss"/>
     <w:p>
       <w:pPr>
         <w:pStyle w:val="BodyText"/>
@@ -9751,7 +9855,7 @@
         <w:t xml:space="preserve">rather than around the line’s fitted values.</w:t>
       </w:r>
     </w:p>
-    <w:bookmarkEnd w:id="32"/>
+    <w:bookmarkEnd w:id="33"/>
     <w:p>
       <w:pPr>
         <w:pStyle w:val="BodyText"/>
@@ -9790,8 +9894,8 @@
         <w:t xml:space="preserve">once the reader knows what the definition covers.</w:t>
       </w:r>
     </w:p>
-    <w:bookmarkEnd w:id="33"/>
-    <w:bookmarkStart w:id="37" w:name="X35ef0536ddd4dcadf17366e9cbbad09e6282954"/>
+    <w:bookmarkEnd w:id="34"/>
+    <w:bookmarkStart w:id="38" w:name="X35ef0536ddd4dcadf17366e9cbbad09e6282954"/>
     <w:p>
       <w:pPr>
         <w:pStyle w:val="Heading2"/>
@@ -9805,7 +9909,24 @@
         <w:pStyle w:val="FirstParagraph"/>
       </w:pPr>
       <w:r>
-        <w:t xml:space="preserve">When a term names a quantity with a mathematical form,</w:t>
+        <w:t xml:space="preserve">When a</w:t>
+      </w:r>
+      <w:r>
+        <w:t xml:space="preserve"> </w:t>
+      </w:r>
+      <w:hyperlink w:anchor="def-term">
+        <w:r>
+          <w:rPr>
+            <w:rStyle w:val="Hyperlink"/>
+          </w:rPr>
+          <w:t xml:space="preserve">term</w:t>
+        </w:r>
+      </w:hyperlink>
+      <w:r>
+        <w:t xml:space="preserve"> </w:t>
+      </w:r>
+      <w:r>
+        <w:t xml:space="preserve">names a quantity with a mathematical form,</w:t>
       </w:r>
       <w:r>
         <w:t xml:space="preserve"> </w:t>
@@ -9846,7 +9967,7 @@
       <w:r>
         <w:t xml:space="preserve"> </w:t>
       </w:r>
-      <w:hyperlink r:id="rId34">
+      <w:hyperlink r:id="rId35">
         <w:r>
           <w:rPr>
             <w:rStyle w:val="Hyperlink"/>
@@ -9861,10 +9982,24 @@
         <w:t xml:space="preserve"> </w:t>
       </w:r>
       <w:r>
-        <w:t xml:space="preserve">A term with no mathematical form, such as active voice, keeps its prose definition alone.</w:t>
+        <w:t xml:space="preserve">A term with no mathematical form, such as</w:t>
+      </w:r>
+      <w:r>
+        <w:t xml:space="preserve"> </w:t>
+      </w:r>
+      <w:hyperlink w:anchor="def-active-voice">
+        <w:r>
+          <w:rPr>
+            <w:rStyle w:val="Hyperlink"/>
+          </w:rPr>
+          <w:t xml:space="preserve">active voice</w:t>
+        </w:r>
+      </w:hyperlink>
+      <w:r>
+        <w:t xml:space="preserve">, keeps its prose definition alone.</w:t>
       </w:r>
     </w:p>
-    <w:bookmarkStart w:id="35" w:name="def-variance-expression-and-prose"/>
+    <w:bookmarkStart w:id="36" w:name="def-variance-expression-and-prose"/>
     <w:p>
       <w:pPr>
         <w:pStyle w:val="BodyText"/>
@@ -10067,8 +10202,8 @@
         <w:t xml:space="preserve">from its population mean.</w:t>
       </w:r>
     </w:p>
-    <w:bookmarkEnd w:id="35"/>
-    <w:bookmarkStart w:id="36" w:name="exm-not-expression-and-prose"/>
+    <w:bookmarkEnd w:id="36"/>
+    <w:bookmarkStart w:id="37" w:name="exm-not-expression-and-prose"/>
     <w:p>
       <w:pPr>
         <w:pStyle w:val="BodyText"/>
@@ -10227,9 +10362,9 @@
         <w:t xml:space="preserve">gives both.</w:t>
       </w:r>
     </w:p>
-    <w:bookmarkEnd w:id="36"/>
     <w:bookmarkEnd w:id="37"/>
-    <w:bookmarkStart w:id="38" w:name="why-examples-matter"/>
+    <w:bookmarkEnd w:id="38"/>
+    <w:bookmarkStart w:id="39" w:name="why-examples-matter"/>
     <w:p>
       <w:pPr>
         <w:pStyle w:val="Heading2"/>
@@ -10381,8 +10516,8 @@
         <w:t xml:space="preserve">which is where readers most often misapply it.</w:t>
       </w:r>
     </w:p>
-    <w:bookmarkEnd w:id="38"/>
-    <w:bookmarkStart w:id="39" w:name="common-pitfalls-to-avoid"/>
+    <w:bookmarkEnd w:id="39"/>
+    <w:bookmarkStart w:id="40" w:name="common-pitfalls-to-avoid"/>
     <w:p>
       <w:pPr>
         <w:pStyle w:val="Heading2"/>
@@ -10409,7 +10544,24 @@
         <w:t xml:space="preserve"> </w:t>
       </w:r>
       <w:r>
-        <w:t xml:space="preserve">Do not define a term using the term itself.</w:t>
+        <w:t xml:space="preserve">Do not define a</w:t>
+      </w:r>
+      <w:r>
+        <w:t xml:space="preserve"> </w:t>
+      </w:r>
+      <w:hyperlink w:anchor="def-term">
+        <w:r>
+          <w:rPr>
+            <w:rStyle w:val="Hyperlink"/>
+          </w:rPr>
+          <w:t xml:space="preserve">term</w:t>
+        </w:r>
+      </w:hyperlink>
+      <w:r>
+        <w:t xml:space="preserve"> </w:t>
+      </w:r>
+      <w:r>
+        <w:t xml:space="preserve">using the term itself.</w:t>
       </w:r>
     </w:p>
     <w:p>
@@ -10510,7 +10662,24 @@
         <w:t xml:space="preserve"> </w:t>
       </w:r>
       <w:r>
-        <w:t xml:space="preserve">drawn from the same population as the training observations</w:t>
+        <w:t xml:space="preserve">drawn from the same</w:t>
+      </w:r>
+      <w:r>
+        <w:t xml:space="preserve"> </w:t>
+      </w:r>
+      <w:hyperlink w:anchor="def-population">
+        <w:r>
+          <w:rPr>
+            <w:rStyle w:val="Hyperlink"/>
+          </w:rPr>
+          <w:t xml:space="preserve">population</w:t>
+        </w:r>
+      </w:hyperlink>
+      <w:r>
+        <w:t xml:space="preserve"> </w:t>
+      </w:r>
+      <w:r>
+        <w:t xml:space="preserve">as the training observations</w:t>
       </w:r>
       <w:r>
         <w:t xml:space="preserve"> </w:t>
@@ -10636,8 +10805,8 @@
         <w:t xml:space="preserve">of the definition they are meant to demonstrate.</w:t>
       </w:r>
     </w:p>
-    <w:bookmarkEnd w:id="39"/>
-    <w:bookmarkStart w:id="47" w:name="mathematical-statements-require-examples"/>
+    <w:bookmarkEnd w:id="40"/>
+    <w:bookmarkStart w:id="48" w:name="mathematical-statements-require-examples"/>
     <w:p>
       <w:pPr>
         <w:pStyle w:val="Heading2"/>
@@ -10669,7 +10838,21 @@
         <w:t xml:space="preserve"> </w:t>
       </w:r>
       <w:r>
-        <w:t xml:space="preserve">and postulates should always include examples</w:t>
+        <w:t xml:space="preserve">and</w:t>
+      </w:r>
+      <w:r>
+        <w:t xml:space="preserve"> </w:t>
+      </w:r>
+      <w:hyperlink w:anchor="def-postulate">
+        <w:r>
+          <w:rPr>
+            <w:rStyle w:val="Hyperlink"/>
+          </w:rPr>
+          <w:t xml:space="preserve">postulate</w:t>
+        </w:r>
+      </w:hyperlink>
+      <w:r>
+        <w:t xml:space="preserve">s should always include examples</w:t>
       </w:r>
       <w:r>
         <w:t xml:space="preserve"> </w:t>
@@ -10690,7 +10873,7 @@
         <w:t xml:space="preserve">when readers can see concrete instances.</w:t>
       </w:r>
     </w:p>
-    <w:bookmarkStart w:id="41" w:name="using-theorem-environments-in-quarto"/>
+    <w:bookmarkStart w:id="42" w:name="using-theorem-environments-in-quarto"/>
     <w:p>
       <w:pPr>
         <w:pStyle w:val="Heading3"/>
@@ -10983,7 +11166,7 @@
       <w:r>
         <w:t xml:space="preserve"> </w:t>
       </w:r>
-      <w:hyperlink r:id="rId40">
+      <w:hyperlink r:id="rId41">
         <w:r>
           <w:rPr>
             <w:rStyle w:val="Hyperlink"/>
@@ -11110,8 +11293,8 @@
         <w:t xml:space="preserve">.</w:t>
       </w:r>
     </w:p>
-    <w:bookmarkEnd w:id="41"/>
-    <w:bookmarkStart w:id="46" w:name="example-pythagorean-theorem"/>
+    <w:bookmarkEnd w:id="42"/>
+    <w:bookmarkStart w:id="47" w:name="example-pythagorean-theorem"/>
     <w:p>
       <w:pPr>
         <w:pStyle w:val="Heading3"/>
@@ -11120,7 +11303,7 @@
         <w:t xml:space="preserve">7.2 Example: Pythagorean theorem</w:t>
       </w:r>
     </w:p>
-    <w:bookmarkStart w:id="42" w:name="thm-pythagoras"/>
+    <w:bookmarkStart w:id="43" w:name="thm-pythagoras"/>
     <w:p>
       <w:pPr>
         <w:pStyle w:val="FirstParagraph"/>
@@ -11211,8 +11394,8 @@
         </m:oMath>
       </m:oMathPara>
     </w:p>
-    <w:bookmarkEnd w:id="42"/>
-    <w:bookmarkStart w:id="43" w:name="exm-pythagoras"/>
+    <w:bookmarkEnd w:id="43"/>
+    <w:bookmarkStart w:id="44" w:name="exm-pythagoras"/>
     <w:p>
       <w:pPr>
         <w:pStyle w:val="FirstParagraph"/>
@@ -11341,8 +11524,8 @@
         </m:oMath>
       </m:oMathPara>
     </w:p>
-    <w:bookmarkEnd w:id="43"/>
-    <w:bookmarkStart w:id="44" w:name="def-postulate"/>
+    <w:bookmarkEnd w:id="44"/>
+    <w:bookmarkStart w:id="45" w:name="def-postulate"/>
     <w:p>
       <w:pPr>
         <w:pStyle w:val="FirstParagraph"/>
@@ -11396,8 +11579,8 @@
         <w:t xml:space="preserve">serving as a starting point for further reasoning.</w:t>
       </w:r>
     </w:p>
-    <w:bookmarkEnd w:id="44"/>
-    <w:bookmarkStart w:id="45" w:name="exm-parallel-postulate"/>
+    <w:bookmarkEnd w:id="45"/>
+    <w:bookmarkStart w:id="46" w:name="exm-parallel-postulate"/>
     <w:p>
       <w:pPr>
         <w:pStyle w:val="BodyText"/>
@@ -11500,10 +11683,10 @@
         <w:t xml:space="preserve">.</w:t>
       </w:r>
     </w:p>
-    <w:bookmarkEnd w:id="45"/>
     <w:bookmarkEnd w:id="46"/>
     <w:bookmarkEnd w:id="47"/>
-    <w:bookmarkStart w:id="56" w:name="Xe6c88c177e563d1f046037569009a36fd08f4bd"/>
+    <w:bookmarkEnd w:id="48"/>
+    <w:bookmarkStart w:id="57" w:name="Xe6c88c177e563d1f046037569009a36fd08f4bd"/>
     <w:p>
       <w:pPr>
         <w:pStyle w:val="Heading2"/>
@@ -11722,7 +11905,7 @@
       <w:r>
         <w:t xml:space="preserve"> </w:t>
       </w:r>
-      <w:hyperlink r:id="rId48">
+      <w:hyperlink r:id="rId49">
         <w:r>
           <w:rPr>
             <w:rStyle w:val="Hyperlink"/>
@@ -11798,7 +11981,7 @@
       <w:r>
         <w:t xml:space="preserve"> </w:t>
       </w:r>
-      <w:hyperlink r:id="rId49">
+      <w:hyperlink r:id="rId50">
         <w:r>
           <w:rPr>
             <w:rStyle w:val="Hyperlink"/>
@@ -11888,6 +12071,9 @@
       </w:r>
       <w:r>
         <w:t xml:space="preserve">When a derivation would add and subtract a term</w:t>
+      </w:r>
+      <w:r>
+        <w:t xml:space="preserve"> </w:t>
       </w:r>
       <w:r>
         <w:t xml:space="preserve"> </w:t>
@@ -12049,7 +12235,7 @@
         <w:t xml:space="preserve">is an ordinary step, not the pattern to avoid.</w:t>
       </w:r>
     </w:p>
-    <w:bookmarkStart w:id="50" w:name="def-sample-mean"/>
+    <w:bookmarkStart w:id="51" w:name="def-sample-mean"/>
     <w:p>
       <w:pPr>
         <w:pStyle w:val="FirstParagraph"/>
@@ -12234,8 +12420,8 @@
         </m:oMath>
       </m:oMathPara>
     </w:p>
-    <w:bookmarkEnd w:id="50"/>
-    <w:bookmarkStart w:id="51" w:name="exr-sum-deviations"/>
+    <w:bookmarkEnd w:id="51"/>
+    <w:bookmarkStart w:id="52" w:name="exr-sum-deviations"/>
     <w:p>
       <w:pPr>
         <w:pStyle w:val="FirstParagraph"/>
@@ -12390,8 +12576,8 @@
         <w:t xml:space="preserve">).</w:t>
       </w:r>
     </w:p>
-    <w:bookmarkEnd w:id="51"/>
-    <w:bookmarkStart w:id="52" w:name="sol-sum-deviations"/>
+    <w:bookmarkEnd w:id="52"/>
+    <w:bookmarkStart w:id="53" w:name="sol-sum-deviations"/>
     <w:p>
       <w:pPr>
         <w:pStyle w:val="BodyText"/>
@@ -12842,8 +13028,8 @@
         </m:oMath>
       </m:oMathPara>
     </w:p>
-    <w:bookmarkEnd w:id="52"/>
-    <w:bookmarkStart w:id="53" w:name="thm-sum-deviations"/>
+    <w:bookmarkEnd w:id="53"/>
+    <w:bookmarkStart w:id="54" w:name="thm-sum-deviations"/>
     <w:p>
       <w:pPr>
         <w:pStyle w:val="FirstParagraph"/>
@@ -13049,7 +13235,7 @@
         </m:oMath>
       </m:oMathPara>
     </w:p>
-    <w:bookmarkEnd w:id="53"/>
+    <w:bookmarkEnd w:id="54"/>
     <w:p>
       <w:pPr>
         <w:pStyle w:val="FirstParagraph"/>
@@ -13079,7 +13265,7 @@
         <w:t xml:space="preserve">derives this result.</w:t>
       </w:r>
     </w:p>
-    <w:bookmarkStart w:id="54" w:name="exm-derivation-direction"/>
+    <w:bookmarkStart w:id="55" w:name="exm-derivation-direction"/>
     <w:p>
       <w:pPr>
         <w:pStyle w:val="BodyText"/>
@@ -14052,6 +14238,9 @@
         <w:t xml:space="preserve"> </w:t>
       </w:r>
       <w:r>
+        <w:t xml:space="preserve"> </w:t>
+      </w:r>
+      <w:r>
         <w:t xml:space="preserve">The ✅ version starts from</w:t>
       </w:r>
       <w:r>
@@ -14143,7 +14332,7 @@
       <w:r>
         <w:t xml:space="preserve"> </w:t>
       </w:r>
-      <w:hyperlink r:id="rId49">
+      <w:hyperlink r:id="rId50">
         <w:r>
           <w:rPr>
             <w:rStyle w:val="Hyperlink"/>
@@ -14155,8 +14344,8 @@
         <w:t xml:space="preserve">).</w:t>
       </w:r>
     </w:p>
-    <w:bookmarkEnd w:id="54"/>
-    <w:bookmarkStart w:id="55" w:name="exm-one-result-per-theorem"/>
+    <w:bookmarkEnd w:id="55"/>
+    <w:bookmarkStart w:id="56" w:name="exm-one-result-per-theorem"/>
     <w:p>
       <w:pPr>
         <w:pStyle w:val="BodyText"/>
@@ -14640,8 +14829,8 @@
         <w:t xml:space="preserve">and a later step that uses only the first can cite only the first.</w:t>
       </w:r>
     </w:p>
-    <w:bookmarkEnd w:id="55"/>
     <w:bookmarkEnd w:id="56"/>
+    <w:bookmarkEnd w:id="57"/>
     <w:sectPr>
       <w:footnotePr>
         <w:numRestart w:val="eachSect"/>

</xml_diff>

<commit_message>
Deploying to gh-pages from @ Morrison-Lab/psw@6033d3971e938431c3fe29ae476493552b70b0e0 🚀
</commit_message>
<xml_diff>
--- a/chapters/defining-terms.docx
+++ b/chapters/defining-terms.docx
@@ -15,7 +15,7 @@
         <w:pStyle w:val="Date"/>
       </w:pPr>
       <w:r>
-        <w:t xml:space="preserve">Last modified: 2026-10-28 16:02:11 (PDT)</w:t>
+        <w:t xml:space="preserve">Last modified: 2026-10-28 16:35:15 (PDT)</w:t>
       </w:r>
     </w:p>
     <w:p>
@@ -507,7 +507,7 @@
       </w:r>
     </w:p>
     <w:bookmarkEnd w:id="15"/>
-    <w:bookmarkStart w:id="22" w:name="guidelines-for-defining-terms"/>
+    <w:bookmarkStart w:id="24" w:name="guidelines-for-defining-terms"/>
     <w:p>
       <w:pPr>
         <w:pStyle w:val="Heading2"/>
@@ -5134,6 +5134,198 @@
           <w:b/>
           <w:bCs/>
         </w:rPr>
+        <w:t xml:space="preserve">Keep an entrenched misnomer, and clarify it once:</w:t>
+      </w:r>
+      <w:r>
+        <w:t xml:space="preserve"> </w:t>
+      </w:r>
+      <w:r>
+        <w:t xml:space="preserve">Some names the literature has fixed are technically wrong,</w:t>
+      </w:r>
+      <w:r>
+        <w:t xml:space="preserve"> </w:t>
+      </w:r>
+      <w:r>
+        <w:t xml:space="preserve">such as</w:t>
+      </w:r>
+      <w:r>
+        <w:t xml:space="preserve"> </w:t>
+      </w:r>
+      <w:r>
+        <w:t xml:space="preserve">“linear regression”</w:t>
+      </w:r>
+      <w:r>
+        <w:t xml:space="preserve"> </w:t>
+      </w:r>
+      <w:r>
+        <w:t xml:space="preserve">for a model with an intercept,</w:t>
+      </w:r>
+      <w:r>
+        <w:t xml:space="preserve"> </w:t>
+      </w:r>
+      <w:r>
+        <w:t xml:space="preserve"> </w:t>
+      </w:r>
+      <w:r>
+        <w:t xml:space="preserve">whose mean is an</w:t>
+      </w:r>
+      <w:r>
+        <w:t xml:space="preserve"> </w:t>
+      </w:r>
+      <w:hyperlink r:id="rId22">
+        <w:r>
+          <w:rPr>
+            <w:rStyle w:val="Hyperlink"/>
+          </w:rPr>
+          <w:t xml:space="preserve">affine</w:t>
+        </w:r>
+      </w:hyperlink>
+      <w:r>
+        <w:t xml:space="preserve"> </w:t>
+      </w:r>
+      <w:hyperlink r:id="rId16">
+        <w:r>
+          <w:rPr>
+            <w:rStyle w:val="Hyperlink"/>
+          </w:rPr>
+          <w:t xml:space="preserve">function</w:t>
+        </w:r>
+      </w:hyperlink>
+      <w:r>
+        <w:t xml:space="preserve"> </w:t>
+      </w:r>
+      <w:r>
+        <w:t xml:space="preserve">of the predictors,</w:t>
+      </w:r>
+      <w:r>
+        <w:t xml:space="preserve"> </w:t>
+      </w:r>
+      <w:r>
+        <w:t xml:space="preserve">not a</w:t>
+      </w:r>
+      <w:r>
+        <w:t xml:space="preserve"> </w:t>
+      </w:r>
+      <w:hyperlink r:id="rId23">
+        <w:r>
+          <w:rPr>
+            <w:rStyle w:val="Hyperlink"/>
+          </w:rPr>
+          <w:t xml:space="preserve">linear</w:t>
+        </w:r>
+      </w:hyperlink>
+      <w:r>
+        <w:t xml:space="preserve"> </w:t>
+      </w:r>
+      <w:r>
+        <w:t xml:space="preserve">one</w:t>
+      </w:r>
+      <w:r>
+        <w:t xml:space="preserve"> </w:t>
+      </w:r>
+      <w:r>
+        <w:t xml:space="preserve">(Ezra, 2026-10-28).</w:t>
+      </w:r>
+      <w:r>
+        <w:t xml:space="preserve"> </w:t>
+      </w:r>
+      <w:r>
+        <w:t xml:space="preserve">Wherever the wording is yours, use the precise word:</w:t>
+      </w:r>
+      <w:r>
+        <w:t xml:space="preserve"> </w:t>
+      </w:r>
+      <w:r>
+        <w:t xml:space="preserve">write</w:t>
+      </w:r>
+      <w:r>
+        <w:t xml:space="preserve"> </w:t>
+      </w:r>
+      <w:r>
+        <w:t xml:space="preserve">“affine in the predictors”</w:t>
+      </w:r>
+      <w:r>
+        <w:t xml:space="preserve"> </w:t>
+      </w:r>
+      <w:r>
+        <w:t xml:space="preserve">for a function with an intercept,</w:t>
+      </w:r>
+      <w:r>
+        <w:t xml:space="preserve"> </w:t>
+      </w:r>
+      <w:r>
+        <w:t xml:space="preserve">and</w:t>
+      </w:r>
+      <w:r>
+        <w:t xml:space="preserve"> </w:t>
+      </w:r>
+      <w:r>
+        <w:t xml:space="preserve">“linear”</w:t>
+      </w:r>
+      <w:r>
+        <w:t xml:space="preserve"> </w:t>
+      </w:r>
+      <w:r>
+        <w:t xml:space="preserve">only when the intercept is zero.</w:t>
+      </w:r>
+      <w:r>
+        <w:t xml:space="preserve"> </w:t>
+      </w:r>
+      <w:r>
+        <w:t xml:space="preserve">Keep a name the reader will meet in other sources,</w:t>
+      </w:r>
+      <w:r>
+        <w:t xml:space="preserve"> </w:t>
+      </w:r>
+      <w:r>
+        <w:t xml:space="preserve">such as linear regression, linear decay or linear approximation,</w:t>
+      </w:r>
+      <w:r>
+        <w:t xml:space="preserve"> </w:t>
+      </w:r>
+      <w:r>
+        <w:t xml:space="preserve">because renaming it cuts the reader off from that literature.</w:t>
+      </w:r>
+      <w:r>
+        <w:t xml:space="preserve"> </w:t>
+      </w:r>
+      <w:r>
+        <w:t xml:space="preserve">Clarify it once, in parentheses, at its definition or its first use on a page,</w:t>
+      </w:r>
+      <w:r>
+        <w:t xml:space="preserve"> </w:t>
+      </w:r>
+      <w:r>
+        <w:t xml:space="preserve">as in</w:t>
+      </w:r>
+      <w:r>
+        <w:t xml:space="preserve"> </w:t>
+      </w:r>
+      <w:r>
+        <w:t xml:space="preserve">“linear (strictly, affine) decay”</w:t>
+      </w:r>
+      <w:r>
+        <w:t xml:space="preserve">,</w:t>
+      </w:r>
+      <w:r>
+        <w:t xml:space="preserve"> </w:t>
+      </w:r>
+      <w:r>
+        <w:t xml:space="preserve">and use the established name unqualified after that.</w:t>
+      </w:r>
+    </w:p>
+    <w:p>
+      <w:pPr>
+        <w:numPr>
+          <w:ilvl w:val="0"/>
+          <w:numId w:val="1001"/>
+        </w:numPr>
+      </w:pPr>
+      <w:r>
+        <w:rPr>
+          <w:b/>
+          <w:bCs/>
+        </w:rPr>
         <w:t xml:space="preserve">Distinguish estimands from estimators:</w:t>
       </w:r>
       <w:r>
@@ -8302,8 +8494,8 @@
         <w:t xml:space="preserve">When in doubt, keep it.</w:t>
       </w:r>
     </w:p>
-    <w:bookmarkEnd w:id="22"/>
-    <w:bookmarkStart w:id="29" w:name="examples-of-term-definitions"/>
+    <w:bookmarkEnd w:id="24"/>
+    <w:bookmarkStart w:id="31" w:name="examples-of-term-definitions"/>
     <w:p>
       <w:pPr>
         <w:pStyle w:val="Heading2"/>
@@ -8334,7 +8526,7 @@
         <w:t xml:space="preserve">s:</w:t>
       </w:r>
     </w:p>
-    <w:bookmarkStart w:id="23" w:name="def-confidence-interval"/>
+    <w:bookmarkStart w:id="25" w:name="def-confidence-interval"/>
     <w:p>
       <w:pPr>
         <w:pStyle w:val="BodyText"/>
@@ -8571,8 +8763,8 @@
         </m:oMath>
       </m:oMathPara>
     </w:p>
-    <w:bookmarkEnd w:id="23"/>
-    <w:bookmarkStart w:id="24" w:name="exm-confidence-interval"/>
+    <w:bookmarkEnd w:id="25"/>
+    <w:bookmarkStart w:id="26" w:name="exm-confidence-interval"/>
     <w:p>
       <w:pPr>
         <w:pStyle w:val="FirstParagraph"/>
@@ -8614,8 +8806,8 @@
         <w:t xml:space="preserve">we are 95% confident that the true population mean height falls within this range.</w:t>
       </w:r>
     </w:p>
-    <w:bookmarkEnd w:id="24"/>
-    <w:bookmarkStart w:id="25" w:name="exm-not-confidence-interval"/>
+    <w:bookmarkEnd w:id="26"/>
+    <w:bookmarkStart w:id="27" w:name="exm-not-confidence-interval"/>
     <w:p>
       <w:pPr>
         <w:pStyle w:val="BodyText"/>
@@ -8675,8 +8867,8 @@
         <w:t xml:space="preserve">and it does not shrink as the sample grows.</w:t>
       </w:r>
     </w:p>
-    <w:bookmarkEnd w:id="25"/>
-    <w:bookmarkStart w:id="26" w:name="def-active-voice"/>
+    <w:bookmarkEnd w:id="27"/>
+    <w:bookmarkStart w:id="28" w:name="def-active-voice"/>
     <w:p>
       <w:pPr>
         <w:pStyle w:val="BodyText"/>
@@ -8705,8 +8897,8 @@
         <w:t xml:space="preserve">is a sentence structure where the subject performs the action expressed by the verb.</w:t>
       </w:r>
     </w:p>
-    <w:bookmarkEnd w:id="26"/>
-    <w:bookmarkStart w:id="27" w:name="exm-active-voice"/>
+    <w:bookmarkEnd w:id="28"/>
+    <w:bookmarkStart w:id="29" w:name="exm-active-voice"/>
     <w:p>
       <w:pPr>
         <w:pStyle w:val="BodyText"/>
@@ -8766,8 +8958,8 @@
         <w:t xml:space="preserve">.</w:t>
       </w:r>
     </w:p>
-    <w:bookmarkEnd w:id="27"/>
-    <w:bookmarkStart w:id="28" w:name="exm-passive-voice"/>
+    <w:bookmarkEnd w:id="29"/>
+    <w:bookmarkStart w:id="30" w:name="exm-passive-voice"/>
     <w:p>
       <w:pPr>
         <w:pStyle w:val="BodyText"/>
@@ -8830,9 +9022,9 @@
         <w:t xml:space="preserve">so the sentence is in passive voice.</w:t>
       </w:r>
     </w:p>
-    <w:bookmarkEnd w:id="28"/>
-    <w:bookmarkEnd w:id="29"/>
-    <w:bookmarkStart w:id="35" w:name="order-general-definition-then-examples"/>
+    <w:bookmarkEnd w:id="30"/>
+    <w:bookmarkEnd w:id="31"/>
+    <w:bookmarkStart w:id="37" w:name="order-general-definition-then-examples"/>
     <w:p>
       <w:pPr>
         <w:pStyle w:val="Heading2"/>
@@ -8970,7 +9162,7 @@
         <w:t xml:space="preserve">would give these blocks, in this order:</w:t>
       </w:r>
     </w:p>
-    <w:bookmarkStart w:id="30" w:name="def-rss"/>
+    <w:bookmarkStart w:id="32" w:name="def-rss"/>
     <w:p>
       <w:pPr>
         <w:pStyle w:val="BodyText"/>
@@ -9088,8 +9280,8 @@
         </m:oMath>
       </m:oMathPara>
     </w:p>
-    <w:bookmarkEnd w:id="30"/>
-    <w:bookmarkStart w:id="32" w:name="exm-rss-line"/>
+    <w:bookmarkEnd w:id="32"/>
+    <w:bookmarkStart w:id="34" w:name="exm-rss-line"/>
     <w:p>
       <w:pPr>
         <w:pStyle w:val="FirstParagraph"/>
@@ -9159,7 +9351,7 @@
       <w:r>
         <w:t xml:space="preserve"> </w:t>
       </w:r>
-      <w:hyperlink r:id="rId31">
+      <w:hyperlink r:id="rId33">
         <w:r>
           <w:rPr>
             <w:rStyle w:val="Hyperlink"/>
@@ -9455,8 +9647,8 @@
         </m:oMath>
       </m:oMathPara>
     </w:p>
-    <w:bookmarkEnd w:id="32"/>
-    <w:bookmarkStart w:id="33" w:name="exm-rss-three-points"/>
+    <w:bookmarkEnd w:id="34"/>
+    <w:bookmarkStart w:id="35" w:name="exm-rss-three-points"/>
     <w:p>
       <w:pPr>
         <w:pStyle w:val="FirstParagraph"/>
@@ -9745,8 +9937,8 @@
         <w:t xml:space="preserve">.</w:t>
       </w:r>
     </w:p>
-    <w:bookmarkEnd w:id="33"/>
-    <w:bookmarkStart w:id="34" w:name="exm-not-rss"/>
+    <w:bookmarkEnd w:id="35"/>
+    <w:bookmarkStart w:id="36" w:name="exm-not-rss"/>
     <w:p>
       <w:pPr>
         <w:pStyle w:val="BodyText"/>
@@ -9891,7 +10083,7 @@
       <w:r>
         <w:t xml:space="preserve"> </w:t>
       </w:r>
-      <w:hyperlink r:id="rId31">
+      <w:hyperlink r:id="rId33">
         <w:r>
           <w:rPr>
             <w:rStyle w:val="Hyperlink"/>
@@ -9903,7 +10095,7 @@
         <w:t xml:space="preserve">s.</w:t>
       </w:r>
     </w:p>
-    <w:bookmarkEnd w:id="34"/>
+    <w:bookmarkEnd w:id="36"/>
     <w:p>
       <w:pPr>
         <w:pStyle w:val="BodyText"/>
@@ -9942,8 +10134,8 @@
         <w:t xml:space="preserve">once the reader knows what the definition covers.</w:t>
       </w:r>
     </w:p>
-    <w:bookmarkEnd w:id="35"/>
-    <w:bookmarkStart w:id="39" w:name="X35ef0536ddd4dcadf17366e9cbbad09e6282954"/>
+    <w:bookmarkEnd w:id="37"/>
+    <w:bookmarkStart w:id="41" w:name="X35ef0536ddd4dcadf17366e9cbbad09e6282954"/>
     <w:p>
       <w:pPr>
         <w:pStyle w:val="Heading2"/>
@@ -10015,7 +10207,7 @@
       <w:r>
         <w:t xml:space="preserve"> </w:t>
       </w:r>
-      <w:hyperlink r:id="rId36">
+      <w:hyperlink r:id="rId38">
         <w:r>
           <w:rPr>
             <w:rStyle w:val="Hyperlink"/>
@@ -10047,7 +10239,7 @@
         <w:t xml:space="preserve">, keeps its prose definition alone.</w:t>
       </w:r>
     </w:p>
-    <w:bookmarkStart w:id="37" w:name="def-variance-expression-and-prose"/>
+    <w:bookmarkStart w:id="39" w:name="def-variance-expression-and-prose"/>
     <w:p>
       <w:pPr>
         <w:pStyle w:val="BodyText"/>
@@ -10250,8 +10442,8 @@
         <w:t xml:space="preserve">from its population mean.</w:t>
       </w:r>
     </w:p>
-    <w:bookmarkEnd w:id="37"/>
-    <w:bookmarkStart w:id="38" w:name="exm-not-expression-and-prose"/>
+    <w:bookmarkEnd w:id="39"/>
+    <w:bookmarkStart w:id="40" w:name="exm-not-expression-and-prose"/>
     <w:p>
       <w:pPr>
         <w:pStyle w:val="BodyText"/>
@@ -10410,9 +10602,9 @@
         <w:t xml:space="preserve">gives both.</w:t>
       </w:r>
     </w:p>
-    <w:bookmarkEnd w:id="38"/>
-    <w:bookmarkEnd w:id="39"/>
-    <w:bookmarkStart w:id="40" w:name="why-examples-matter"/>
+    <w:bookmarkEnd w:id="40"/>
+    <w:bookmarkEnd w:id="41"/>
+    <w:bookmarkStart w:id="42" w:name="why-examples-matter"/>
     <w:p>
       <w:pPr>
         <w:pStyle w:val="Heading2"/>
@@ -10564,8 +10756,8 @@
         <w:t xml:space="preserve">which is where readers most often misapply it.</w:t>
       </w:r>
     </w:p>
-    <w:bookmarkEnd w:id="40"/>
-    <w:bookmarkStart w:id="41" w:name="common-pitfalls-to-avoid"/>
+    <w:bookmarkEnd w:id="42"/>
+    <w:bookmarkStart w:id="43" w:name="common-pitfalls-to-avoid"/>
     <w:p>
       <w:pPr>
         <w:pStyle w:val="Heading2"/>
@@ -10853,8 +11045,8 @@
         <w:t xml:space="preserve">of the definition they are meant to demonstrate.</w:t>
       </w:r>
     </w:p>
-    <w:bookmarkEnd w:id="41"/>
-    <w:bookmarkStart w:id="49" w:name="mathematical-statements-require-examples"/>
+    <w:bookmarkEnd w:id="43"/>
+    <w:bookmarkStart w:id="51" w:name="mathematical-statements-require-examples"/>
     <w:p>
       <w:pPr>
         <w:pStyle w:val="Heading2"/>
@@ -10921,7 +11113,7 @@
         <w:t xml:space="preserve">when readers can see concrete instances.</w:t>
       </w:r>
     </w:p>
-    <w:bookmarkStart w:id="43" w:name="using-theorem-environments-in-quarto"/>
+    <w:bookmarkStart w:id="45" w:name="using-theorem-environments-in-quarto"/>
     <w:p>
       <w:pPr>
         <w:pStyle w:val="Heading3"/>
@@ -11214,7 +11406,7 @@
       <w:r>
         <w:t xml:space="preserve"> </w:t>
       </w:r>
-      <w:hyperlink r:id="rId42">
+      <w:hyperlink r:id="rId44">
         <w:r>
           <w:rPr>
             <w:rStyle w:val="Hyperlink"/>
@@ -11341,8 +11533,8 @@
         <w:t xml:space="preserve">.</w:t>
       </w:r>
     </w:p>
-    <w:bookmarkEnd w:id="43"/>
-    <w:bookmarkStart w:id="48" w:name="example-pythagorean-theorem"/>
+    <w:bookmarkEnd w:id="45"/>
+    <w:bookmarkStart w:id="50" w:name="example-pythagorean-theorem"/>
     <w:p>
       <w:pPr>
         <w:pStyle w:val="Heading3"/>
@@ -11351,7 +11543,7 @@
         <w:t xml:space="preserve">7.2 Example: Pythagorean theorem</w:t>
       </w:r>
     </w:p>
-    <w:bookmarkStart w:id="44" w:name="thm-pythagoras"/>
+    <w:bookmarkStart w:id="46" w:name="thm-pythagoras"/>
     <w:p>
       <w:pPr>
         <w:pStyle w:val="FirstParagraph"/>
@@ -11442,8 +11634,8 @@
         </m:oMath>
       </m:oMathPara>
     </w:p>
-    <w:bookmarkEnd w:id="44"/>
-    <w:bookmarkStart w:id="45" w:name="exm-pythagoras"/>
+    <w:bookmarkEnd w:id="46"/>
+    <w:bookmarkStart w:id="47" w:name="exm-pythagoras"/>
     <w:p>
       <w:pPr>
         <w:pStyle w:val="FirstParagraph"/>
@@ -11572,8 +11764,8 @@
         </m:oMath>
       </m:oMathPara>
     </w:p>
-    <w:bookmarkEnd w:id="45"/>
-    <w:bookmarkStart w:id="46" w:name="def-postulate"/>
+    <w:bookmarkEnd w:id="47"/>
+    <w:bookmarkStart w:id="48" w:name="def-postulate"/>
     <w:p>
       <w:pPr>
         <w:pStyle w:val="FirstParagraph"/>
@@ -11627,8 +11819,8 @@
         <w:t xml:space="preserve">serving as a starting point for further reasoning.</w:t>
       </w:r>
     </w:p>
-    <w:bookmarkEnd w:id="46"/>
-    <w:bookmarkStart w:id="47" w:name="exm-parallel-postulate"/>
+    <w:bookmarkEnd w:id="48"/>
+    <w:bookmarkStart w:id="49" w:name="exm-parallel-postulate"/>
     <w:p>
       <w:pPr>
         <w:pStyle w:val="BodyText"/>
@@ -11731,10 +11923,10 @@
         <w:t xml:space="preserve">.</w:t>
       </w:r>
     </w:p>
-    <w:bookmarkEnd w:id="47"/>
-    <w:bookmarkEnd w:id="48"/>
     <w:bookmarkEnd w:id="49"/>
-    <w:bookmarkStart w:id="58" w:name="Xe6c88c177e563d1f046037569009a36fd08f4bd"/>
+    <w:bookmarkEnd w:id="50"/>
+    <w:bookmarkEnd w:id="51"/>
+    <w:bookmarkStart w:id="60" w:name="Xe6c88c177e563d1f046037569009a36fd08f4bd"/>
     <w:p>
       <w:pPr>
         <w:pStyle w:val="Heading2"/>
@@ -11953,7 +12145,7 @@
       <w:r>
         <w:t xml:space="preserve"> </w:t>
       </w:r>
-      <w:hyperlink r:id="rId50">
+      <w:hyperlink r:id="rId52">
         <w:r>
           <w:rPr>
             <w:rStyle w:val="Hyperlink"/>
@@ -12029,7 +12221,7 @@
       <w:r>
         <w:t xml:space="preserve"> </w:t>
       </w:r>
-      <w:hyperlink r:id="rId51">
+      <w:hyperlink r:id="rId53">
         <w:r>
           <w:rPr>
             <w:rStyle w:val="Hyperlink"/>
@@ -12283,7 +12475,7 @@
         <w:t xml:space="preserve">is an ordinary step, not the pattern to avoid.</w:t>
       </w:r>
     </w:p>
-    <w:bookmarkStart w:id="52" w:name="def-sample-mean"/>
+    <w:bookmarkStart w:id="54" w:name="def-sample-mean"/>
     <w:p>
       <w:pPr>
         <w:pStyle w:val="FirstParagraph"/>
@@ -12468,8 +12660,8 @@
         </m:oMath>
       </m:oMathPara>
     </w:p>
-    <w:bookmarkEnd w:id="52"/>
-    <w:bookmarkStart w:id="53" w:name="exr-sum-deviations"/>
+    <w:bookmarkEnd w:id="54"/>
+    <w:bookmarkStart w:id="55" w:name="exr-sum-deviations"/>
     <w:p>
       <w:pPr>
         <w:pStyle w:val="FirstParagraph"/>
@@ -12624,8 +12816,8 @@
         <w:t xml:space="preserve">).</w:t>
       </w:r>
     </w:p>
-    <w:bookmarkEnd w:id="53"/>
-    <w:bookmarkStart w:id="54" w:name="sol-sum-deviations"/>
+    <w:bookmarkEnd w:id="55"/>
+    <w:bookmarkStart w:id="56" w:name="sol-sum-deviations"/>
     <w:p>
       <w:pPr>
         <w:pStyle w:val="BodyText"/>
@@ -13076,8 +13268,8 @@
         </m:oMath>
       </m:oMathPara>
     </w:p>
-    <w:bookmarkEnd w:id="54"/>
-    <w:bookmarkStart w:id="55" w:name="thm-sum-deviations"/>
+    <w:bookmarkEnd w:id="56"/>
+    <w:bookmarkStart w:id="57" w:name="thm-sum-deviations"/>
     <w:p>
       <w:pPr>
         <w:pStyle w:val="FirstParagraph"/>
@@ -13283,7 +13475,7 @@
         </m:oMath>
       </m:oMathPara>
     </w:p>
-    <w:bookmarkEnd w:id="55"/>
+    <w:bookmarkEnd w:id="57"/>
     <w:p>
       <w:pPr>
         <w:pStyle w:val="FirstParagraph"/>
@@ -13313,7 +13505,7 @@
         <w:t xml:space="preserve">derives this result.</w:t>
       </w:r>
     </w:p>
-    <w:bookmarkStart w:id="56" w:name="exm-derivation-direction"/>
+    <w:bookmarkStart w:id="58" w:name="exm-derivation-direction"/>
     <w:p>
       <w:pPr>
         <w:pStyle w:val="BodyText"/>
@@ -14380,7 +14572,7 @@
       <w:r>
         <w:t xml:space="preserve"> </w:t>
       </w:r>
-      <w:hyperlink r:id="rId51">
+      <w:hyperlink r:id="rId53">
         <w:r>
           <w:rPr>
             <w:rStyle w:val="Hyperlink"/>
@@ -14392,8 +14584,8 @@
         <w:t xml:space="preserve">).</w:t>
       </w:r>
     </w:p>
-    <w:bookmarkEnd w:id="56"/>
-    <w:bookmarkStart w:id="57" w:name="exm-one-result-per-theorem"/>
+    <w:bookmarkEnd w:id="58"/>
+    <w:bookmarkStart w:id="59" w:name="exm-one-result-per-theorem"/>
     <w:p>
       <w:pPr>
         <w:pStyle w:val="BodyText"/>
@@ -14877,8 +15069,8 @@
         <w:t xml:space="preserve">and a later step that uses only the first can cite only the first.</w:t>
       </w:r>
     </w:p>
-    <w:bookmarkEnd w:id="57"/>
-    <w:bookmarkEnd w:id="58"/>
+    <w:bookmarkEnd w:id="59"/>
+    <w:bookmarkEnd w:id="60"/>
     <w:sectPr>
       <w:footnotePr>
         <w:numRestart w:val="eachSect"/>

</xml_diff>

<commit_message>
Deploying to gh-pages from @ Morrison-Lab/psw@f43a0fc7ac0a535c6d9d6ec42be560f0bdb4174f 🚀
</commit_message>
<xml_diff>
--- a/chapters/defining-terms.docx
+++ b/chapters/defining-terms.docx
@@ -15,7 +15,7 @@
         <w:pStyle w:val="Date"/>
       </w:pPr>
       <w:r>
-        <w:t xml:space="preserve">Last modified: 2026-10-29 14:35:32 (PDT)</w:t>
+        <w:t xml:space="preserve">Last modified: 2026-10-29 15:25:43 (PDT)</w:t>
       </w:r>
     </w:p>
     <w:p>
@@ -507,7 +507,7 @@
       </w:r>
     </w:p>
     <w:bookmarkEnd w:id="15"/>
-    <w:bookmarkStart w:id="24" w:name="guidelines-for-defining-terms"/>
+    <w:bookmarkStart w:id="26" w:name="guidelines-for-defining-terms"/>
     <w:p>
       <w:pPr>
         <w:pStyle w:val="Heading2"/>
@@ -2048,6 +2048,1020 @@
       </w:r>
       <w:r>
         <w:t xml:space="preserve">and hides that the symbol is a mean of the deviations.</w:t>
+      </w:r>
+    </w:p>
+    <w:p>
+      <w:pPr>
+        <w:numPr>
+          <w:ilvl w:val="0"/>
+          <w:numId w:val="1001"/>
+        </w:numPr>
+      </w:pPr>
+      <w:r>
+        <w:rPr>
+          <w:b/>
+          <w:bCs/>
+        </w:rPr>
+        <w:t xml:space="preserve">Put only the defining equation in a definition, and state equivalences as results:</w:t>
+      </w:r>
+      <w:r>
+        <w:t xml:space="preserve"> </w:t>
+      </w:r>
+      <w:r>
+        <w:t xml:space="preserve">A definition div displays one equation,</w:t>
+      </w:r>
+      <w:r>
+        <w:t xml:space="preserve"> </w:t>
+      </w:r>
+      <w:r>
+        <w:t xml:space="preserve">the one that links the symbol of the defined</w:t>
+      </w:r>
+      <w:r>
+        <w:t xml:space="preserve"> </w:t>
+      </w:r>
+      <w:hyperlink w:anchor="def-term">
+        <w:r>
+          <w:rPr>
+            <w:rStyle w:val="Hyperlink"/>
+          </w:rPr>
+          <w:t xml:space="preserve">term</w:t>
+        </w:r>
+      </w:hyperlink>
+      <w:r>
+        <w:t xml:space="preserve"> </w:t>
+      </w:r>
+      <w:r>
+        <w:t xml:space="preserve">to its definitional expression.</w:t>
+      </w:r>
+      <w:r>
+        <w:t xml:space="preserve"> </w:t>
+      </w:r>
+      <w:r>
+        <w:t xml:space="preserve">It does not display a chain of equal expressions,</w:t>
+      </w:r>
+      <w:r>
+        <w:t xml:space="preserve"> </w:t>
+      </w:r>
+      <w:r>
+        <w:t xml:space="preserve">and it does not display an equivalent form.</w:t>
+      </w:r>
+      <w:r>
+        <w:t xml:space="preserve"> </w:t>
+      </w:r>
+      <w:r>
+        <w:t xml:space="preserve">It does not state that the defined concept is the same as, or equivalent to, another concept either.</w:t>
+      </w:r>
+      <w:r>
+        <w:t xml:space="preserve"> </w:t>
+      </w:r>
+      <w:r>
+        <w:t xml:space="preserve">State each equality between expressions, and each equivalence between concepts,</w:t>
+      </w:r>
+      <w:r>
+        <w:t xml:space="preserve"> </w:t>
+      </w:r>
+      <w:r>
+        <w:t xml:space="preserve">in its own result (a theorem, lemma, corollary or proposition) after the definition.</w:t>
+      </w:r>
+      <w:r>
+        <w:t xml:space="preserve"> </w:t>
+      </w:r>
+      <w:r>
+        <w:t xml:space="preserve">For example, define the residual</w:t>
+      </w:r>
+      <w:r>
+        <w:t xml:space="preserve"> </w:t>
+      </w:r>
+      <w:hyperlink r:id="rId17">
+        <w:r>
+          <w:rPr>
+            <w:rStyle w:val="Hyperlink"/>
+          </w:rPr>
+          <w:t xml:space="preserve">variance</w:t>
+        </w:r>
+      </w:hyperlink>
+      <w:r>
+        <w:t xml:space="preserve"> </w:t>
+      </w:r>
+      <w:r>
+        <w:t xml:space="preserve">at</w:t>
+      </w:r>
+      <w:r>
+        <w:t xml:space="preserve"> </w:t>
+      </w:r>
+      <m:oMath>
+        <m:r>
+          <m:t>x</m:t>
+        </m:r>
+      </m:oMath>
+      <w:r>
+        <w:t xml:space="preserve"> </w:t>
+      </w:r>
+      <w:r>
+        <w:t xml:space="preserve">as</w:t>
+      </w:r>
+      <w:r>
+        <w:t xml:space="preserve"> </w:t>
+      </w:r>
+      <m:oMath>
+        <m:sSup>
+          <m:e>
+            <m:r>
+              <m:t>σ</m:t>
+            </m:r>
+          </m:e>
+          <m:sup>
+            <m:r>
+              <m:t>2</m:t>
+            </m:r>
+          </m:sup>
+        </m:sSup>
+        <m:limUpp>
+          <m:e>
+            <m:r>
+              <m:rPr>
+                <m:sty m:val="p"/>
+              </m:rPr>
+              <m:t>=</m:t>
+            </m:r>
+          </m:e>
+          <m:lim>
+            <m:r>
+              <m:rPr>
+                <m:nor/>
+                <m:sty m:val="p"/>
+              </m:rPr>
+              <m:t>def</m:t>
+            </m:r>
+          </m:lim>
+        </m:limUpp>
+        <m:r>
+          <m:rPr>
+            <m:sty m:val="p"/>
+          </m:rPr>
+          <m:t>Var</m:t>
+        </m:r>
+        <m:r>
+          <m:t>​</m:t>
+        </m:r>
+        <m:d>
+          <m:dPr>
+            <m:begChr m:val="("/>
+            <m:sepChr m:val=""/>
+            <m:endChr m:val=")"/>
+            <m:grow/>
+          </m:dPr>
+          <m:e>
+            <m:r>
+              <m:t>ε</m:t>
+            </m:r>
+            <m:r>
+              <m:rPr>
+                <m:sty m:val="p"/>
+              </m:rPr>
+              <m:t>∣</m:t>
+            </m:r>
+            <m:r>
+              <m:t>X</m:t>
+            </m:r>
+            <m:r>
+              <m:rPr>
+                <m:sty m:val="p"/>
+              </m:rPr>
+              <m:t>=</m:t>
+            </m:r>
+            <m:r>
+              <m:t>x</m:t>
+            </m:r>
+          </m:e>
+        </m:d>
+        <m:r>
+          <m:t>​</m:t>
+        </m:r>
+      </m:oMath>
+      <w:r>
+        <w:t xml:space="preserve">,</w:t>
+      </w:r>
+      <w:r>
+        <w:t xml:space="preserve"> </w:t>
+      </w:r>
+      <w:r>
+        <w:t xml:space="preserve">then state</w:t>
+      </w:r>
+      <w:r>
+        <w:t xml:space="preserve"> </w:t>
+      </w:r>
+      <m:oMath>
+        <m:sSup>
+          <m:e>
+            <m:r>
+              <m:t>σ</m:t>
+            </m:r>
+          </m:e>
+          <m:sup>
+            <m:r>
+              <m:t>2</m:t>
+            </m:r>
+          </m:sup>
+        </m:sSup>
+        <m:r>
+          <m:rPr>
+            <m:sty m:val="p"/>
+          </m:rPr>
+          <m:t>=</m:t>
+        </m:r>
+        <m:r>
+          <m:rPr>
+            <m:sty m:val="p"/>
+          </m:rPr>
+          <m:t>Var</m:t>
+        </m:r>
+        <m:r>
+          <m:t>​</m:t>
+        </m:r>
+        <m:d>
+          <m:dPr>
+            <m:begChr m:val="("/>
+            <m:sepChr m:val=""/>
+            <m:endChr m:val=")"/>
+            <m:grow/>
+          </m:dPr>
+          <m:e>
+            <m:r>
+              <m:t>Y</m:t>
+            </m:r>
+            <m:r>
+              <m:rPr>
+                <m:sty m:val="p"/>
+              </m:rPr>
+              <m:t>∣</m:t>
+            </m:r>
+            <m:r>
+              <m:t>X</m:t>
+            </m:r>
+            <m:r>
+              <m:rPr>
+                <m:sty m:val="p"/>
+              </m:rPr>
+              <m:t>=</m:t>
+            </m:r>
+            <m:r>
+              <m:t>x</m:t>
+            </m:r>
+          </m:e>
+        </m:d>
+        <m:r>
+          <m:t>​</m:t>
+        </m:r>
+      </m:oMath>
+      <w:r>
+        <w:t xml:space="preserve"> </w:t>
+      </w:r>
+      <w:r>
+        <w:t xml:space="preserve">as a result.</w:t>
+      </w:r>
+      <w:r>
+        <w:t xml:space="preserve"> </w:t>
+      </w:r>
+      <w:r>
+        <w:t xml:space="preserve">A definition that also shows</w:t>
+      </w:r>
+      <w:r>
+        <w:t xml:space="preserve"> </w:t>
+      </w:r>
+      <m:oMath>
+        <m:r>
+          <m:rPr>
+            <m:sty m:val="p"/>
+          </m:rPr>
+          <m:t>=</m:t>
+        </m:r>
+        <m:r>
+          <m:rPr>
+            <m:sty m:val="p"/>
+          </m:rPr>
+          <m:t>Var</m:t>
+        </m:r>
+        <m:r>
+          <m:t>​</m:t>
+        </m:r>
+        <m:d>
+          <m:dPr>
+            <m:begChr m:val="("/>
+            <m:sepChr m:val=""/>
+            <m:endChr m:val=")"/>
+            <m:grow/>
+          </m:dPr>
+          <m:e>
+            <m:r>
+              <m:t>Y</m:t>
+            </m:r>
+            <m:r>
+              <m:rPr>
+                <m:sty m:val="p"/>
+              </m:rPr>
+              <m:t>∣</m:t>
+            </m:r>
+            <m:r>
+              <m:t>X</m:t>
+            </m:r>
+            <m:r>
+              <m:rPr>
+                <m:sty m:val="p"/>
+              </m:rPr>
+              <m:t>=</m:t>
+            </m:r>
+            <m:r>
+              <m:t>x</m:t>
+            </m:r>
+          </m:e>
+        </m:d>
+        <m:r>
+          <m:t>​</m:t>
+        </m:r>
+      </m:oMath>
+      <w:r>
+        <w:t xml:space="preserve"> </w:t>
+      </w:r>
+      <w:r>
+        <w:t xml:space="preserve">asserts a result without a statement or a proof,</w:t>
+      </w:r>
+      <w:r>
+        <w:t xml:space="preserve"> </w:t>
+      </w:r>
+      <w:r>
+        <w:t xml:space="preserve">and the reader cannot tell which equality is the definition.</w:t>
+      </w:r>
+      <w:r>
+        <w:t xml:space="preserve"> </w:t>
+      </w:r>
+      <w:r>
+        <w:t xml:space="preserve">The same holds for a sentence:</w:t>
+      </w:r>
+      <w:r>
+        <w:t xml:space="preserve"> </w:t>
+      </w:r>
+      <w:r>
+        <w:t xml:space="preserve">a definition that adds</w:t>
+      </w:r>
+      <w:r>
+        <w:t xml:space="preserve"> </w:t>
+      </w:r>
+      <w:r>
+        <w:t xml:space="preserve">“equivalently, the variance of the outcome given the covariates”</w:t>
+      </w:r>
+      <w:r>
+        <w:t xml:space="preserve"> </w:t>
+      </w:r>
+      <w:r>
+        <w:t xml:space="preserve">states a result, so it belongs in one.</w:t>
+      </w:r>
+    </w:p>
+    <w:p>
+      <w:pPr>
+        <w:numPr>
+          <w:ilvl w:val="0"/>
+          <w:numId w:val="1001"/>
+        </w:numPr>
+      </w:pPr>
+      <w:r>
+        <w:rPr>
+          <w:b/>
+          <w:bCs/>
+        </w:rPr>
+        <w:t xml:space="preserve">Write both sides of a definition in the same notation:</w:t>
+      </w:r>
+      <w:r>
+        <w:t xml:space="preserve"> </w:t>
+      </w:r>
+      <w:r>
+        <w:t xml:space="preserve">The symbol on the left names an object,</w:t>
+      </w:r>
+      <w:r>
+        <w:t xml:space="preserve"> </w:t>
+      </w:r>
+      <w:r>
+        <w:t xml:space="preserve">and the right side expands that object’s own definition.</w:t>
+      </w:r>
+      <w:r>
+        <w:t xml:space="preserve"> </w:t>
+      </w:r>
+      <w:r>
+        <w:t xml:space="preserve">It does not describe the object in another way,</w:t>
+      </w:r>
+      <w:r>
+        <w:t xml:space="preserve"> </w:t>
+      </w:r>
+      <w:r>
+        <w:t xml:space="preserve">because the step from one description to the other is a result.</w:t>
+      </w:r>
+      <w:r>
+        <w:t xml:space="preserve"> </w:t>
+      </w:r>
+      <w:r>
+        <w:t xml:space="preserve">For example, with the conditional expectation</w:t>
+      </w:r>
+      <w:r>
+        <w:t xml:space="preserve"> </w:t>
+      </w:r>
+      <w:hyperlink r:id="rId16">
+        <w:r>
+          <w:rPr>
+            <w:rStyle w:val="Hyperlink"/>
+          </w:rPr>
+          <w:t xml:space="preserve">function</w:t>
+        </w:r>
+      </w:hyperlink>
+      <w:r>
+        <w:t xml:space="preserve"> </w:t>
+      </w:r>
+      <m:oMath>
+        <m:r>
+          <m:t>μ</m:t>
+        </m:r>
+      </m:oMath>
+      <w:r>
+        <w:t xml:space="preserve"> </w:t>
+      </w:r>
+      <w:r>
+        <w:t xml:space="preserve">and its prediction error</w:t>
+      </w:r>
+      <w:r>
+        <w:t xml:space="preserve"> </w:t>
+      </w:r>
+      <m:oMath>
+        <m:sSub>
+          <m:e>
+            <m:r>
+              <m:t>ε</m:t>
+            </m:r>
+          </m:e>
+          <m:sub>
+            <m:r>
+              <m:rPr>
+                <m:nor/>
+                <m:sty m:val="p"/>
+              </m:rPr>
+              <m:t>pred</m:t>
+            </m:r>
+          </m:sub>
+        </m:sSub>
+        <m:r>
+          <m:t>​</m:t>
+        </m:r>
+        <m:d>
+          <m:dPr>
+            <m:begChr m:val="("/>
+            <m:sepChr m:val=""/>
+            <m:endChr m:val=")"/>
+            <m:grow/>
+          </m:dPr>
+          <m:e>
+            <m:r>
+              <m:t>μ</m:t>
+            </m:r>
+          </m:e>
+        </m:d>
+        <m:r>
+          <m:t>​</m:t>
+        </m:r>
+      </m:oMath>
+      <w:r>
+        <w:t xml:space="preserve">,</w:t>
+      </w:r>
+      <w:r>
+        <w:t xml:space="preserve"> </w:t>
+      </w:r>
+      <w:r>
+        <w:t xml:space="preserve">define the residual risk as</w:t>
+      </w:r>
+      <w:r>
+        <w:t xml:space="preserve"> </w:t>
+      </w:r>
+      <m:oMath>
+        <m:r>
+          <m:t>R</m:t>
+        </m:r>
+        <m:r>
+          <m:t>​</m:t>
+        </m:r>
+        <m:d>
+          <m:dPr>
+            <m:begChr m:val="("/>
+            <m:sepChr m:val=""/>
+            <m:endChr m:val=")"/>
+            <m:grow/>
+          </m:dPr>
+          <m:e>
+            <m:r>
+              <m:t>μ</m:t>
+            </m:r>
+          </m:e>
+        </m:d>
+        <m:r>
+          <m:t>​</m:t>
+        </m:r>
+        <m:r>
+          <m:rPr>
+            <m:sty m:val="p"/>
+          </m:rPr>
+          <m:t>=</m:t>
+        </m:r>
+        <m:r>
+          <m:rPr>
+            <m:scr m:val="double-struck"/>
+            <m:sty m:val="p"/>
+          </m:rPr>
+          <m:t>E</m:t>
+        </m:r>
+        <m:r>
+          <m:t>​</m:t>
+        </m:r>
+        <m:d>
+          <m:dPr>
+            <m:begChr m:val="["/>
+            <m:sepChr m:val=""/>
+            <m:endChr m:val="]"/>
+            <m:grow/>
+          </m:dPr>
+          <m:e>
+            <m:sSup>
+              <m:e>
+                <m:r>
+                  <m:t>​</m:t>
+                </m:r>
+                <m:d>
+                  <m:dPr>
+                    <m:begChr m:val="("/>
+                    <m:sepChr m:val=""/>
+                    <m:endChr m:val=")"/>
+                    <m:grow/>
+                  </m:dPr>
+                  <m:e>
+                    <m:sSub>
+                      <m:e>
+                        <m:r>
+                          <m:t>ε</m:t>
+                        </m:r>
+                      </m:e>
+                      <m:sub>
+                        <m:r>
+                          <m:rPr>
+                            <m:nor/>
+                            <m:sty m:val="p"/>
+                          </m:rPr>
+                          <m:t>pred</m:t>
+                        </m:r>
+                      </m:sub>
+                    </m:sSub>
+                    <m:r>
+                      <m:t>​</m:t>
+                    </m:r>
+                    <m:d>
+                      <m:dPr>
+                        <m:begChr m:val="("/>
+                        <m:sepChr m:val=""/>
+                        <m:endChr m:val=")"/>
+                        <m:grow/>
+                      </m:dPr>
+                      <m:e>
+                        <m:r>
+                          <m:t>μ</m:t>
+                        </m:r>
+                      </m:e>
+                    </m:d>
+                    <m:r>
+                      <m:t>​</m:t>
+                    </m:r>
+                  </m:e>
+                </m:d>
+                <m:r>
+                  <m:t>​</m:t>
+                </m:r>
+              </m:e>
+              <m:sup>
+                <m:r>
+                  <m:t>2</m:t>
+                </m:r>
+              </m:sup>
+            </m:sSup>
+          </m:e>
+        </m:d>
+        <m:r>
+          <m:t>​</m:t>
+        </m:r>
+      </m:oMath>
+      <w:r>
+        <w:t xml:space="preserve">,</w:t>
+      </w:r>
+      <w:r>
+        <w:t xml:space="preserve"> </w:t>
+      </w:r>
+      <w:r>
+        <w:t xml:space="preserve">not as</w:t>
+      </w:r>
+      <w:r>
+        <w:t xml:space="preserve"> </w:t>
+      </w:r>
+      <m:oMath>
+        <m:r>
+          <m:t>R</m:t>
+        </m:r>
+        <m:r>
+          <m:t>​</m:t>
+        </m:r>
+        <m:d>
+          <m:dPr>
+            <m:begChr m:val="("/>
+            <m:sepChr m:val=""/>
+            <m:endChr m:val=")"/>
+            <m:grow/>
+          </m:dPr>
+          <m:e>
+            <m:r>
+              <m:t>μ</m:t>
+            </m:r>
+          </m:e>
+        </m:d>
+        <m:r>
+          <m:t>​</m:t>
+        </m:r>
+        <m:r>
+          <m:rPr>
+            <m:sty m:val="p"/>
+          </m:rPr>
+          <m:t>=</m:t>
+        </m:r>
+        <m:r>
+          <m:rPr>
+            <m:scr m:val="double-struck"/>
+            <m:sty m:val="p"/>
+          </m:rPr>
+          <m:t>E</m:t>
+        </m:r>
+        <m:r>
+          <m:t>​</m:t>
+        </m:r>
+        <m:d>
+          <m:dPr>
+            <m:begChr m:val="["/>
+            <m:sepChr m:val=""/>
+            <m:endChr m:val="]"/>
+            <m:grow/>
+          </m:dPr>
+          <m:e>
+            <m:sSup>
+              <m:e>
+                <m:r>
+                  <m:t>​</m:t>
+                </m:r>
+                <m:d>
+                  <m:dPr>
+                    <m:begChr m:val="("/>
+                    <m:sepChr m:val=""/>
+                    <m:endChr m:val=")"/>
+                    <m:grow/>
+                  </m:dPr>
+                  <m:e>
+                    <m:r>
+                      <m:t>Y</m:t>
+                    </m:r>
+                    <m:r>
+                      <m:rPr>
+                        <m:sty m:val="p"/>
+                      </m:rPr>
+                      <m:t>−</m:t>
+                    </m:r>
+                    <m:r>
+                      <m:rPr>
+                        <m:scr m:val="double-struck"/>
+                        <m:sty m:val="p"/>
+                      </m:rPr>
+                      <m:t>E</m:t>
+                    </m:r>
+                    <m:r>
+                      <m:t>​</m:t>
+                    </m:r>
+                    <m:d>
+                      <m:dPr>
+                        <m:begChr m:val="["/>
+                        <m:sepChr m:val=""/>
+                        <m:endChr m:val="]"/>
+                        <m:grow/>
+                      </m:dPr>
+                      <m:e>
+                        <m:r>
+                          <m:t>Y</m:t>
+                        </m:r>
+                        <m:r>
+                          <m:rPr>
+                            <m:sty m:val="p"/>
+                          </m:rPr>
+                          <m:t>∣</m:t>
+                        </m:r>
+                        <m:r>
+                          <m:t>X</m:t>
+                        </m:r>
+                      </m:e>
+                    </m:d>
+                    <m:r>
+                      <m:t>​</m:t>
+                    </m:r>
+                  </m:e>
+                </m:d>
+                <m:r>
+                  <m:t>​</m:t>
+                </m:r>
+              </m:e>
+              <m:sup>
+                <m:r>
+                  <m:t>2</m:t>
+                </m:r>
+              </m:sup>
+            </m:sSup>
+          </m:e>
+        </m:d>
+        <m:r>
+          <m:t>​</m:t>
+        </m:r>
+      </m:oMath>
+      <w:r>
+        <w:t xml:space="preserve">.</w:t>
+      </w:r>
+      <w:r>
+        <w:t xml:space="preserve"> </w:t>
+      </w:r>
+      <w:r>
+        <w:t xml:space="preserve">The second form spells the function</w:t>
+      </w:r>
+      <w:r>
+        <w:t xml:space="preserve"> </w:t>
+      </w:r>
+      <m:oMath>
+        <m:r>
+          <m:t>μ</m:t>
+        </m:r>
+      </m:oMath>
+      <w:r>
+        <w:t xml:space="preserve"> </w:t>
+      </w:r>
+      <w:r>
+        <w:t xml:space="preserve">out on the right</w:t>
+      </w:r>
+      <w:r>
+        <w:t xml:space="preserve"> </w:t>
+      </w:r>
+      <w:r>
+        <w:t xml:space="preserve">but names it on the left,</w:t>
+      </w:r>
+      <w:r>
+        <w:t xml:space="preserve"> </w:t>
+      </w:r>
+      <w:r>
+        <w:t xml:space="preserve">so a reader cannot tell whether the two sides describe the same object.</w:t>
+      </w:r>
+      <w:r>
+        <w:t xml:space="preserve"> </w:t>
+      </w:r>
+      <w:r>
+        <w:t xml:space="preserve">Derive the second form from the first in a proof.</w:t>
+      </w:r>
+    </w:p>
+    <w:p>
+      <w:pPr>
+        <w:numPr>
+          <w:ilvl w:val="0"/>
+          <w:numId w:val="1001"/>
+        </w:numPr>
+      </w:pPr>
+      <w:r>
+        <w:rPr>
+          <w:b/>
+          <w:bCs/>
+        </w:rPr>
+        <w:t xml:space="preserve">Reuse the notation and the concept names of the result that introduces an object:</w:t>
+      </w:r>
+      <w:r>
+        <w:t xml:space="preserve"> </w:t>
+      </w:r>
+      <w:r>
+        <w:t xml:space="preserve">When an earlier theorem names an object,</w:t>
+      </w:r>
+      <w:r>
+        <w:t xml:space="preserve"> </w:t>
+      </w:r>
+      <w:r>
+        <w:t xml:space="preserve">every later definition about it uses the same symbols and the same concept.</w:t>
+      </w:r>
+      <w:r>
+        <w:t xml:space="preserve"> </w:t>
+      </w:r>
+      <w:r>
+        <w:t xml:space="preserve">Do not coin an alias symbol or a synonym</w:t>
+      </w:r>
+      <w:r>
+        <w:t xml:space="preserve"> </w:t>
+      </w:r>
+      <w:hyperlink w:anchor="def-term">
+        <w:r>
+          <w:rPr>
+            <w:rStyle w:val="Hyperlink"/>
+          </w:rPr>
+          <w:t xml:space="preserve">term</w:t>
+        </w:r>
+      </w:hyperlink>
+      <w:r>
+        <w:t xml:space="preserve"> </w:t>
+      </w:r>
+      <w:r>
+        <w:t xml:space="preserve">for it.</w:t>
+      </w:r>
+      <w:r>
+        <w:t xml:space="preserve"> </w:t>
+      </w:r>
+      <w:r>
+        <w:t xml:space="preserve">For example, a theorem that decomposes the squared-error risk</w:t>
+      </w:r>
+      <w:r>
+        <w:t xml:space="preserve"> </w:t>
+      </w:r>
+      <w:r>
+        <w:t xml:space="preserve">and names the minimizing</w:t>
+      </w:r>
+      <w:r>
+        <w:t xml:space="preserve"> </w:t>
+      </w:r>
+      <w:hyperlink r:id="rId16">
+        <w:r>
+          <w:rPr>
+            <w:rStyle w:val="Hyperlink"/>
+          </w:rPr>
+          <w:t xml:space="preserve">function</w:t>
+        </w:r>
+      </w:hyperlink>
+      <w:r>
+        <w:t xml:space="preserve"> </w:t>
+      </w:r>
+      <m:oMath>
+        <m:r>
+          <m:t>μ</m:t>
+        </m:r>
+      </m:oMath>
+      <w:r>
+        <w:t xml:space="preserve"> </w:t>
+      </w:r>
+      <w:r>
+        <w:t xml:space="preserve">fixes the residual risk as the risk</w:t>
+      </w:r>
+      <w:r>
+        <w:t xml:space="preserve"> </w:t>
+      </w:r>
+      <m:oMath>
+        <m:r>
+          <m:t>R</m:t>
+        </m:r>
+        <m:r>
+          <m:t>​</m:t>
+        </m:r>
+        <m:d>
+          <m:dPr>
+            <m:begChr m:val="("/>
+            <m:sepChr m:val=""/>
+            <m:endChr m:val=")"/>
+            <m:grow/>
+          </m:dPr>
+          <m:e>
+            <m:r>
+              <m:t>μ</m:t>
+            </m:r>
+          </m:e>
+        </m:d>
+        <m:r>
+          <m:t>​</m:t>
+        </m:r>
+      </m:oMath>
+      <w:r>
+        <w:t xml:space="preserve"> </w:t>
+      </w:r>
+      <w:r>
+        <w:t xml:space="preserve">of that function.</w:t>
+      </w:r>
+      <w:r>
+        <w:t xml:space="preserve"> </w:t>
+      </w:r>
+      <w:r>
+        <w:t xml:space="preserve">A definition that names the residual risk through a second symbol for the same function</w:t>
+      </w:r>
+      <w:r>
+        <w:t xml:space="preserve"> </w:t>
+      </w:r>
+      <w:r>
+        <w:t xml:space="preserve">leaves the reader to check that the two symbols denote one object.</w:t>
+      </w:r>
+    </w:p>
+    <w:p>
+      <w:pPr>
+        <w:numPr>
+          <w:ilvl w:val="0"/>
+          <w:numId w:val="1001"/>
+        </w:numPr>
+      </w:pPr>
+      <w:r>
+        <w:rPr>
+          <w:b/>
+          <w:bCs/>
+        </w:rPr>
+        <w:t xml:space="preserve">Make a definition as concise as possible:</w:t>
+      </w:r>
+      <w:r>
+        <w:t xml:space="preserve"> </w:t>
+      </w:r>
+      <w:r>
+        <w:t xml:space="preserve">State the</w:t>
+      </w:r>
+      <w:r>
+        <w:t xml:space="preserve"> </w:t>
+      </w:r>
+      <w:hyperlink w:anchor="def-term">
+        <w:r>
+          <w:rPr>
+            <w:rStyle w:val="Hyperlink"/>
+          </w:rPr>
+          <w:t xml:space="preserve">term</w:t>
+        </w:r>
+      </w:hyperlink>
+      <w:r>
+        <w:t xml:space="preserve"> </w:t>
+      </w:r>
+      <w:r>
+        <w:t xml:space="preserve">with the fewest words and symbols that fix it exactly.</w:t>
+      </w:r>
+      <w:r>
+        <w:t xml:space="preserve"> </w:t>
+      </w:r>
+      <w:r>
+        <w:t xml:space="preserve">Build on terms that are already defined, and link them,</w:t>
+      </w:r>
+      <w:r>
+        <w:t xml:space="preserve"> </w:t>
+      </w:r>
+      <w:r>
+        <w:t xml:space="preserve">instead of spelling out again what they mean.</w:t>
+      </w:r>
+      <w:r>
+        <w:t xml:space="preserve"> </w:t>
+      </w:r>
+      <w:r>
+        <w:t xml:space="preserve">For example, define a mode of a distribution as an element of the</w:t>
+      </w:r>
+      <w:r>
+        <w:t xml:space="preserve"> </w:t>
+      </w:r>
+      <w:hyperlink r:id="rId18">
+        <w:r>
+          <w:rPr>
+            <w:rStyle w:val="Hyperlink"/>
+          </w:rPr>
+          <w:t xml:space="preserve">argmax</w:t>
+        </w:r>
+      </w:hyperlink>
+      <w:r>
+        <w:t xml:space="preserve"> </w:t>
+      </w:r>
+      <w:r>
+        <w:t xml:space="preserve">of its density or mass</w:t>
+      </w:r>
+      <w:r>
+        <w:t xml:space="preserve"> </w:t>
+      </w:r>
+      <w:hyperlink r:id="rId16">
+        <w:r>
+          <w:rPr>
+            <w:rStyle w:val="Hyperlink"/>
+          </w:rPr>
+          <w:t xml:space="preserve">function</w:t>
+        </w:r>
+      </w:hyperlink>
+      <w:r>
+        <w:t xml:space="preserve">,</w:t>
+      </w:r>
+      <w:r>
+        <w:t xml:space="preserve"> </w:t>
+      </w:r>
+      <w:r>
+        <w:t xml:space="preserve">not by writing out the inequality that the argmax stands for.</w:t>
+      </w:r>
+      <w:r>
+        <w:t xml:space="preserve"> </w:t>
+      </w:r>
+      <w:r>
+        <w:t xml:space="preserve">The inequality belongs in the definition of the argmax, which the reader can follow the link to.</w:t>
+      </w:r>
+      <w:r>
+        <w:t xml:space="preserve"> </w:t>
+      </w:r>
+      <w:r>
+        <w:t xml:space="preserve">A definition that restates a linked term is longer to read and drifts from the original if either changes.</w:t>
       </w:r>
     </w:p>
     <w:p>
@@ -2709,7 +3723,7 @@
       <w:r>
         <w:t xml:space="preserve"> </w:t>
       </w:r>
-      <w:hyperlink r:id="rId17">
+      <w:hyperlink r:id="rId19">
         <w:r>
           <w:rPr>
             <w:rStyle w:val="Hyperlink"/>
@@ -3499,7 +4513,7 @@
       <w:r>
         <w:t xml:space="preserve"> </w:t>
       </w:r>
-      <w:hyperlink r:id="rId18">
+      <w:hyperlink r:id="rId20">
         <w:r>
           <w:rPr>
             <w:rStyle w:val="Hyperlink"/>
@@ -3627,7 +4641,7 @@
       <w:r>
         <w:t xml:space="preserve"> </w:t>
       </w:r>
-      <w:hyperlink r:id="rId19">
+      <w:hyperlink r:id="rId21">
         <w:r>
           <w:rPr>
             <w:rStyle w:val="Hyperlink"/>
@@ -4199,7 +5213,7 @@
         <w:t xml:space="preserve">A reader who needs one of them can then link to exactly that one.</w:t>
       </w:r>
     </w:p>
-    <w:bookmarkStart w:id="20" w:name="exm-one-definition-per-div"/>
+    <w:bookmarkStart w:id="22" w:name="exm-one-definition-per-div"/>
     <w:p>
       <w:pPr>
         <w:numPr>
@@ -4739,7 +5753,7 @@
         <w:t xml:space="preserve">and each needs its own example.</w:t>
       </w:r>
     </w:p>
-    <w:bookmarkEnd w:id="20"/>
+    <w:bookmarkEnd w:id="22"/>
     <w:p>
       <w:pPr>
         <w:numPr>
@@ -4943,7 +5957,7 @@
       <w:r>
         <w:t xml:space="preserve"> </w:t>
       </w:r>
-      <w:hyperlink r:id="rId21">
+      <w:hyperlink r:id="rId23">
         <w:r>
           <w:rPr>
             <w:rStyle w:val="Hyperlink"/>
@@ -5172,7 +6186,7 @@
       <w:r>
         <w:t xml:space="preserve"> </w:t>
       </w:r>
-      <w:hyperlink r:id="rId22">
+      <w:hyperlink r:id="rId24">
         <w:r>
           <w:rPr>
             <w:rStyle w:val="Hyperlink"/>
@@ -5206,7 +6220,7 @@
       <w:r>
         <w:t xml:space="preserve"> </w:t>
       </w:r>
-      <w:hyperlink r:id="rId23">
+      <w:hyperlink r:id="rId25">
         <w:r>
           <w:rPr>
             <w:rStyle w:val="Hyperlink"/>
@@ -8494,8 +9508,8 @@
         <w:t xml:space="preserve">When in doubt, keep it.</w:t>
       </w:r>
     </w:p>
-    <w:bookmarkEnd w:id="24"/>
-    <w:bookmarkStart w:id="31" w:name="examples-of-term-definitions"/>
+    <w:bookmarkEnd w:id="26"/>
+    <w:bookmarkStart w:id="33" w:name="examples-of-term-definitions"/>
     <w:p>
       <w:pPr>
         <w:pStyle w:val="Heading2"/>
@@ -8526,7 +9540,7 @@
         <w:t xml:space="preserve">s:</w:t>
       </w:r>
     </w:p>
-    <w:bookmarkStart w:id="25" w:name="def-confidence-interval"/>
+    <w:bookmarkStart w:id="27" w:name="def-confidence-interval"/>
     <w:p>
       <w:pPr>
         <w:pStyle w:val="BodyText"/>
@@ -8763,8 +9777,8 @@
         </m:oMath>
       </m:oMathPara>
     </w:p>
-    <w:bookmarkEnd w:id="25"/>
-    <w:bookmarkStart w:id="26" w:name="exm-confidence-interval"/>
+    <w:bookmarkEnd w:id="27"/>
+    <w:bookmarkStart w:id="28" w:name="exm-confidence-interval"/>
     <w:p>
       <w:pPr>
         <w:pStyle w:val="FirstParagraph"/>
@@ -8806,8 +9820,8 @@
         <w:t xml:space="preserve">we are 95% confident that the true population mean height falls within this range.</w:t>
       </w:r>
     </w:p>
-    <w:bookmarkEnd w:id="26"/>
-    <w:bookmarkStart w:id="27" w:name="exm-not-confidence-interval"/>
+    <w:bookmarkEnd w:id="28"/>
+    <w:bookmarkStart w:id="29" w:name="exm-not-confidence-interval"/>
     <w:p>
       <w:pPr>
         <w:pStyle w:val="BodyText"/>
@@ -8867,8 +9881,8 @@
         <w:t xml:space="preserve">and it does not shrink as the sample grows.</w:t>
       </w:r>
     </w:p>
-    <w:bookmarkEnd w:id="27"/>
-    <w:bookmarkStart w:id="28" w:name="def-active-voice"/>
+    <w:bookmarkEnd w:id="29"/>
+    <w:bookmarkStart w:id="30" w:name="def-active-voice"/>
     <w:p>
       <w:pPr>
         <w:pStyle w:val="BodyText"/>
@@ -8897,8 +9911,8 @@
         <w:t xml:space="preserve">is a sentence structure where the subject performs the action expressed by the verb.</w:t>
       </w:r>
     </w:p>
-    <w:bookmarkEnd w:id="28"/>
-    <w:bookmarkStart w:id="29" w:name="exm-active-voice"/>
+    <w:bookmarkEnd w:id="30"/>
+    <w:bookmarkStart w:id="31" w:name="exm-active-voice"/>
     <w:p>
       <w:pPr>
         <w:pStyle w:val="BodyText"/>
@@ -8958,8 +9972,8 @@
         <w:t xml:space="preserve">.</w:t>
       </w:r>
     </w:p>
-    <w:bookmarkEnd w:id="29"/>
-    <w:bookmarkStart w:id="30" w:name="exm-passive-voice"/>
+    <w:bookmarkEnd w:id="31"/>
+    <w:bookmarkStart w:id="32" w:name="exm-passive-voice"/>
     <w:p>
       <w:pPr>
         <w:pStyle w:val="BodyText"/>
@@ -9022,9 +10036,9 @@
         <w:t xml:space="preserve">so the sentence is in passive voice.</w:t>
       </w:r>
     </w:p>
-    <w:bookmarkEnd w:id="30"/>
-    <w:bookmarkEnd w:id="31"/>
-    <w:bookmarkStart w:id="37" w:name="order-general-definition-then-examples"/>
+    <w:bookmarkEnd w:id="32"/>
+    <w:bookmarkEnd w:id="33"/>
+    <w:bookmarkStart w:id="39" w:name="order-general-definition-then-examples"/>
     <w:p>
       <w:pPr>
         <w:pStyle w:val="Heading2"/>
@@ -9162,7 +10176,7 @@
         <w:t xml:space="preserve">would give these blocks, in this order:</w:t>
       </w:r>
     </w:p>
-    <w:bookmarkStart w:id="32" w:name="def-rss"/>
+    <w:bookmarkStart w:id="34" w:name="def-rss"/>
     <w:p>
       <w:pPr>
         <w:pStyle w:val="BodyText"/>
@@ -9280,8 +10294,8 @@
         </m:oMath>
       </m:oMathPara>
     </w:p>
-    <w:bookmarkEnd w:id="32"/>
-    <w:bookmarkStart w:id="34" w:name="exm-rss-line"/>
+    <w:bookmarkEnd w:id="34"/>
+    <w:bookmarkStart w:id="36" w:name="exm-rss-line"/>
     <w:p>
       <w:pPr>
         <w:pStyle w:val="FirstParagraph"/>
@@ -9351,7 +10365,7 @@
       <w:r>
         <w:t xml:space="preserve"> </w:t>
       </w:r>
-      <w:hyperlink r:id="rId33">
+      <w:hyperlink r:id="rId35">
         <w:r>
           <w:rPr>
             <w:rStyle w:val="Hyperlink"/>
@@ -9647,8 +10661,8 @@
         </m:oMath>
       </m:oMathPara>
     </w:p>
-    <w:bookmarkEnd w:id="34"/>
-    <w:bookmarkStart w:id="35" w:name="exm-rss-three-points"/>
+    <w:bookmarkEnd w:id="36"/>
+    <w:bookmarkStart w:id="37" w:name="exm-rss-three-points"/>
     <w:p>
       <w:pPr>
         <w:pStyle w:val="FirstParagraph"/>
@@ -9937,8 +10951,8 @@
         <w:t xml:space="preserve">.</w:t>
       </w:r>
     </w:p>
-    <w:bookmarkEnd w:id="35"/>
-    <w:bookmarkStart w:id="36" w:name="exm-not-rss"/>
+    <w:bookmarkEnd w:id="37"/>
+    <w:bookmarkStart w:id="38" w:name="exm-not-rss"/>
     <w:p>
       <w:pPr>
         <w:pStyle w:val="BodyText"/>
@@ -10083,7 +11097,7 @@
       <w:r>
         <w:t xml:space="preserve"> </w:t>
       </w:r>
-      <w:hyperlink r:id="rId33">
+      <w:hyperlink r:id="rId35">
         <w:r>
           <w:rPr>
             <w:rStyle w:val="Hyperlink"/>
@@ -10095,7 +11109,7 @@
         <w:t xml:space="preserve">s.</w:t>
       </w:r>
     </w:p>
-    <w:bookmarkEnd w:id="36"/>
+    <w:bookmarkEnd w:id="38"/>
     <w:p>
       <w:pPr>
         <w:pStyle w:val="BodyText"/>
@@ -10134,8 +11148,8 @@
         <w:t xml:space="preserve">once the reader knows what the definition covers.</w:t>
       </w:r>
     </w:p>
-    <w:bookmarkEnd w:id="37"/>
-    <w:bookmarkStart w:id="41" w:name="X35ef0536ddd4dcadf17366e9cbbad09e6282954"/>
+    <w:bookmarkEnd w:id="39"/>
+    <w:bookmarkStart w:id="43" w:name="X35ef0536ddd4dcadf17366e9cbbad09e6282954"/>
     <w:p>
       <w:pPr>
         <w:pStyle w:val="Heading2"/>
@@ -10207,7 +11221,7 @@
       <w:r>
         <w:t xml:space="preserve"> </w:t>
       </w:r>
-      <w:hyperlink r:id="rId38">
+      <w:hyperlink r:id="rId40">
         <w:r>
           <w:rPr>
             <w:rStyle w:val="Hyperlink"/>
@@ -10239,7 +11253,7 @@
         <w:t xml:space="preserve">, keeps its prose definition alone.</w:t>
       </w:r>
     </w:p>
-    <w:bookmarkStart w:id="39" w:name="def-variance-expression-and-prose"/>
+    <w:bookmarkStart w:id="41" w:name="def-variance-expression-and-prose"/>
     <w:p>
       <w:pPr>
         <w:pStyle w:val="BodyText"/>
@@ -10442,8 +11456,8 @@
         <w:t xml:space="preserve">from its population mean.</w:t>
       </w:r>
     </w:p>
-    <w:bookmarkEnd w:id="39"/>
-    <w:bookmarkStart w:id="40" w:name="exm-not-expression-and-prose"/>
+    <w:bookmarkEnd w:id="41"/>
+    <w:bookmarkStart w:id="42" w:name="exm-not-expression-and-prose"/>
     <w:p>
       <w:pPr>
         <w:pStyle w:val="BodyText"/>
@@ -10602,9 +11616,9 @@
         <w:t xml:space="preserve">gives both.</w:t>
       </w:r>
     </w:p>
-    <w:bookmarkEnd w:id="40"/>
-    <w:bookmarkEnd w:id="41"/>
-    <w:bookmarkStart w:id="42" w:name="why-examples-matter"/>
+    <w:bookmarkEnd w:id="42"/>
+    <w:bookmarkEnd w:id="43"/>
+    <w:bookmarkStart w:id="44" w:name="why-examples-matter"/>
     <w:p>
       <w:pPr>
         <w:pStyle w:val="Heading2"/>
@@ -10756,8 +11770,8 @@
         <w:t xml:space="preserve">which is where readers most often misapply it.</w:t>
       </w:r>
     </w:p>
-    <w:bookmarkEnd w:id="42"/>
-    <w:bookmarkStart w:id="43" w:name="common-pitfalls-to-avoid"/>
+    <w:bookmarkEnd w:id="44"/>
+    <w:bookmarkStart w:id="45" w:name="common-pitfalls-to-avoid"/>
     <w:p>
       <w:pPr>
         <w:pStyle w:val="Heading2"/>
@@ -11045,8 +12059,8 @@
         <w:t xml:space="preserve">of the definition they are meant to demonstrate.</w:t>
       </w:r>
     </w:p>
-    <w:bookmarkEnd w:id="43"/>
-    <w:bookmarkStart w:id="51" w:name="mathematical-statements-require-examples"/>
+    <w:bookmarkEnd w:id="45"/>
+    <w:bookmarkStart w:id="53" w:name="mathematical-statements-require-examples"/>
     <w:p>
       <w:pPr>
         <w:pStyle w:val="Heading2"/>
@@ -11113,7 +12127,7 @@
         <w:t xml:space="preserve">when readers can see concrete instances.</w:t>
       </w:r>
     </w:p>
-    <w:bookmarkStart w:id="45" w:name="using-theorem-environments-in-quarto"/>
+    <w:bookmarkStart w:id="47" w:name="using-theorem-environments-in-quarto"/>
     <w:p>
       <w:pPr>
         <w:pStyle w:val="Heading3"/>
@@ -11406,7 +12420,7 @@
       <w:r>
         <w:t xml:space="preserve"> </w:t>
       </w:r>
-      <w:hyperlink r:id="rId44">
+      <w:hyperlink r:id="rId46">
         <w:r>
           <w:rPr>
             <w:rStyle w:val="Hyperlink"/>
@@ -11533,8 +12547,8 @@
         <w:t xml:space="preserve">.</w:t>
       </w:r>
     </w:p>
-    <w:bookmarkEnd w:id="45"/>
-    <w:bookmarkStart w:id="50" w:name="example-pythagorean-theorem"/>
+    <w:bookmarkEnd w:id="47"/>
+    <w:bookmarkStart w:id="52" w:name="example-pythagorean-theorem"/>
     <w:p>
       <w:pPr>
         <w:pStyle w:val="Heading3"/>
@@ -11543,7 +12557,7 @@
         <w:t xml:space="preserve">7.2 Example: Pythagorean theorem</w:t>
       </w:r>
     </w:p>
-    <w:bookmarkStart w:id="46" w:name="thm-pythagoras"/>
+    <w:bookmarkStart w:id="48" w:name="thm-pythagoras"/>
     <w:p>
       <w:pPr>
         <w:pStyle w:val="FirstParagraph"/>
@@ -11634,8 +12648,8 @@
         </m:oMath>
       </m:oMathPara>
     </w:p>
-    <w:bookmarkEnd w:id="46"/>
-    <w:bookmarkStart w:id="47" w:name="exm-pythagoras"/>
+    <w:bookmarkEnd w:id="48"/>
+    <w:bookmarkStart w:id="49" w:name="exm-pythagoras"/>
     <w:p>
       <w:pPr>
         <w:pStyle w:val="FirstParagraph"/>
@@ -11764,8 +12778,8 @@
         </m:oMath>
       </m:oMathPara>
     </w:p>
-    <w:bookmarkEnd w:id="47"/>
-    <w:bookmarkStart w:id="48" w:name="def-postulate"/>
+    <w:bookmarkEnd w:id="49"/>
+    <w:bookmarkStart w:id="50" w:name="def-postulate"/>
     <w:p>
       <w:pPr>
         <w:pStyle w:val="FirstParagraph"/>
@@ -11819,8 +12833,8 @@
         <w:t xml:space="preserve">serving as a starting point for further reasoning.</w:t>
       </w:r>
     </w:p>
-    <w:bookmarkEnd w:id="48"/>
-    <w:bookmarkStart w:id="49" w:name="exm-parallel-postulate"/>
+    <w:bookmarkEnd w:id="50"/>
+    <w:bookmarkStart w:id="51" w:name="exm-parallel-postulate"/>
     <w:p>
       <w:pPr>
         <w:pStyle w:val="BodyText"/>
@@ -11923,10 +12937,10 @@
         <w:t xml:space="preserve">.</w:t>
       </w:r>
     </w:p>
-    <w:bookmarkEnd w:id="49"/>
-    <w:bookmarkEnd w:id="50"/>
     <w:bookmarkEnd w:id="51"/>
-    <w:bookmarkStart w:id="60" w:name="Xe6c88c177e563d1f046037569009a36fd08f4bd"/>
+    <w:bookmarkEnd w:id="52"/>
+    <w:bookmarkEnd w:id="53"/>
+    <w:bookmarkStart w:id="62" w:name="Xe6c88c177e563d1f046037569009a36fd08f4bd"/>
     <w:p>
       <w:pPr>
         <w:pStyle w:val="Heading2"/>
@@ -12145,7 +13159,7 @@
       <w:r>
         <w:t xml:space="preserve"> </w:t>
       </w:r>
-      <w:hyperlink r:id="rId52">
+      <w:hyperlink r:id="rId54">
         <w:r>
           <w:rPr>
             <w:rStyle w:val="Hyperlink"/>
@@ -12221,7 +13235,7 @@
       <w:r>
         <w:t xml:space="preserve"> </w:t>
       </w:r>
-      <w:hyperlink r:id="rId53">
+      <w:hyperlink r:id="rId55">
         <w:r>
           <w:rPr>
             <w:rStyle w:val="Hyperlink"/>
@@ -12475,7 +13489,7 @@
         <w:t xml:space="preserve">is an ordinary step, not the pattern to avoid.</w:t>
       </w:r>
     </w:p>
-    <w:bookmarkStart w:id="54" w:name="def-sample-mean"/>
+    <w:bookmarkStart w:id="56" w:name="def-sample-mean"/>
     <w:p>
       <w:pPr>
         <w:pStyle w:val="FirstParagraph"/>
@@ -12660,8 +13674,8 @@
         </m:oMath>
       </m:oMathPara>
     </w:p>
-    <w:bookmarkEnd w:id="54"/>
-    <w:bookmarkStart w:id="55" w:name="exr-sum-deviations"/>
+    <w:bookmarkEnd w:id="56"/>
+    <w:bookmarkStart w:id="57" w:name="exr-sum-deviations"/>
     <w:p>
       <w:pPr>
         <w:pStyle w:val="FirstParagraph"/>
@@ -12816,8 +13830,8 @@
         <w:t xml:space="preserve">).</w:t>
       </w:r>
     </w:p>
-    <w:bookmarkEnd w:id="55"/>
-    <w:bookmarkStart w:id="56" w:name="sol-sum-deviations"/>
+    <w:bookmarkEnd w:id="57"/>
+    <w:bookmarkStart w:id="58" w:name="sol-sum-deviations"/>
     <w:p>
       <w:pPr>
         <w:pStyle w:val="BodyText"/>
@@ -13268,8 +14282,8 @@
         </m:oMath>
       </m:oMathPara>
     </w:p>
-    <w:bookmarkEnd w:id="56"/>
-    <w:bookmarkStart w:id="57" w:name="thm-sum-deviations"/>
+    <w:bookmarkEnd w:id="58"/>
+    <w:bookmarkStart w:id="59" w:name="thm-sum-deviations"/>
     <w:p>
       <w:pPr>
         <w:pStyle w:val="FirstParagraph"/>
@@ -13475,7 +14489,7 @@
         </m:oMath>
       </m:oMathPara>
     </w:p>
-    <w:bookmarkEnd w:id="57"/>
+    <w:bookmarkEnd w:id="59"/>
     <w:p>
       <w:pPr>
         <w:pStyle w:val="FirstParagraph"/>
@@ -13505,7 +14519,7 @@
         <w:t xml:space="preserve">derives this result.</w:t>
       </w:r>
     </w:p>
-    <w:bookmarkStart w:id="58" w:name="exm-derivation-direction"/>
+    <w:bookmarkStart w:id="60" w:name="exm-derivation-direction"/>
     <w:p>
       <w:pPr>
         <w:pStyle w:val="BodyText"/>
@@ -14572,7 +15586,7 @@
       <w:r>
         <w:t xml:space="preserve"> </w:t>
       </w:r>
-      <w:hyperlink r:id="rId53">
+      <w:hyperlink r:id="rId55">
         <w:r>
           <w:rPr>
             <w:rStyle w:val="Hyperlink"/>
@@ -14584,8 +15598,8 @@
         <w:t xml:space="preserve">).</w:t>
       </w:r>
     </w:p>
-    <w:bookmarkEnd w:id="58"/>
-    <w:bookmarkStart w:id="59" w:name="exm-one-result-per-theorem"/>
+    <w:bookmarkEnd w:id="60"/>
+    <w:bookmarkStart w:id="61" w:name="exm-one-result-per-theorem"/>
     <w:p>
       <w:pPr>
         <w:pStyle w:val="BodyText"/>
@@ -15069,8 +16083,8 @@
         <w:t xml:space="preserve">and a later step that uses only the first can cite only the first.</w:t>
       </w:r>
     </w:p>
-    <w:bookmarkEnd w:id="59"/>
-    <w:bookmarkEnd w:id="60"/>
+    <w:bookmarkEnd w:id="61"/>
+    <w:bookmarkEnd w:id="62"/>
     <w:sectPr>
       <w:footnotePr>
         <w:numRestart w:val="eachSect"/>

</xml_diff>

<commit_message>
Deploying to gh-pages from @ Morrison-Lab/psw@1faccb747af428c9e57bd6353c15b6cda5e3adb5 🚀
</commit_message>
<xml_diff>
--- a/chapters/defining-terms.docx
+++ b/chapters/defining-terms.docx
@@ -15,7 +15,7 @@
         <w:pStyle w:val="Date"/>
       </w:pPr>
       <w:r>
-        <w:t xml:space="preserve">Last modified: 2026-10-29 15:37:42 (PDT)</w:t>
+        <w:t xml:space="preserve">Last modified: 2026-10-29 15:44:03 (PDT)</w:t>
       </w:r>
     </w:p>
     <w:p>
@@ -507,7 +507,7 @@
       </w:r>
     </w:p>
     <w:bookmarkEnd w:id="15"/>
-    <w:bookmarkStart w:id="26" w:name="guidelines-for-defining-terms"/>
+    <w:bookmarkStart w:id="27" w:name="guidelines-for-defining-terms"/>
     <w:p>
       <w:pPr>
         <w:pStyle w:val="Heading2"/>
@@ -6148,6 +6148,138 @@
           <w:b/>
           <w:bCs/>
         </w:rPr>
+        <w:t xml:space="preserve">Tell synonyms from equivalent concepts:</w:t>
+      </w:r>
+      <w:r>
+        <w:t xml:space="preserve"> </w:t>
+      </w:r>
+      <w:r>
+        <w:t xml:space="preserve">Only true synonyms share a div title as aliases:</w:t>
+      </w:r>
+      <w:r>
+        <w:t xml:space="preserve"> </w:t>
+      </w:r>
+      <w:r>
+        <w:t xml:space="preserve">names for one concept, which has one definition.</w:t>
+      </w:r>
+      <w:r>
+        <w:t xml:space="preserve"> </w:t>
+      </w:r>
+      <w:r>
+        <w:t xml:space="preserve">Two concepts that happen to be equivalent are different concepts,</w:t>
+      </w:r>
+      <w:r>
+        <w:t xml:space="preserve"> </w:t>
+      </w:r>
+      <w:r>
+        <w:t xml:space="preserve">however often they coincide.</w:t>
+      </w:r>
+      <w:r>
+        <w:t xml:space="preserve"> </w:t>
+      </w:r>
+      <w:r>
+        <w:t xml:space="preserve">Give each its own definition, an example after each,</w:t>
+      </w:r>
+      <w:r>
+        <w:t xml:space="preserve"> </w:t>
+      </w:r>
+      <w:r>
+        <w:t xml:space="preserve">and a theorem showing that they agree</w:t>
+      </w:r>
+      <w:r>
+        <w:t xml:space="preserve"> </w:t>
+      </w:r>
+      <w:r>
+        <w:t xml:space="preserve">(see</w:t>
+      </w:r>
+      <w:r>
+        <w:t xml:space="preserve"> </w:t>
+      </w:r>
+      <w:r>
+        <w:rPr>
+          <w:i/>
+          <w:iCs/>
+        </w:rPr>
+        <w:t xml:space="preserve">Put only the defining equation in a definition, and state equivalences as results</w:t>
+      </w:r>
+      <w:r>
+        <w:t xml:space="preserve"> </w:t>
+      </w:r>
+      <w:r>
+        <w:t xml:space="preserve">above).</w:t>
+      </w:r>
+      <w:r>
+        <w:t xml:space="preserve"> </w:t>
+      </w:r>
+      <w:r>
+        <w:t xml:space="preserve">A test: if each name has its own natural definition,</w:t>
+      </w:r>
+      <w:r>
+        <w:t xml:space="preserve"> </w:t>
+      </w:r>
+      <w:r>
+        <w:t xml:space="preserve">they are two concepts.</w:t>
+      </w:r>
+      <w:r>
+        <w:t xml:space="preserve"> </w:t>
+      </w:r>
+      <w:r>
+        <w:t xml:space="preserve">For example, a loss defined as the negative log of the predicted probability of the observed class</w:t>
+      </w:r>
+      <w:r>
+        <w:t xml:space="preserve"> </w:t>
+      </w:r>
+      <w:r>
+        <w:t xml:space="preserve">and a loss defined as the</w:t>
+      </w:r>
+      <w:r>
+        <w:t xml:space="preserve"> </w:t>
+      </w:r>
+      <w:hyperlink r:id="rId24">
+        <w:r>
+          <w:rPr>
+            <w:rStyle w:val="Hyperlink"/>
+          </w:rPr>
+          <w:t xml:space="preserve">cross-entropy</w:t>
+        </w:r>
+      </w:hyperlink>
+      <w:r>
+        <w:t xml:space="preserve"> </w:t>
+      </w:r>
+      <w:r>
+        <w:t xml:space="preserve">between two distributions</w:t>
+      </w:r>
+      <w:r>
+        <w:t xml:space="preserve"> </w:t>
+      </w:r>
+      <w:r>
+        <w:t xml:space="preserve">each have a natural definition,</w:t>
+      </w:r>
+      <w:r>
+        <w:t xml:space="preserve"> </w:t>
+      </w:r>
+      <w:r>
+        <w:t xml:space="preserve">so give each its own div and state that they agree as a theorem,</w:t>
+      </w:r>
+      <w:r>
+        <w:t xml:space="preserve"> </w:t>
+      </w:r>
+      <w:r>
+        <w:t xml:space="preserve">instead of titling one div with both names.</w:t>
+      </w:r>
+    </w:p>
+    <w:p>
+      <w:pPr>
+        <w:numPr>
+          <w:ilvl w:val="0"/>
+          <w:numId w:val="1001"/>
+        </w:numPr>
+      </w:pPr>
+      <w:r>
+        <w:rPr>
+          <w:b/>
+          <w:bCs/>
+        </w:rPr>
         <w:t xml:space="preserve">Keep an entrenched misnomer, and clarify it once:</w:t>
       </w:r>
       <w:r>
@@ -6186,7 +6318,7 @@
       <w:r>
         <w:t xml:space="preserve"> </w:t>
       </w:r>
-      <w:hyperlink r:id="rId24">
+      <w:hyperlink r:id="rId25">
         <w:r>
           <w:rPr>
             <w:rStyle w:val="Hyperlink"/>
@@ -6220,7 +6352,7 @@
       <w:r>
         <w:t xml:space="preserve"> </w:t>
       </w:r>
-      <w:hyperlink r:id="rId25">
+      <w:hyperlink r:id="rId26">
         <w:r>
           <w:rPr>
             <w:rStyle w:val="Hyperlink"/>
@@ -9508,8 +9640,8 @@
         <w:t xml:space="preserve">When in doubt, keep it.</w:t>
       </w:r>
     </w:p>
-    <w:bookmarkEnd w:id="26"/>
-    <w:bookmarkStart w:id="33" w:name="examples-of-term-definitions"/>
+    <w:bookmarkEnd w:id="27"/>
+    <w:bookmarkStart w:id="34" w:name="examples-of-term-definitions"/>
     <w:p>
       <w:pPr>
         <w:pStyle w:val="Heading2"/>
@@ -9540,7 +9672,7 @@
         <w:t xml:space="preserve">s:</w:t>
       </w:r>
     </w:p>
-    <w:bookmarkStart w:id="27" w:name="def-confidence-interval"/>
+    <w:bookmarkStart w:id="28" w:name="def-confidence-interval"/>
     <w:p>
       <w:pPr>
         <w:pStyle w:val="BodyText"/>
@@ -9777,8 +9909,8 @@
         </m:oMath>
       </m:oMathPara>
     </w:p>
-    <w:bookmarkEnd w:id="27"/>
-    <w:bookmarkStart w:id="28" w:name="exm-confidence-interval"/>
+    <w:bookmarkEnd w:id="28"/>
+    <w:bookmarkStart w:id="29" w:name="exm-confidence-interval"/>
     <w:p>
       <w:pPr>
         <w:pStyle w:val="FirstParagraph"/>
@@ -9820,8 +9952,8 @@
         <w:t xml:space="preserve">we are 95% confident that the true population mean height falls within this range.</w:t>
       </w:r>
     </w:p>
-    <w:bookmarkEnd w:id="28"/>
-    <w:bookmarkStart w:id="29" w:name="exm-not-confidence-interval"/>
+    <w:bookmarkEnd w:id="29"/>
+    <w:bookmarkStart w:id="30" w:name="exm-not-confidence-interval"/>
     <w:p>
       <w:pPr>
         <w:pStyle w:val="BodyText"/>
@@ -9881,8 +10013,8 @@
         <w:t xml:space="preserve">and it does not shrink as the sample grows.</w:t>
       </w:r>
     </w:p>
-    <w:bookmarkEnd w:id="29"/>
-    <w:bookmarkStart w:id="30" w:name="def-active-voice"/>
+    <w:bookmarkEnd w:id="30"/>
+    <w:bookmarkStart w:id="31" w:name="def-active-voice"/>
     <w:p>
       <w:pPr>
         <w:pStyle w:val="BodyText"/>
@@ -9911,8 +10043,8 @@
         <w:t xml:space="preserve">is a sentence structure where the subject performs the action expressed by the verb.</w:t>
       </w:r>
     </w:p>
-    <w:bookmarkEnd w:id="30"/>
-    <w:bookmarkStart w:id="31" w:name="exm-active-voice"/>
+    <w:bookmarkEnd w:id="31"/>
+    <w:bookmarkStart w:id="32" w:name="exm-active-voice"/>
     <w:p>
       <w:pPr>
         <w:pStyle w:val="BodyText"/>
@@ -9972,8 +10104,8 @@
         <w:t xml:space="preserve">.</w:t>
       </w:r>
     </w:p>
-    <w:bookmarkEnd w:id="31"/>
-    <w:bookmarkStart w:id="32" w:name="exm-passive-voice"/>
+    <w:bookmarkEnd w:id="32"/>
+    <w:bookmarkStart w:id="33" w:name="exm-passive-voice"/>
     <w:p>
       <w:pPr>
         <w:pStyle w:val="BodyText"/>
@@ -10036,9 +10168,9 @@
         <w:t xml:space="preserve">so the sentence is in passive voice.</w:t>
       </w:r>
     </w:p>
-    <w:bookmarkEnd w:id="32"/>
     <w:bookmarkEnd w:id="33"/>
-    <w:bookmarkStart w:id="39" w:name="order-general-definition-then-examples"/>
+    <w:bookmarkEnd w:id="34"/>
+    <w:bookmarkStart w:id="40" w:name="order-general-definition-then-examples"/>
     <w:p>
       <w:pPr>
         <w:pStyle w:val="Heading2"/>
@@ -10176,7 +10308,7 @@
         <w:t xml:space="preserve">would give these blocks, in this order:</w:t>
       </w:r>
     </w:p>
-    <w:bookmarkStart w:id="34" w:name="def-rss"/>
+    <w:bookmarkStart w:id="35" w:name="def-rss"/>
     <w:p>
       <w:pPr>
         <w:pStyle w:val="BodyText"/>
@@ -10294,8 +10426,8 @@
         </m:oMath>
       </m:oMathPara>
     </w:p>
-    <w:bookmarkEnd w:id="34"/>
-    <w:bookmarkStart w:id="36" w:name="exm-rss-line"/>
+    <w:bookmarkEnd w:id="35"/>
+    <w:bookmarkStart w:id="37" w:name="exm-rss-line"/>
     <w:p>
       <w:pPr>
         <w:pStyle w:val="FirstParagraph"/>
@@ -10365,7 +10497,7 @@
       <w:r>
         <w:t xml:space="preserve"> </w:t>
       </w:r>
-      <w:hyperlink r:id="rId35">
+      <w:hyperlink r:id="rId36">
         <w:r>
           <w:rPr>
             <w:rStyle w:val="Hyperlink"/>
@@ -10661,8 +10793,8 @@
         </m:oMath>
       </m:oMathPara>
     </w:p>
-    <w:bookmarkEnd w:id="36"/>
-    <w:bookmarkStart w:id="37" w:name="exm-rss-three-points"/>
+    <w:bookmarkEnd w:id="37"/>
+    <w:bookmarkStart w:id="38" w:name="exm-rss-three-points"/>
     <w:p>
       <w:pPr>
         <w:pStyle w:val="FirstParagraph"/>
@@ -10951,8 +11083,8 @@
         <w:t xml:space="preserve">.</w:t>
       </w:r>
     </w:p>
-    <w:bookmarkEnd w:id="37"/>
-    <w:bookmarkStart w:id="38" w:name="exm-not-rss"/>
+    <w:bookmarkEnd w:id="38"/>
+    <w:bookmarkStart w:id="39" w:name="exm-not-rss"/>
     <w:p>
       <w:pPr>
         <w:pStyle w:val="BodyText"/>
@@ -11097,7 +11229,7 @@
       <w:r>
         <w:t xml:space="preserve"> </w:t>
       </w:r>
-      <w:hyperlink r:id="rId35">
+      <w:hyperlink r:id="rId36">
         <w:r>
           <w:rPr>
             <w:rStyle w:val="Hyperlink"/>
@@ -11109,7 +11241,7 @@
         <w:t xml:space="preserve">s.</w:t>
       </w:r>
     </w:p>
-    <w:bookmarkEnd w:id="38"/>
+    <w:bookmarkEnd w:id="39"/>
     <w:p>
       <w:pPr>
         <w:pStyle w:val="BodyText"/>
@@ -11148,8 +11280,8 @@
         <w:t xml:space="preserve">once the reader knows what the definition covers.</w:t>
       </w:r>
     </w:p>
-    <w:bookmarkEnd w:id="39"/>
-    <w:bookmarkStart w:id="43" w:name="X35ef0536ddd4dcadf17366e9cbbad09e6282954"/>
+    <w:bookmarkEnd w:id="40"/>
+    <w:bookmarkStart w:id="44" w:name="X35ef0536ddd4dcadf17366e9cbbad09e6282954"/>
     <w:p>
       <w:pPr>
         <w:pStyle w:val="Heading2"/>
@@ -11221,7 +11353,7 @@
       <w:r>
         <w:t xml:space="preserve"> </w:t>
       </w:r>
-      <w:hyperlink r:id="rId40">
+      <w:hyperlink r:id="rId41">
         <w:r>
           <w:rPr>
             <w:rStyle w:val="Hyperlink"/>
@@ -11253,7 +11385,7 @@
         <w:t xml:space="preserve">, keeps its prose definition alone.</w:t>
       </w:r>
     </w:p>
-    <w:bookmarkStart w:id="41" w:name="def-variance-expression-and-prose"/>
+    <w:bookmarkStart w:id="42" w:name="def-variance-expression-and-prose"/>
     <w:p>
       <w:pPr>
         <w:pStyle w:val="BodyText"/>
@@ -11456,8 +11588,8 @@
         <w:t xml:space="preserve">from its population mean.</w:t>
       </w:r>
     </w:p>
-    <w:bookmarkEnd w:id="41"/>
-    <w:bookmarkStart w:id="42" w:name="exm-not-expression-and-prose"/>
+    <w:bookmarkEnd w:id="42"/>
+    <w:bookmarkStart w:id="43" w:name="exm-not-expression-and-prose"/>
     <w:p>
       <w:pPr>
         <w:pStyle w:val="BodyText"/>
@@ -11616,9 +11748,9 @@
         <w:t xml:space="preserve">gives both.</w:t>
       </w:r>
     </w:p>
-    <w:bookmarkEnd w:id="42"/>
     <w:bookmarkEnd w:id="43"/>
-    <w:bookmarkStart w:id="44" w:name="why-examples-matter"/>
+    <w:bookmarkEnd w:id="44"/>
+    <w:bookmarkStart w:id="45" w:name="why-examples-matter"/>
     <w:p>
       <w:pPr>
         <w:pStyle w:val="Heading2"/>
@@ -11770,8 +11902,8 @@
         <w:t xml:space="preserve">which is where readers most often misapply it.</w:t>
       </w:r>
     </w:p>
-    <w:bookmarkEnd w:id="44"/>
-    <w:bookmarkStart w:id="45" w:name="common-pitfalls-to-avoid"/>
+    <w:bookmarkEnd w:id="45"/>
+    <w:bookmarkStart w:id="46" w:name="common-pitfalls-to-avoid"/>
     <w:p>
       <w:pPr>
         <w:pStyle w:val="Heading2"/>
@@ -12059,8 +12191,8 @@
         <w:t xml:space="preserve">of the definition they are meant to demonstrate.</w:t>
       </w:r>
     </w:p>
-    <w:bookmarkEnd w:id="45"/>
-    <w:bookmarkStart w:id="53" w:name="mathematical-statements-require-examples"/>
+    <w:bookmarkEnd w:id="46"/>
+    <w:bookmarkStart w:id="54" w:name="mathematical-statements-require-examples"/>
     <w:p>
       <w:pPr>
         <w:pStyle w:val="Heading2"/>
@@ -12127,7 +12259,7 @@
         <w:t xml:space="preserve">when readers can see concrete instances.</w:t>
       </w:r>
     </w:p>
-    <w:bookmarkStart w:id="47" w:name="using-theorem-environments-in-quarto"/>
+    <w:bookmarkStart w:id="48" w:name="using-theorem-environments-in-quarto"/>
     <w:p>
       <w:pPr>
         <w:pStyle w:val="Heading3"/>
@@ -12420,7 +12552,7 @@
       <w:r>
         <w:t xml:space="preserve"> </w:t>
       </w:r>
-      <w:hyperlink r:id="rId46">
+      <w:hyperlink r:id="rId47">
         <w:r>
           <w:rPr>
             <w:rStyle w:val="Hyperlink"/>
@@ -12547,8 +12679,8 @@
         <w:t xml:space="preserve">.</w:t>
       </w:r>
     </w:p>
-    <w:bookmarkEnd w:id="47"/>
-    <w:bookmarkStart w:id="52" w:name="example-pythagorean-theorem"/>
+    <w:bookmarkEnd w:id="48"/>
+    <w:bookmarkStart w:id="53" w:name="example-pythagorean-theorem"/>
     <w:p>
       <w:pPr>
         <w:pStyle w:val="Heading3"/>
@@ -12557,7 +12689,7 @@
         <w:t xml:space="preserve">7.2 Example: Pythagorean theorem</w:t>
       </w:r>
     </w:p>
-    <w:bookmarkStart w:id="48" w:name="thm-pythagoras"/>
+    <w:bookmarkStart w:id="49" w:name="thm-pythagoras"/>
     <w:p>
       <w:pPr>
         <w:pStyle w:val="FirstParagraph"/>
@@ -12648,8 +12780,8 @@
         </m:oMath>
       </m:oMathPara>
     </w:p>
-    <w:bookmarkEnd w:id="48"/>
-    <w:bookmarkStart w:id="49" w:name="exm-pythagoras"/>
+    <w:bookmarkEnd w:id="49"/>
+    <w:bookmarkStart w:id="50" w:name="exm-pythagoras"/>
     <w:p>
       <w:pPr>
         <w:pStyle w:val="FirstParagraph"/>
@@ -12778,8 +12910,8 @@
         </m:oMath>
       </m:oMathPara>
     </w:p>
-    <w:bookmarkEnd w:id="49"/>
-    <w:bookmarkStart w:id="50" w:name="def-postulate"/>
+    <w:bookmarkEnd w:id="50"/>
+    <w:bookmarkStart w:id="51" w:name="def-postulate"/>
     <w:p>
       <w:pPr>
         <w:pStyle w:val="FirstParagraph"/>
@@ -12833,8 +12965,8 @@
         <w:t xml:space="preserve">serving as a starting point for further reasoning.</w:t>
       </w:r>
     </w:p>
-    <w:bookmarkEnd w:id="50"/>
-    <w:bookmarkStart w:id="51" w:name="exm-parallel-postulate"/>
+    <w:bookmarkEnd w:id="51"/>
+    <w:bookmarkStart w:id="52" w:name="exm-parallel-postulate"/>
     <w:p>
       <w:pPr>
         <w:pStyle w:val="BodyText"/>
@@ -12937,10 +13069,10 @@
         <w:t xml:space="preserve">.</w:t>
       </w:r>
     </w:p>
-    <w:bookmarkEnd w:id="51"/>
     <w:bookmarkEnd w:id="52"/>
     <w:bookmarkEnd w:id="53"/>
-    <w:bookmarkStart w:id="62" w:name="Xe6c88c177e563d1f046037569009a36fd08f4bd"/>
+    <w:bookmarkEnd w:id="54"/>
+    <w:bookmarkStart w:id="63" w:name="Xe6c88c177e563d1f046037569009a36fd08f4bd"/>
     <w:p>
       <w:pPr>
         <w:pStyle w:val="Heading2"/>
@@ -13159,7 +13291,7 @@
       <w:r>
         <w:t xml:space="preserve"> </w:t>
       </w:r>
-      <w:hyperlink r:id="rId54">
+      <w:hyperlink r:id="rId55">
         <w:r>
           <w:rPr>
             <w:rStyle w:val="Hyperlink"/>
@@ -13235,7 +13367,7 @@
       <w:r>
         <w:t xml:space="preserve"> </w:t>
       </w:r>
-      <w:hyperlink r:id="rId55">
+      <w:hyperlink r:id="rId56">
         <w:r>
           <w:rPr>
             <w:rStyle w:val="Hyperlink"/>
@@ -13489,7 +13621,7 @@
         <w:t xml:space="preserve">is an ordinary step, not the pattern to avoid.</w:t>
       </w:r>
     </w:p>
-    <w:bookmarkStart w:id="56" w:name="def-sample-mean"/>
+    <w:bookmarkStart w:id="57" w:name="def-sample-mean"/>
     <w:p>
       <w:pPr>
         <w:pStyle w:val="FirstParagraph"/>
@@ -13674,8 +13806,8 @@
         </m:oMath>
       </m:oMathPara>
     </w:p>
-    <w:bookmarkEnd w:id="56"/>
-    <w:bookmarkStart w:id="57" w:name="exr-sum-deviations"/>
+    <w:bookmarkEnd w:id="57"/>
+    <w:bookmarkStart w:id="58" w:name="exr-sum-deviations"/>
     <w:p>
       <w:pPr>
         <w:pStyle w:val="FirstParagraph"/>
@@ -13830,8 +13962,8 @@
         <w:t xml:space="preserve">).</w:t>
       </w:r>
     </w:p>
-    <w:bookmarkEnd w:id="57"/>
-    <w:bookmarkStart w:id="58" w:name="sol-sum-deviations"/>
+    <w:bookmarkEnd w:id="58"/>
+    <w:bookmarkStart w:id="59" w:name="sol-sum-deviations"/>
     <w:p>
       <w:pPr>
         <w:pStyle w:val="BodyText"/>
@@ -14282,8 +14414,8 @@
         </m:oMath>
       </m:oMathPara>
     </w:p>
-    <w:bookmarkEnd w:id="58"/>
-    <w:bookmarkStart w:id="59" w:name="thm-sum-deviations"/>
+    <w:bookmarkEnd w:id="59"/>
+    <w:bookmarkStart w:id="60" w:name="thm-sum-deviations"/>
     <w:p>
       <w:pPr>
         <w:pStyle w:val="FirstParagraph"/>
@@ -14489,7 +14621,7 @@
         </m:oMath>
       </m:oMathPara>
     </w:p>
-    <w:bookmarkEnd w:id="59"/>
+    <w:bookmarkEnd w:id="60"/>
     <w:p>
       <w:pPr>
         <w:pStyle w:val="FirstParagraph"/>
@@ -14519,7 +14651,7 @@
         <w:t xml:space="preserve">derives this result.</w:t>
       </w:r>
     </w:p>
-    <w:bookmarkStart w:id="60" w:name="exm-derivation-direction"/>
+    <w:bookmarkStart w:id="61" w:name="exm-derivation-direction"/>
     <w:p>
       <w:pPr>
         <w:pStyle w:val="BodyText"/>
@@ -15586,7 +15718,7 @@
       <w:r>
         <w:t xml:space="preserve"> </w:t>
       </w:r>
-      <w:hyperlink r:id="rId55">
+      <w:hyperlink r:id="rId56">
         <w:r>
           <w:rPr>
             <w:rStyle w:val="Hyperlink"/>
@@ -15598,8 +15730,8 @@
         <w:t xml:space="preserve">).</w:t>
       </w:r>
     </w:p>
-    <w:bookmarkEnd w:id="60"/>
-    <w:bookmarkStart w:id="61" w:name="exm-one-result-per-theorem"/>
+    <w:bookmarkEnd w:id="61"/>
+    <w:bookmarkStart w:id="62" w:name="exm-one-result-per-theorem"/>
     <w:p>
       <w:pPr>
         <w:pStyle w:val="BodyText"/>
@@ -16083,8 +16215,8 @@
         <w:t xml:space="preserve">and a later step that uses only the first can cite only the first.</w:t>
       </w:r>
     </w:p>
-    <w:bookmarkEnd w:id="61"/>
     <w:bookmarkEnd w:id="62"/>
+    <w:bookmarkEnd w:id="63"/>
     <w:sectPr>
       <w:footnotePr>
         <w:numRestart w:val="eachSect"/>

</xml_diff>